<commit_message>
2.3 Logical Functions completed
</commit_message>
<xml_diff>
--- a/Notes.docx
+++ b/Notes.docx
@@ -61,6 +61,7 @@
           <w:pPr>
             <w:pStyle w:val="TOC1"/>
             <w:tabs>
+              <w:tab w:val="left" w:pos="480"/>
               <w:tab w:val="right" w:leader="dot" w:pos="9016"/>
             </w:tabs>
             <w:rPr>
@@ -79,10 +80,98 @@
           <w:r>
             <w:fldChar w:fldCharType="separate"/>
           </w:r>
-          <w:hyperlink w:anchor="_Toc231911824" w:history="1">
+          <w:hyperlink w:anchor="_Toc231974411" w:history="1">
             <w:r>
               <w:rPr>
                 <w:rStyle w:val="Hyperlink"/>
+                <w:rFonts w:ascii="Wingdings" w:hAnsi="Wingdings"/>
+                <w:noProof/>
+              </w:rPr>
+              <w:t></w:t>
+            </w:r>
+            <w:r>
+              <w:rPr>
+                <w:rFonts w:asciiTheme="minorHAnsi" w:eastAsiaTheme="minorEastAsia" w:hAnsiTheme="minorHAnsi"/>
+                <w:noProof/>
+                <w:szCs w:val="24"/>
+                <w:lang w:eastAsia="en-IN" w:bidi="gu-IN"/>
+              </w:rPr>
+              <w:tab/>
+            </w:r>
+            <w:r>
+              <w:rPr>
+                <w:rStyle w:val="Hyperlink"/>
+                <w:noProof/>
+              </w:rPr>
+              <w:t>Short Cuts</w:t>
+            </w:r>
+            <w:r>
+              <w:rPr>
+                <w:noProof/>
+                <w:webHidden/>
+              </w:rPr>
+              <w:tab/>
+            </w:r>
+            <w:r>
+              <w:rPr>
+                <w:noProof/>
+                <w:webHidden/>
+              </w:rPr>
+              <w:fldChar w:fldCharType="begin"/>
+            </w:r>
+            <w:r>
+              <w:rPr>
+                <w:noProof/>
+                <w:webHidden/>
+              </w:rPr>
+              <w:instrText xml:space="preserve"> PAGEREF _Toc231974411 \h </w:instrText>
+            </w:r>
+            <w:r>
+              <w:rPr>
+                <w:noProof/>
+                <w:webHidden/>
+              </w:rPr>
+            </w:r>
+            <w:r>
+              <w:rPr>
+                <w:noProof/>
+                <w:webHidden/>
+              </w:rPr>
+              <w:fldChar w:fldCharType="separate"/>
+            </w:r>
+            <w:r>
+              <w:rPr>
+                <w:noProof/>
+                <w:webHidden/>
+              </w:rPr>
+              <w:t>2</w:t>
+            </w:r>
+            <w:r>
+              <w:rPr>
+                <w:noProof/>
+                <w:webHidden/>
+              </w:rPr>
+              <w:fldChar w:fldCharType="end"/>
+            </w:r>
+          </w:hyperlink>
+        </w:p>
+        <w:p>
+          <w:pPr>
+            <w:pStyle w:val="TOC1"/>
+            <w:tabs>
+              <w:tab w:val="right" w:leader="dot" w:pos="9016"/>
+            </w:tabs>
+            <w:rPr>
+              <w:rFonts w:asciiTheme="minorHAnsi" w:eastAsiaTheme="minorEastAsia" w:hAnsiTheme="minorHAnsi"/>
+              <w:noProof/>
+              <w:szCs w:val="24"/>
+              <w:lang w:eastAsia="en-IN" w:bidi="gu-IN"/>
+            </w:rPr>
+          </w:pPr>
+          <w:hyperlink w:anchor="_Toc231974412" w:history="1">
+            <w:r>
+              <w:rPr>
+                <w:rStyle w:val="Hyperlink"/>
                 <w:noProof/>
                 <w:lang w:val="en-US"/>
               </w:rPr>
@@ -107,7 +196,7 @@
                 <w:noProof/>
                 <w:webHidden/>
               </w:rPr>
-              <w:instrText xml:space="preserve"> PAGEREF _Toc231911824 \h </w:instrText>
+              <w:instrText xml:space="preserve"> PAGEREF _Toc231974412 \h </w:instrText>
             </w:r>
             <w:r>
               <w:rPr>
@@ -127,7 +216,7 @@
                 <w:noProof/>
                 <w:webHidden/>
               </w:rPr>
-              <w:t>2</w:t>
+              <w:t>3</w:t>
             </w:r>
             <w:r>
               <w:rPr>
@@ -152,7 +241,7 @@
               <w:lang w:eastAsia="en-IN" w:bidi="gu-IN"/>
             </w:rPr>
           </w:pPr>
-          <w:hyperlink w:anchor="_Toc231911825" w:history="1">
+          <w:hyperlink w:anchor="_Toc231974413" w:history="1">
             <w:r>
               <w:rPr>
                 <w:rStyle w:val="Hyperlink"/>
@@ -197,7 +286,7 @@
                 <w:noProof/>
                 <w:webHidden/>
               </w:rPr>
-              <w:instrText xml:space="preserve"> PAGEREF _Toc231911825 \h </w:instrText>
+              <w:instrText xml:space="preserve"> PAGEREF _Toc231974413 \h </w:instrText>
             </w:r>
             <w:r>
               <w:rPr>
@@ -217,7 +306,7 @@
                 <w:noProof/>
                 <w:webHidden/>
               </w:rPr>
-              <w:t>2</w:t>
+              <w:t>3</w:t>
             </w:r>
             <w:r>
               <w:rPr>
@@ -241,7 +330,7 @@
               <w:lang w:eastAsia="en-IN" w:bidi="gu-IN"/>
             </w:rPr>
           </w:pPr>
-          <w:hyperlink w:anchor="_Toc231911826" w:history="1">
+          <w:hyperlink w:anchor="_Toc231974414" w:history="1">
             <w:r>
               <w:rPr>
                 <w:rStyle w:val="Hyperlink"/>
@@ -269,7 +358,7 @@
                 <w:noProof/>
                 <w:webHidden/>
               </w:rPr>
-              <w:instrText xml:space="preserve"> PAGEREF _Toc231911826 \h </w:instrText>
+              <w:instrText xml:space="preserve"> PAGEREF _Toc231974414 \h </w:instrText>
             </w:r>
             <w:r>
               <w:rPr>
@@ -289,7 +378,7 @@
                 <w:noProof/>
                 <w:webHidden/>
               </w:rPr>
-              <w:t>2</w:t>
+              <w:t>3</w:t>
             </w:r>
             <w:r>
               <w:rPr>
@@ -313,7 +402,7 @@
               <w:lang w:eastAsia="en-IN" w:bidi="gu-IN"/>
             </w:rPr>
           </w:pPr>
-          <w:hyperlink w:anchor="_Toc231911827" w:history="1">
+          <w:hyperlink w:anchor="_Toc231974415" w:history="1">
             <w:r>
               <w:rPr>
                 <w:rStyle w:val="Hyperlink"/>
@@ -341,7 +430,7 @@
                 <w:noProof/>
                 <w:webHidden/>
               </w:rPr>
-              <w:instrText xml:space="preserve"> PAGEREF _Toc231911827 \h </w:instrText>
+              <w:instrText xml:space="preserve"> PAGEREF _Toc231974415 \h </w:instrText>
             </w:r>
             <w:r>
               <w:rPr>
@@ -361,7 +450,7 @@
                 <w:noProof/>
                 <w:webHidden/>
               </w:rPr>
-              <w:t>2</w:t>
+              <w:t>3</w:t>
             </w:r>
             <w:r>
               <w:rPr>
@@ -386,7 +475,7 @@
               <w:lang w:eastAsia="en-IN" w:bidi="gu-IN"/>
             </w:rPr>
           </w:pPr>
-          <w:hyperlink w:anchor="_Toc231911828" w:history="1">
+          <w:hyperlink w:anchor="_Toc231974416" w:history="1">
             <w:r>
               <w:rPr>
                 <w:rStyle w:val="Hyperlink"/>
@@ -431,7 +520,7 @@
                 <w:noProof/>
                 <w:webHidden/>
               </w:rPr>
-              <w:instrText xml:space="preserve"> PAGEREF _Toc231911828 \h </w:instrText>
+              <w:instrText xml:space="preserve"> PAGEREF _Toc231974416 \h </w:instrText>
             </w:r>
             <w:r>
               <w:rPr>
@@ -451,7 +540,7 @@
                 <w:noProof/>
                 <w:webHidden/>
               </w:rPr>
-              <w:t>3</w:t>
+              <w:t>4</w:t>
             </w:r>
             <w:r>
               <w:rPr>
@@ -476,7 +565,7 @@
               <w:lang w:eastAsia="en-IN" w:bidi="gu-IN"/>
             </w:rPr>
           </w:pPr>
-          <w:hyperlink w:anchor="_Toc231911829" w:history="1">
+          <w:hyperlink w:anchor="_Toc231974417" w:history="1">
             <w:r>
               <w:rPr>
                 <w:rStyle w:val="Hyperlink"/>
@@ -521,7 +610,7 @@
                 <w:noProof/>
                 <w:webHidden/>
               </w:rPr>
-              <w:instrText xml:space="preserve"> PAGEREF _Toc231911829 \h </w:instrText>
+              <w:instrText xml:space="preserve"> PAGEREF _Toc231974417 \h </w:instrText>
             </w:r>
             <w:r>
               <w:rPr>
@@ -541,7 +630,7 @@
                 <w:noProof/>
                 <w:webHidden/>
               </w:rPr>
-              <w:t>4</w:t>
+              <w:t>5</w:t>
             </w:r>
             <w:r>
               <w:rPr>
@@ -565,7 +654,7 @@
               <w:lang w:eastAsia="en-IN" w:bidi="gu-IN"/>
             </w:rPr>
           </w:pPr>
-          <w:hyperlink w:anchor="_Toc231911830" w:history="1">
+          <w:hyperlink w:anchor="_Toc231974418" w:history="1">
             <w:r>
               <w:rPr>
                 <w:rStyle w:val="Hyperlink"/>
@@ -593,7 +682,7 @@
                 <w:noProof/>
                 <w:webHidden/>
               </w:rPr>
-              <w:instrText xml:space="preserve"> PAGEREF _Toc231911830 \h </w:instrText>
+              <w:instrText xml:space="preserve"> PAGEREF _Toc231974418 \h </w:instrText>
             </w:r>
             <w:r>
               <w:rPr>
@@ -613,7 +702,7 @@
                 <w:noProof/>
                 <w:webHidden/>
               </w:rPr>
-              <w:t>6</w:t>
+              <w:t>7</w:t>
             </w:r>
             <w:r>
               <w:rPr>
@@ -637,30 +726,14 @@
               <w:lang w:eastAsia="en-IN" w:bidi="gu-IN"/>
             </w:rPr>
           </w:pPr>
-          <w:hyperlink w:anchor="_Toc231911831" w:history="1">
+          <w:hyperlink w:anchor="_Toc231974419" w:history="1">
             <w:r>
               <w:rPr>
                 <w:rStyle w:val="Hyperlink"/>
                 <w:noProof/>
                 <w:lang w:val="en-US"/>
               </w:rPr>
-              <w:t>2.1 Formulas In</w:t>
-            </w:r>
-            <w:r>
-              <w:rPr>
-                <w:rStyle w:val="Hyperlink"/>
-                <w:noProof/>
-                <w:lang w:val="en-US"/>
-              </w:rPr>
-              <w:t>t</w:t>
-            </w:r>
-            <w:r>
-              <w:rPr>
-                <w:rStyle w:val="Hyperlink"/>
-                <w:noProof/>
-                <w:lang w:val="en-US"/>
-              </w:rPr>
-              <w:t>ro</w:t>
+              <w:t>2.1 Formulas Intro</w:t>
             </w:r>
             <w:r>
               <w:rPr>
@@ -681,7 +754,7 @@
                 <w:noProof/>
                 <w:webHidden/>
               </w:rPr>
-              <w:instrText xml:space="preserve"> PAGEREF _Toc231911831 \h </w:instrText>
+              <w:instrText xml:space="preserve"> PAGEREF _Toc231974419 \h </w:instrText>
             </w:r>
             <w:r>
               <w:rPr>
@@ -701,7 +774,7 @@
                 <w:noProof/>
                 <w:webHidden/>
               </w:rPr>
-              <w:t>6</w:t>
+              <w:t>7</w:t>
             </w:r>
             <w:r>
               <w:rPr>
@@ -714,9 +787,8 @@
         </w:p>
         <w:p>
           <w:pPr>
-            <w:pStyle w:val="TOC1"/>
+            <w:pStyle w:val="TOC2"/>
             <w:tabs>
-              <w:tab w:val="left" w:pos="480"/>
               <w:tab w:val="right" w:leader="dot" w:pos="9016"/>
             </w:tabs>
             <w:rPr>
@@ -726,40 +798,40 @@
               <w:lang w:eastAsia="en-IN" w:bidi="gu-IN"/>
             </w:rPr>
           </w:pPr>
-          <w:hyperlink w:anchor="_Toc231911832" w:history="1">
+          <w:hyperlink w:anchor="_Toc231974420" w:history="1">
             <w:r>
               <w:rPr>
                 <w:rStyle w:val="Hyperlink"/>
-                <w:rFonts w:ascii="Wingdings" w:hAnsi="Wingdings"/>
-                <w:noProof/>
-              </w:rPr>
-              <w:t></w:t>
-            </w:r>
-            <w:r>
-              <w:rPr>
-                <w:rFonts w:asciiTheme="minorHAnsi" w:eastAsiaTheme="minorEastAsia" w:hAnsiTheme="minorHAnsi"/>
-                <w:noProof/>
-                <w:szCs w:val="24"/>
-                <w:lang w:eastAsia="en-IN" w:bidi="gu-IN"/>
+                <w:noProof/>
+                <w:lang w:val="en-US"/>
+              </w:rPr>
+              <w:t>2.2 Functions I</w:t>
+            </w:r>
+            <w:r>
+              <w:rPr>
+                <w:rStyle w:val="Hyperlink"/>
+                <w:noProof/>
+                <w:lang w:val="en-US"/>
+              </w:rPr>
+              <w:t>n</w:t>
+            </w:r>
+            <w:r>
+              <w:rPr>
+                <w:rStyle w:val="Hyperlink"/>
+                <w:noProof/>
+                <w:lang w:val="en-US"/>
+              </w:rPr>
+              <w:t>tro</w:t>
+            </w:r>
+            <w:r>
+              <w:rPr>
+                <w:noProof/>
+                <w:webHidden/>
               </w:rPr>
               <w:tab/>
             </w:r>
             <w:r>
               <w:rPr>
-                <w:rStyle w:val="Hyperlink"/>
-                <w:noProof/>
-              </w:rPr>
-              <w:t>Short Cuts</w:t>
-            </w:r>
-            <w:r>
-              <w:rPr>
-                <w:noProof/>
-                <w:webHidden/>
-              </w:rPr>
-              <w:tab/>
-            </w:r>
-            <w:r>
-              <w:rPr>
                 <w:noProof/>
                 <w:webHidden/>
               </w:rPr>
@@ -770,7 +842,7 @@
                 <w:noProof/>
                 <w:webHidden/>
               </w:rPr>
-              <w:instrText xml:space="preserve"> PAGEREF _Toc231911832 \h </w:instrText>
+              <w:instrText xml:space="preserve"> PAGEREF _Toc231974420 \h </w:instrText>
             </w:r>
             <w:r>
               <w:rPr>
@@ -790,7 +862,7 @@
                 <w:noProof/>
                 <w:webHidden/>
               </w:rPr>
-              <w:t>7</w:t>
+              <w:t>8</w:t>
             </w:r>
             <w:r>
               <w:rPr>
@@ -829,11 +901,65 @@
     <w:p>
       <w:pPr>
         <w:pStyle w:val="Heading1"/>
-        <w:rPr>
-          <w:lang w:val="en-US"/>
-        </w:rPr>
-      </w:pPr>
-      <w:bookmarkStart w:id="0" w:name="_Toc231911824"/>
+        <w:numPr>
+          <w:ilvl w:val="0"/>
+          <w:numId w:val="3"/>
+        </w:numPr>
+        <w:ind w:left="420" w:hanging="420"/>
+      </w:pPr>
+      <w:bookmarkStart w:id="0" w:name="_Toc231974411"/>
+      <w:r>
+        <w:lastRenderedPageBreak/>
+        <w:t>Short Cuts</w:t>
+      </w:r>
+      <w:bookmarkEnd w:id="0"/>
+    </w:p>
+    <w:p/>
+    <w:p>
+      <w:r>
+        <w:rPr>
+          <w:b/>
+          <w:bCs/>
+        </w:rPr>
+        <w:t>Double Click</w:t>
+      </w:r>
+      <w:r>
+        <w:t xml:space="preserve"> on Ribbon name to close Ribbon</w:t>
+      </w:r>
+    </w:p>
+    <w:p>
+      <w:r>
+        <w:rPr>
+          <w:b/>
+          <w:bCs/>
+        </w:rPr>
+        <w:t>Enter:</w:t>
+      </w:r>
+      <w:r>
+        <w:t xml:space="preserve"> To move down to column to another cell</w:t>
+      </w:r>
+    </w:p>
+    <w:p>
+      <w:pPr>
+        <w:rPr>
+          <w:lang w:val="en-US"/>
+        </w:rPr>
+      </w:pPr>
+      <w:r>
+        <w:rPr>
+          <w:lang w:val="en-US"/>
+        </w:rPr>
+        <w:br w:type="page"/>
+      </w:r>
+    </w:p>
+    <w:p>
+      <w:pPr>
+        <w:pStyle w:val="Heading1"/>
+        <w:rPr>
+          <w:lang w:val="en-US"/>
+        </w:rPr>
+      </w:pPr>
+      <w:bookmarkStart w:id="1" w:name="_Toc231974412"/>
       <w:r>
         <w:rPr>
           <w:lang w:val="en-US"/>
@@ -853,7 +979,7 @@
         </w:rPr>
         <w:t>Sheets Intro</w:t>
       </w:r>
-      <w:bookmarkEnd w:id="0"/>
+      <w:bookmarkEnd w:id="1"/>
     </w:p>
     <w:p>
       <w:pPr>
@@ -880,14 +1006,14 @@
           <w:lang w:val="en-US"/>
         </w:rPr>
       </w:pPr>
-      <w:bookmarkStart w:id="1" w:name="_Toc231911825"/>
+      <w:bookmarkStart w:id="2" w:name="_Toc231974413"/>
       <w:r>
         <w:rPr>
           <w:lang w:val="en-US"/>
         </w:rPr>
         <w:t>Worksheets</w:t>
       </w:r>
-      <w:bookmarkEnd w:id="1"/>
+      <w:bookmarkEnd w:id="2"/>
     </w:p>
     <w:p>
       <w:pPr>
@@ -991,14 +1117,14 @@
           <w:lang w:val="en-US"/>
         </w:rPr>
       </w:pPr>
-      <w:bookmarkStart w:id="2" w:name="_Toc231911826"/>
+      <w:bookmarkStart w:id="3" w:name="_Toc231974414"/>
       <w:r>
         <w:rPr>
           <w:lang w:val="en-US"/>
         </w:rPr>
         <w:t>Formulas</w:t>
       </w:r>
-      <w:bookmarkEnd w:id="2"/>
+      <w:bookmarkEnd w:id="3"/>
     </w:p>
     <w:p>
       <w:pPr>
@@ -1018,15 +1144,7 @@
           <w:bdr w:val="single" w:sz="4" w:space="0" w:color="auto"/>
           <w:lang w:val="en-US"/>
         </w:rPr>
-        <w:t>= A1</w:t>
-      </w:r>
-      <w:proofErr w:type="gramStart"/>
-      <w:r>
-        <w:rPr>
-          <w:bdr w:val="single" w:sz="4" w:space="0" w:color="auto"/>
-          <w:lang w:val="en-US"/>
-        </w:rPr>
-        <w:t>&amp;</w:t>
+        <w:t>= A1&amp;</w:t>
       </w:r>
       <w:r>
         <w:rPr>
@@ -1041,15 +1159,7 @@
           <w:bdr w:val="single" w:sz="4" w:space="0" w:color="auto"/>
           <w:lang w:val="en-US"/>
         </w:rPr>
-        <w:t>&amp;</w:t>
-      </w:r>
-      <w:proofErr w:type="gramEnd"/>
-      <w:r>
-        <w:rPr>
-          <w:bdr w:val="single" w:sz="4" w:space="0" w:color="auto"/>
-          <w:lang w:val="en-US"/>
-        </w:rPr>
-        <w:t>E1</w:t>
+        <w:t>&amp;E1</w:t>
       </w:r>
       <w:r>
         <w:rPr>
@@ -1067,21 +1177,7 @@
         <w:rPr>
           <w:lang w:val="en-US"/>
         </w:rPr>
-        <w:t xml:space="preserve"> This Will Add </w:t>
-      </w:r>
-      <w:proofErr w:type="spellStart"/>
-      <w:r>
-        <w:rPr>
-          <w:lang w:val="en-US"/>
-        </w:rPr>
-        <w:t>Hypen</w:t>
-      </w:r>
-      <w:proofErr w:type="spellEnd"/>
-      <w:r>
-        <w:rPr>
-          <w:lang w:val="en-US"/>
-        </w:rPr>
-        <w:t xml:space="preserve"> (-) between data of A1 and E1 cells</w:t>
+        <w:t xml:space="preserve"> This Will Add Hypen (-) between data of A1 and E1 cells</w:t>
       </w:r>
       <w:r>
         <w:rPr>
@@ -1094,93 +1190,153 @@
           <w:color w:val="4472C4" w:themeColor="accent1"/>
           <w:lang w:val="en-US"/>
         </w:rPr>
-        <w:t xml:space="preserve">(Quotes </w:t>
-      </w:r>
-      <w:proofErr w:type="gramStart"/>
+        <w:t xml:space="preserve">(Quotes are </w:t>
+      </w:r>
       <w:r>
         <w:rPr>
           <w:color w:val="4472C4" w:themeColor="accent1"/>
           <w:lang w:val="en-US"/>
         </w:rPr>
-        <w:t xml:space="preserve">are </w:t>
+        <w:t xml:space="preserve"> </w:t>
       </w:r>
       <w:r>
         <w:rPr>
           <w:color w:val="4472C4" w:themeColor="accent1"/>
           <w:lang w:val="en-US"/>
         </w:rPr>
-        <w:t xml:space="preserve"> </w:t>
-      </w:r>
-      <w:r>
-        <w:rPr>
-          <w:color w:val="4472C4" w:themeColor="accent1"/>
-          <w:lang w:val="en-US"/>
-        </w:rPr>
-        <w:t>mandatory</w:t>
-      </w:r>
-      <w:proofErr w:type="gramEnd"/>
-      <w:r>
-        <w:rPr>
-          <w:color w:val="4472C4" w:themeColor="accent1"/>
+        <w:t>mandatory)</w:t>
+      </w:r>
+    </w:p>
+    <w:p>
+      <w:pPr>
+        <w:rPr>
+          <w:lang w:val="en-US"/>
+        </w:rPr>
+      </w:pPr>
+    </w:p>
+    <w:p>
+      <w:pPr>
+        <w:pStyle w:val="Heading3"/>
+        <w:rPr>
+          <w:lang w:val="en-US"/>
+        </w:rPr>
+      </w:pPr>
+      <w:bookmarkStart w:id="4" w:name="_Toc231974415"/>
+      <w:r>
+        <w:rPr>
+          <w:lang w:val="en-US"/>
+        </w:rPr>
+        <w:t>Ranges – Collection of Cells</w:t>
+      </w:r>
+      <w:bookmarkEnd w:id="4"/>
+    </w:p>
+    <w:p>
+      <w:pPr>
+        <w:rPr>
+          <w:lang w:val="en-US"/>
+        </w:rPr>
+      </w:pPr>
+    </w:p>
+    <w:p>
+      <w:pPr>
+        <w:rPr>
+          <w:lang w:val="en-US"/>
+        </w:rPr>
+      </w:pPr>
+      <w:r>
+        <w:rPr>
+          <w:lang w:val="en-US"/>
+        </w:rPr>
+        <w:t>While selecting you may notice this inside Name Box:</w:t>
+      </w:r>
+    </w:p>
+    <w:p>
+      <w:pPr>
+        <w:rPr>
+          <w:lang w:val="en-US"/>
+        </w:rPr>
+      </w:pPr>
+      <w:r>
+        <w:rPr>
+          <w:lang w:val="en-US"/>
+        </w:rPr>
+        <w:t xml:space="preserve">5R X 2C </w:t>
+      </w:r>
+      <w:r>
+        <w:rPr>
+          <w:lang w:val="en-US"/>
+        </w:rPr>
+        <w:sym w:font="Wingdings" w:char="F0E0"/>
+      </w:r>
+      <w:r>
+        <w:rPr>
+          <w:lang w:val="en-US"/>
+        </w:rPr>
+        <w:t xml:space="preserve"> Which means you have selected 5 Rows and 2 Columns</w:t>
+      </w:r>
+    </w:p>
+    <w:p>
+      <w:pPr>
+        <w:rPr>
+          <w:lang w:val="en-US"/>
+        </w:rPr>
+      </w:pPr>
+    </w:p>
+    <w:p>
+      <w:pPr>
+        <w:rPr>
+          <w:lang w:val="en-US"/>
+        </w:rPr>
+      </w:pPr>
+      <w:r>
+        <w:rPr>
+          <w:lang w:val="en-US"/>
+        </w:rPr>
+        <w:t>To Copy:</w:t>
+      </w:r>
+    </w:p>
+    <w:p>
+      <w:pPr>
+        <w:rPr>
+          <w:lang w:val="en-US"/>
+        </w:rPr>
+      </w:pPr>
+      <w:r>
+        <w:rPr>
+          <w:lang w:val="en-US"/>
+        </w:rPr>
+        <w:t xml:space="preserve">AKA (Also </w:t>
+      </w:r>
+      <w:r>
+        <w:rPr>
+          <w:lang w:val="en-US"/>
+        </w:rPr>
+        <w:t>Known as</w:t>
+      </w:r>
+      <w:r>
+        <w:rPr>
           <w:lang w:val="en-US"/>
         </w:rPr>
         <w:t>)</w:t>
       </w:r>
-    </w:p>
-    <w:p>
-      <w:pPr>
-        <w:rPr>
-          <w:lang w:val="en-US"/>
-        </w:rPr>
-      </w:pPr>
-    </w:p>
-    <w:p>
-      <w:pPr>
-        <w:pStyle w:val="Heading3"/>
-        <w:rPr>
-          <w:lang w:val="en-US"/>
-        </w:rPr>
-      </w:pPr>
-      <w:bookmarkStart w:id="3" w:name="_Toc231911827"/>
-      <w:r>
-        <w:rPr>
-          <w:lang w:val="en-US"/>
-        </w:rPr>
-        <w:t>Ranges – Collection of Cells</w:t>
-      </w:r>
-      <w:bookmarkEnd w:id="3"/>
-    </w:p>
-    <w:p>
-      <w:pPr>
-        <w:rPr>
-          <w:lang w:val="en-US"/>
-        </w:rPr>
-      </w:pPr>
-    </w:p>
-    <w:p>
-      <w:pPr>
-        <w:rPr>
-          <w:lang w:val="en-US"/>
-        </w:rPr>
-      </w:pPr>
-      <w:r>
-        <w:rPr>
-          <w:lang w:val="en-US"/>
-        </w:rPr>
-        <w:t>While selecting you may notice this inside Name Box:</w:t>
-      </w:r>
-    </w:p>
-    <w:p>
-      <w:pPr>
-        <w:rPr>
-          <w:lang w:val="en-US"/>
-        </w:rPr>
-      </w:pPr>
-      <w:r>
-        <w:rPr>
-          <w:lang w:val="en-US"/>
-        </w:rPr>
-        <w:t xml:space="preserve">5R X 2C </w:t>
+      <w:r>
+        <w:rPr>
+          <w:lang w:val="en-US"/>
+        </w:rPr>
+        <w:t xml:space="preserve"> Dynamic Ranges</w:t>
+      </w:r>
+    </w:p>
+    <w:p>
+      <w:pPr>
+        <w:rPr>
+          <w:lang w:val="en-US"/>
+        </w:rPr>
+      </w:pPr>
+      <w:r>
+        <w:rPr>
+          <w:lang w:val="en-US"/>
+        </w:rPr>
+        <w:t xml:space="preserve">=A1:G6 </w:t>
       </w:r>
       <w:r>
         <w:rPr>
@@ -1192,82 +1348,6 @@
         <w:rPr>
           <w:lang w:val="en-US"/>
         </w:rPr>
-        <w:t xml:space="preserve"> Which means you have selected 5 Rows and 2 Columns</w:t>
-      </w:r>
-    </w:p>
-    <w:p>
-      <w:pPr>
-        <w:rPr>
-          <w:lang w:val="en-US"/>
-        </w:rPr>
-      </w:pPr>
-    </w:p>
-    <w:p>
-      <w:pPr>
-        <w:rPr>
-          <w:lang w:val="en-US"/>
-        </w:rPr>
-      </w:pPr>
-      <w:r>
-        <w:rPr>
-          <w:lang w:val="en-US"/>
-        </w:rPr>
-        <w:t>To Copy:</w:t>
-      </w:r>
-    </w:p>
-    <w:p>
-      <w:pPr>
-        <w:rPr>
-          <w:lang w:val="en-US"/>
-        </w:rPr>
-      </w:pPr>
-      <w:r>
-        <w:rPr>
-          <w:lang w:val="en-US"/>
-        </w:rPr>
-        <w:t xml:space="preserve">AKA (Also </w:t>
-      </w:r>
-      <w:r>
-        <w:rPr>
-          <w:lang w:val="en-US"/>
-        </w:rPr>
-        <w:t>Known as</w:t>
-      </w:r>
-      <w:r>
-        <w:rPr>
-          <w:lang w:val="en-US"/>
-        </w:rPr>
-        <w:t>)</w:t>
-      </w:r>
-      <w:r>
-        <w:rPr>
-          <w:lang w:val="en-US"/>
-        </w:rPr>
-        <w:t xml:space="preserve"> Dynamic Ranges</w:t>
-      </w:r>
-    </w:p>
-    <w:p>
-      <w:pPr>
-        <w:rPr>
-          <w:lang w:val="en-US"/>
-        </w:rPr>
-      </w:pPr>
-      <w:r>
-        <w:rPr>
-          <w:lang w:val="en-US"/>
-        </w:rPr>
-        <w:t xml:space="preserve">=A1:G6 </w:t>
-      </w:r>
-      <w:r>
-        <w:rPr>
-          <w:lang w:val="en-US"/>
-        </w:rPr>
-        <w:sym w:font="Wingdings" w:char="F0E0"/>
-      </w:r>
-      <w:r>
-        <w:rPr>
-          <w:lang w:val="en-US"/>
-        </w:rPr>
         <w:t xml:space="preserve"> It will copy content from A1 cell till G6 cell to current cell</w:t>
       </w:r>
     </w:p>
@@ -1301,21 +1381,7 @@
         <w:rPr>
           <w:lang w:val="en-US"/>
         </w:rPr>
-        <w:t>=</w:t>
-      </w:r>
-      <w:proofErr w:type="gramStart"/>
-      <w:r>
-        <w:rPr>
-          <w:lang w:val="en-US"/>
-        </w:rPr>
-        <w:t>A:A</w:t>
-      </w:r>
-      <w:proofErr w:type="gramEnd"/>
-      <w:r>
-        <w:rPr>
-          <w:lang w:val="en-US"/>
-        </w:rPr>
-        <w:t xml:space="preserve"> </w:t>
+        <w:t xml:space="preserve">=A:A </w:t>
       </w:r>
       <w:r>
         <w:rPr>
@@ -1419,7 +1485,7 @@
         </w:rPr>
         <w:br w:type="page"/>
       </w:r>
-      <w:bookmarkStart w:id="4" w:name="_Toc231911828"/>
+      <w:bookmarkStart w:id="5" w:name="_Toc231974416"/>
       <w:r>
         <w:rPr>
           <w:lang w:val="en-US"/>
@@ -1427,7 +1493,7 @@
         <w:lastRenderedPageBreak/>
         <w:t>Workbook</w:t>
       </w:r>
-      <w:bookmarkEnd w:id="4"/>
+      <w:bookmarkEnd w:id="5"/>
     </w:p>
     <w:p>
       <w:pPr>
@@ -1574,21 +1640,7 @@
         <w:rPr>
           <w:lang w:val="en-US"/>
         </w:rPr>
-        <w:t xml:space="preserve">We just need to select the cells in the other workbook – It will automatically take </w:t>
-      </w:r>
-      <w:proofErr w:type="gramStart"/>
-      <w:r>
-        <w:rPr>
-          <w:lang w:val="en-US"/>
-        </w:rPr>
-        <w:t>this formulas</w:t>
-      </w:r>
-      <w:proofErr w:type="gramEnd"/>
-      <w:r>
-        <w:rPr>
-          <w:lang w:val="en-US"/>
-        </w:rPr>
-        <w:t>.</w:t>
+        <w:t>We just need to select the cells in the other workbook – It will automatically take this formulas.</w:t>
       </w:r>
     </w:p>
     <w:p>
@@ -1740,35 +1792,7 @@
         <w:rPr>
           <w:lang w:val="en-US"/>
         </w:rPr>
-        <w:t xml:space="preserve">Simply go to Data Workbook, </w:t>
-      </w:r>
-      <w:proofErr w:type="gramStart"/>
-      <w:r>
-        <w:rPr>
-          <w:lang w:val="en-US"/>
-        </w:rPr>
-        <w:t>Copy</w:t>
-      </w:r>
-      <w:proofErr w:type="gramEnd"/>
-      <w:r>
-        <w:rPr>
-          <w:lang w:val="en-US"/>
-        </w:rPr>
-        <w:t xml:space="preserve"> all the content and </w:t>
-      </w:r>
-      <w:proofErr w:type="gramStart"/>
-      <w:r>
-        <w:rPr>
-          <w:lang w:val="en-US"/>
-        </w:rPr>
-        <w:t>Paste</w:t>
-      </w:r>
-      <w:proofErr w:type="gramEnd"/>
-      <w:r>
-        <w:rPr>
-          <w:lang w:val="en-US"/>
-        </w:rPr>
-        <w:t xml:space="preserve"> it in a new Workbook</w:t>
+        <w:t>Simply go to Data Workbook, Copy all the content and Paste it in a new Workbook</w:t>
       </w:r>
     </w:p>
     <w:p>
@@ -1939,7 +1963,7 @@
         </w:rPr>
         <w:br w:type="page"/>
       </w:r>
-      <w:bookmarkStart w:id="5" w:name="_Toc231911829"/>
+      <w:bookmarkStart w:id="6" w:name="_Toc231974417"/>
       <w:r>
         <w:rPr>
           <w:lang w:val="en-US"/>
@@ -1953,7 +1977,7 @@
         </w:rPr>
         <w:t xml:space="preserve"> Menu</w:t>
       </w:r>
-      <w:bookmarkEnd w:id="5"/>
+      <w:bookmarkEnd w:id="6"/>
     </w:p>
     <w:p>
       <w:pPr>
@@ -2049,21 +2073,7 @@
         <w:rPr>
           <w:lang w:val="en-US"/>
         </w:rPr>
-        <w:t xml:space="preserve">Select all (full / complete) columns and all the columns and just double click on the last one to open, </w:t>
-      </w:r>
-      <w:proofErr w:type="gramStart"/>
-      <w:r>
-        <w:rPr>
-          <w:lang w:val="en-US"/>
-        </w:rPr>
-        <w:t>It</w:t>
-      </w:r>
-      <w:proofErr w:type="gramEnd"/>
-      <w:r>
-        <w:rPr>
-          <w:lang w:val="en-US"/>
-        </w:rPr>
-        <w:t xml:space="preserve"> will open all the columns selected.</w:t>
+        <w:t>Select all (full / complete) columns and all the columns and just double click on the last one to open, It will open all the columns selected.</w:t>
       </w:r>
     </w:p>
     <w:p>
@@ -2499,21 +2509,7 @@
           <w:lang w:val="en-US"/>
         </w:rPr>
         <w:lastRenderedPageBreak/>
-        <w:t xml:space="preserve">Similarly, </w:t>
-      </w:r>
-      <w:proofErr w:type="gramStart"/>
-      <w:r>
-        <w:rPr>
-          <w:lang w:val="en-US"/>
-        </w:rPr>
-        <w:t>If</w:t>
-      </w:r>
-      <w:proofErr w:type="gramEnd"/>
-      <w:r>
-        <w:rPr>
-          <w:lang w:val="en-US"/>
-        </w:rPr>
-        <w:t xml:space="preserve"> you want to clear all the applied filters then:</w:t>
+        <w:t>Similarly, If you want to clear all the applied filters then:</w:t>
       </w:r>
     </w:p>
     <w:p>
@@ -2599,14 +2595,14 @@
           <w:lang w:val="en-US"/>
         </w:rPr>
       </w:pPr>
-      <w:bookmarkStart w:id="6" w:name="_Toc231911830"/>
+      <w:bookmarkStart w:id="7" w:name="_Toc231974418"/>
       <w:r>
         <w:rPr>
           <w:lang w:val="en-US"/>
         </w:rPr>
         <w:t>2. Formulas And Functions</w:t>
       </w:r>
-      <w:bookmarkEnd w:id="6"/>
+      <w:bookmarkEnd w:id="7"/>
     </w:p>
     <w:p>
       <w:pPr>
@@ -2622,47 +2618,33 @@
           <w:lang w:val="en-US"/>
         </w:rPr>
       </w:pPr>
-      <w:bookmarkStart w:id="7" w:name="_Toc231911831"/>
+      <w:bookmarkStart w:id="8" w:name="_Toc231974419"/>
       <w:r>
         <w:rPr>
           <w:lang w:val="en-US"/>
         </w:rPr>
         <w:t>2.1 Formulas Intro</w:t>
       </w:r>
-      <w:bookmarkEnd w:id="7"/>
-    </w:p>
-    <w:p>
-      <w:pPr>
-        <w:rPr>
-          <w:lang w:val="en-US"/>
-        </w:rPr>
-      </w:pPr>
-    </w:p>
-    <w:p>
-      <w:pPr>
-        <w:rPr>
-          <w:lang w:val="en-US"/>
-        </w:rPr>
-      </w:pPr>
-      <w:r>
-        <w:rPr>
-          <w:lang w:val="en-US"/>
-        </w:rPr>
-        <w:t xml:space="preserve">- Note that </w:t>
-      </w:r>
-      <w:proofErr w:type="gramStart"/>
-      <w:r>
-        <w:rPr>
-          <w:lang w:val="en-US"/>
-        </w:rPr>
-        <w:t>In</w:t>
-      </w:r>
-      <w:proofErr w:type="gramEnd"/>
-      <w:r>
-        <w:rPr>
-          <w:lang w:val="en-US"/>
-        </w:rPr>
-        <w:t xml:space="preserve"> comparison operator for EQUALS we have only one (=) instead of (==)</w:t>
+      <w:bookmarkEnd w:id="8"/>
+    </w:p>
+    <w:p>
+      <w:pPr>
+        <w:rPr>
+          <w:lang w:val="en-US"/>
+        </w:rPr>
+      </w:pPr>
+    </w:p>
+    <w:p>
+      <w:pPr>
+        <w:rPr>
+          <w:lang w:val="en-US"/>
+        </w:rPr>
+      </w:pPr>
+      <w:r>
+        <w:rPr>
+          <w:lang w:val="en-US"/>
+        </w:rPr>
+        <w:t>- Note that In comparison operator for EQUALS we have only one (=) instead of (==)</w:t>
       </w:r>
     </w:p>
     <w:p>
@@ -2700,6 +2682,7 @@
       </w:pPr>
       <w:r>
         <w:rPr>
+          <w:noProof/>
           <w:lang w:val="en-US"/>
         </w:rPr>
         <w:drawing>
@@ -2769,21 +2752,7 @@
         <w:rPr>
           <w:lang w:val="en-US"/>
         </w:rPr>
-        <w:t xml:space="preserve">, </w:t>
-      </w:r>
-      <w:proofErr w:type="gramStart"/>
-      <w:r>
-        <w:rPr>
-          <w:lang w:val="en-US"/>
-        </w:rPr>
-        <w:t>It</w:t>
-      </w:r>
-      <w:proofErr w:type="gramEnd"/>
-      <w:r>
-        <w:rPr>
-          <w:lang w:val="en-US"/>
-        </w:rPr>
-        <w:t xml:space="preserve"> will automatically add ‘$’ before row and column.</w:t>
+        <w:t>, It will automatically add ‘$’ before row and column.</w:t>
       </w:r>
     </w:p>
     <w:p>
@@ -2886,21 +2855,7 @@
         <w:rPr>
           <w:lang w:val="en-US"/>
         </w:rPr>
-        <w:t xml:space="preserve"> Will lock 15 </w:t>
-      </w:r>
-      <w:proofErr w:type="gramStart"/>
-      <w:r>
-        <w:rPr>
-          <w:lang w:val="en-US"/>
-        </w:rPr>
-        <w:t>row</w:t>
-      </w:r>
-      <w:proofErr w:type="gramEnd"/>
-      <w:r>
-        <w:rPr>
-          <w:lang w:val="en-US"/>
-        </w:rPr>
-        <w:t xml:space="preserve"> but will iterate through columns</w:t>
+        <w:t xml:space="preserve"> Will lock 15 row but will iterate through columns</w:t>
       </w:r>
     </w:p>
     <w:p>
@@ -2924,6 +2879,7 @@
           <w:lang w:val="en-US"/>
         </w:rPr>
       </w:pPr>
+      <w:bookmarkStart w:id="9" w:name="_Toc231974420"/>
       <w:r>
         <w:rPr>
           <w:lang w:val="en-US"/>
@@ -2936,6 +2892,7 @@
         </w:rPr>
         <w:t>Functions Intro</w:t>
       </w:r>
+      <w:bookmarkEnd w:id="9"/>
     </w:p>
     <w:p>
       <w:pPr>
@@ -2955,90 +2912,40 @@
         <w:rPr>
           <w:lang w:val="en-US"/>
         </w:rPr>
-        <w:t>=</w:t>
-      </w:r>
-      <w:proofErr w:type="gramStart"/>
-      <w:r>
-        <w:rPr>
-          <w:lang w:val="en-US"/>
-        </w:rPr>
-        <w:t>AVERAGE(</w:t>
-      </w:r>
-      <w:proofErr w:type="gramEnd"/>
-      <w:r>
-        <w:rPr>
-          <w:lang w:val="en-US"/>
-        </w:rPr>
-        <w:t>)</w:t>
-      </w:r>
-    </w:p>
-    <w:p>
-      <w:pPr>
-        <w:rPr>
-          <w:lang w:val="en-US"/>
-        </w:rPr>
-      </w:pPr>
-      <w:r>
-        <w:rPr>
-          <w:lang w:val="en-US"/>
-        </w:rPr>
-        <w:t>=</w:t>
-      </w:r>
-      <w:proofErr w:type="gramStart"/>
-      <w:r>
-        <w:rPr>
-          <w:lang w:val="en-US"/>
-        </w:rPr>
-        <w:t>AND(</w:t>
-      </w:r>
-      <w:proofErr w:type="gramEnd"/>
-      <w:r>
-        <w:rPr>
-          <w:lang w:val="en-US"/>
-        </w:rPr>
-        <w:t xml:space="preserve">) </w:t>
-      </w:r>
-    </w:p>
-    <w:p>
-      <w:pPr>
-        <w:rPr>
-          <w:lang w:val="en-US"/>
-        </w:rPr>
-      </w:pPr>
-    </w:p>
-    <w:p>
-      <w:pPr>
-        <w:rPr>
-          <w:lang w:val="en-US"/>
-        </w:rPr>
-      </w:pPr>
-      <w:proofErr w:type="gramStart"/>
-      <w:r>
-        <w:rPr>
-          <w:lang w:val="en-US"/>
-        </w:rPr>
-        <w:t>Also</w:t>
-      </w:r>
-      <w:proofErr w:type="gramEnd"/>
-      <w:r>
-        <w:rPr>
-          <w:lang w:val="en-US"/>
-        </w:rPr>
-        <w:t xml:space="preserve"> If we are not able to recall the function name, </w:t>
-      </w:r>
-      <w:proofErr w:type="gramStart"/>
-      <w:r>
-        <w:rPr>
-          <w:lang w:val="en-US"/>
-        </w:rPr>
-        <w:t>Then</w:t>
-      </w:r>
-      <w:proofErr w:type="gramEnd"/>
-      <w:r>
-        <w:rPr>
-          <w:lang w:val="en-US"/>
-        </w:rPr>
-        <w:t xml:space="preserve"> we can use this</w:t>
+        <w:t>=AVERAGE()</w:t>
+      </w:r>
+    </w:p>
+    <w:p>
+      <w:pPr>
+        <w:rPr>
+          <w:lang w:val="en-US"/>
+        </w:rPr>
+      </w:pPr>
+      <w:r>
+        <w:rPr>
+          <w:lang w:val="en-US"/>
+        </w:rPr>
+        <w:t xml:space="preserve">=AND() </w:t>
+      </w:r>
+    </w:p>
+    <w:p>
+      <w:pPr>
+        <w:rPr>
+          <w:lang w:val="en-US"/>
+        </w:rPr>
+      </w:pPr>
+    </w:p>
+    <w:p>
+      <w:pPr>
+        <w:rPr>
+          <w:lang w:val="en-US"/>
+        </w:rPr>
+      </w:pPr>
+      <w:r>
+        <w:rPr>
+          <w:lang w:val="en-US"/>
+        </w:rPr>
+        <w:t>Also If we are not able to recall the function name, Then we can use this</w:t>
       </w:r>
     </w:p>
     <w:p>
@@ -3125,6 +3032,7 @@
       </w:r>
       <w:r>
         <w:rPr>
+          <w:noProof/>
           <w:lang w:val="en-US"/>
         </w:rPr>
         <w:drawing>
@@ -3202,19 +3110,11 @@
         </w:rPr>
         <w:t xml:space="preserve">If you face error like this: </w:t>
       </w:r>
-      <w:proofErr w:type="gramStart"/>
-      <w:r>
-        <w:rPr>
-          <w:lang w:val="en-US"/>
-        </w:rPr>
-        <w:t>COUNTIF(</w:t>
-      </w:r>
-      <w:proofErr w:type="gramEnd"/>
-      <w:r>
-        <w:rPr>
-          <w:lang w:val="en-US"/>
-        </w:rPr>
-        <w:t>)</w:t>
+      <w:r>
+        <w:rPr>
+          <w:lang w:val="en-US"/>
+        </w:rPr>
+        <w:t>COUNTIF()</w:t>
       </w:r>
     </w:p>
     <w:p>
@@ -3226,6 +3126,7 @@
       </w:pPr>
       <w:r>
         <w:rPr>
+          <w:noProof/>
           <w:lang w:val="en-US"/>
         </w:rPr>
         <w:drawing>
@@ -3289,7 +3190,6 @@
         </w:rPr>
         <w:t xml:space="preserve">Then to solve this, we need to wrap our conditional operators around </w:t>
       </w:r>
-      <w:proofErr w:type="gramStart"/>
       <w:r>
         <w:rPr>
           <w:color w:val="4472C4" w:themeColor="accent1"/>
@@ -3311,7 +3211,6 @@
         </w:rPr>
         <w:t>”</w:t>
       </w:r>
-      <w:proofErr w:type="gramEnd"/>
       <w:r>
         <w:rPr>
           <w:lang w:val="en-US"/>
@@ -3349,21 +3248,7 @@
         <w:rPr>
           <w:lang w:val="en-US"/>
         </w:rPr>
-        <w:t xml:space="preserve">If we want to Refer a cell inside complicated functions like </w:t>
-      </w:r>
-      <w:proofErr w:type="gramStart"/>
-      <w:r>
-        <w:rPr>
-          <w:lang w:val="en-US"/>
-        </w:rPr>
-        <w:t>COUNTIF(</w:t>
-      </w:r>
-      <w:proofErr w:type="gramEnd"/>
-      <w:r>
-        <w:rPr>
-          <w:lang w:val="en-US"/>
-        </w:rPr>
-        <w:t>), We need to use “</w:t>
+        <w:t>If we want to Refer a cell inside complicated functions like COUNTIF(), We need to use “</w:t>
       </w:r>
       <w:r>
         <w:rPr>
@@ -3388,6 +3273,7 @@
       </w:pPr>
       <w:r>
         <w:rPr>
+          <w:noProof/>
           <w:lang w:val="en-US"/>
         </w:rPr>
         <w:drawing>
@@ -3431,67 +3317,397 @@
           </wp:inline>
         </w:drawing>
       </w:r>
-      <w:r>
-        <w:rPr>
-          <w:lang w:val="en-US"/>
-        </w:rPr>
-        <w:br w:type="page"/>
-      </w:r>
-    </w:p>
-    <w:p>
-      <w:pPr>
-        <w:rPr>
-          <w:lang w:val="en-US"/>
-        </w:rPr>
-      </w:pPr>
-    </w:p>
-    <w:p>
-      <w:pPr>
-        <w:rPr>
-          <w:lang w:val="en-US"/>
-        </w:rPr>
-      </w:pPr>
-    </w:p>
-    <w:p>
-      <w:pPr>
-        <w:pStyle w:val="Heading1"/>
-        <w:numPr>
-          <w:ilvl w:val="0"/>
-          <w:numId w:val="3"/>
-        </w:numPr>
-      </w:pPr>
-      <w:bookmarkStart w:id="8" w:name="_Toc231911832"/>
-      <w:r>
-        <w:t>Short Cuts</w:t>
-      </w:r>
-      <w:bookmarkEnd w:id="8"/>
+    </w:p>
+    <w:p>
+      <w:pPr>
+        <w:jc w:val="center"/>
+        <w:rPr>
+          <w:lang w:val="en-US"/>
+        </w:rPr>
+      </w:pPr>
+    </w:p>
+    <w:p>
+      <w:pPr>
+        <w:rPr>
+          <w:lang w:val="en-US"/>
+        </w:rPr>
+      </w:pPr>
+    </w:p>
+    <w:p>
+      <w:pPr>
+        <w:rPr>
+          <w:lang w:val="en-US"/>
+        </w:rPr>
+      </w:pPr>
+    </w:p>
+    <w:p>
+      <w:pPr>
+        <w:rPr>
+          <w:lang w:val="en-US"/>
+        </w:rPr>
+      </w:pPr>
+    </w:p>
+    <w:p>
+      <w:pPr>
+        <w:pStyle w:val="Heading2"/>
+        <w:rPr>
+          <w:lang w:val="en-US"/>
+        </w:rPr>
+      </w:pPr>
+      <w:r>
+        <w:rPr>
+          <w:lang w:val="en-US"/>
+        </w:rPr>
+        <w:lastRenderedPageBreak/>
+        <w:t>2.3 Logical Functions</w:t>
+      </w:r>
+    </w:p>
+    <w:p>
+      <w:pPr>
+        <w:rPr>
+          <w:lang w:val="en-US"/>
+        </w:rPr>
+      </w:pPr>
+    </w:p>
+    <w:p>
+      <w:pPr>
+        <w:rPr>
+          <w:lang w:val="en-US"/>
+        </w:rPr>
+      </w:pPr>
+      <w:r>
+        <w:rPr>
+          <w:lang w:val="en-US"/>
+        </w:rPr>
+        <w:t xml:space="preserve">IF() </w:t>
+      </w:r>
+      <w:r>
+        <w:rPr>
+          <w:lang w:val="en-US"/>
+        </w:rPr>
+        <w:sym w:font="Wingdings" w:char="F0E0"/>
+      </w:r>
+      <w:r>
+        <w:rPr>
+          <w:lang w:val="en-US"/>
+        </w:rPr>
+        <w:t xml:space="preserve"> IF(</w:t>
+      </w:r>
+      <w:r>
+        <w:rPr>
+          <w:i/>
+          <w:iCs/>
+          <w:lang w:val="en-US"/>
+        </w:rPr>
+        <w:t>Cell_location</w:t>
+      </w:r>
+      <w:r>
+        <w:rPr>
+          <w:lang w:val="en-US"/>
+        </w:rPr>
+        <w:t>, “</w:t>
+      </w:r>
+      <w:r>
+        <w:rPr>
+          <w:i/>
+          <w:iCs/>
+          <w:lang w:val="en-US"/>
+        </w:rPr>
+        <w:t>What to print If true</w:t>
+      </w:r>
+      <w:r>
+        <w:rPr>
+          <w:lang w:val="en-US"/>
+        </w:rPr>
+        <w:t>”, “</w:t>
+      </w:r>
+      <w:r>
+        <w:rPr>
+          <w:i/>
+          <w:iCs/>
+          <w:lang w:val="en-US"/>
+        </w:rPr>
+        <w:t>What to print if False</w:t>
+      </w:r>
+      <w:r>
+        <w:rPr>
+          <w:lang w:val="en-US"/>
+        </w:rPr>
+        <w:t>”)</w:t>
+      </w:r>
     </w:p>
     <w:p/>
     <w:p>
       <w:r>
-        <w:rPr>
-          <w:b/>
-          <w:bCs/>
-        </w:rPr>
-        <w:t>Double Click</w:t>
-      </w:r>
-      <w:r>
-        <w:t xml:space="preserve"> on Ribbon name to close Ribbon</w:t>
-      </w:r>
-    </w:p>
-    <w:p>
-      <w:r>
-        <w:rPr>
-          <w:b/>
-          <w:bCs/>
-        </w:rPr>
-        <w:t>Enter:</w:t>
-      </w:r>
-      <w:r>
-        <w:t xml:space="preserve"> To move down to column to another cell</w:t>
-      </w:r>
-    </w:p>
-    <w:p/>
+        <w:sym w:font="Wingdings" w:char="F0E0"/>
+      </w:r>
+      <w:r>
+        <w:t xml:space="preserve"> Nested IF:</w:t>
+      </w:r>
+    </w:p>
+    <w:p>
+      <w:pPr>
+        <w:rPr>
+          <w:lang w:val="en-US"/>
+        </w:rPr>
+      </w:pPr>
+      <w:r>
+        <w:rPr>
+          <w:lang w:val="en-US"/>
+        </w:rPr>
+        <w:t>IF(</w:t>
+      </w:r>
+      <w:r>
+        <w:rPr>
+          <w:i/>
+          <w:iCs/>
+          <w:lang w:val="en-US"/>
+        </w:rPr>
+        <w:t>Cell_location</w:t>
+      </w:r>
+      <w:r>
+        <w:rPr>
+          <w:lang w:val="en-US"/>
+        </w:rPr>
+        <w:t>, “</w:t>
+      </w:r>
+      <w:r>
+        <w:rPr>
+          <w:i/>
+          <w:iCs/>
+          <w:lang w:val="en-US"/>
+        </w:rPr>
+        <w:t>What to print If true</w:t>
+      </w:r>
+      <w:r>
+        <w:rPr>
+          <w:lang w:val="en-US"/>
+        </w:rPr>
+        <w:t>”, IF(</w:t>
+      </w:r>
+      <w:r>
+        <w:rPr>
+          <w:i/>
+          <w:iCs/>
+          <w:lang w:val="en-US"/>
+        </w:rPr>
+        <w:t>Cell_location</w:t>
+      </w:r>
+      <w:r>
+        <w:rPr>
+          <w:lang w:val="en-US"/>
+        </w:rPr>
+        <w:t>, “</w:t>
+      </w:r>
+      <w:r>
+        <w:rPr>
+          <w:i/>
+          <w:iCs/>
+          <w:lang w:val="en-US"/>
+        </w:rPr>
+        <w:t>What to print If true</w:t>
+      </w:r>
+      <w:r>
+        <w:rPr>
+          <w:lang w:val="en-US"/>
+        </w:rPr>
+        <w:t>”, “</w:t>
+      </w:r>
+      <w:r>
+        <w:rPr>
+          <w:i/>
+          <w:iCs/>
+          <w:lang w:val="en-US"/>
+        </w:rPr>
+        <w:t>What to print if False</w:t>
+      </w:r>
+      <w:r>
+        <w:rPr>
+          <w:lang w:val="en-US"/>
+        </w:rPr>
+        <w:t>”))</w:t>
+      </w:r>
+    </w:p>
+    <w:p>
+      <w:pPr>
+        <w:rPr>
+          <w:lang w:val="en-US"/>
+        </w:rPr>
+      </w:pPr>
+    </w:p>
+    <w:p>
+      <w:pPr>
+        <w:rPr>
+          <w:lang w:val="en-US"/>
+        </w:rPr>
+      </w:pPr>
+    </w:p>
+    <w:p>
+      <w:pPr>
+        <w:rPr>
+          <w:lang w:val="en-US"/>
+        </w:rPr>
+      </w:pPr>
+      <w:r>
+        <w:rPr>
+          <w:lang w:val="en-US"/>
+        </w:rPr>
+        <w:sym w:font="Wingdings" w:char="F0E0"/>
+      </w:r>
+      <w:r>
+        <w:rPr>
+          <w:lang w:val="en-US"/>
+        </w:rPr>
+        <w:t xml:space="preserve"> IFS:</w:t>
+      </w:r>
+    </w:p>
+    <w:p>
+      <w:pPr>
+        <w:rPr>
+          <w:lang w:val="en-US"/>
+        </w:rPr>
+      </w:pPr>
+      <w:r>
+        <w:rPr>
+          <w:lang w:val="en-US"/>
+        </w:rPr>
+        <w:t>- Multiple If conditions</w:t>
+      </w:r>
+    </w:p>
+    <w:p>
+      <w:r>
+        <w:rPr>
+          <w:lang w:val="en-US"/>
+        </w:rPr>
+        <w:t xml:space="preserve">- </w:t>
+      </w:r>
+      <w:r>
+        <w:rPr>
+          <w:lang w:val="en-US"/>
+        </w:rPr>
+        <w:t>IFS(“Condition1”,</w:t>
+      </w:r>
+      <w:r>
+        <w:rPr>
+          <w:lang w:val="en-US"/>
+        </w:rPr>
+        <w:t xml:space="preserve"> </w:t>
+      </w:r>
+      <w:r>
+        <w:rPr>
+          <w:lang w:val="en-US"/>
+        </w:rPr>
+        <w:t>“</w:t>
+      </w:r>
+      <w:r>
+        <w:rPr>
+          <w:lang w:val="en-US"/>
+        </w:rPr>
+        <w:t>Value if true1”,</w:t>
+      </w:r>
+      <w:r>
+        <w:rPr>
+          <w:lang w:val="en-US"/>
+        </w:rPr>
+        <w:t xml:space="preserve"> </w:t>
+      </w:r>
+      <w:r>
+        <w:rPr>
+          <w:lang w:val="en-US"/>
+        </w:rPr>
+        <w:t>“Condition</w:t>
+      </w:r>
+      <w:r>
+        <w:rPr>
+          <w:lang w:val="en-US"/>
+        </w:rPr>
+        <w:t>2</w:t>
+      </w:r>
+      <w:r>
+        <w:rPr>
+          <w:lang w:val="en-US"/>
+        </w:rPr>
+        <w:t>”,</w:t>
+      </w:r>
+      <w:r>
+        <w:rPr>
+          <w:lang w:val="en-US"/>
+        </w:rPr>
+        <w:t xml:space="preserve"> </w:t>
+      </w:r>
+      <w:r>
+        <w:rPr>
+          <w:lang w:val="en-US"/>
+        </w:rPr>
+        <w:t>“Value if true</w:t>
+      </w:r>
+      <w:r>
+        <w:rPr>
+          <w:lang w:val="en-US"/>
+        </w:rPr>
+        <w:t>2</w:t>
+      </w:r>
+      <w:r>
+        <w:rPr>
+          <w:lang w:val="en-US"/>
+        </w:rPr>
+        <w:t>”,</w:t>
+      </w:r>
+      <w:r>
+        <w:rPr>
+          <w:lang w:val="en-US"/>
+        </w:rPr>
+        <w:t xml:space="preserve"> </w:t>
+      </w:r>
+      <w:r>
+        <w:rPr>
+          <w:lang w:val="en-US"/>
+        </w:rPr>
+        <w:t>“Condition</w:t>
+      </w:r>
+      <w:r>
+        <w:rPr>
+          <w:lang w:val="en-US"/>
+        </w:rPr>
+        <w:t>3</w:t>
+      </w:r>
+      <w:r>
+        <w:rPr>
+          <w:lang w:val="en-US"/>
+        </w:rPr>
+        <w:t>”,</w:t>
+      </w:r>
+      <w:r>
+        <w:rPr>
+          <w:lang w:val="en-US"/>
+        </w:rPr>
+        <w:t xml:space="preserve"> </w:t>
+      </w:r>
+      <w:r>
+        <w:rPr>
+          <w:lang w:val="en-US"/>
+        </w:rPr>
+        <w:t>“Value if true</w:t>
+      </w:r>
+      <w:r>
+        <w:rPr>
+          <w:lang w:val="en-US"/>
+        </w:rPr>
+        <w:t>3</w:t>
+      </w:r>
+      <w:r>
+        <w:rPr>
+          <w:lang w:val="en-US"/>
+        </w:rPr>
+        <w:t>”</w:t>
+      </w:r>
+      <w:r>
+        <w:rPr>
+          <w:lang w:val="en-US"/>
+        </w:rPr>
+        <w:t>)</w:t>
+      </w:r>
+    </w:p>
     <w:sectPr>
       <w:pgSz w:w="11906" w:h="16838"/>
       <w:pgMar w:top="1440" w:right="1440" w:bottom="1440" w:left="1440" w:header="708" w:footer="708" w:gutter="0"/>

</xml_diff>

<commit_message>
2.4 Math Functions Completed
</commit_message>
<xml_diff>
--- a/Notes.docx
+++ b/Notes.docx
@@ -3575,6 +3575,11 @@
       </w:r>
     </w:p>
     <w:p>
+      <w:pPr>
+        <w:rPr>
+          <w:lang w:val="en-US"/>
+        </w:rPr>
+      </w:pPr>
       <w:r>
         <w:rPr>
           <w:lang w:val="en-US"/>
@@ -3706,6 +3711,361 @@
           <w:lang w:val="en-US"/>
         </w:rPr>
         <w:t>)</w:t>
+      </w:r>
+    </w:p>
+    <w:p>
+      <w:pPr>
+        <w:rPr>
+          <w:lang w:val="en-US"/>
+        </w:rPr>
+      </w:pPr>
+    </w:p>
+    <w:p>
+      <w:pPr>
+        <w:rPr>
+          <w:lang w:val="en-US"/>
+        </w:rPr>
+      </w:pPr>
+    </w:p>
+    <w:p>
+      <w:pPr>
+        <w:pStyle w:val="Heading2"/>
+      </w:pPr>
+      <w:r>
+        <w:t>2.4 Math Functions</w:t>
+      </w:r>
+    </w:p>
+    <w:p/>
+    <w:tbl>
+      <w:tblPr>
+        <w:tblStyle w:val="TableGrid"/>
+        <w:tblW w:w="0" w:type="auto"/>
+        <w:tblLook w:val="04A0" w:firstRow="1" w:lastRow="0" w:firstColumn="1" w:lastColumn="0" w:noHBand="0" w:noVBand="1"/>
+      </w:tblPr>
+      <w:tblGrid>
+        <w:gridCol w:w="1399"/>
+        <w:gridCol w:w="7588"/>
+      </w:tblGrid>
+      <w:tr>
+        <w:tc>
+          <w:tcPr>
+            <w:tcW w:w="0" w:type="auto"/>
+            <w:hideMark/>
+          </w:tcPr>
+          <w:p>
+            <w:pPr>
+              <w:spacing w:after="160" w:line="259" w:lineRule="auto"/>
+              <w:rPr>
+                <w:b/>
+                <w:bCs/>
+              </w:rPr>
+            </w:pPr>
+            <w:r>
+              <w:rPr>
+                <w:b/>
+                <w:bCs/>
+              </w:rPr>
+              <w:t>Function</w:t>
+            </w:r>
+          </w:p>
+        </w:tc>
+        <w:tc>
+          <w:tcPr>
+            <w:tcW w:w="0" w:type="auto"/>
+            <w:hideMark/>
+          </w:tcPr>
+          <w:p>
+            <w:pPr>
+              <w:spacing w:after="160" w:line="259" w:lineRule="auto"/>
+              <w:rPr>
+                <w:b/>
+                <w:bCs/>
+              </w:rPr>
+            </w:pPr>
+            <w:r>
+              <w:rPr>
+                <w:b/>
+                <w:bCs/>
+              </w:rPr>
+              <w:t>What it Counts</w:t>
+            </w:r>
+          </w:p>
+        </w:tc>
+      </w:tr>
+      <w:tr>
+        <w:tc>
+          <w:tcPr>
+            <w:tcW w:w="0" w:type="auto"/>
+            <w:hideMark/>
+          </w:tcPr>
+          <w:p>
+            <w:pPr>
+              <w:spacing w:after="160" w:line="259" w:lineRule="auto"/>
+            </w:pPr>
+            <w:r>
+              <w:rPr>
+                <w:b/>
+                <w:bCs/>
+              </w:rPr>
+              <w:t>COUNT()</w:t>
+            </w:r>
+          </w:p>
+        </w:tc>
+        <w:tc>
+          <w:tcPr>
+            <w:tcW w:w="0" w:type="auto"/>
+            <w:hideMark/>
+          </w:tcPr>
+          <w:p>
+            <w:pPr>
+              <w:spacing w:after="160" w:line="259" w:lineRule="auto"/>
+            </w:pPr>
+            <w:r>
+              <w:t xml:space="preserve">Counts only cells containing </w:t>
+            </w:r>
+            <w:r>
+              <w:rPr>
+                <w:b/>
+                <w:bCs/>
+              </w:rPr>
+              <w:t>numbers</w:t>
+            </w:r>
+          </w:p>
+        </w:tc>
+      </w:tr>
+      <w:tr>
+        <w:tc>
+          <w:tcPr>
+            <w:tcW w:w="0" w:type="auto"/>
+            <w:hideMark/>
+          </w:tcPr>
+          <w:p>
+            <w:pPr>
+              <w:spacing w:after="160" w:line="259" w:lineRule="auto"/>
+            </w:pPr>
+            <w:r>
+              <w:rPr>
+                <w:b/>
+                <w:bCs/>
+              </w:rPr>
+              <w:t>COUNTA()</w:t>
+            </w:r>
+          </w:p>
+        </w:tc>
+        <w:tc>
+          <w:tcPr>
+            <w:tcW w:w="0" w:type="auto"/>
+            <w:hideMark/>
+          </w:tcPr>
+          <w:p>
+            <w:pPr>
+              <w:spacing w:after="160" w:line="259" w:lineRule="auto"/>
+            </w:pPr>
+            <w:r>
+              <w:t xml:space="preserve">Counts all </w:t>
+            </w:r>
+            <w:r>
+              <w:rPr>
+                <w:b/>
+                <w:bCs/>
+              </w:rPr>
+              <w:t>non-empty</w:t>
+            </w:r>
+            <w:r>
+              <w:t xml:space="preserve"> cells (numbers, text, dates, logical values, errors, etc.)</w:t>
+            </w:r>
+          </w:p>
+        </w:tc>
+      </w:tr>
+    </w:tbl>
+    <w:p/>
+    <w:p/>
+    <w:p>
+      <w:r>
+        <w:sym w:font="Wingdings" w:char="F0E0"/>
+      </w:r>
+      <w:r>
+        <w:t>SUMIF:</w:t>
+      </w:r>
+    </w:p>
+    <w:p>
+      <w:r>
+        <w:t>SUMIF(</w:t>
+      </w:r>
+      <w:r>
+        <w:rPr>
+          <w:i/>
+          <w:iCs/>
+          <w:color w:val="4472C4" w:themeColor="accent1"/>
+        </w:rPr>
+        <w:t>Range to check condition</w:t>
+      </w:r>
+      <w:r>
+        <w:t xml:space="preserve">, </w:t>
+      </w:r>
+      <w:r>
+        <w:rPr>
+          <w:i/>
+          <w:iCs/>
+          <w:color w:val="ED7D31" w:themeColor="accent2"/>
+        </w:rPr>
+        <w:t>To match with?</w:t>
+      </w:r>
+      <w:r>
+        <w:t xml:space="preserve">, </w:t>
+      </w:r>
+      <w:r>
+        <w:rPr>
+          <w:i/>
+          <w:iCs/>
+          <w:color w:val="70AD47" w:themeColor="accent6"/>
+        </w:rPr>
+        <w:t>Range for sum</w:t>
+      </w:r>
+      <w:r>
+        <w:t>)</w:t>
+      </w:r>
+    </w:p>
+    <w:p/>
+    <w:p>
+      <w:r>
+        <w:sym w:font="Wingdings" w:char="F0E0"/>
+      </w:r>
+      <w:r>
+        <w:t xml:space="preserve"> SUMIFS:</w:t>
+      </w:r>
+    </w:p>
+    <w:p>
+      <w:r>
+        <w:t>SUMIFS(</w:t>
+      </w:r>
+      <w:r>
+        <w:rPr>
+          <w:i/>
+          <w:iCs/>
+          <w:color w:val="70AD47" w:themeColor="accent6"/>
+        </w:rPr>
+        <w:t>Range for sum</w:t>
+      </w:r>
+      <w:r>
+        <w:rPr>
+          <w:i/>
+          <w:iCs/>
+          <w:color w:val="70AD47" w:themeColor="accent6"/>
+        </w:rPr>
+        <w:t xml:space="preserve">, </w:t>
+      </w:r>
+      <w:r>
+        <w:rPr>
+          <w:i/>
+          <w:iCs/>
+          <w:color w:val="4472C4" w:themeColor="accent1"/>
+        </w:rPr>
+        <w:t>Range to check condition</w:t>
+      </w:r>
+      <w:r>
+        <w:rPr>
+          <w:i/>
+          <w:iCs/>
+          <w:color w:val="4472C4" w:themeColor="accent1"/>
+        </w:rPr>
+        <w:t>1</w:t>
+      </w:r>
+      <w:r>
+        <w:t xml:space="preserve">, </w:t>
+      </w:r>
+      <w:r>
+        <w:rPr>
+          <w:i/>
+          <w:iCs/>
+          <w:color w:val="ED7D31" w:themeColor="accent2"/>
+        </w:rPr>
+        <w:t>To match with</w:t>
+      </w:r>
+      <w:r>
+        <w:rPr>
+          <w:i/>
+          <w:iCs/>
+          <w:color w:val="ED7D31" w:themeColor="accent2"/>
+        </w:rPr>
+        <w:t>1</w:t>
+      </w:r>
+      <w:r>
+        <w:rPr>
+          <w:i/>
+          <w:iCs/>
+          <w:color w:val="ED7D31" w:themeColor="accent2"/>
+        </w:rPr>
+        <w:t>?</w:t>
+      </w:r>
+      <w:r>
+        <w:t>,</w:t>
+      </w:r>
+      <w:r>
+        <w:t xml:space="preserve"> </w:t>
+      </w:r>
+      <w:r>
+        <w:rPr>
+          <w:i/>
+          <w:iCs/>
+          <w:color w:val="4472C4" w:themeColor="accent1"/>
+        </w:rPr>
+        <w:t>Range to check condition</w:t>
+      </w:r>
+      <w:r>
+        <w:rPr>
+          <w:i/>
+          <w:iCs/>
+          <w:color w:val="4472C4" w:themeColor="accent1"/>
+        </w:rPr>
+        <w:t>2</w:t>
+      </w:r>
+      <w:r>
+        <w:t xml:space="preserve">, </w:t>
+      </w:r>
+      <w:r>
+        <w:rPr>
+          <w:i/>
+          <w:iCs/>
+          <w:color w:val="ED7D31" w:themeColor="accent2"/>
+        </w:rPr>
+        <w:t>To match with</w:t>
+      </w:r>
+      <w:r>
+        <w:rPr>
+          <w:i/>
+          <w:iCs/>
+          <w:color w:val="ED7D31" w:themeColor="accent2"/>
+        </w:rPr>
+        <w:t>2</w:t>
+      </w:r>
+      <w:r>
+        <w:rPr>
+          <w:i/>
+          <w:iCs/>
+          <w:color w:val="ED7D31" w:themeColor="accent2"/>
+        </w:rPr>
+        <w:t>?</w:t>
+      </w:r>
+      <w:r>
+        <w:t>)</w:t>
+      </w:r>
+    </w:p>
+    <w:p/>
+    <w:p>
+      <w:r>
+        <w:sym w:font="Wingdings" w:char="F0E0"/>
+      </w:r>
+      <w:r>
+        <w:t xml:space="preserve"> MINIFS:</w:t>
+      </w:r>
+    </w:p>
+    <w:p>
+      <w:r>
+        <w:sym w:font="Wingdings" w:char="F0E0"/>
+      </w:r>
+      <w:r>
+        <w:t xml:space="preserve"> MAXIFS:</w:t>
       </w:r>
     </w:p>
     <w:sectPr>
@@ -5119,7 +5479,6 @@
   <w:style w:type="character" w:default="1" w:styleId="DefaultParagraphFont">
     <w:name w:val="Default Paragraph Font"/>
     <w:uiPriority w:val="1"/>
-    <w:semiHidden/>
     <w:unhideWhenUsed/>
   </w:style>
   <w:style w:type="table" w:default="1" w:styleId="TableNormal">
@@ -5513,6 +5872,25 @@
       <w:ind w:left="480"/>
     </w:pPr>
   </w:style>
+  <w:style w:type="table" w:styleId="TableGrid">
+    <w:name w:val="Table Grid"/>
+    <w:basedOn w:val="TableNormal"/>
+    <w:uiPriority w:val="39"/>
+    <w:rsid w:val="00D2348C"/>
+    <w:pPr>
+      <w:spacing w:after="0" w:line="240" w:lineRule="auto"/>
+    </w:pPr>
+    <w:tblPr>
+      <w:tblBorders>
+        <w:top w:val="single" w:sz="4" w:space="0" w:color="auto"/>
+        <w:left w:val="single" w:sz="4" w:space="0" w:color="auto"/>
+        <w:bottom w:val="single" w:sz="4" w:space="0" w:color="auto"/>
+        <w:right w:val="single" w:sz="4" w:space="0" w:color="auto"/>
+        <w:insideH w:val="single" w:sz="4" w:space="0" w:color="auto"/>
+        <w:insideV w:val="single" w:sz="4" w:space="0" w:color="auto"/>
+      </w:tblBorders>
+    </w:tblPr>
+  </w:style>
 </w:styles>
 </file>
 

</xml_diff>

<commit_message>
2.5 Statistical Functions Completed
</commit_message>
<xml_diff>
--- a/Notes.docx
+++ b/Notes.docx
@@ -80,7 +80,7 @@
           <w:r>
             <w:fldChar w:fldCharType="separate"/>
           </w:r>
-          <w:hyperlink w:anchor="_Toc231974411" w:history="1">
+          <w:hyperlink w:anchor="_Toc232587004" w:history="1">
             <w:r>
               <w:rPr>
                 <w:rStyle w:val="Hyperlink"/>
@@ -124,7 +124,7 @@
                 <w:noProof/>
                 <w:webHidden/>
               </w:rPr>
-              <w:instrText xml:space="preserve"> PAGEREF _Toc231974411 \h </w:instrText>
+              <w:instrText xml:space="preserve"> PAGEREF _Toc232587004 \h </w:instrText>
             </w:r>
             <w:r>
               <w:rPr>
@@ -168,7 +168,7 @@
               <w:lang w:eastAsia="en-IN" w:bidi="gu-IN"/>
             </w:rPr>
           </w:pPr>
-          <w:hyperlink w:anchor="_Toc231974412" w:history="1">
+          <w:hyperlink w:anchor="_Toc232587005" w:history="1">
             <w:r>
               <w:rPr>
                 <w:rStyle w:val="Hyperlink"/>
@@ -196,7 +196,7 @@
                 <w:noProof/>
                 <w:webHidden/>
               </w:rPr>
-              <w:instrText xml:space="preserve"> PAGEREF _Toc231974412 \h </w:instrText>
+              <w:instrText xml:space="preserve"> PAGEREF _Toc232587005 \h </w:instrText>
             </w:r>
             <w:r>
               <w:rPr>
@@ -241,7 +241,7 @@
               <w:lang w:eastAsia="en-IN" w:bidi="gu-IN"/>
             </w:rPr>
           </w:pPr>
-          <w:hyperlink w:anchor="_Toc231974413" w:history="1">
+          <w:hyperlink w:anchor="_Toc232587006" w:history="1">
             <w:r>
               <w:rPr>
                 <w:rStyle w:val="Hyperlink"/>
@@ -286,7 +286,7 @@
                 <w:noProof/>
                 <w:webHidden/>
               </w:rPr>
-              <w:instrText xml:space="preserve"> PAGEREF _Toc231974413 \h </w:instrText>
+              <w:instrText xml:space="preserve"> PAGEREF _Toc232587006 \h </w:instrText>
             </w:r>
             <w:r>
               <w:rPr>
@@ -330,7 +330,7 @@
               <w:lang w:eastAsia="en-IN" w:bidi="gu-IN"/>
             </w:rPr>
           </w:pPr>
-          <w:hyperlink w:anchor="_Toc231974414" w:history="1">
+          <w:hyperlink w:anchor="_Toc232587007" w:history="1">
             <w:r>
               <w:rPr>
                 <w:rStyle w:val="Hyperlink"/>
@@ -358,7 +358,7 @@
                 <w:noProof/>
                 <w:webHidden/>
               </w:rPr>
-              <w:instrText xml:space="preserve"> PAGEREF _Toc231974414 \h </w:instrText>
+              <w:instrText xml:space="preserve"> PAGEREF _Toc232587007 \h </w:instrText>
             </w:r>
             <w:r>
               <w:rPr>
@@ -402,7 +402,7 @@
               <w:lang w:eastAsia="en-IN" w:bidi="gu-IN"/>
             </w:rPr>
           </w:pPr>
-          <w:hyperlink w:anchor="_Toc231974415" w:history="1">
+          <w:hyperlink w:anchor="_Toc232587008" w:history="1">
             <w:r>
               <w:rPr>
                 <w:rStyle w:val="Hyperlink"/>
@@ -430,7 +430,7 @@
                 <w:noProof/>
                 <w:webHidden/>
               </w:rPr>
-              <w:instrText xml:space="preserve"> PAGEREF _Toc231974415 \h </w:instrText>
+              <w:instrText xml:space="preserve"> PAGEREF _Toc232587008 \h </w:instrText>
             </w:r>
             <w:r>
               <w:rPr>
@@ -475,7 +475,7 @@
               <w:lang w:eastAsia="en-IN" w:bidi="gu-IN"/>
             </w:rPr>
           </w:pPr>
-          <w:hyperlink w:anchor="_Toc231974416" w:history="1">
+          <w:hyperlink w:anchor="_Toc232587009" w:history="1">
             <w:r>
               <w:rPr>
                 <w:rStyle w:val="Hyperlink"/>
@@ -520,7 +520,7 @@
                 <w:noProof/>
                 <w:webHidden/>
               </w:rPr>
-              <w:instrText xml:space="preserve"> PAGEREF _Toc231974416 \h </w:instrText>
+              <w:instrText xml:space="preserve"> PAGEREF _Toc232587009 \h </w:instrText>
             </w:r>
             <w:r>
               <w:rPr>
@@ -565,7 +565,7 @@
               <w:lang w:eastAsia="en-IN" w:bidi="gu-IN"/>
             </w:rPr>
           </w:pPr>
-          <w:hyperlink w:anchor="_Toc231974417" w:history="1">
+          <w:hyperlink w:anchor="_Toc232587010" w:history="1">
             <w:r>
               <w:rPr>
                 <w:rStyle w:val="Hyperlink"/>
@@ -610,7 +610,7 @@
                 <w:noProof/>
                 <w:webHidden/>
               </w:rPr>
-              <w:instrText xml:space="preserve"> PAGEREF _Toc231974417 \h </w:instrText>
+              <w:instrText xml:space="preserve"> PAGEREF _Toc232587010 \h </w:instrText>
             </w:r>
             <w:r>
               <w:rPr>
@@ -654,7 +654,7 @@
               <w:lang w:eastAsia="en-IN" w:bidi="gu-IN"/>
             </w:rPr>
           </w:pPr>
-          <w:hyperlink w:anchor="_Toc231974418" w:history="1">
+          <w:hyperlink w:anchor="_Toc232587011" w:history="1">
             <w:r>
               <w:rPr>
                 <w:rStyle w:val="Hyperlink"/>
@@ -682,7 +682,7 @@
                 <w:noProof/>
                 <w:webHidden/>
               </w:rPr>
-              <w:instrText xml:space="preserve"> PAGEREF _Toc231974418 \h </w:instrText>
+              <w:instrText xml:space="preserve"> PAGEREF _Toc232587011 \h </w:instrText>
             </w:r>
             <w:r>
               <w:rPr>
@@ -726,7 +726,7 @@
               <w:lang w:eastAsia="en-IN" w:bidi="gu-IN"/>
             </w:rPr>
           </w:pPr>
-          <w:hyperlink w:anchor="_Toc231974419" w:history="1">
+          <w:hyperlink w:anchor="_Toc232587012" w:history="1">
             <w:r>
               <w:rPr>
                 <w:rStyle w:val="Hyperlink"/>
@@ -754,7 +754,7 @@
                 <w:noProof/>
                 <w:webHidden/>
               </w:rPr>
-              <w:instrText xml:space="preserve"> PAGEREF _Toc231974419 \h </w:instrText>
+              <w:instrText xml:space="preserve"> PAGEREF _Toc232587012 \h </w:instrText>
             </w:r>
             <w:r>
               <w:rPr>
@@ -798,30 +798,157 @@
               <w:lang w:eastAsia="en-IN" w:bidi="gu-IN"/>
             </w:rPr>
           </w:pPr>
-          <w:hyperlink w:anchor="_Toc231974420" w:history="1">
+          <w:hyperlink w:anchor="_Toc232587013" w:history="1">
             <w:r>
               <w:rPr>
                 <w:rStyle w:val="Hyperlink"/>
                 <w:noProof/>
                 <w:lang w:val="en-US"/>
               </w:rPr>
-              <w:t>2.2 Functions I</w:t>
-            </w:r>
+              <w:t>2.2 Functions Intro</w:t>
+            </w:r>
+            <w:r>
+              <w:rPr>
+                <w:noProof/>
+                <w:webHidden/>
+              </w:rPr>
+              <w:tab/>
+            </w:r>
+            <w:r>
+              <w:rPr>
+                <w:noProof/>
+                <w:webHidden/>
+              </w:rPr>
+              <w:fldChar w:fldCharType="begin"/>
+            </w:r>
+            <w:r>
+              <w:rPr>
+                <w:noProof/>
+                <w:webHidden/>
+              </w:rPr>
+              <w:instrText xml:space="preserve"> PAGEREF _Toc232587013 \h </w:instrText>
+            </w:r>
+            <w:r>
+              <w:rPr>
+                <w:noProof/>
+                <w:webHidden/>
+              </w:rPr>
+            </w:r>
+            <w:r>
+              <w:rPr>
+                <w:noProof/>
+                <w:webHidden/>
+              </w:rPr>
+              <w:fldChar w:fldCharType="separate"/>
+            </w:r>
+            <w:r>
+              <w:rPr>
+                <w:noProof/>
+                <w:webHidden/>
+              </w:rPr>
+              <w:t>8</w:t>
+            </w:r>
+            <w:r>
+              <w:rPr>
+                <w:noProof/>
+                <w:webHidden/>
+              </w:rPr>
+              <w:fldChar w:fldCharType="end"/>
+            </w:r>
+          </w:hyperlink>
+        </w:p>
+        <w:p>
+          <w:pPr>
+            <w:pStyle w:val="TOC2"/>
+            <w:tabs>
+              <w:tab w:val="right" w:leader="dot" w:pos="9016"/>
+            </w:tabs>
+            <w:rPr>
+              <w:rFonts w:asciiTheme="minorHAnsi" w:eastAsiaTheme="minorEastAsia" w:hAnsiTheme="minorHAnsi"/>
+              <w:noProof/>
+              <w:szCs w:val="24"/>
+              <w:lang w:eastAsia="en-IN" w:bidi="gu-IN"/>
+            </w:rPr>
+          </w:pPr>
+          <w:hyperlink w:anchor="_Toc232587014" w:history="1">
             <w:r>
               <w:rPr>
                 <w:rStyle w:val="Hyperlink"/>
                 <w:noProof/>
                 <w:lang w:val="en-US"/>
               </w:rPr>
-              <w:t>n</w:t>
-            </w:r>
+              <w:t>2.3 Logical Functions</w:t>
+            </w:r>
+            <w:r>
+              <w:rPr>
+                <w:noProof/>
+                <w:webHidden/>
+              </w:rPr>
+              <w:tab/>
+            </w:r>
+            <w:r>
+              <w:rPr>
+                <w:noProof/>
+                <w:webHidden/>
+              </w:rPr>
+              <w:fldChar w:fldCharType="begin"/>
+            </w:r>
+            <w:r>
+              <w:rPr>
+                <w:noProof/>
+                <w:webHidden/>
+              </w:rPr>
+              <w:instrText xml:space="preserve"> PAGEREF _Toc232587014 \h </w:instrText>
+            </w:r>
+            <w:r>
+              <w:rPr>
+                <w:noProof/>
+                <w:webHidden/>
+              </w:rPr>
+            </w:r>
+            <w:r>
+              <w:rPr>
+                <w:noProof/>
+                <w:webHidden/>
+              </w:rPr>
+              <w:fldChar w:fldCharType="separate"/>
+            </w:r>
+            <w:r>
+              <w:rPr>
+                <w:noProof/>
+                <w:webHidden/>
+              </w:rPr>
+              <w:t>10</w:t>
+            </w:r>
+            <w:r>
+              <w:rPr>
+                <w:noProof/>
+                <w:webHidden/>
+              </w:rPr>
+              <w:fldChar w:fldCharType="end"/>
+            </w:r>
+          </w:hyperlink>
+        </w:p>
+        <w:p>
+          <w:pPr>
+            <w:pStyle w:val="TOC2"/>
+            <w:tabs>
+              <w:tab w:val="right" w:leader="dot" w:pos="9016"/>
+            </w:tabs>
+            <w:rPr>
+              <w:rFonts w:asciiTheme="minorHAnsi" w:eastAsiaTheme="minorEastAsia" w:hAnsiTheme="minorHAnsi"/>
+              <w:noProof/>
+              <w:szCs w:val="24"/>
+              <w:lang w:eastAsia="en-IN" w:bidi="gu-IN"/>
+            </w:rPr>
+          </w:pPr>
+          <w:hyperlink w:anchor="_Toc232587015" w:history="1">
             <w:r>
               <w:rPr>
                 <w:rStyle w:val="Hyperlink"/>
                 <w:noProof/>
-                <w:lang w:val="en-US"/>
-              </w:rPr>
-              <w:t>tro</w:t>
+              </w:rPr>
+              <w:t>2.4 Math Functions</w:t>
             </w:r>
             <w:r>
               <w:rPr>
@@ -842,7 +969,7 @@
                 <w:noProof/>
                 <w:webHidden/>
               </w:rPr>
-              <w:instrText xml:space="preserve"> PAGEREF _Toc231974420 \h </w:instrText>
+              <w:instrText xml:space="preserve"> PAGEREF _Toc232587015 \h </w:instrText>
             </w:r>
             <w:r>
               <w:rPr>
@@ -862,7 +989,78 @@
                 <w:noProof/>
                 <w:webHidden/>
               </w:rPr>
-              <w:t>8</w:t>
+              <w:t>10</w:t>
+            </w:r>
+            <w:r>
+              <w:rPr>
+                <w:noProof/>
+                <w:webHidden/>
+              </w:rPr>
+              <w:fldChar w:fldCharType="end"/>
+            </w:r>
+          </w:hyperlink>
+        </w:p>
+        <w:p>
+          <w:pPr>
+            <w:pStyle w:val="TOC2"/>
+            <w:tabs>
+              <w:tab w:val="right" w:leader="dot" w:pos="9016"/>
+            </w:tabs>
+            <w:rPr>
+              <w:rFonts w:asciiTheme="minorHAnsi" w:eastAsiaTheme="minorEastAsia" w:hAnsiTheme="minorHAnsi"/>
+              <w:noProof/>
+              <w:szCs w:val="24"/>
+              <w:lang w:eastAsia="en-IN" w:bidi="gu-IN"/>
+            </w:rPr>
+          </w:pPr>
+          <w:hyperlink w:anchor="_Toc232587016" w:history="1">
+            <w:r>
+              <w:rPr>
+                <w:rStyle w:val="Hyperlink"/>
+                <w:noProof/>
+              </w:rPr>
+              <w:t>2.5 Statistical Functions</w:t>
+            </w:r>
+            <w:r>
+              <w:rPr>
+                <w:noProof/>
+                <w:webHidden/>
+              </w:rPr>
+              <w:tab/>
+            </w:r>
+            <w:r>
+              <w:rPr>
+                <w:noProof/>
+                <w:webHidden/>
+              </w:rPr>
+              <w:fldChar w:fldCharType="begin"/>
+            </w:r>
+            <w:r>
+              <w:rPr>
+                <w:noProof/>
+                <w:webHidden/>
+              </w:rPr>
+              <w:instrText xml:space="preserve"> PAGEREF _Toc232587016 \h </w:instrText>
+            </w:r>
+            <w:r>
+              <w:rPr>
+                <w:noProof/>
+                <w:webHidden/>
+              </w:rPr>
+            </w:r>
+            <w:r>
+              <w:rPr>
+                <w:noProof/>
+                <w:webHidden/>
+              </w:rPr>
+              <w:fldChar w:fldCharType="separate"/>
+            </w:r>
+            <w:r>
+              <w:rPr>
+                <w:noProof/>
+                <w:webHidden/>
+              </w:rPr>
+              <w:t>11</w:t>
             </w:r>
             <w:r>
               <w:rPr>
@@ -897,6 +1095,13 @@
         </w:rPr>
         <w:br w:type="page"/>
       </w:r>
+      <w:r>
+        <w:rPr>
+          <w:lang w:val="en-US"/>
+        </w:rPr>
+        <w:lastRenderedPageBreak/>
+        <w:t xml:space="preserve"> </w:t>
+      </w:r>
     </w:p>
     <w:p>
       <w:pPr>
@@ -907,9 +1112,8 @@
         </w:numPr>
         <w:ind w:left="420" w:hanging="420"/>
       </w:pPr>
-      <w:bookmarkStart w:id="0" w:name="_Toc231974411"/>
-      <w:r>
-        <w:lastRenderedPageBreak/>
+      <w:bookmarkStart w:id="0" w:name="_Toc232587004"/>
+      <w:r>
         <w:t>Short Cuts</w:t>
       </w:r>
       <w:bookmarkEnd w:id="0"/>
@@ -959,7 +1163,7 @@
           <w:lang w:val="en-US"/>
         </w:rPr>
       </w:pPr>
-      <w:bookmarkStart w:id="1" w:name="_Toc231974412"/>
+      <w:bookmarkStart w:id="1" w:name="_Toc232587005"/>
       <w:r>
         <w:rPr>
           <w:lang w:val="en-US"/>
@@ -1006,7 +1210,7 @@
           <w:lang w:val="en-US"/>
         </w:rPr>
       </w:pPr>
-      <w:bookmarkStart w:id="2" w:name="_Toc231974413"/>
+      <w:bookmarkStart w:id="2" w:name="_Toc232587006"/>
       <w:r>
         <w:rPr>
           <w:lang w:val="en-US"/>
@@ -1117,7 +1321,7 @@
           <w:lang w:val="en-US"/>
         </w:rPr>
       </w:pPr>
-      <w:bookmarkStart w:id="3" w:name="_Toc231974414"/>
+      <w:bookmarkStart w:id="3" w:name="_Toc232587007"/>
       <w:r>
         <w:rPr>
           <w:lang w:val="en-US"/>
@@ -1144,7 +1348,15 @@
           <w:bdr w:val="single" w:sz="4" w:space="0" w:color="auto"/>
           <w:lang w:val="en-US"/>
         </w:rPr>
-        <w:t>= A1&amp;</w:t>
+        <w:t>= A1</w:t>
+      </w:r>
+      <w:proofErr w:type="gramStart"/>
+      <w:r>
+        <w:rPr>
+          <w:bdr w:val="single" w:sz="4" w:space="0" w:color="auto"/>
+          <w:lang w:val="en-US"/>
+        </w:rPr>
+        <w:t>&amp;</w:t>
       </w:r>
       <w:r>
         <w:rPr>
@@ -1159,7 +1371,15 @@
           <w:bdr w:val="single" w:sz="4" w:space="0" w:color="auto"/>
           <w:lang w:val="en-US"/>
         </w:rPr>
-        <w:t>&amp;E1</w:t>
+        <w:t>&amp;</w:t>
+      </w:r>
+      <w:proofErr w:type="gramEnd"/>
+      <w:r>
+        <w:rPr>
+          <w:bdr w:val="single" w:sz="4" w:space="0" w:color="auto"/>
+          <w:lang w:val="en-US"/>
+        </w:rPr>
+        <w:t>E1</w:t>
       </w:r>
       <w:r>
         <w:rPr>
@@ -1177,7 +1397,21 @@
         <w:rPr>
           <w:lang w:val="en-US"/>
         </w:rPr>
-        <w:t xml:space="preserve"> This Will Add Hypen (-) between data of A1 and E1 cells</w:t>
+        <w:t xml:space="preserve"> This Will Add </w:t>
+      </w:r>
+      <w:proofErr w:type="spellStart"/>
+      <w:r>
+        <w:rPr>
+          <w:lang w:val="en-US"/>
+        </w:rPr>
+        <w:t>Hypen</w:t>
+      </w:r>
+      <w:proofErr w:type="spellEnd"/>
+      <w:r>
+        <w:rPr>
+          <w:lang w:val="en-US"/>
+        </w:rPr>
+        <w:t xml:space="preserve"> (-) between data of A1 and E1 cells</w:t>
       </w:r>
       <w:r>
         <w:rPr>
@@ -1190,13 +1424,21 @@
           <w:color w:val="4472C4" w:themeColor="accent1"/>
           <w:lang w:val="en-US"/>
         </w:rPr>
-        <w:t xml:space="preserve">(Quotes are </w:t>
-      </w:r>
+        <w:t xml:space="preserve">(Quotes </w:t>
+      </w:r>
+      <w:proofErr w:type="gramStart"/>
       <w:r>
         <w:rPr>
           <w:color w:val="4472C4" w:themeColor="accent1"/>
           <w:lang w:val="en-US"/>
         </w:rPr>
+        <w:t xml:space="preserve">are </w:t>
+      </w:r>
+      <w:r>
+        <w:rPr>
+          <w:color w:val="4472C4" w:themeColor="accent1"/>
+          <w:lang w:val="en-US"/>
+        </w:rPr>
         <w:t xml:space="preserve"> </w:t>
       </w:r>
       <w:r>
@@ -1204,7 +1446,15 @@
           <w:color w:val="4472C4" w:themeColor="accent1"/>
           <w:lang w:val="en-US"/>
         </w:rPr>
-        <w:t>mandatory)</w:t>
+        <w:t>mandatory</w:t>
+      </w:r>
+      <w:proofErr w:type="gramEnd"/>
+      <w:r>
+        <w:rPr>
+          <w:color w:val="4472C4" w:themeColor="accent1"/>
+          <w:lang w:val="en-US"/>
+        </w:rPr>
+        <w:t>)</w:t>
       </w:r>
     </w:p>
     <w:p>
@@ -1221,7 +1471,7 @@
           <w:lang w:val="en-US"/>
         </w:rPr>
       </w:pPr>
-      <w:bookmarkStart w:id="4" w:name="_Toc231974415"/>
+      <w:bookmarkStart w:id="4" w:name="_Toc232587008"/>
       <w:r>
         <w:rPr>
           <w:lang w:val="en-US"/>
@@ -1381,7 +1631,21 @@
         <w:rPr>
           <w:lang w:val="en-US"/>
         </w:rPr>
-        <w:t xml:space="preserve">=A:A </w:t>
+        <w:t>=</w:t>
+      </w:r>
+      <w:proofErr w:type="gramStart"/>
+      <w:r>
+        <w:rPr>
+          <w:lang w:val="en-US"/>
+        </w:rPr>
+        <w:t>A:A</w:t>
+      </w:r>
+      <w:proofErr w:type="gramEnd"/>
+      <w:r>
+        <w:rPr>
+          <w:lang w:val="en-US"/>
+        </w:rPr>
+        <w:t xml:space="preserve"> </w:t>
       </w:r>
       <w:r>
         <w:rPr>
@@ -1485,7 +1749,7 @@
         </w:rPr>
         <w:br w:type="page"/>
       </w:r>
-      <w:bookmarkStart w:id="5" w:name="_Toc231974416"/>
+      <w:bookmarkStart w:id="5" w:name="_Toc232587009"/>
       <w:r>
         <w:rPr>
           <w:lang w:val="en-US"/>
@@ -1640,7 +1904,21 @@
         <w:rPr>
           <w:lang w:val="en-US"/>
         </w:rPr>
-        <w:t>We just need to select the cells in the other workbook – It will automatically take this formulas.</w:t>
+        <w:t xml:space="preserve">We just need to select the cells in the other workbook – It will automatically take </w:t>
+      </w:r>
+      <w:proofErr w:type="gramStart"/>
+      <w:r>
+        <w:rPr>
+          <w:lang w:val="en-US"/>
+        </w:rPr>
+        <w:t>this formulas</w:t>
+      </w:r>
+      <w:proofErr w:type="gramEnd"/>
+      <w:r>
+        <w:rPr>
+          <w:lang w:val="en-US"/>
+        </w:rPr>
+        <w:t>.</w:t>
       </w:r>
     </w:p>
     <w:p>
@@ -1792,7 +2070,35 @@
         <w:rPr>
           <w:lang w:val="en-US"/>
         </w:rPr>
-        <w:t>Simply go to Data Workbook, Copy all the content and Paste it in a new Workbook</w:t>
+        <w:t xml:space="preserve">Simply go to Data Workbook, </w:t>
+      </w:r>
+      <w:proofErr w:type="gramStart"/>
+      <w:r>
+        <w:rPr>
+          <w:lang w:val="en-US"/>
+        </w:rPr>
+        <w:t>Copy</w:t>
+      </w:r>
+      <w:proofErr w:type="gramEnd"/>
+      <w:r>
+        <w:rPr>
+          <w:lang w:val="en-US"/>
+        </w:rPr>
+        <w:t xml:space="preserve"> all the content and </w:t>
+      </w:r>
+      <w:proofErr w:type="gramStart"/>
+      <w:r>
+        <w:rPr>
+          <w:lang w:val="en-US"/>
+        </w:rPr>
+        <w:t>Paste</w:t>
+      </w:r>
+      <w:proofErr w:type="gramEnd"/>
+      <w:r>
+        <w:rPr>
+          <w:lang w:val="en-US"/>
+        </w:rPr>
+        <w:t xml:space="preserve"> it in a new Workbook</w:t>
       </w:r>
     </w:p>
     <w:p>
@@ -1963,7 +2269,7 @@
         </w:rPr>
         <w:br w:type="page"/>
       </w:r>
-      <w:bookmarkStart w:id="6" w:name="_Toc231974417"/>
+      <w:bookmarkStart w:id="6" w:name="_Toc232587010"/>
       <w:r>
         <w:rPr>
           <w:lang w:val="en-US"/>
@@ -2073,7 +2379,21 @@
         <w:rPr>
           <w:lang w:val="en-US"/>
         </w:rPr>
-        <w:t>Select all (full / complete) columns and all the columns and just double click on the last one to open, It will open all the columns selected.</w:t>
+        <w:t xml:space="preserve">Select all (full / complete) columns and all the columns and just double click on the last one to open, </w:t>
+      </w:r>
+      <w:proofErr w:type="gramStart"/>
+      <w:r>
+        <w:rPr>
+          <w:lang w:val="en-US"/>
+        </w:rPr>
+        <w:t>It</w:t>
+      </w:r>
+      <w:proofErr w:type="gramEnd"/>
+      <w:r>
+        <w:rPr>
+          <w:lang w:val="en-US"/>
+        </w:rPr>
+        <w:t xml:space="preserve"> will open all the columns selected.</w:t>
       </w:r>
     </w:p>
     <w:p>
@@ -2509,7 +2829,21 @@
           <w:lang w:val="en-US"/>
         </w:rPr>
         <w:lastRenderedPageBreak/>
-        <w:t>Similarly, If you want to clear all the applied filters then:</w:t>
+        <w:t xml:space="preserve">Similarly, </w:t>
+      </w:r>
+      <w:proofErr w:type="gramStart"/>
+      <w:r>
+        <w:rPr>
+          <w:lang w:val="en-US"/>
+        </w:rPr>
+        <w:t>If</w:t>
+      </w:r>
+      <w:proofErr w:type="gramEnd"/>
+      <w:r>
+        <w:rPr>
+          <w:lang w:val="en-US"/>
+        </w:rPr>
+        <w:t xml:space="preserve"> you want to clear all the applied filters then:</w:t>
       </w:r>
     </w:p>
     <w:p>
@@ -2595,7 +2929,7 @@
           <w:lang w:val="en-US"/>
         </w:rPr>
       </w:pPr>
-      <w:bookmarkStart w:id="7" w:name="_Toc231974418"/>
+      <w:bookmarkStart w:id="7" w:name="_Toc232587011"/>
       <w:r>
         <w:rPr>
           <w:lang w:val="en-US"/>
@@ -2618,7 +2952,7 @@
           <w:lang w:val="en-US"/>
         </w:rPr>
       </w:pPr>
-      <w:bookmarkStart w:id="8" w:name="_Toc231974419"/>
+      <w:bookmarkStart w:id="8" w:name="_Toc232587012"/>
       <w:r>
         <w:rPr>
           <w:lang w:val="en-US"/>
@@ -2644,7 +2978,21 @@
         <w:rPr>
           <w:lang w:val="en-US"/>
         </w:rPr>
-        <w:t>- Note that In comparison operator for EQUALS we have only one (=) instead of (==)</w:t>
+        <w:t xml:space="preserve">- Note that </w:t>
+      </w:r>
+      <w:proofErr w:type="gramStart"/>
+      <w:r>
+        <w:rPr>
+          <w:lang w:val="en-US"/>
+        </w:rPr>
+        <w:t>In</w:t>
+      </w:r>
+      <w:proofErr w:type="gramEnd"/>
+      <w:r>
+        <w:rPr>
+          <w:lang w:val="en-US"/>
+        </w:rPr>
+        <w:t xml:space="preserve"> comparison operator for EQUALS we have only one (=) instead of (==)</w:t>
       </w:r>
     </w:p>
     <w:p>
@@ -2752,7 +3100,21 @@
         <w:rPr>
           <w:lang w:val="en-US"/>
         </w:rPr>
-        <w:t>, It will automatically add ‘$’ before row and column.</w:t>
+        <w:t xml:space="preserve">, </w:t>
+      </w:r>
+      <w:proofErr w:type="gramStart"/>
+      <w:r>
+        <w:rPr>
+          <w:lang w:val="en-US"/>
+        </w:rPr>
+        <w:t>It</w:t>
+      </w:r>
+      <w:proofErr w:type="gramEnd"/>
+      <w:r>
+        <w:rPr>
+          <w:lang w:val="en-US"/>
+        </w:rPr>
+        <w:t xml:space="preserve"> will automatically add ‘$’ before row and column.</w:t>
       </w:r>
     </w:p>
     <w:p>
@@ -2855,7 +3217,21 @@
         <w:rPr>
           <w:lang w:val="en-US"/>
         </w:rPr>
-        <w:t xml:space="preserve"> Will lock 15 row but will iterate through columns</w:t>
+        <w:t xml:space="preserve"> Will lock 15 </w:t>
+      </w:r>
+      <w:proofErr w:type="gramStart"/>
+      <w:r>
+        <w:rPr>
+          <w:lang w:val="en-US"/>
+        </w:rPr>
+        <w:t>row</w:t>
+      </w:r>
+      <w:proofErr w:type="gramEnd"/>
+      <w:r>
+        <w:rPr>
+          <w:lang w:val="en-US"/>
+        </w:rPr>
+        <w:t xml:space="preserve"> but will iterate through columns</w:t>
       </w:r>
     </w:p>
     <w:p>
@@ -2879,7 +3255,7 @@
           <w:lang w:val="en-US"/>
         </w:rPr>
       </w:pPr>
-      <w:bookmarkStart w:id="9" w:name="_Toc231974420"/>
+      <w:bookmarkStart w:id="9" w:name="_Toc232587013"/>
       <w:r>
         <w:rPr>
           <w:lang w:val="en-US"/>
@@ -2912,40 +3288,90 @@
         <w:rPr>
           <w:lang w:val="en-US"/>
         </w:rPr>
-        <w:t>=AVERAGE()</w:t>
-      </w:r>
-    </w:p>
-    <w:p>
-      <w:pPr>
-        <w:rPr>
-          <w:lang w:val="en-US"/>
-        </w:rPr>
-      </w:pPr>
-      <w:r>
-        <w:rPr>
-          <w:lang w:val="en-US"/>
-        </w:rPr>
-        <w:t xml:space="preserve">=AND() </w:t>
-      </w:r>
-    </w:p>
-    <w:p>
-      <w:pPr>
-        <w:rPr>
-          <w:lang w:val="en-US"/>
-        </w:rPr>
-      </w:pPr>
-    </w:p>
-    <w:p>
-      <w:pPr>
-        <w:rPr>
-          <w:lang w:val="en-US"/>
-        </w:rPr>
-      </w:pPr>
-      <w:r>
-        <w:rPr>
-          <w:lang w:val="en-US"/>
-        </w:rPr>
-        <w:t>Also If we are not able to recall the function name, Then we can use this</w:t>
+        <w:t>=</w:t>
+      </w:r>
+      <w:proofErr w:type="gramStart"/>
+      <w:r>
+        <w:rPr>
+          <w:lang w:val="en-US"/>
+        </w:rPr>
+        <w:t>AVERAGE(</w:t>
+      </w:r>
+      <w:proofErr w:type="gramEnd"/>
+      <w:r>
+        <w:rPr>
+          <w:lang w:val="en-US"/>
+        </w:rPr>
+        <w:t>)</w:t>
+      </w:r>
+    </w:p>
+    <w:p>
+      <w:pPr>
+        <w:rPr>
+          <w:lang w:val="en-US"/>
+        </w:rPr>
+      </w:pPr>
+      <w:r>
+        <w:rPr>
+          <w:lang w:val="en-US"/>
+        </w:rPr>
+        <w:t>=</w:t>
+      </w:r>
+      <w:proofErr w:type="gramStart"/>
+      <w:r>
+        <w:rPr>
+          <w:lang w:val="en-US"/>
+        </w:rPr>
+        <w:t>AND(</w:t>
+      </w:r>
+      <w:proofErr w:type="gramEnd"/>
+      <w:r>
+        <w:rPr>
+          <w:lang w:val="en-US"/>
+        </w:rPr>
+        <w:t xml:space="preserve">) </w:t>
+      </w:r>
+    </w:p>
+    <w:p>
+      <w:pPr>
+        <w:rPr>
+          <w:lang w:val="en-US"/>
+        </w:rPr>
+      </w:pPr>
+    </w:p>
+    <w:p>
+      <w:pPr>
+        <w:rPr>
+          <w:lang w:val="en-US"/>
+        </w:rPr>
+      </w:pPr>
+      <w:proofErr w:type="gramStart"/>
+      <w:r>
+        <w:rPr>
+          <w:lang w:val="en-US"/>
+        </w:rPr>
+        <w:t>Also</w:t>
+      </w:r>
+      <w:proofErr w:type="gramEnd"/>
+      <w:r>
+        <w:rPr>
+          <w:lang w:val="en-US"/>
+        </w:rPr>
+        <w:t xml:space="preserve"> If we are not able to recall the function name, </w:t>
+      </w:r>
+      <w:proofErr w:type="gramStart"/>
+      <w:r>
+        <w:rPr>
+          <w:lang w:val="en-US"/>
+        </w:rPr>
+        <w:t>Then</w:t>
+      </w:r>
+      <w:proofErr w:type="gramEnd"/>
+      <w:r>
+        <w:rPr>
+          <w:lang w:val="en-US"/>
+        </w:rPr>
+        <w:t xml:space="preserve"> we can use this</w:t>
       </w:r>
     </w:p>
     <w:p>
@@ -3025,7 +3451,7 @@
           </mc:Choice>
           <mc:Fallback>
             <w:pict>
-              <v:rect w14:anchorId="6B766F48" id="Rectangle 1" o:spid="_x0000_s1026" style="position:absolute;margin-left:80.5pt;margin-top:8.75pt;width:39.5pt;height:53.5pt;z-index:251659264;visibility:visible;mso-wrap-style:square;mso-wrap-distance-left:9pt;mso-wrap-distance-top:0;mso-wrap-distance-right:9pt;mso-wrap-distance-bottom:0;mso-position-horizontal:absolute;mso-position-horizontal-relative:text;mso-position-vertical:absolute;mso-position-vertical-relative:text;v-text-anchor:middle" o:gfxdata="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" filled="f" strokecolor="#e00" strokeweight="3pt"/>
+              <v:rect w14:anchorId="43FCDE51" id="Rectangle 1" o:spid="_x0000_s1026" style="position:absolute;margin-left:80.5pt;margin-top:8.75pt;width:39.5pt;height:53.5pt;z-index:251659264;visibility:visible;mso-wrap-style:square;mso-wrap-distance-left:9pt;mso-wrap-distance-top:0;mso-wrap-distance-right:9pt;mso-wrap-distance-bottom:0;mso-position-horizontal:absolute;mso-position-horizontal-relative:text;mso-position-vertical:absolute;mso-position-vertical-relative:text;v-text-anchor:middle" o:gfxdata="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" filled="f" strokecolor="#e00" strokeweight="3pt"/>
             </w:pict>
           </mc:Fallback>
         </mc:AlternateContent>
@@ -3097,24 +3523,26 @@
           <w:lang w:val="en-US"/>
         </w:rPr>
       </w:pPr>
-    </w:p>
-    <w:p>
-      <w:pPr>
-        <w:rPr>
-          <w:lang w:val="en-US"/>
-        </w:rPr>
-      </w:pPr>
-      <w:r>
-        <w:rPr>
-          <w:lang w:val="en-US"/>
-        </w:rPr>
+      <w:r>
+        <w:rPr>
+          <w:lang w:val="en-US"/>
+        </w:rPr>
+        <w:lastRenderedPageBreak/>
         <w:t xml:space="preserve">If you face error like this: </w:t>
       </w:r>
-      <w:r>
-        <w:rPr>
-          <w:lang w:val="en-US"/>
-        </w:rPr>
-        <w:t>COUNTIF()</w:t>
+      <w:proofErr w:type="gramStart"/>
+      <w:r>
+        <w:rPr>
+          <w:lang w:val="en-US"/>
+        </w:rPr>
+        <w:t>COUNTIF(</w:t>
+      </w:r>
+      <w:proofErr w:type="gramEnd"/>
+      <w:r>
+        <w:rPr>
+          <w:lang w:val="en-US"/>
+        </w:rPr>
+        <w:t>)</w:t>
       </w:r>
     </w:p>
     <w:p>
@@ -3190,6 +3618,7 @@
         </w:rPr>
         <w:t xml:space="preserve">Then to solve this, we need to wrap our conditional operators around </w:t>
       </w:r>
+      <w:proofErr w:type="gramStart"/>
       <w:r>
         <w:rPr>
           <w:color w:val="4472C4" w:themeColor="accent1"/>
@@ -3211,6 +3640,7 @@
         </w:rPr>
         <w:t>”</w:t>
       </w:r>
+      <w:proofErr w:type="gramEnd"/>
       <w:r>
         <w:rPr>
           <w:lang w:val="en-US"/>
@@ -3248,7 +3678,21 @@
         <w:rPr>
           <w:lang w:val="en-US"/>
         </w:rPr>
-        <w:t>If we want to Refer a cell inside complicated functions like COUNTIF(), We need to use “</w:t>
+        <w:t xml:space="preserve">If we want to Refer a cell inside complicated functions like </w:t>
+      </w:r>
+      <w:proofErr w:type="gramStart"/>
+      <w:r>
+        <w:rPr>
+          <w:lang w:val="en-US"/>
+        </w:rPr>
+        <w:t>COUNTIF(</w:t>
+      </w:r>
+      <w:proofErr w:type="gramEnd"/>
+      <w:r>
+        <w:rPr>
+          <w:lang w:val="en-US"/>
+        </w:rPr>
+        <w:t>), We need to use “</w:t>
       </w:r>
       <w:r>
         <w:rPr>
@@ -3349,11 +3793,19 @@
     </w:p>
     <w:p>
       <w:pPr>
+        <w:rPr>
+          <w:lang w:val="en-US"/>
+        </w:rPr>
+      </w:pPr>
+    </w:p>
+    <w:p>
+      <w:pPr>
         <w:pStyle w:val="Heading2"/>
         <w:rPr>
           <w:lang w:val="en-US"/>
         </w:rPr>
       </w:pPr>
+      <w:bookmarkStart w:id="10" w:name="_Toc232587014"/>
       <w:r>
         <w:rPr>
           <w:lang w:val="en-US"/>
@@ -3361,25 +3813,34 @@
         <w:lastRenderedPageBreak/>
         <w:t>2.3 Logical Functions</w:t>
       </w:r>
-    </w:p>
-    <w:p>
-      <w:pPr>
-        <w:rPr>
-          <w:lang w:val="en-US"/>
-        </w:rPr>
-      </w:pPr>
-    </w:p>
-    <w:p>
-      <w:pPr>
-        <w:rPr>
-          <w:lang w:val="en-US"/>
-        </w:rPr>
-      </w:pPr>
-      <w:r>
-        <w:rPr>
-          <w:lang w:val="en-US"/>
-        </w:rPr>
-        <w:t xml:space="preserve">IF() </w:t>
+      <w:bookmarkEnd w:id="10"/>
+    </w:p>
+    <w:p>
+      <w:pPr>
+        <w:rPr>
+          <w:lang w:val="en-US"/>
+        </w:rPr>
+      </w:pPr>
+    </w:p>
+    <w:p>
+      <w:pPr>
+        <w:rPr>
+          <w:lang w:val="en-US"/>
+        </w:rPr>
+      </w:pPr>
+      <w:proofErr w:type="gramStart"/>
+      <w:r>
+        <w:rPr>
+          <w:lang w:val="en-US"/>
+        </w:rPr>
+        <w:t>IF(</w:t>
+      </w:r>
+      <w:proofErr w:type="gramEnd"/>
+      <w:r>
+        <w:rPr>
+          <w:lang w:val="en-US"/>
+        </w:rPr>
+        <w:t xml:space="preserve">) </w:t>
       </w:r>
       <w:r>
         <w:rPr>
@@ -3391,8 +3852,16 @@
         <w:rPr>
           <w:lang w:val="en-US"/>
         </w:rPr>
-        <w:t xml:space="preserve"> IF(</w:t>
-      </w:r>
+        <w:t xml:space="preserve"> </w:t>
+      </w:r>
+      <w:proofErr w:type="gramStart"/>
+      <w:r>
+        <w:rPr>
+          <w:lang w:val="en-US"/>
+        </w:rPr>
+        <w:t>IF(</w:t>
+      </w:r>
+      <w:proofErr w:type="gramEnd"/>
       <w:r>
         <w:rPr>
           <w:i/>
@@ -3451,12 +3920,14 @@
           <w:lang w:val="en-US"/>
         </w:rPr>
       </w:pPr>
+      <w:proofErr w:type="gramStart"/>
       <w:r>
         <w:rPr>
           <w:lang w:val="en-US"/>
         </w:rPr>
         <w:t>IF(</w:t>
       </w:r>
+      <w:proofErr w:type="gramEnd"/>
       <w:r>
         <w:rPr>
           <w:i/>
@@ -3483,8 +3954,16 @@
         <w:rPr>
           <w:lang w:val="en-US"/>
         </w:rPr>
-        <w:t>”, IF(</w:t>
-      </w:r>
+        <w:t xml:space="preserve">”, </w:t>
+      </w:r>
+      <w:proofErr w:type="gramStart"/>
+      <w:r>
+        <w:rPr>
+          <w:lang w:val="en-US"/>
+        </w:rPr>
+        <w:t>IF(</w:t>
+      </w:r>
+      <w:proofErr w:type="gramEnd"/>
       <w:r>
         <w:rPr>
           <w:i/>
@@ -3586,11 +4065,19 @@
         </w:rPr>
         <w:t xml:space="preserve">- </w:t>
       </w:r>
-      <w:r>
-        <w:rPr>
-          <w:lang w:val="en-US"/>
-        </w:rPr>
-        <w:t>IFS(“Condition1”,</w:t>
+      <w:proofErr w:type="gramStart"/>
+      <w:r>
+        <w:rPr>
+          <w:lang w:val="en-US"/>
+        </w:rPr>
+        <w:t>IFS(</w:t>
+      </w:r>
+      <w:proofErr w:type="gramEnd"/>
+      <w:r>
+        <w:rPr>
+          <w:lang w:val="en-US"/>
+        </w:rPr>
+        <w:t>“Condition1”,</w:t>
       </w:r>
       <w:r>
         <w:rPr>
@@ -3602,13 +4089,7 @@
         <w:rPr>
           <w:lang w:val="en-US"/>
         </w:rPr>
-        <w:t>“</w:t>
-      </w:r>
-      <w:r>
-        <w:rPr>
-          <w:lang w:val="en-US"/>
-        </w:rPr>
-        <w:t>Value if true1”,</w:t>
+        <w:t>“Value if true1”,</w:t>
       </w:r>
       <w:r>
         <w:rPr>
@@ -3620,19 +4101,7 @@
         <w:rPr>
           <w:lang w:val="en-US"/>
         </w:rPr>
-        <w:t>“Condition</w:t>
-      </w:r>
-      <w:r>
-        <w:rPr>
-          <w:lang w:val="en-US"/>
-        </w:rPr>
-        <w:t>2</w:t>
-      </w:r>
-      <w:r>
-        <w:rPr>
-          <w:lang w:val="en-US"/>
-        </w:rPr>
-        <w:t>”,</w:t>
+        <w:t>“Condition2”,</w:t>
       </w:r>
       <w:r>
         <w:rPr>
@@ -3644,19 +4113,7 @@
         <w:rPr>
           <w:lang w:val="en-US"/>
         </w:rPr>
-        <w:t>“Value if true</w:t>
-      </w:r>
-      <w:r>
-        <w:rPr>
-          <w:lang w:val="en-US"/>
-        </w:rPr>
-        <w:t>2</w:t>
-      </w:r>
-      <w:r>
-        <w:rPr>
-          <w:lang w:val="en-US"/>
-        </w:rPr>
-        <w:t>”,</w:t>
+        <w:t>“Value if true2”,</w:t>
       </w:r>
       <w:r>
         <w:rPr>
@@ -3668,19 +4125,7 @@
         <w:rPr>
           <w:lang w:val="en-US"/>
         </w:rPr>
-        <w:t>“Condition</w:t>
-      </w:r>
-      <w:r>
-        <w:rPr>
-          <w:lang w:val="en-US"/>
-        </w:rPr>
-        <w:t>3</w:t>
-      </w:r>
-      <w:r>
-        <w:rPr>
-          <w:lang w:val="en-US"/>
-        </w:rPr>
-        <w:t>”,</w:t>
+        <w:t>“Condition3”,</w:t>
       </w:r>
       <w:r>
         <w:rPr>
@@ -3692,25 +4137,7 @@
         <w:rPr>
           <w:lang w:val="en-US"/>
         </w:rPr>
-        <w:t>“Value if true</w:t>
-      </w:r>
-      <w:r>
-        <w:rPr>
-          <w:lang w:val="en-US"/>
-        </w:rPr>
-        <w:t>3</w:t>
-      </w:r>
-      <w:r>
-        <w:rPr>
-          <w:lang w:val="en-US"/>
-        </w:rPr>
-        <w:t>”</w:t>
-      </w:r>
-      <w:r>
-        <w:rPr>
-          <w:lang w:val="en-US"/>
-        </w:rPr>
-        <w:t>)</w:t>
+        <w:t>“Value if true3”)</w:t>
       </w:r>
     </w:p>
     <w:p>
@@ -3731,9 +4158,11 @@
       <w:pPr>
         <w:pStyle w:val="Heading2"/>
       </w:pPr>
+      <w:bookmarkStart w:id="11" w:name="_Toc232587015"/>
       <w:r>
         <w:t>2.4 Math Functions</w:t>
       </w:r>
+      <w:bookmarkEnd w:id="11"/>
     </w:p>
     <w:p/>
     <w:tbl>
@@ -3802,12 +4231,21 @@
             <w:pPr>
               <w:spacing w:after="160" w:line="259" w:lineRule="auto"/>
             </w:pPr>
+            <w:proofErr w:type="gramStart"/>
             <w:r>
               <w:rPr>
                 <w:b/>
                 <w:bCs/>
               </w:rPr>
-              <w:t>COUNT()</w:t>
+              <w:t>COUNT(</w:t>
+            </w:r>
+            <w:proofErr w:type="gramEnd"/>
+            <w:r>
+              <w:rPr>
+                <w:b/>
+                <w:bCs/>
+              </w:rPr>
+              <w:t>)</w:t>
             </w:r>
           </w:p>
         </w:tc>
@@ -3843,12 +4281,21 @@
             <w:pPr>
               <w:spacing w:after="160" w:line="259" w:lineRule="auto"/>
             </w:pPr>
+            <w:proofErr w:type="gramStart"/>
             <w:r>
               <w:rPr>
                 <w:b/>
                 <w:bCs/>
               </w:rPr>
-              <w:t>COUNTA()</w:t>
+              <w:t>COUNTA(</w:t>
+            </w:r>
+            <w:proofErr w:type="gramEnd"/>
+            <w:r>
+              <w:rPr>
+                <w:b/>
+                <w:bCs/>
+              </w:rPr>
+              <w:t>)</w:t>
             </w:r>
           </w:p>
         </w:tc>
@@ -3889,9 +4336,11 @@
       </w:r>
     </w:p>
     <w:p>
+      <w:proofErr w:type="gramStart"/>
       <w:r>
         <w:t>SUMIF(</w:t>
       </w:r>
+      <w:proofErr w:type="gramEnd"/>
       <w:r>
         <w:rPr>
           <w:i/>
@@ -3903,16 +4352,39 @@
       <w:r>
         <w:t xml:space="preserve">, </w:t>
       </w:r>
+      <w:proofErr w:type="gramStart"/>
       <w:r>
         <w:rPr>
           <w:i/>
           <w:iCs/>
           <w:color w:val="ED7D31" w:themeColor="accent2"/>
         </w:rPr>
-        <w:t>To match with?</w:t>
-      </w:r>
-      <w:r>
-        <w:t xml:space="preserve">, </w:t>
+        <w:t>To</w:t>
+      </w:r>
+      <w:proofErr w:type="gramEnd"/>
+      <w:r>
+        <w:rPr>
+          <w:i/>
+          <w:iCs/>
+          <w:color w:val="ED7D31" w:themeColor="accent2"/>
+        </w:rPr>
+        <w:t xml:space="preserve"> match </w:t>
+      </w:r>
+      <w:proofErr w:type="gramStart"/>
+      <w:r>
+        <w:rPr>
+          <w:i/>
+          <w:iCs/>
+          <w:color w:val="ED7D31" w:themeColor="accent2"/>
+        </w:rPr>
+        <w:t>with?</w:t>
+      </w:r>
+      <w:r>
+        <w:t>,</w:t>
+      </w:r>
+      <w:proofErr w:type="gramEnd"/>
+      <w:r>
+        <w:t xml:space="preserve"> </w:t>
       </w:r>
       <w:r>
         <w:rPr>
@@ -3936,9 +4408,11 @@
       </w:r>
     </w:p>
     <w:p>
+      <w:proofErr w:type="gramStart"/>
       <w:r>
         <w:t>SUMIFS(</w:t>
       </w:r>
+      <w:proofErr w:type="gramEnd"/>
       <w:r>
         <w:rPr>
           <w:i/>
@@ -3974,33 +4448,45 @@
       <w:r>
         <w:t xml:space="preserve">, </w:t>
       </w:r>
+      <w:proofErr w:type="gramStart"/>
       <w:r>
         <w:rPr>
           <w:i/>
           <w:iCs/>
           <w:color w:val="ED7D31" w:themeColor="accent2"/>
         </w:rPr>
-        <w:t>To match with</w:t>
-      </w:r>
+        <w:t>To</w:t>
+      </w:r>
+      <w:proofErr w:type="gramEnd"/>
       <w:r>
         <w:rPr>
           <w:i/>
           <w:iCs/>
           <w:color w:val="ED7D31" w:themeColor="accent2"/>
         </w:rPr>
-        <w:t>1</w:t>
-      </w:r>
+        <w:t xml:space="preserve"> match with</w:t>
+      </w:r>
+      <w:proofErr w:type="gramStart"/>
       <w:r>
         <w:rPr>
           <w:i/>
           <w:iCs/>
           <w:color w:val="ED7D31" w:themeColor="accent2"/>
         </w:rPr>
+        <w:t>1</w:t>
+      </w:r>
+      <w:r>
+        <w:rPr>
+          <w:i/>
+          <w:iCs/>
+          <w:color w:val="ED7D31" w:themeColor="accent2"/>
+        </w:rPr>
         <w:t>?</w:t>
       </w:r>
       <w:r>
         <w:t>,</w:t>
       </w:r>
+      <w:proofErr w:type="gramEnd"/>
       <w:r>
         <w:t xml:space="preserve"> </w:t>
       </w:r>
@@ -4023,21 +4509,23 @@
       <w:r>
         <w:t xml:space="preserve">, </w:t>
       </w:r>
+      <w:proofErr w:type="gramStart"/>
       <w:r>
         <w:rPr>
           <w:i/>
           <w:iCs/>
           <w:color w:val="ED7D31" w:themeColor="accent2"/>
         </w:rPr>
-        <w:t>To match with</w:t>
-      </w:r>
+        <w:t>To</w:t>
+      </w:r>
+      <w:proofErr w:type="gramEnd"/>
       <w:r>
         <w:rPr>
           <w:i/>
           <w:iCs/>
           <w:color w:val="ED7D31" w:themeColor="accent2"/>
         </w:rPr>
-        <w:t>2</w:t>
+        <w:t xml:space="preserve"> match with</w:t>
       </w:r>
       <w:r>
         <w:rPr>
@@ -4045,6 +4533,14 @@
           <w:iCs/>
           <w:color w:val="ED7D31" w:themeColor="accent2"/>
         </w:rPr>
+        <w:t>2</w:t>
+      </w:r>
+      <w:r>
+        <w:rPr>
+          <w:i/>
+          <w:iCs/>
+          <w:color w:val="ED7D31" w:themeColor="accent2"/>
+        </w:rPr>
         <w:t>?</w:t>
       </w:r>
       <w:r>
@@ -4066,6 +4562,512 @@
       </w:r>
       <w:r>
         <w:t xml:space="preserve"> MAXIFS:</w:t>
+      </w:r>
+    </w:p>
+    <w:p/>
+    <w:p>
+      <w:pPr>
+        <w:pStyle w:val="Heading2"/>
+      </w:pPr>
+      <w:bookmarkStart w:id="12" w:name="_Toc232587016"/>
+      <w:r>
+        <w:lastRenderedPageBreak/>
+        <w:t>2.5 Statistical Functions</w:t>
+      </w:r>
+      <w:bookmarkEnd w:id="12"/>
+    </w:p>
+    <w:p/>
+    <w:p>
+      <w:proofErr w:type="gramStart"/>
+      <w:r>
+        <w:t>Median</w:t>
+      </w:r>
+      <w:r>
+        <w:t>(</w:t>
+      </w:r>
+      <w:proofErr w:type="gramEnd"/>
+      <w:r>
+        <w:t xml:space="preserve">), </w:t>
+      </w:r>
+      <w:proofErr w:type="gramStart"/>
+      <w:r>
+        <w:t>Min() ,Max</w:t>
+      </w:r>
+      <w:proofErr w:type="gramEnd"/>
+      <w:r>
+        <w:t>()</w:t>
+      </w:r>
+    </w:p>
+    <w:p>
+      <w:r>
+        <w:t xml:space="preserve">STDEV </w:t>
+      </w:r>
+      <w:r>
+        <w:sym w:font="Wingdings" w:char="F0E0"/>
+      </w:r>
+      <w:r>
+        <w:t xml:space="preserve"> Standard Deviation</w:t>
+      </w:r>
+    </w:p>
+    <w:p/>
+    <w:p>
+      <w:r>
+        <w:sym w:font="Wingdings" w:char="F0E0"/>
+      </w:r>
+      <w:r>
+        <w:t xml:space="preserve"> </w:t>
+      </w:r>
+      <w:proofErr w:type="gramStart"/>
+      <w:r>
+        <w:t>Quartile.INC(</w:t>
+      </w:r>
+      <w:proofErr w:type="gramEnd"/>
+      <w:r>
+        <w:t>array,</w:t>
+      </w:r>
+      <w:r>
+        <w:t xml:space="preserve"> quartile)</w:t>
+      </w:r>
+    </w:p>
+    <w:p>
+      <w:r>
+        <w:sym w:font="Wingdings" w:char="F0E0"/>
+      </w:r>
+      <w:r>
+        <w:t xml:space="preserve"> </w:t>
+      </w:r>
+      <w:proofErr w:type="gramStart"/>
+      <w:r>
+        <w:t>Quartile.EXC(</w:t>
+      </w:r>
+      <w:proofErr w:type="gramEnd"/>
+      <w:r>
+        <w:t>array, quartile)</w:t>
+      </w:r>
+    </w:p>
+    <w:p/>
+    <w:p>
+      <w:r>
+        <w:sym w:font="Wingdings" w:char="F0E8"/>
+      </w:r>
+      <w:r>
+        <w:t xml:space="preserve"> Quartile Inclusive and Exclusive both provides same result, just the difference between them is </w:t>
+      </w:r>
+      <w:proofErr w:type="gramStart"/>
+      <w:r>
+        <w:t>Quartile.EXC(</w:t>
+      </w:r>
+      <w:proofErr w:type="gramEnd"/>
+      <w:r>
+        <w:t>) – excludes quartile 0 and 4 that MIN and MAX.</w:t>
+      </w:r>
+    </w:p>
+    <w:p/>
+    <w:p>
+      <w:pPr>
+        <w:rPr>
+          <w:b/>
+          <w:bCs/>
+          <w:i/>
+          <w:iCs/>
+          <w:u w:val="single"/>
+        </w:rPr>
+      </w:pPr>
+      <w:r>
+        <w:rPr>
+          <w:b/>
+          <w:bCs/>
+          <w:i/>
+          <w:iCs/>
+          <w:u w:val="single"/>
+        </w:rPr>
+        <w:t xml:space="preserve">Also: </w:t>
+      </w:r>
+    </w:p>
+    <w:p>
+      <w:r>
+        <w:t xml:space="preserve">quartile 0 = gives similar value to </w:t>
+      </w:r>
+      <w:proofErr w:type="gramStart"/>
+      <w:r>
+        <w:t>MIN(</w:t>
+      </w:r>
+      <w:proofErr w:type="gramEnd"/>
+      <w:r>
+        <w:t>)</w:t>
+      </w:r>
+    </w:p>
+    <w:p>
+      <w:r>
+        <w:t xml:space="preserve">quartile 4 = gives similar value to </w:t>
+      </w:r>
+      <w:proofErr w:type="gramStart"/>
+      <w:r>
+        <w:t>MAX(</w:t>
+      </w:r>
+      <w:proofErr w:type="gramEnd"/>
+      <w:r>
+        <w:t>)</w:t>
+      </w:r>
+    </w:p>
+    <w:p/>
+    <w:p/>
+    <w:p>
+      <w:r>
+        <w:sym w:font="Wingdings" w:char="F0E0"/>
+      </w:r>
+      <w:r>
+        <w:t xml:space="preserve"> =</w:t>
+      </w:r>
+      <w:proofErr w:type="gramStart"/>
+      <w:r>
+        <w:t>MODE(</w:t>
+      </w:r>
+      <w:proofErr w:type="gramEnd"/>
+      <w:r>
+        <w:t>)</w:t>
+      </w:r>
+    </w:p>
+    <w:p>
+      <w:r>
+        <w:t>In Excel, =</w:t>
+      </w:r>
+      <w:proofErr w:type="gramStart"/>
+      <w:r>
+        <w:t>MODE(</w:t>
+      </w:r>
+      <w:proofErr w:type="gramEnd"/>
+      <w:r>
+        <w:t xml:space="preserve">) is used to find the </w:t>
+      </w:r>
+      <w:r>
+        <w:rPr>
+          <w:b/>
+          <w:bCs/>
+        </w:rPr>
+        <w:t>most frequently occurring value</w:t>
+      </w:r>
+      <w:r>
+        <w:t xml:space="preserve"> in a range of numbers.</w:t>
+      </w:r>
+    </w:p>
+    <w:p/>
+    <w:p>
+      <w:pPr>
+        <w:rPr>
+          <w:b/>
+          <w:bCs/>
+        </w:rPr>
+      </w:pPr>
+      <w:r>
+        <w:rPr>
+          <w:b/>
+          <w:bCs/>
+        </w:rPr>
+        <w:t>Example</w:t>
+      </w:r>
+    </w:p>
+    <w:p>
+      <w:r>
+        <w:t>If cells A1:A6 contain:</w:t>
+      </w:r>
+    </w:p>
+    <w:tbl>
+      <w:tblPr>
+        <w:tblStyle w:val="TableGridLight"/>
+        <w:tblW w:w="0" w:type="auto"/>
+        <w:tblLook w:val="04A0" w:firstRow="1" w:lastRow="0" w:firstColumn="1" w:lastColumn="0" w:noHBand="0" w:noVBand="1"/>
+      </w:tblPr>
+      <w:tblGrid>
+        <w:gridCol w:w="336"/>
+        <w:gridCol w:w="456"/>
+      </w:tblGrid>
+      <w:tr>
+        <w:tc>
+          <w:tcPr>
+            <w:tcW w:w="0" w:type="auto"/>
+            <w:shd w:val="clear" w:color="auto" w:fill="E7E6E6" w:themeFill="background2"/>
+          </w:tcPr>
+          <w:p>
+            <w:pPr>
+              <w:rPr>
+                <w:b/>
+                <w:bCs/>
+              </w:rPr>
+            </w:pPr>
+          </w:p>
+        </w:tc>
+        <w:tc>
+          <w:tcPr>
+            <w:tcW w:w="0" w:type="auto"/>
+            <w:hideMark/>
+          </w:tcPr>
+          <w:p>
+            <w:pPr>
+              <w:spacing w:after="160" w:line="259" w:lineRule="auto"/>
+              <w:rPr>
+                <w:b/>
+                <w:bCs/>
+              </w:rPr>
+            </w:pPr>
+            <w:r>
+              <w:rPr>
+                <w:b/>
+                <w:bCs/>
+              </w:rPr>
+              <w:t>A</w:t>
+            </w:r>
+          </w:p>
+        </w:tc>
+      </w:tr>
+      <w:tr>
+        <w:tc>
+          <w:tcPr>
+            <w:tcW w:w="0" w:type="auto"/>
+          </w:tcPr>
+          <w:p>
+            <w:r>
+              <w:t>1</w:t>
+            </w:r>
+          </w:p>
+        </w:tc>
+        <w:tc>
+          <w:tcPr>
+            <w:tcW w:w="0" w:type="auto"/>
+            <w:hideMark/>
+          </w:tcPr>
+          <w:p>
+            <w:pPr>
+              <w:spacing w:after="160" w:line="259" w:lineRule="auto"/>
+            </w:pPr>
+            <w:r>
+              <w:t>10</w:t>
+            </w:r>
+          </w:p>
+        </w:tc>
+      </w:tr>
+      <w:tr>
+        <w:tc>
+          <w:tcPr>
+            <w:tcW w:w="0" w:type="auto"/>
+          </w:tcPr>
+          <w:p>
+            <w:r>
+              <w:t>2</w:t>
+            </w:r>
+          </w:p>
+        </w:tc>
+        <w:tc>
+          <w:tcPr>
+            <w:tcW w:w="0" w:type="auto"/>
+            <w:hideMark/>
+          </w:tcPr>
+          <w:p>
+            <w:pPr>
+              <w:spacing w:after="160" w:line="259" w:lineRule="auto"/>
+            </w:pPr>
+            <w:r>
+              <w:t>20</w:t>
+            </w:r>
+          </w:p>
+        </w:tc>
+      </w:tr>
+      <w:tr>
+        <w:tc>
+          <w:tcPr>
+            <w:tcW w:w="0" w:type="auto"/>
+          </w:tcPr>
+          <w:p>
+            <w:r>
+              <w:t>3</w:t>
+            </w:r>
+          </w:p>
+        </w:tc>
+        <w:tc>
+          <w:tcPr>
+            <w:tcW w:w="0" w:type="auto"/>
+            <w:hideMark/>
+          </w:tcPr>
+          <w:p>
+            <w:pPr>
+              <w:spacing w:after="160" w:line="259" w:lineRule="auto"/>
+            </w:pPr>
+            <w:r>
+              <w:t>20</w:t>
+            </w:r>
+          </w:p>
+        </w:tc>
+      </w:tr>
+      <w:tr>
+        <w:tc>
+          <w:tcPr>
+            <w:tcW w:w="0" w:type="auto"/>
+          </w:tcPr>
+          <w:p>
+            <w:r>
+              <w:t>4</w:t>
+            </w:r>
+          </w:p>
+        </w:tc>
+        <w:tc>
+          <w:tcPr>
+            <w:tcW w:w="0" w:type="auto"/>
+            <w:hideMark/>
+          </w:tcPr>
+          <w:p>
+            <w:pPr>
+              <w:spacing w:after="160" w:line="259" w:lineRule="auto"/>
+            </w:pPr>
+            <w:r>
+              <w:t>30</w:t>
+            </w:r>
+          </w:p>
+        </w:tc>
+      </w:tr>
+      <w:tr>
+        <w:tc>
+          <w:tcPr>
+            <w:tcW w:w="0" w:type="auto"/>
+          </w:tcPr>
+          <w:p>
+            <w:r>
+              <w:t>5</w:t>
+            </w:r>
+          </w:p>
+        </w:tc>
+        <w:tc>
+          <w:tcPr>
+            <w:tcW w:w="0" w:type="auto"/>
+            <w:hideMark/>
+          </w:tcPr>
+          <w:p>
+            <w:pPr>
+              <w:spacing w:after="160" w:line="259" w:lineRule="auto"/>
+            </w:pPr>
+            <w:r>
+              <w:t>20</w:t>
+            </w:r>
+          </w:p>
+        </w:tc>
+      </w:tr>
+      <w:tr>
+        <w:tc>
+          <w:tcPr>
+            <w:tcW w:w="0" w:type="auto"/>
+          </w:tcPr>
+          <w:p>
+            <w:r>
+              <w:t>6</w:t>
+            </w:r>
+          </w:p>
+        </w:tc>
+        <w:tc>
+          <w:tcPr>
+            <w:tcW w:w="0" w:type="auto"/>
+            <w:hideMark/>
+          </w:tcPr>
+          <w:p>
+            <w:pPr>
+              <w:spacing w:after="160" w:line="259" w:lineRule="auto"/>
+            </w:pPr>
+            <w:r>
+              <w:t>40</w:t>
+            </w:r>
+          </w:p>
+        </w:tc>
+      </w:tr>
+    </w:tbl>
+    <w:p/>
+    <w:p>
+      <w:r>
+        <w:t>=</w:t>
+      </w:r>
+      <w:proofErr w:type="gramStart"/>
+      <w:r>
+        <w:t>MODE(</w:t>
+      </w:r>
+      <w:proofErr w:type="gramEnd"/>
+      <w:r>
+        <w:t>A1:A6)</w:t>
+      </w:r>
+    </w:p>
+    <w:p>
+      <w:r>
+        <w:rPr>
+          <w:b/>
+          <w:bCs/>
+          <w:i/>
+          <w:iCs/>
+          <w:u w:val="single"/>
+        </w:rPr>
+        <w:lastRenderedPageBreak/>
+        <w:t>RESULT:</w:t>
+      </w:r>
+      <w:r>
+        <w:t xml:space="preserve"> </w:t>
+      </w:r>
+      <w:r>
+        <w:t>20</w:t>
+      </w:r>
+    </w:p>
+    <w:p/>
+    <w:p/>
+    <w:p>
+      <w:r>
+        <w:rPr>
+          <w:b/>
+          <w:bCs/>
+        </w:rPr>
+        <w:sym w:font="Wingdings" w:char="F0E0"/>
+      </w:r>
+      <w:r>
+        <w:rPr>
+          <w:b/>
+          <w:bCs/>
+        </w:rPr>
+        <w:t xml:space="preserve"> </w:t>
+      </w:r>
+      <w:proofErr w:type="gramStart"/>
+      <w:r>
+        <w:rPr>
+          <w:b/>
+          <w:bCs/>
+        </w:rPr>
+        <w:t>RANK(</w:t>
+      </w:r>
+      <w:proofErr w:type="gramEnd"/>
+      <w:r>
+        <w:rPr>
+          <w:b/>
+          <w:bCs/>
+        </w:rPr>
+        <w:t>):</w:t>
+      </w:r>
+      <w:r>
+        <w:t xml:space="preserve"> </w:t>
+      </w:r>
+    </w:p>
+    <w:p>
+      <w:r>
+        <w:t>We can also rank the columns based on (let’s a salary)</w:t>
+      </w:r>
+    </w:p>
+    <w:p>
+      <w:proofErr w:type="gramStart"/>
+      <w:r>
+        <w:t>RANK(</w:t>
+      </w:r>
+      <w:proofErr w:type="gramEnd"/>
+      <w:r>
+        <w:t xml:space="preserve">current cell’s rank </w:t>
+      </w:r>
+      <w:proofErr w:type="gramStart"/>
+      <w:r>
+        <w:t>reference,  All</w:t>
+      </w:r>
+      <w:proofErr w:type="gramEnd"/>
+      <w:r>
+        <w:t xml:space="preserve"> the values (Array - Range))</w:t>
       </w:r>
     </w:p>
     <w:sectPr>
@@ -5891,6 +6893,25 @@
       </w:tblBorders>
     </w:tblPr>
   </w:style>
+  <w:style w:type="table" w:styleId="TableGridLight">
+    <w:name w:val="Grid Table Light"/>
+    <w:basedOn w:val="TableNormal"/>
+    <w:uiPriority w:val="40"/>
+    <w:rsid w:val="000854A2"/>
+    <w:pPr>
+      <w:spacing w:after="0" w:line="240" w:lineRule="auto"/>
+    </w:pPr>
+    <w:tblPr>
+      <w:tblBorders>
+        <w:top w:val="single" w:sz="4" w:space="0" w:color="BFBFBF" w:themeColor="background1" w:themeShade="BF"/>
+        <w:left w:val="single" w:sz="4" w:space="0" w:color="BFBFBF" w:themeColor="background1" w:themeShade="BF"/>
+        <w:bottom w:val="single" w:sz="4" w:space="0" w:color="BFBFBF" w:themeColor="background1" w:themeShade="BF"/>
+        <w:right w:val="single" w:sz="4" w:space="0" w:color="BFBFBF" w:themeColor="background1" w:themeShade="BF"/>
+        <w:insideH w:val="single" w:sz="4" w:space="0" w:color="BFBFBF" w:themeColor="background1" w:themeShade="BF"/>
+        <w:insideV w:val="single" w:sz="4" w:space="0" w:color="BFBFBF" w:themeColor="background1" w:themeShade="BF"/>
+      </w:tblBorders>
+    </w:tblPr>
+  </w:style>
 </w:styles>
 </file>
 

</xml_diff>

<commit_message>
2.6 Array Formulas Completed
</commit_message>
<xml_diff>
--- a/Notes.docx
+++ b/Notes.docx
@@ -80,7 +80,7 @@
           <w:r>
             <w:fldChar w:fldCharType="separate"/>
           </w:r>
-          <w:hyperlink w:anchor="_Toc232587004" w:history="1">
+          <w:hyperlink w:anchor="_Toc232598977" w:history="1">
             <w:r>
               <w:rPr>
                 <w:rStyle w:val="Hyperlink"/>
@@ -124,7 +124,7 @@
                 <w:noProof/>
                 <w:webHidden/>
               </w:rPr>
-              <w:instrText xml:space="preserve"> PAGEREF _Toc232587004 \h </w:instrText>
+              <w:instrText xml:space="preserve"> PAGEREF _Toc232598977 \h </w:instrText>
             </w:r>
             <w:r>
               <w:rPr>
@@ -168,7 +168,7 @@
               <w:lang w:eastAsia="en-IN" w:bidi="gu-IN"/>
             </w:rPr>
           </w:pPr>
-          <w:hyperlink w:anchor="_Toc232587005" w:history="1">
+          <w:hyperlink w:anchor="_Toc232598978" w:history="1">
             <w:r>
               <w:rPr>
                 <w:rStyle w:val="Hyperlink"/>
@@ -196,7 +196,7 @@
                 <w:noProof/>
                 <w:webHidden/>
               </w:rPr>
-              <w:instrText xml:space="preserve"> PAGEREF _Toc232587005 \h </w:instrText>
+              <w:instrText xml:space="preserve"> PAGEREF _Toc232598978 \h </w:instrText>
             </w:r>
             <w:r>
               <w:rPr>
@@ -241,7 +241,7 @@
               <w:lang w:eastAsia="en-IN" w:bidi="gu-IN"/>
             </w:rPr>
           </w:pPr>
-          <w:hyperlink w:anchor="_Toc232587006" w:history="1">
+          <w:hyperlink w:anchor="_Toc232598979" w:history="1">
             <w:r>
               <w:rPr>
                 <w:rStyle w:val="Hyperlink"/>
@@ -286,7 +286,7 @@
                 <w:noProof/>
                 <w:webHidden/>
               </w:rPr>
-              <w:instrText xml:space="preserve"> PAGEREF _Toc232587006 \h </w:instrText>
+              <w:instrText xml:space="preserve"> PAGEREF _Toc232598979 \h </w:instrText>
             </w:r>
             <w:r>
               <w:rPr>
@@ -330,7 +330,7 @@
               <w:lang w:eastAsia="en-IN" w:bidi="gu-IN"/>
             </w:rPr>
           </w:pPr>
-          <w:hyperlink w:anchor="_Toc232587007" w:history="1">
+          <w:hyperlink w:anchor="_Toc232598980" w:history="1">
             <w:r>
               <w:rPr>
                 <w:rStyle w:val="Hyperlink"/>
@@ -358,7 +358,7 @@
                 <w:noProof/>
                 <w:webHidden/>
               </w:rPr>
-              <w:instrText xml:space="preserve"> PAGEREF _Toc232587007 \h </w:instrText>
+              <w:instrText xml:space="preserve"> PAGEREF _Toc232598980 \h </w:instrText>
             </w:r>
             <w:r>
               <w:rPr>
@@ -402,7 +402,7 @@
               <w:lang w:eastAsia="en-IN" w:bidi="gu-IN"/>
             </w:rPr>
           </w:pPr>
-          <w:hyperlink w:anchor="_Toc232587008" w:history="1">
+          <w:hyperlink w:anchor="_Toc232598981" w:history="1">
             <w:r>
               <w:rPr>
                 <w:rStyle w:val="Hyperlink"/>
@@ -430,7 +430,7 @@
                 <w:noProof/>
                 <w:webHidden/>
               </w:rPr>
-              <w:instrText xml:space="preserve"> PAGEREF _Toc232587008 \h </w:instrText>
+              <w:instrText xml:space="preserve"> PAGEREF _Toc232598981 \h </w:instrText>
             </w:r>
             <w:r>
               <w:rPr>
@@ -475,7 +475,7 @@
               <w:lang w:eastAsia="en-IN" w:bidi="gu-IN"/>
             </w:rPr>
           </w:pPr>
-          <w:hyperlink w:anchor="_Toc232587009" w:history="1">
+          <w:hyperlink w:anchor="_Toc232598982" w:history="1">
             <w:r>
               <w:rPr>
                 <w:rStyle w:val="Hyperlink"/>
@@ -520,7 +520,7 @@
                 <w:noProof/>
                 <w:webHidden/>
               </w:rPr>
-              <w:instrText xml:space="preserve"> PAGEREF _Toc232587009 \h </w:instrText>
+              <w:instrText xml:space="preserve"> PAGEREF _Toc232598982 \h </w:instrText>
             </w:r>
             <w:r>
               <w:rPr>
@@ -565,7 +565,7 @@
               <w:lang w:eastAsia="en-IN" w:bidi="gu-IN"/>
             </w:rPr>
           </w:pPr>
-          <w:hyperlink w:anchor="_Toc232587010" w:history="1">
+          <w:hyperlink w:anchor="_Toc232598983" w:history="1">
             <w:r>
               <w:rPr>
                 <w:rStyle w:val="Hyperlink"/>
@@ -610,7 +610,7 @@
                 <w:noProof/>
                 <w:webHidden/>
               </w:rPr>
-              <w:instrText xml:space="preserve"> PAGEREF _Toc232587010 \h </w:instrText>
+              <w:instrText xml:space="preserve"> PAGEREF _Toc232598983 \h </w:instrText>
             </w:r>
             <w:r>
               <w:rPr>
@@ -654,7 +654,7 @@
               <w:lang w:eastAsia="en-IN" w:bidi="gu-IN"/>
             </w:rPr>
           </w:pPr>
-          <w:hyperlink w:anchor="_Toc232587011" w:history="1">
+          <w:hyperlink w:anchor="_Toc232598984" w:history="1">
             <w:r>
               <w:rPr>
                 <w:rStyle w:val="Hyperlink"/>
@@ -682,7 +682,7 @@
                 <w:noProof/>
                 <w:webHidden/>
               </w:rPr>
-              <w:instrText xml:space="preserve"> PAGEREF _Toc232587011 \h </w:instrText>
+              <w:instrText xml:space="preserve"> PAGEREF _Toc232598984 \h </w:instrText>
             </w:r>
             <w:r>
               <w:rPr>
@@ -726,7 +726,7 @@
               <w:lang w:eastAsia="en-IN" w:bidi="gu-IN"/>
             </w:rPr>
           </w:pPr>
-          <w:hyperlink w:anchor="_Toc232587012" w:history="1">
+          <w:hyperlink w:anchor="_Toc232598985" w:history="1">
             <w:r>
               <w:rPr>
                 <w:rStyle w:val="Hyperlink"/>
@@ -754,7 +754,7 @@
                 <w:noProof/>
                 <w:webHidden/>
               </w:rPr>
-              <w:instrText xml:space="preserve"> PAGEREF _Toc232587012 \h </w:instrText>
+              <w:instrText xml:space="preserve"> PAGEREF _Toc232598985 \h </w:instrText>
             </w:r>
             <w:r>
               <w:rPr>
@@ -798,7 +798,7 @@
               <w:lang w:eastAsia="en-IN" w:bidi="gu-IN"/>
             </w:rPr>
           </w:pPr>
-          <w:hyperlink w:anchor="_Toc232587013" w:history="1">
+          <w:hyperlink w:anchor="_Toc232598986" w:history="1">
             <w:r>
               <w:rPr>
                 <w:rStyle w:val="Hyperlink"/>
@@ -826,7 +826,7 @@
                 <w:noProof/>
                 <w:webHidden/>
               </w:rPr>
-              <w:instrText xml:space="preserve"> PAGEREF _Toc232587013 \h </w:instrText>
+              <w:instrText xml:space="preserve"> PAGEREF _Toc232598986 \h </w:instrText>
             </w:r>
             <w:r>
               <w:rPr>
@@ -870,7 +870,7 @@
               <w:lang w:eastAsia="en-IN" w:bidi="gu-IN"/>
             </w:rPr>
           </w:pPr>
-          <w:hyperlink w:anchor="_Toc232587014" w:history="1">
+          <w:hyperlink w:anchor="_Toc232598987" w:history="1">
             <w:r>
               <w:rPr>
                 <w:rStyle w:val="Hyperlink"/>
@@ -898,7 +898,7 @@
                 <w:noProof/>
                 <w:webHidden/>
               </w:rPr>
-              <w:instrText xml:space="preserve"> PAGEREF _Toc232587014 \h </w:instrText>
+              <w:instrText xml:space="preserve"> PAGEREF _Toc232598987 \h </w:instrText>
             </w:r>
             <w:r>
               <w:rPr>
@@ -942,7 +942,7 @@
               <w:lang w:eastAsia="en-IN" w:bidi="gu-IN"/>
             </w:rPr>
           </w:pPr>
-          <w:hyperlink w:anchor="_Toc232587015" w:history="1">
+          <w:hyperlink w:anchor="_Toc232598988" w:history="1">
             <w:r>
               <w:rPr>
                 <w:rStyle w:val="Hyperlink"/>
@@ -969,7 +969,7 @@
                 <w:noProof/>
                 <w:webHidden/>
               </w:rPr>
-              <w:instrText xml:space="preserve"> PAGEREF _Toc232587015 \h </w:instrText>
+              <w:instrText xml:space="preserve"> PAGEREF _Toc232598988 \h </w:instrText>
             </w:r>
             <w:r>
               <w:rPr>
@@ -1013,7 +1013,7 @@
               <w:lang w:eastAsia="en-IN" w:bidi="gu-IN"/>
             </w:rPr>
           </w:pPr>
-          <w:hyperlink w:anchor="_Toc232587016" w:history="1">
+          <w:hyperlink w:anchor="_Toc232598989" w:history="1">
             <w:r>
               <w:rPr>
                 <w:rStyle w:val="Hyperlink"/>
@@ -1040,7 +1040,7 @@
                 <w:noProof/>
                 <w:webHidden/>
               </w:rPr>
-              <w:instrText xml:space="preserve"> PAGEREF _Toc232587016 \h </w:instrText>
+              <w:instrText xml:space="preserve"> PAGEREF _Toc232598989 \h </w:instrText>
             </w:r>
             <w:r>
               <w:rPr>
@@ -1061,6 +1061,77 @@
                 <w:webHidden/>
               </w:rPr>
               <w:t>11</w:t>
+            </w:r>
+            <w:r>
+              <w:rPr>
+                <w:noProof/>
+                <w:webHidden/>
+              </w:rPr>
+              <w:fldChar w:fldCharType="end"/>
+            </w:r>
+          </w:hyperlink>
+        </w:p>
+        <w:p>
+          <w:pPr>
+            <w:pStyle w:val="TOC2"/>
+            <w:tabs>
+              <w:tab w:val="right" w:leader="dot" w:pos="9016"/>
+            </w:tabs>
+            <w:rPr>
+              <w:rFonts w:asciiTheme="minorHAnsi" w:eastAsiaTheme="minorEastAsia" w:hAnsiTheme="minorHAnsi"/>
+              <w:noProof/>
+              <w:szCs w:val="24"/>
+              <w:lang w:eastAsia="en-IN" w:bidi="gu-IN"/>
+            </w:rPr>
+          </w:pPr>
+          <w:hyperlink w:anchor="_Toc232598990" w:history="1">
+            <w:r>
+              <w:rPr>
+                <w:rStyle w:val="Hyperlink"/>
+                <w:noProof/>
+              </w:rPr>
+              <w:t>2.6 Array Formulas</w:t>
+            </w:r>
+            <w:r>
+              <w:rPr>
+                <w:noProof/>
+                <w:webHidden/>
+              </w:rPr>
+              <w:tab/>
+            </w:r>
+            <w:r>
+              <w:rPr>
+                <w:noProof/>
+                <w:webHidden/>
+              </w:rPr>
+              <w:fldChar w:fldCharType="begin"/>
+            </w:r>
+            <w:r>
+              <w:rPr>
+                <w:noProof/>
+                <w:webHidden/>
+              </w:rPr>
+              <w:instrText xml:space="preserve"> PAGEREF _Toc232598990 \h </w:instrText>
+            </w:r>
+            <w:r>
+              <w:rPr>
+                <w:noProof/>
+                <w:webHidden/>
+              </w:rPr>
+            </w:r>
+            <w:r>
+              <w:rPr>
+                <w:noProof/>
+                <w:webHidden/>
+              </w:rPr>
+              <w:fldChar w:fldCharType="separate"/>
+            </w:r>
+            <w:r>
+              <w:rPr>
+                <w:noProof/>
+                <w:webHidden/>
+              </w:rPr>
+              <w:t>12</w:t>
             </w:r>
             <w:r>
               <w:rPr>
@@ -1112,7 +1183,7 @@
         </w:numPr>
         <w:ind w:left="420" w:hanging="420"/>
       </w:pPr>
-      <w:bookmarkStart w:id="0" w:name="_Toc232587004"/>
+      <w:bookmarkStart w:id="0" w:name="_Toc232598977"/>
       <w:r>
         <w:t>Short Cuts</w:t>
       </w:r>
@@ -1163,7 +1234,7 @@
           <w:lang w:val="en-US"/>
         </w:rPr>
       </w:pPr>
-      <w:bookmarkStart w:id="1" w:name="_Toc232587005"/>
+      <w:bookmarkStart w:id="1" w:name="_Toc232598978"/>
       <w:r>
         <w:rPr>
           <w:lang w:val="en-US"/>
@@ -1210,7 +1281,7 @@
           <w:lang w:val="en-US"/>
         </w:rPr>
       </w:pPr>
-      <w:bookmarkStart w:id="2" w:name="_Toc232587006"/>
+      <w:bookmarkStart w:id="2" w:name="_Toc232598979"/>
       <w:r>
         <w:rPr>
           <w:lang w:val="en-US"/>
@@ -1321,7 +1392,7 @@
           <w:lang w:val="en-US"/>
         </w:rPr>
       </w:pPr>
-      <w:bookmarkStart w:id="3" w:name="_Toc232587007"/>
+      <w:bookmarkStart w:id="3" w:name="_Toc232598980"/>
       <w:r>
         <w:rPr>
           <w:lang w:val="en-US"/>
@@ -1471,7 +1542,7 @@
           <w:lang w:val="en-US"/>
         </w:rPr>
       </w:pPr>
-      <w:bookmarkStart w:id="4" w:name="_Toc232587008"/>
+      <w:bookmarkStart w:id="4" w:name="_Toc232598981"/>
       <w:r>
         <w:rPr>
           <w:lang w:val="en-US"/>
@@ -1749,7 +1820,7 @@
         </w:rPr>
         <w:br w:type="page"/>
       </w:r>
-      <w:bookmarkStart w:id="5" w:name="_Toc232587009"/>
+      <w:bookmarkStart w:id="5" w:name="_Toc232598982"/>
       <w:r>
         <w:rPr>
           <w:lang w:val="en-US"/>
@@ -2269,7 +2340,7 @@
         </w:rPr>
         <w:br w:type="page"/>
       </w:r>
-      <w:bookmarkStart w:id="6" w:name="_Toc232587010"/>
+      <w:bookmarkStart w:id="6" w:name="_Toc232598983"/>
       <w:r>
         <w:rPr>
           <w:lang w:val="en-US"/>
@@ -2929,7 +3000,7 @@
           <w:lang w:val="en-US"/>
         </w:rPr>
       </w:pPr>
-      <w:bookmarkStart w:id="7" w:name="_Toc232587011"/>
+      <w:bookmarkStart w:id="7" w:name="_Toc232598984"/>
       <w:r>
         <w:rPr>
           <w:lang w:val="en-US"/>
@@ -2952,7 +3023,7 @@
           <w:lang w:val="en-US"/>
         </w:rPr>
       </w:pPr>
-      <w:bookmarkStart w:id="8" w:name="_Toc232587012"/>
+      <w:bookmarkStart w:id="8" w:name="_Toc232598985"/>
       <w:r>
         <w:rPr>
           <w:lang w:val="en-US"/>
@@ -3244,6 +3315,105 @@
     <w:p>
       <w:pPr>
         <w:rPr>
+          <w:b/>
+          <w:bCs/>
+          <w:i/>
+          <w:iCs/>
+          <w:color w:val="EE0000"/>
+          <w:u w:val="single"/>
+          <w:lang w:val="en-US"/>
+        </w:rPr>
+      </w:pPr>
+      <w:r>
+        <w:rPr>
+          <w:b/>
+          <w:bCs/>
+          <w:i/>
+          <w:iCs/>
+          <w:color w:val="EE0000"/>
+          <w:u w:val="single"/>
+          <w:lang w:val="en-US"/>
+        </w:rPr>
+        <w:t>NOTE:</w:t>
+      </w:r>
+    </w:p>
+    <w:p>
+      <w:pPr>
+        <w:rPr>
+          <w:lang w:val="en-US"/>
+        </w:rPr>
+      </w:pPr>
+      <w:r>
+        <w:rPr>
+          <w:lang w:val="en-US"/>
+        </w:rPr>
+        <w:t xml:space="preserve">If You want to Write function as a String, </w:t>
+      </w:r>
+      <w:proofErr w:type="gramStart"/>
+      <w:r>
+        <w:rPr>
+          <w:lang w:val="en-US"/>
+        </w:rPr>
+        <w:t>You</w:t>
+      </w:r>
+      <w:proofErr w:type="gramEnd"/>
+      <w:r>
+        <w:rPr>
+          <w:lang w:val="en-US"/>
+        </w:rPr>
+        <w:t xml:space="preserve"> can add one Quote ahead of that and insert it!</w:t>
+      </w:r>
+    </w:p>
+    <w:p>
+      <w:pPr>
+        <w:rPr>
+          <w:lang w:val="en-US"/>
+        </w:rPr>
+      </w:pPr>
+      <w:r>
+        <w:rPr>
+          <w:lang w:val="en-US"/>
+        </w:rPr>
+        <w:drawing>
+          <wp:inline distT="0" distB="0" distL="0" distR="0" wp14:anchorId="16557154" wp14:editId="66E95D35">
+            <wp:extent cx="2255715" cy="274344"/>
+            <wp:effectExtent l="0" t="0" r="0" b="0"/>
+            <wp:docPr id="1566186106" name="Picture 1"/>
+            <wp:cNvGraphicFramePr>
+              <a:graphicFrameLocks xmlns:a="http://schemas.openxmlformats.org/drawingml/2006/main" noChangeAspect="1"/>
+            </wp:cNvGraphicFramePr>
+            <a:graphic xmlns:a="http://schemas.openxmlformats.org/drawingml/2006/main">
+              <a:graphicData uri="http://schemas.openxmlformats.org/drawingml/2006/picture">
+                <pic:pic xmlns:pic="http://schemas.openxmlformats.org/drawingml/2006/picture">
+                  <pic:nvPicPr>
+                    <pic:cNvPr id="1566186106" name=""/>
+                    <pic:cNvPicPr/>
+                  </pic:nvPicPr>
+                  <pic:blipFill>
+                    <a:blip r:embed="rId16"/>
+                    <a:stretch>
+                      <a:fillRect/>
+                    </a:stretch>
+                  </pic:blipFill>
+                  <pic:spPr>
+                    <a:xfrm>
+                      <a:off x="0" y="0"/>
+                      <a:ext cx="2255715" cy="274344"/>
+                    </a:xfrm>
+                    <a:prstGeom prst="rect">
+                      <a:avLst/>
+                    </a:prstGeom>
+                  </pic:spPr>
+                </pic:pic>
+              </a:graphicData>
+            </a:graphic>
+          </wp:inline>
+        </w:drawing>
+      </w:r>
+    </w:p>
+    <w:p>
+      <w:pPr>
+        <w:rPr>
           <w:lang w:val="en-US"/>
         </w:rPr>
       </w:pPr>
@@ -3255,7 +3425,7 @@
           <w:lang w:val="en-US"/>
         </w:rPr>
       </w:pPr>
-      <w:bookmarkStart w:id="9" w:name="_Toc232587013"/>
+      <w:bookmarkStart w:id="9" w:name="_Toc232598986"/>
       <w:r>
         <w:rPr>
           <w:lang w:val="en-US"/>
@@ -3386,6 +3556,7 @@
           <w:noProof/>
           <w:lang w:val="en-US"/>
         </w:rPr>
+        <w:lastRenderedPageBreak/>
         <mc:AlternateContent>
           <mc:Choice Requires="wps">
             <w:drawing>
@@ -3477,7 +3648,7 @@
                     <pic:cNvPicPr/>
                   </pic:nvPicPr>
                   <pic:blipFill>
-                    <a:blip r:embed="rId16"/>
+                    <a:blip r:embed="rId17"/>
                     <a:stretch>
                       <a:fillRect/>
                     </a:stretch>
@@ -3527,7 +3698,6 @@
         <w:rPr>
           <w:lang w:val="en-US"/>
         </w:rPr>
-        <w:lastRenderedPageBreak/>
         <w:t xml:space="preserve">If you face error like this: </w:t>
       </w:r>
       <w:proofErr w:type="gramStart"/>
@@ -3573,7 +3743,7 @@
                     <pic:cNvPicPr/>
                   </pic:nvPicPr>
                   <pic:blipFill>
-                    <a:blip r:embed="rId17"/>
+                    <a:blip r:embed="rId18"/>
                     <a:stretch>
                       <a:fillRect/>
                     </a:stretch>
@@ -3678,6 +3848,7 @@
         <w:rPr>
           <w:lang w:val="en-US"/>
         </w:rPr>
+        <w:lastRenderedPageBreak/>
         <w:t xml:space="preserve">If we want to Refer a cell inside complicated functions like </w:t>
       </w:r>
       <w:proofErr w:type="gramStart"/>
@@ -3736,7 +3907,7 @@
                     <pic:cNvPicPr/>
                   </pic:nvPicPr>
                   <pic:blipFill>
-                    <a:blip r:embed="rId18"/>
+                    <a:blip r:embed="rId19"/>
                     <a:stretch>
                       <a:fillRect/>
                     </a:stretch>
@@ -3805,12 +3976,11 @@
           <w:lang w:val="en-US"/>
         </w:rPr>
       </w:pPr>
-      <w:bookmarkStart w:id="10" w:name="_Toc232587014"/>
-      <w:r>
-        <w:rPr>
-          <w:lang w:val="en-US"/>
-        </w:rPr>
-        <w:lastRenderedPageBreak/>
+      <w:bookmarkStart w:id="10" w:name="_Toc232598987"/>
+      <w:r>
+        <w:rPr>
+          <w:lang w:val="en-US"/>
+        </w:rPr>
         <w:t>2.3 Logical Functions</w:t>
       </w:r>
       <w:bookmarkEnd w:id="10"/>
@@ -4158,7 +4328,7 @@
       <w:pPr>
         <w:pStyle w:val="Heading2"/>
       </w:pPr>
-      <w:bookmarkStart w:id="11" w:name="_Toc232587015"/>
+      <w:bookmarkStart w:id="11" w:name="_Toc232598988"/>
       <w:r>
         <w:t>2.4 Math Functions</w:t>
       </w:r>
@@ -4194,6 +4364,7 @@
                 <w:b/>
                 <w:bCs/>
               </w:rPr>
+              <w:lastRenderedPageBreak/>
               <w:t>Function</w:t>
             </w:r>
           </w:p>
@@ -4569,9 +4740,8 @@
       <w:pPr>
         <w:pStyle w:val="Heading2"/>
       </w:pPr>
-      <w:bookmarkStart w:id="12" w:name="_Toc232587016"/>
-      <w:r>
-        <w:lastRenderedPageBreak/>
+      <w:bookmarkStart w:id="12" w:name="_Toc232598989"/>
+      <w:r>
         <w:t>2.5 Statistical Functions</w:t>
       </w:r>
       <w:bookmarkEnd w:id="12"/>
@@ -4714,6 +4884,7 @@
     <w:p/>
     <w:p>
       <w:r>
+        <w:lastRenderedPageBreak/>
         <w:sym w:font="Wingdings" w:char="F0E0"/>
       </w:r>
       <w:r>
@@ -4729,6 +4900,11 @@
       </w:r>
     </w:p>
     <w:p>
+      <w:pPr>
+        <w:rPr>
+          <w:lang w:val="en-US"/>
+        </w:rPr>
+      </w:pPr>
       <w:r>
         <w:t>In Excel, =</w:t>
       </w:r>
@@ -5000,7 +5176,6 @@
           <w:iCs/>
           <w:u w:val="single"/>
         </w:rPr>
-        <w:lastRenderedPageBreak/>
         <w:t>RESULT:</w:t>
       </w:r>
       <w:r>
@@ -5059,17 +5234,714 @@
       </w:r>
       <w:proofErr w:type="gramEnd"/>
       <w:r>
-        <w:t xml:space="preserve">current cell’s rank </w:t>
+        <w:t>current cell’s rank reference, All the values (Array - Range))</w:t>
+      </w:r>
+    </w:p>
+    <w:p/>
+    <w:p/>
+    <w:p/>
+    <w:p>
+      <w:pPr>
+        <w:pStyle w:val="Heading2"/>
+      </w:pPr>
+      <w:bookmarkStart w:id="13" w:name="_Toc232598990"/>
+      <w:r>
+        <w:t>2.6 Array</w:t>
+      </w:r>
+      <w:r>
+        <w:t xml:space="preserve"> Formulas</w:t>
+      </w:r>
+      <w:bookmarkEnd w:id="13"/>
+    </w:p>
+    <w:p/>
+    <w:p>
+      <w:r>
+        <w:t>Modern (Dynamic) Arrays</w:t>
+      </w:r>
+      <w:r>
+        <w:t xml:space="preserve"> </w:t>
       </w:r>
       <w:proofErr w:type="gramStart"/>
       <w:r>
-        <w:t>reference,  All</w:t>
+        <w:t xml:space="preserve">| </w:t>
+      </w:r>
+      <w:r>
+        <w:t xml:space="preserve"> </w:t>
+      </w:r>
+      <w:r>
+        <w:rPr>
+          <w:b/>
+          <w:bCs/>
+          <w:i/>
+          <w:iCs/>
+          <w:color w:val="ED7D31" w:themeColor="accent2"/>
+        </w:rPr>
+        <w:t>VS</w:t>
       </w:r>
       <w:proofErr w:type="gramEnd"/>
       <w:r>
-        <w:t xml:space="preserve"> the values (Array - Range))</w:t>
-      </w:r>
-    </w:p>
+        <w:t xml:space="preserve"> </w:t>
+      </w:r>
+      <w:r>
+        <w:t xml:space="preserve"> </w:t>
+      </w:r>
+      <w:proofErr w:type="gramStart"/>
+      <w:r>
+        <w:t xml:space="preserve">| </w:t>
+      </w:r>
+      <w:r>
+        <w:t xml:space="preserve"> </w:t>
+      </w:r>
+      <w:r>
+        <w:t>Classic</w:t>
+      </w:r>
+      <w:proofErr w:type="gramEnd"/>
+      <w:r>
+        <w:t>(Old) Arrays</w:t>
+      </w:r>
+    </w:p>
+    <w:p/>
+    <w:p>
+      <w:r>
+        <w:t>Modern (Dynamic) Arrays:</w:t>
+      </w:r>
+    </w:p>
+    <w:p>
+      <w:pPr>
+        <w:pStyle w:val="ListParagraph"/>
+        <w:numPr>
+          <w:ilvl w:val="0"/>
+          <w:numId w:val="5"/>
+        </w:numPr>
+      </w:pPr>
+      <w:r>
+        <w:t>They are modern / new arrays</w:t>
+      </w:r>
+    </w:p>
+    <w:p>
+      <w:pPr>
+        <w:pStyle w:val="ListParagraph"/>
+        <w:numPr>
+          <w:ilvl w:val="0"/>
+          <w:numId w:val="5"/>
+        </w:numPr>
+      </w:pPr>
+      <w:r>
+        <w:t>It provides ease as compare to classic Arrays</w:t>
+      </w:r>
+    </w:p>
+    <w:p>
+      <w:pPr>
+        <w:pStyle w:val="ListParagraph"/>
+        <w:numPr>
+          <w:ilvl w:val="0"/>
+          <w:numId w:val="5"/>
+        </w:numPr>
+      </w:pPr>
+      <w:r>
+        <w:lastRenderedPageBreak/>
+        <w:t>Has simple formula</w:t>
+      </w:r>
+    </w:p>
+    <w:p>
+      <w:pPr>
+        <w:pStyle w:val="ListParagraph"/>
+        <w:numPr>
+          <w:ilvl w:val="0"/>
+          <w:numId w:val="5"/>
+        </w:numPr>
+      </w:pPr>
+      <w:r>
+        <w:t>E.g. =B2:B6</w:t>
+      </w:r>
+    </w:p>
+    <w:p>
+      <w:pPr>
+        <w:pStyle w:val="ListParagraph"/>
+        <w:numPr>
+          <w:ilvl w:val="0"/>
+          <w:numId w:val="5"/>
+        </w:numPr>
+      </w:pPr>
+      <w:r>
+        <w:t>Just need to press “Enter” after writing formula</w:t>
+      </w:r>
+    </w:p>
+    <w:p>
+      <w:pPr>
+        <w:pStyle w:val="ListParagraph"/>
+        <w:numPr>
+          <w:ilvl w:val="0"/>
+          <w:numId w:val="5"/>
+        </w:numPr>
+      </w:pPr>
+      <w:r>
+        <w:t xml:space="preserve">When you click on one of the </w:t>
+      </w:r>
+      <w:proofErr w:type="gramStart"/>
+      <w:r>
+        <w:t>cell</w:t>
+      </w:r>
+      <w:proofErr w:type="gramEnd"/>
+      <w:r>
+        <w:t xml:space="preserve"> in it </w:t>
+      </w:r>
+      <w:proofErr w:type="gramStart"/>
+      <w:r>
+        <w:t>-  borders</w:t>
+      </w:r>
+      <w:proofErr w:type="gramEnd"/>
+      <w:r>
+        <w:t xml:space="preserve"> becomes have some shadows (in excel)</w:t>
+      </w:r>
+    </w:p>
+    <w:p>
+      <w:pPr>
+        <w:pStyle w:val="ListParagraph"/>
+        <w:numPr>
+          <w:ilvl w:val="0"/>
+          <w:numId w:val="5"/>
+        </w:numPr>
+      </w:pPr>
+      <w:r>
+        <w:t>Directly write formula</w:t>
+      </w:r>
+    </w:p>
+    <w:p/>
+    <w:p>
+      <w:r>
+        <w:t>Classic (Old) Arrays:</w:t>
+      </w:r>
+    </w:p>
+    <w:p>
+      <w:pPr>
+        <w:pStyle w:val="ListParagraph"/>
+        <w:numPr>
+          <w:ilvl w:val="0"/>
+          <w:numId w:val="8"/>
+        </w:numPr>
+      </w:pPr>
+      <w:r>
+        <w:t>They are old arrays</w:t>
+      </w:r>
+    </w:p>
+    <w:p>
+      <w:pPr>
+        <w:pStyle w:val="ListParagraph"/>
+        <w:numPr>
+          <w:ilvl w:val="0"/>
+          <w:numId w:val="8"/>
+        </w:numPr>
+      </w:pPr>
+      <w:r>
+        <w:t>They are more complex</w:t>
+      </w:r>
+    </w:p>
+    <w:p>
+      <w:pPr>
+        <w:pStyle w:val="ListParagraph"/>
+        <w:numPr>
+          <w:ilvl w:val="0"/>
+          <w:numId w:val="8"/>
+        </w:numPr>
+      </w:pPr>
+      <w:r>
+        <w:t>Has complex formula</w:t>
+      </w:r>
+    </w:p>
+    <w:p>
+      <w:pPr>
+        <w:pStyle w:val="ListParagraph"/>
+        <w:numPr>
+          <w:ilvl w:val="0"/>
+          <w:numId w:val="8"/>
+        </w:numPr>
+      </w:pPr>
+      <w:r>
+        <w:t xml:space="preserve">E.g. </w:t>
+      </w:r>
+      <w:r>
+        <w:t>{=A2:A6</w:t>
+      </w:r>
+      <w:r>
+        <w:t>*B2:B6</w:t>
+      </w:r>
+      <w:r>
+        <w:t>}</w:t>
+      </w:r>
+    </w:p>
+    <w:p>
+      <w:pPr>
+        <w:pStyle w:val="ListParagraph"/>
+        <w:numPr>
+          <w:ilvl w:val="0"/>
+          <w:numId w:val="8"/>
+        </w:numPr>
+      </w:pPr>
+      <w:r>
+        <w:t>We need to press Ctrl + Shift + Enter after writing formula</w:t>
+      </w:r>
+    </w:p>
+    <w:p>
+      <w:pPr>
+        <w:pStyle w:val="ListParagraph"/>
+        <w:numPr>
+          <w:ilvl w:val="0"/>
+          <w:numId w:val="8"/>
+        </w:numPr>
+      </w:pPr>
+      <w:r>
+        <w:t>No shadows around border of table</w:t>
+      </w:r>
+    </w:p>
+    <w:p>
+      <w:pPr>
+        <w:pStyle w:val="ListParagraph"/>
+        <w:numPr>
+          <w:ilvl w:val="0"/>
+          <w:numId w:val="8"/>
+        </w:numPr>
+      </w:pPr>
+      <w:proofErr w:type="gramStart"/>
+      <w:r>
+        <w:t>First</w:t>
+      </w:r>
+      <w:proofErr w:type="gramEnd"/>
+      <w:r>
+        <w:t xml:space="preserve"> we need to select the cells and then need to write formula</w:t>
+      </w:r>
+    </w:p>
+    <w:p/>
+    <w:p/>
+    <w:p/>
+    <w:p/>
+    <w:p>
+      <w:r>
+        <w:sym w:font="Wingdings" w:char="F0E0"/>
+      </w:r>
+      <w:r>
+        <w:t xml:space="preserve"> =</w:t>
+      </w:r>
+      <w:proofErr w:type="gramStart"/>
+      <w:r>
+        <w:t>UNIQUE(</w:t>
+      </w:r>
+      <w:proofErr w:type="gramEnd"/>
+      <w:r>
+        <w:t>)</w:t>
+      </w:r>
+    </w:p>
+    <w:p>
+      <w:r>
+        <w:t>It will return all unique values once – It is like group by of SQL – just difference is it will return the values of group by (Distinct values)</w:t>
+      </w:r>
+    </w:p>
+    <w:p/>
+    <w:p/>
+    <w:p>
+      <w:r>
+        <w:sym w:font="Wingdings" w:char="F0E0"/>
+      </w:r>
+      <w:r>
+        <w:t xml:space="preserve"> =</w:t>
+      </w:r>
+      <w:proofErr w:type="gramStart"/>
+      <w:r>
+        <w:t>SORT(</w:t>
+      </w:r>
+      <w:proofErr w:type="gramEnd"/>
+      <w:r>
+        <w:t>range)</w:t>
+      </w:r>
+    </w:p>
+    <w:p>
+      <w:r>
+        <w:t>One term I learnt recently is Spill range.</w:t>
+      </w:r>
+    </w:p>
+    <w:p>
+      <w:proofErr w:type="gramStart"/>
+      <w:r>
+        <w:t>So</w:t>
+      </w:r>
+      <w:proofErr w:type="gramEnd"/>
+      <w:r>
+        <w:t xml:space="preserve"> specify here spill range</w:t>
+      </w:r>
+    </w:p>
+    <w:p/>
+    <w:p/>
+    <w:p>
+      <w:r>
+        <w:sym w:font="Wingdings" w:char="F0E0"/>
+      </w:r>
+      <w:r>
+        <w:t xml:space="preserve"> #SPILL</w:t>
+      </w:r>
+      <w:r>
+        <w:t>!</w:t>
+      </w:r>
+      <w:r>
+        <w:t xml:space="preserve"> – Error</w:t>
+      </w:r>
+    </w:p>
+    <w:p>
+      <w:r>
+        <w:t>When We have Spill</w:t>
+      </w:r>
+      <w:r>
+        <w:t xml:space="preserve">ed range, and if we try to change a single cell, then it will give us SPILL Error </w:t>
+      </w:r>
+      <w:proofErr w:type="gramStart"/>
+      <w:r>
+        <w:t>-  Because</w:t>
+      </w:r>
+      <w:proofErr w:type="gramEnd"/>
+      <w:r>
+        <w:t xml:space="preserve"> we are manually modifying the cell and destroying the consistency.</w:t>
+      </w:r>
+    </w:p>
+    <w:p/>
+    <w:p>
+      <w:r>
+        <w:t>#SPILL! is an Excel error that occurs when a formula wants to return multiple values (a spilled array), but Excel cannot place the results into the required cells.</w:t>
+      </w:r>
+    </w:p>
+    <w:p>
+      <w:r>
+        <w:lastRenderedPageBreak/>
+        <w:sym w:font="Wingdings" w:char="F0E0"/>
+      </w:r>
+      <w:proofErr w:type="gramStart"/>
+      <w:r>
+        <w:t>MEDIANIF(</w:t>
+      </w:r>
+      <w:proofErr w:type="gramEnd"/>
+      <w:r>
+        <w:t>):</w:t>
+      </w:r>
+    </w:p>
+    <w:p>
+      <w:r>
+        <w:t xml:space="preserve">By </w:t>
+      </w:r>
+      <w:proofErr w:type="gramStart"/>
+      <w:r>
+        <w:t>default</w:t>
+      </w:r>
+      <w:proofErr w:type="gramEnd"/>
+      <w:r>
+        <w:t xml:space="preserve"> Excel does not provide </w:t>
+      </w:r>
+      <w:proofErr w:type="gramStart"/>
+      <w:r>
+        <w:t>MEDIANIF(</w:t>
+      </w:r>
+      <w:proofErr w:type="gramEnd"/>
+      <w:r>
+        <w:t>), So to have that We need to put IF condition inside MEDIAN(</w:t>
+      </w:r>
+      <w:proofErr w:type="gramStart"/>
+      <w:r>
+        <w:t>IF(</w:t>
+      </w:r>
+      <w:proofErr w:type="gramEnd"/>
+      <w:r>
+        <w:t>))</w:t>
+      </w:r>
+    </w:p>
+    <w:p>
+      <w:r>
+        <w:t>E.g.</w:t>
+      </w:r>
+    </w:p>
+    <w:tbl>
+      <w:tblPr>
+        <w:tblStyle w:val="TableGrid"/>
+        <w:tblW w:w="0" w:type="auto"/>
+        <w:tblLook w:val="04A0" w:firstRow="1" w:lastRow="0" w:firstColumn="1" w:lastColumn="0" w:noHBand="0" w:noVBand="1"/>
+      </w:tblPr>
+      <w:tblGrid>
+        <w:gridCol w:w="9016"/>
+      </w:tblGrid>
+      <w:tr>
+        <w:tc>
+          <w:tcPr>
+            <w:tcW w:w="9016" w:type="dxa"/>
+            <w:shd w:val="clear" w:color="auto" w:fill="E7E6E6" w:themeFill="background2"/>
+          </w:tcPr>
+          <w:p>
+            <w:r>
+              <w:t>=MEDIAN(IF((</w:t>
+            </w:r>
+            <w:r>
+              <w:rPr>
+                <w:color w:val="4472C4" w:themeColor="accent1"/>
+              </w:rPr>
+              <w:t>$A$</w:t>
+            </w:r>
+            <w:proofErr w:type="gramStart"/>
+            <w:r>
+              <w:rPr>
+                <w:color w:val="4472C4" w:themeColor="accent1"/>
+              </w:rPr>
+              <w:t>2</w:t>
+            </w:r>
+            <w:r>
+              <w:t>:</w:t>
+            </w:r>
+            <w:r>
+              <w:rPr>
+                <w:color w:val="4472C4" w:themeColor="accent1"/>
+              </w:rPr>
+              <w:t>$</w:t>
+            </w:r>
+            <w:proofErr w:type="gramEnd"/>
+            <w:r>
+              <w:rPr>
+                <w:color w:val="4472C4" w:themeColor="accent1"/>
+              </w:rPr>
+              <w:t>A$32673</w:t>
+            </w:r>
+            <w:r>
+              <w:t>=</w:t>
+            </w:r>
+            <w:r>
+              <w:rPr>
+                <w:color w:val="EE0000"/>
+              </w:rPr>
+              <w:t>$AA</w:t>
+            </w:r>
+            <w:proofErr w:type="gramStart"/>
+            <w:r>
+              <w:rPr>
+                <w:color w:val="EE0000"/>
+              </w:rPr>
+              <w:t>2</w:t>
+            </w:r>
+            <w:r>
+              <w:t>)*</w:t>
+            </w:r>
+            <w:proofErr w:type="gramEnd"/>
+            <w:r>
+              <w:t>(</w:t>
+            </w:r>
+            <w:r>
+              <w:rPr>
+                <w:color w:val="7030A0"/>
+              </w:rPr>
+              <w:t>$M$</w:t>
+            </w:r>
+            <w:proofErr w:type="gramStart"/>
+            <w:r>
+              <w:rPr>
+                <w:color w:val="7030A0"/>
+              </w:rPr>
+              <w:t>2</w:t>
+            </w:r>
+            <w:r>
+              <w:t>:</w:t>
+            </w:r>
+            <w:r>
+              <w:rPr>
+                <w:color w:val="7030A0"/>
+              </w:rPr>
+              <w:t>$</w:t>
+            </w:r>
+            <w:proofErr w:type="gramEnd"/>
+            <w:r>
+              <w:rPr>
+                <w:color w:val="7030A0"/>
+              </w:rPr>
+              <w:t>M$32673</w:t>
+            </w:r>
+            <w:r>
+              <w:t>&lt;&gt;""</w:t>
+            </w:r>
+            <w:proofErr w:type="gramStart"/>
+            <w:r>
+              <w:t>),</w:t>
+            </w:r>
+            <w:r>
+              <w:rPr>
+                <w:color w:val="7030A0"/>
+              </w:rPr>
+              <w:t>$</w:t>
+            </w:r>
+            <w:proofErr w:type="gramEnd"/>
+            <w:r>
+              <w:rPr>
+                <w:color w:val="7030A0"/>
+              </w:rPr>
+              <w:t>M$</w:t>
+            </w:r>
+            <w:proofErr w:type="gramStart"/>
+            <w:r>
+              <w:rPr>
+                <w:color w:val="7030A0"/>
+              </w:rPr>
+              <w:t>2</w:t>
+            </w:r>
+            <w:r>
+              <w:t>:</w:t>
+            </w:r>
+            <w:r>
+              <w:rPr>
+                <w:color w:val="7030A0"/>
+              </w:rPr>
+              <w:t>$</w:t>
+            </w:r>
+            <w:proofErr w:type="gramEnd"/>
+            <w:r>
+              <w:rPr>
+                <w:color w:val="7030A0"/>
+              </w:rPr>
+              <w:t>M$32673</w:t>
+            </w:r>
+            <w:r>
+              <w:t>))</w:t>
+            </w:r>
+          </w:p>
+        </w:tc>
+      </w:tr>
+    </w:tbl>
+    <w:p/>
+    <w:p>
+      <w:r>
+        <w:t xml:space="preserve">This way we can work with </w:t>
+      </w:r>
+      <w:r>
+        <w:rPr>
+          <w:b/>
+          <w:bCs/>
+          <w:i/>
+          <w:iCs/>
+        </w:rPr>
+        <w:t>ANY</w:t>
+      </w:r>
+      <w:r>
+        <w:rPr>
+          <w:b/>
+          <w:bCs/>
+          <w:i/>
+          <w:iCs/>
+        </w:rPr>
+        <w:t xml:space="preserve"> </w:t>
+      </w:r>
+      <w:r>
+        <w:t xml:space="preserve">function </w:t>
+      </w:r>
+      <w:r>
+        <w:t xml:space="preserve">as having the IF functionality, by providing </w:t>
+      </w:r>
+      <w:proofErr w:type="gramStart"/>
+      <w:r>
+        <w:t>IF(</w:t>
+      </w:r>
+      <w:proofErr w:type="gramEnd"/>
+      <w:r>
+        <w:t>) inside that function.</w:t>
+      </w:r>
+    </w:p>
+    <w:p/>
+    <w:p/>
+    <w:p/>
+    <w:p>
+      <w:pPr>
+        <w:pStyle w:val="ListParagraph"/>
+        <w:numPr>
+          <w:ilvl w:val="0"/>
+          <w:numId w:val="9"/>
+        </w:numPr>
+      </w:pPr>
+      <w:r>
+        <w:t xml:space="preserve">If we want to convert TRUE / FALSE value to </w:t>
+      </w:r>
+      <w:r>
+        <w:t>Integer, we can do</w:t>
+      </w:r>
+    </w:p>
+    <w:p>
+      <w:pPr>
+        <w:ind w:left="1440"/>
+      </w:pPr>
+      <w:r>
+        <w:t xml:space="preserve">-(TRUE) </w:t>
+      </w:r>
+      <w:r>
+        <w:sym w:font="Wingdings" w:char="F0E0"/>
+      </w:r>
+      <w:r>
+        <w:t xml:space="preserve"> -1</w:t>
+      </w:r>
+      <w:r>
+        <w:t xml:space="preserve"> (Negates one time)</w:t>
+      </w:r>
+    </w:p>
+    <w:p>
+      <w:pPr>
+        <w:ind w:left="1440"/>
+      </w:pPr>
+      <w:r>
+        <w:t xml:space="preserve">--(TRUE) </w:t>
+      </w:r>
+      <w:r>
+        <w:sym w:font="Wingdings" w:char="F0E0"/>
+      </w:r>
+      <w:r>
+        <w:t xml:space="preserve"> 1</w:t>
+      </w:r>
+      <w:r>
+        <w:t xml:space="preserve"> (Negates two time – means - - = </w:t>
+      </w:r>
+      <w:proofErr w:type="gramStart"/>
+      <w:r>
+        <w:t>+ )</w:t>
+      </w:r>
+      <w:proofErr w:type="gramEnd"/>
+    </w:p>
+    <w:p/>
+    <w:p/>
+    <w:p>
+      <w:r>
+        <w:sym w:font="Wingdings" w:char="F0E0"/>
+      </w:r>
+      <w:r>
+        <w:t xml:space="preserve"> </w:t>
+      </w:r>
+      <w:proofErr w:type="gramStart"/>
+      <w:r>
+        <w:t>TEXT(</w:t>
+      </w:r>
+      <w:proofErr w:type="gramEnd"/>
+      <w:r>
+        <w:t>) function</w:t>
+      </w:r>
+    </w:p>
+    <w:p>
+      <w:pPr>
+        <w:pStyle w:val="ListParagraph"/>
+        <w:numPr>
+          <w:ilvl w:val="0"/>
+          <w:numId w:val="11"/>
+        </w:numPr>
+      </w:pPr>
+      <w:r>
+        <w:t>It is for formatting</w:t>
+      </w:r>
+    </w:p>
+    <w:p>
+      <w:pPr>
+        <w:pStyle w:val="ListParagraph"/>
+      </w:pPr>
+    </w:p>
+    <w:p>
+      <w:pPr>
+        <w:ind w:left="1440"/>
+      </w:pPr>
+    </w:p>
+    <w:p/>
+    <w:p/>
     <w:sectPr>
       <w:pgSz w:w="11906" w:h="16838"/>
       <w:pgMar w:top="1440" w:right="1440" w:bottom="1440" w:left="1440" w:header="708" w:footer="708" w:gutter="0"/>
@@ -5083,6 +5955,119 @@
 <file path=word/numbering.xml><?xml version="1.0" encoding="utf-8"?>
 <w:numbering xmlns:wpc="http://schemas.microsoft.com/office/word/2010/wordprocessingCanvas" xmlns:cx="http://schemas.microsoft.com/office/drawing/2014/chartex" xmlns:cx1="http://schemas.microsoft.com/office/drawing/2015/9/8/chartex" xmlns:cx2="http://schemas.microsoft.com/office/drawing/2015/10/21/chartex" xmlns:cx3="http://schemas.microsoft.com/office/drawing/2016/5/9/chartex" xmlns:cx4="http://schemas.microsoft.com/office/drawing/2016/5/10/chartex" xmlns:cx5="http://schemas.microsoft.com/office/drawing/2016/5/11/chartex" xmlns:cx6="http://schemas.microsoft.com/office/drawing/2016/5/12/chartex" xmlns:cx7="http://schemas.microsoft.com/office/drawing/2016/5/13/chartex" xmlns:cx8="http://schemas.microsoft.com/office/drawing/2016/5/14/chartex" xmlns:mc="http://schemas.openxmlformats.org/markup-compatibility/2006" xmlns:aink="http://schemas.microsoft.com/office/drawing/2016/ink" xmlns:am3d="http://schemas.microsoft.com/office/drawing/2017/model3d" xmlns:o="urn:schemas-microsoft-com:office:office" xmlns:oel="http://schemas.microsoft.com/office/2019/extlst" xmlns:r="http://schemas.openxmlformats.org/officeDocument/2006/relationships" xmlns:m="http://schemas.openxmlformats.org/officeDocument/2006/math" xmlns:v="urn:schemas-microsoft-com:vml" xmlns:wp14="http://schemas.microsoft.com/office/word/2010/wordprocessingDrawing" xmlns:wp="http://schemas.openxmlformats.org/drawingml/2006/wordprocessingDrawing" xmlns:w10="urn:schemas-microsoft-com:office:word" xmlns:w="http://schemas.openxmlformats.org/wordprocessingml/2006/main" xmlns:w14="http://schemas.microsoft.com/office/word/2010/wordml" xmlns:w15="http://schemas.microsoft.com/office/word/2012/wordml" xmlns:w16cex="http://schemas.microsoft.com/office/word/2018/wordml/cex" xmlns:w16cid="http://schemas.microsoft.com/office/word/2016/wordml/cid" xmlns:w16="http://schemas.microsoft.com/office/word/2018/wordml" xmlns:w16du="http://schemas.microsoft.com/office/word/2023/wordml/word16du" xmlns:w16sdtdh="http://schemas.microsoft.com/office/word/2020/wordml/sdtdatahash" xmlns:w16sdtfl="http://schemas.microsoft.com/office/word/2024/wordml/sdtformatlock" xmlns:w16se="http://schemas.microsoft.com/office/word/2015/wordml/symex" xmlns:wpg="http://schemas.microsoft.com/office/word/2010/wordprocessingGroup" xmlns:wpi="http://schemas.microsoft.com/office/word/2010/wordprocessingInk" xmlns:wne="http://schemas.microsoft.com/office/word/2006/wordml" xmlns:wps="http://schemas.microsoft.com/office/word/2010/wordprocessingShape" mc:Ignorable="w14 w15 w16se w16cid w16 w16cex w16sdtdh w16sdtfl w16du wp14">
   <w:abstractNum w:abstractNumId="0" w15:restartNumberingAfterBreak="0">
+    <w:nsid w:val="0EEF14A2"/>
+    <w:multiLevelType w:val="hybridMultilevel"/>
+    <w:tmpl w:val="87204A02"/>
+    <w:lvl w:ilvl="0" w:tplc="40090001">
+      <w:start w:val="1"/>
+      <w:numFmt w:val="bullet"/>
+      <w:lvlText w:val=""/>
+      <w:lvlJc w:val="left"/>
+      <w:pPr>
+        <w:ind w:left="720" w:hanging="360"/>
+      </w:pPr>
+      <w:rPr>
+        <w:rFonts w:ascii="Symbol" w:hAnsi="Symbol" w:hint="default"/>
+      </w:rPr>
+    </w:lvl>
+    <w:lvl w:ilvl="1" w:tplc="40090003" w:tentative="1">
+      <w:start w:val="1"/>
+      <w:numFmt w:val="bullet"/>
+      <w:lvlText w:val="o"/>
+      <w:lvlJc w:val="left"/>
+      <w:pPr>
+        <w:ind w:left="1440" w:hanging="360"/>
+      </w:pPr>
+      <w:rPr>
+        <w:rFonts w:ascii="Courier New" w:hAnsi="Courier New" w:cs="Courier New" w:hint="default"/>
+      </w:rPr>
+    </w:lvl>
+    <w:lvl w:ilvl="2" w:tplc="40090005" w:tentative="1">
+      <w:start w:val="1"/>
+      <w:numFmt w:val="bullet"/>
+      <w:lvlText w:val=""/>
+      <w:lvlJc w:val="left"/>
+      <w:pPr>
+        <w:ind w:left="2160" w:hanging="360"/>
+      </w:pPr>
+      <w:rPr>
+        <w:rFonts w:ascii="Wingdings" w:hAnsi="Wingdings" w:hint="default"/>
+      </w:rPr>
+    </w:lvl>
+    <w:lvl w:ilvl="3" w:tplc="40090001" w:tentative="1">
+      <w:start w:val="1"/>
+      <w:numFmt w:val="bullet"/>
+      <w:lvlText w:val=""/>
+      <w:lvlJc w:val="left"/>
+      <w:pPr>
+        <w:ind w:left="2880" w:hanging="360"/>
+      </w:pPr>
+      <w:rPr>
+        <w:rFonts w:ascii="Symbol" w:hAnsi="Symbol" w:hint="default"/>
+      </w:rPr>
+    </w:lvl>
+    <w:lvl w:ilvl="4" w:tplc="40090003" w:tentative="1">
+      <w:start w:val="1"/>
+      <w:numFmt w:val="bullet"/>
+      <w:lvlText w:val="o"/>
+      <w:lvlJc w:val="left"/>
+      <w:pPr>
+        <w:ind w:left="3600" w:hanging="360"/>
+      </w:pPr>
+      <w:rPr>
+        <w:rFonts w:ascii="Courier New" w:hAnsi="Courier New" w:cs="Courier New" w:hint="default"/>
+      </w:rPr>
+    </w:lvl>
+    <w:lvl w:ilvl="5" w:tplc="40090005" w:tentative="1">
+      <w:start w:val="1"/>
+      <w:numFmt w:val="bullet"/>
+      <w:lvlText w:val=""/>
+      <w:lvlJc w:val="left"/>
+      <w:pPr>
+        <w:ind w:left="4320" w:hanging="360"/>
+      </w:pPr>
+      <w:rPr>
+        <w:rFonts w:ascii="Wingdings" w:hAnsi="Wingdings" w:hint="default"/>
+      </w:rPr>
+    </w:lvl>
+    <w:lvl w:ilvl="6" w:tplc="40090001" w:tentative="1">
+      <w:start w:val="1"/>
+      <w:numFmt w:val="bullet"/>
+      <w:lvlText w:val=""/>
+      <w:lvlJc w:val="left"/>
+      <w:pPr>
+        <w:ind w:left="5040" w:hanging="360"/>
+      </w:pPr>
+      <w:rPr>
+        <w:rFonts w:ascii="Symbol" w:hAnsi="Symbol" w:hint="default"/>
+      </w:rPr>
+    </w:lvl>
+    <w:lvl w:ilvl="7" w:tplc="40090003" w:tentative="1">
+      <w:start w:val="1"/>
+      <w:numFmt w:val="bullet"/>
+      <w:lvlText w:val="o"/>
+      <w:lvlJc w:val="left"/>
+      <w:pPr>
+        <w:ind w:left="5760" w:hanging="360"/>
+      </w:pPr>
+      <w:rPr>
+        <w:rFonts w:ascii="Courier New" w:hAnsi="Courier New" w:cs="Courier New" w:hint="default"/>
+      </w:rPr>
+    </w:lvl>
+    <w:lvl w:ilvl="8" w:tplc="40090005" w:tentative="1">
+      <w:start w:val="1"/>
+      <w:numFmt w:val="bullet"/>
+      <w:lvlText w:val=""/>
+      <w:lvlJc w:val="left"/>
+      <w:pPr>
+        <w:ind w:left="6480" w:hanging="360"/>
+      </w:pPr>
+      <w:rPr>
+        <w:rFonts w:ascii="Wingdings" w:hAnsi="Wingdings" w:hint="default"/>
+      </w:rPr>
+    </w:lvl>
+  </w:abstractNum>
+  <w:abstractNum w:abstractNumId="1" w15:restartNumberingAfterBreak="0">
     <w:nsid w:val="159405F6"/>
     <w:multiLevelType w:val="hybridMultilevel"/>
     <w:tmpl w:val="EDF44402"/>
@@ -5171,7 +6156,7 @@
       </w:pPr>
     </w:lvl>
   </w:abstractNum>
-  <w:abstractNum w:abstractNumId="1" w15:restartNumberingAfterBreak="0">
+  <w:abstractNum w:abstractNumId="2" w15:restartNumberingAfterBreak="0">
     <w:nsid w:val="1FFF3DEA"/>
     <w:multiLevelType w:val="hybridMultilevel"/>
     <w:tmpl w:val="FFE222E8"/>
@@ -5284,7 +6269,7 @@
       </w:rPr>
     </w:lvl>
   </w:abstractNum>
-  <w:abstractNum w:abstractNumId="2" w15:restartNumberingAfterBreak="0">
+  <w:abstractNum w:abstractNumId="3" w15:restartNumberingAfterBreak="0">
     <w:nsid w:val="2C7F4519"/>
     <w:multiLevelType w:val="hybridMultilevel"/>
     <w:tmpl w:val="489E457C"/>
@@ -5397,7 +6382,7 @@
       </w:rPr>
     </w:lvl>
   </w:abstractNum>
-  <w:abstractNum w:abstractNumId="3" w15:restartNumberingAfterBreak="0">
+  <w:abstractNum w:abstractNumId="4" w15:restartNumberingAfterBreak="0">
     <w:nsid w:val="43514108"/>
     <w:multiLevelType w:val="multilevel"/>
     <w:tmpl w:val="0EBEFDA2"/>
@@ -5510,20 +6495,133 @@
       </w:rPr>
     </w:lvl>
   </w:abstractNum>
-  <w:abstractNum w:abstractNumId="4" w15:restartNumberingAfterBreak="0">
+  <w:abstractNum w:abstractNumId="5" w15:restartNumberingAfterBreak="0">
+    <w:nsid w:val="44DA19B7"/>
+    <w:multiLevelType w:val="hybridMultilevel"/>
+    <w:tmpl w:val="6EA062E2"/>
+    <w:lvl w:ilvl="0" w:tplc="2B0CDF98">
+      <w:start w:val="5"/>
+      <w:numFmt w:val="bullet"/>
+      <w:lvlText w:val="-"/>
+      <w:lvlJc w:val="left"/>
+      <w:pPr>
+        <w:ind w:left="1800" w:hanging="360"/>
+      </w:pPr>
+      <w:rPr>
+        <w:rFonts w:ascii="Times New Roman" w:eastAsiaTheme="minorHAnsi" w:hAnsi="Times New Roman" w:cs="Times New Roman" w:hint="default"/>
+      </w:rPr>
+    </w:lvl>
+    <w:lvl w:ilvl="1" w:tplc="40090003" w:tentative="1">
+      <w:start w:val="1"/>
+      <w:numFmt w:val="bullet"/>
+      <w:lvlText w:val="o"/>
+      <w:lvlJc w:val="left"/>
+      <w:pPr>
+        <w:ind w:left="2520" w:hanging="360"/>
+      </w:pPr>
+      <w:rPr>
+        <w:rFonts w:ascii="Courier New" w:hAnsi="Courier New" w:cs="Courier New" w:hint="default"/>
+      </w:rPr>
+    </w:lvl>
+    <w:lvl w:ilvl="2" w:tplc="40090005" w:tentative="1">
+      <w:start w:val="1"/>
+      <w:numFmt w:val="bullet"/>
+      <w:lvlText w:val=""/>
+      <w:lvlJc w:val="left"/>
+      <w:pPr>
+        <w:ind w:left="3240" w:hanging="360"/>
+      </w:pPr>
+      <w:rPr>
+        <w:rFonts w:ascii="Wingdings" w:hAnsi="Wingdings" w:hint="default"/>
+      </w:rPr>
+    </w:lvl>
+    <w:lvl w:ilvl="3" w:tplc="40090001" w:tentative="1">
+      <w:start w:val="1"/>
+      <w:numFmt w:val="bullet"/>
+      <w:lvlText w:val=""/>
+      <w:lvlJc w:val="left"/>
+      <w:pPr>
+        <w:ind w:left="3960" w:hanging="360"/>
+      </w:pPr>
+      <w:rPr>
+        <w:rFonts w:ascii="Symbol" w:hAnsi="Symbol" w:hint="default"/>
+      </w:rPr>
+    </w:lvl>
+    <w:lvl w:ilvl="4" w:tplc="40090003" w:tentative="1">
+      <w:start w:val="1"/>
+      <w:numFmt w:val="bullet"/>
+      <w:lvlText w:val="o"/>
+      <w:lvlJc w:val="left"/>
+      <w:pPr>
+        <w:ind w:left="4680" w:hanging="360"/>
+      </w:pPr>
+      <w:rPr>
+        <w:rFonts w:ascii="Courier New" w:hAnsi="Courier New" w:cs="Courier New" w:hint="default"/>
+      </w:rPr>
+    </w:lvl>
+    <w:lvl w:ilvl="5" w:tplc="40090005" w:tentative="1">
+      <w:start w:val="1"/>
+      <w:numFmt w:val="bullet"/>
+      <w:lvlText w:val=""/>
+      <w:lvlJc w:val="left"/>
+      <w:pPr>
+        <w:ind w:left="5400" w:hanging="360"/>
+      </w:pPr>
+      <w:rPr>
+        <w:rFonts w:ascii="Wingdings" w:hAnsi="Wingdings" w:hint="default"/>
+      </w:rPr>
+    </w:lvl>
+    <w:lvl w:ilvl="6" w:tplc="40090001" w:tentative="1">
+      <w:start w:val="1"/>
+      <w:numFmt w:val="bullet"/>
+      <w:lvlText w:val=""/>
+      <w:lvlJc w:val="left"/>
+      <w:pPr>
+        <w:ind w:left="6120" w:hanging="360"/>
+      </w:pPr>
+      <w:rPr>
+        <w:rFonts w:ascii="Symbol" w:hAnsi="Symbol" w:hint="default"/>
+      </w:rPr>
+    </w:lvl>
+    <w:lvl w:ilvl="7" w:tplc="40090003" w:tentative="1">
+      <w:start w:val="1"/>
+      <w:numFmt w:val="bullet"/>
+      <w:lvlText w:val="o"/>
+      <w:lvlJc w:val="left"/>
+      <w:pPr>
+        <w:ind w:left="6840" w:hanging="360"/>
+      </w:pPr>
+      <w:rPr>
+        <w:rFonts w:ascii="Courier New" w:hAnsi="Courier New" w:cs="Courier New" w:hint="default"/>
+      </w:rPr>
+    </w:lvl>
+    <w:lvl w:ilvl="8" w:tplc="40090005" w:tentative="1">
+      <w:start w:val="1"/>
+      <w:numFmt w:val="bullet"/>
+      <w:lvlText w:val=""/>
+      <w:lvlJc w:val="left"/>
+      <w:pPr>
+        <w:ind w:left="7560" w:hanging="360"/>
+      </w:pPr>
+      <w:rPr>
+        <w:rFonts w:ascii="Wingdings" w:hAnsi="Wingdings" w:hint="default"/>
+      </w:rPr>
+    </w:lvl>
+  </w:abstractNum>
+  <w:abstractNum w:abstractNumId="6" w15:restartNumberingAfterBreak="0">
     <w:nsid w:val="454827C2"/>
     <w:multiLevelType w:val="hybridMultilevel"/>
-    <w:tmpl w:val="59825A0A"/>
-    <w:lvl w:ilvl="0" w:tplc="F87C36C8">
-      <w:start w:val="3"/>
+    <w:tmpl w:val="51ACCA48"/>
+    <w:lvl w:ilvl="0" w:tplc="40090001">
+      <w:start w:val="1"/>
       <w:numFmt w:val="bullet"/>
-      <w:lvlText w:val="-"/>
+      <w:lvlText w:val=""/>
       <w:lvlJc w:val="left"/>
       <w:pPr>
         <w:ind w:left="1080" w:hanging="360"/>
       </w:pPr>
       <w:rPr>
-        <w:rFonts w:ascii="Times New Roman" w:eastAsiaTheme="minorHAnsi" w:hAnsi="Times New Roman" w:cs="Times New Roman" w:hint="default"/>
+        <w:rFonts w:ascii="Symbol" w:hAnsi="Symbol" w:hint="default"/>
       </w:rPr>
     </w:lvl>
     <w:lvl w:ilvl="1" w:tplc="40090003" w:tentative="1">
@@ -5623,7 +6721,7 @@
       </w:rPr>
     </w:lvl>
   </w:abstractNum>
-  <w:abstractNum w:abstractNumId="5" w15:restartNumberingAfterBreak="0">
+  <w:abstractNum w:abstractNumId="7" w15:restartNumberingAfterBreak="0">
     <w:nsid w:val="45953846"/>
     <w:multiLevelType w:val="hybridMultilevel"/>
     <w:tmpl w:val="0CF8C256"/>
@@ -5736,7 +6834,233 @@
       </w:rPr>
     </w:lvl>
   </w:abstractNum>
-  <w:abstractNum w:abstractNumId="6" w15:restartNumberingAfterBreak="0">
+  <w:abstractNum w:abstractNumId="8" w15:restartNumberingAfterBreak="0">
+    <w:nsid w:val="60C24978"/>
+    <w:multiLevelType w:val="hybridMultilevel"/>
+    <w:tmpl w:val="2BB4F0BE"/>
+    <w:lvl w:ilvl="0" w:tplc="04DE1F18">
+      <w:start w:val="5"/>
+      <w:numFmt w:val="bullet"/>
+      <w:lvlText w:val=""/>
+      <w:lvlJc w:val="left"/>
+      <w:pPr>
+        <w:ind w:left="720" w:hanging="360"/>
+      </w:pPr>
+      <w:rPr>
+        <w:rFonts w:ascii="Wingdings" w:eastAsiaTheme="minorHAnsi" w:hAnsi="Wingdings" w:cstheme="minorBidi" w:hint="default"/>
+      </w:rPr>
+    </w:lvl>
+    <w:lvl w:ilvl="1" w:tplc="40090003">
+      <w:start w:val="1"/>
+      <w:numFmt w:val="bullet"/>
+      <w:lvlText w:val="o"/>
+      <w:lvlJc w:val="left"/>
+      <w:pPr>
+        <w:ind w:left="1440" w:hanging="360"/>
+      </w:pPr>
+      <w:rPr>
+        <w:rFonts w:ascii="Courier New" w:hAnsi="Courier New" w:cs="Courier New" w:hint="default"/>
+      </w:rPr>
+    </w:lvl>
+    <w:lvl w:ilvl="2" w:tplc="40090005" w:tentative="1">
+      <w:start w:val="1"/>
+      <w:numFmt w:val="bullet"/>
+      <w:lvlText w:val=""/>
+      <w:lvlJc w:val="left"/>
+      <w:pPr>
+        <w:ind w:left="2160" w:hanging="360"/>
+      </w:pPr>
+      <w:rPr>
+        <w:rFonts w:ascii="Wingdings" w:hAnsi="Wingdings" w:hint="default"/>
+      </w:rPr>
+    </w:lvl>
+    <w:lvl w:ilvl="3" w:tplc="40090001" w:tentative="1">
+      <w:start w:val="1"/>
+      <w:numFmt w:val="bullet"/>
+      <w:lvlText w:val=""/>
+      <w:lvlJc w:val="left"/>
+      <w:pPr>
+        <w:ind w:left="2880" w:hanging="360"/>
+      </w:pPr>
+      <w:rPr>
+        <w:rFonts w:ascii="Symbol" w:hAnsi="Symbol" w:hint="default"/>
+      </w:rPr>
+    </w:lvl>
+    <w:lvl w:ilvl="4" w:tplc="40090003" w:tentative="1">
+      <w:start w:val="1"/>
+      <w:numFmt w:val="bullet"/>
+      <w:lvlText w:val="o"/>
+      <w:lvlJc w:val="left"/>
+      <w:pPr>
+        <w:ind w:left="3600" w:hanging="360"/>
+      </w:pPr>
+      <w:rPr>
+        <w:rFonts w:ascii="Courier New" w:hAnsi="Courier New" w:cs="Courier New" w:hint="default"/>
+      </w:rPr>
+    </w:lvl>
+    <w:lvl w:ilvl="5" w:tplc="40090005" w:tentative="1">
+      <w:start w:val="1"/>
+      <w:numFmt w:val="bullet"/>
+      <w:lvlText w:val=""/>
+      <w:lvlJc w:val="left"/>
+      <w:pPr>
+        <w:ind w:left="4320" w:hanging="360"/>
+      </w:pPr>
+      <w:rPr>
+        <w:rFonts w:ascii="Wingdings" w:hAnsi="Wingdings" w:hint="default"/>
+      </w:rPr>
+    </w:lvl>
+    <w:lvl w:ilvl="6" w:tplc="40090001" w:tentative="1">
+      <w:start w:val="1"/>
+      <w:numFmt w:val="bullet"/>
+      <w:lvlText w:val=""/>
+      <w:lvlJc w:val="left"/>
+      <w:pPr>
+        <w:ind w:left="5040" w:hanging="360"/>
+      </w:pPr>
+      <w:rPr>
+        <w:rFonts w:ascii="Symbol" w:hAnsi="Symbol" w:hint="default"/>
+      </w:rPr>
+    </w:lvl>
+    <w:lvl w:ilvl="7" w:tplc="40090003" w:tentative="1">
+      <w:start w:val="1"/>
+      <w:numFmt w:val="bullet"/>
+      <w:lvlText w:val="o"/>
+      <w:lvlJc w:val="left"/>
+      <w:pPr>
+        <w:ind w:left="5760" w:hanging="360"/>
+      </w:pPr>
+      <w:rPr>
+        <w:rFonts w:ascii="Courier New" w:hAnsi="Courier New" w:cs="Courier New" w:hint="default"/>
+      </w:rPr>
+    </w:lvl>
+    <w:lvl w:ilvl="8" w:tplc="40090005" w:tentative="1">
+      <w:start w:val="1"/>
+      <w:numFmt w:val="bullet"/>
+      <w:lvlText w:val=""/>
+      <w:lvlJc w:val="left"/>
+      <w:pPr>
+        <w:ind w:left="6480" w:hanging="360"/>
+      </w:pPr>
+      <w:rPr>
+        <w:rFonts w:ascii="Wingdings" w:hAnsi="Wingdings" w:hint="default"/>
+      </w:rPr>
+    </w:lvl>
+  </w:abstractNum>
+  <w:abstractNum w:abstractNumId="9" w15:restartNumberingAfterBreak="0">
+    <w:nsid w:val="68C75728"/>
+    <w:multiLevelType w:val="hybridMultilevel"/>
+    <w:tmpl w:val="D646FC02"/>
+    <w:lvl w:ilvl="0" w:tplc="4E8600D2">
+      <w:start w:val="5"/>
+      <w:numFmt w:val="bullet"/>
+      <w:lvlText w:val="-"/>
+      <w:lvlJc w:val="left"/>
+      <w:pPr>
+        <w:ind w:left="720" w:hanging="360"/>
+      </w:pPr>
+      <w:rPr>
+        <w:rFonts w:ascii="Times New Roman" w:eastAsiaTheme="minorHAnsi" w:hAnsi="Times New Roman" w:cs="Times New Roman" w:hint="default"/>
+      </w:rPr>
+    </w:lvl>
+    <w:lvl w:ilvl="1" w:tplc="40090003" w:tentative="1">
+      <w:start w:val="1"/>
+      <w:numFmt w:val="bullet"/>
+      <w:lvlText w:val="o"/>
+      <w:lvlJc w:val="left"/>
+      <w:pPr>
+        <w:ind w:left="1440" w:hanging="360"/>
+      </w:pPr>
+      <w:rPr>
+        <w:rFonts w:ascii="Courier New" w:hAnsi="Courier New" w:cs="Courier New" w:hint="default"/>
+      </w:rPr>
+    </w:lvl>
+    <w:lvl w:ilvl="2" w:tplc="40090005" w:tentative="1">
+      <w:start w:val="1"/>
+      <w:numFmt w:val="bullet"/>
+      <w:lvlText w:val=""/>
+      <w:lvlJc w:val="left"/>
+      <w:pPr>
+        <w:ind w:left="2160" w:hanging="360"/>
+      </w:pPr>
+      <w:rPr>
+        <w:rFonts w:ascii="Wingdings" w:hAnsi="Wingdings" w:hint="default"/>
+      </w:rPr>
+    </w:lvl>
+    <w:lvl w:ilvl="3" w:tplc="40090001" w:tentative="1">
+      <w:start w:val="1"/>
+      <w:numFmt w:val="bullet"/>
+      <w:lvlText w:val=""/>
+      <w:lvlJc w:val="left"/>
+      <w:pPr>
+        <w:ind w:left="2880" w:hanging="360"/>
+      </w:pPr>
+      <w:rPr>
+        <w:rFonts w:ascii="Symbol" w:hAnsi="Symbol" w:hint="default"/>
+      </w:rPr>
+    </w:lvl>
+    <w:lvl w:ilvl="4" w:tplc="40090003" w:tentative="1">
+      <w:start w:val="1"/>
+      <w:numFmt w:val="bullet"/>
+      <w:lvlText w:val="o"/>
+      <w:lvlJc w:val="left"/>
+      <w:pPr>
+        <w:ind w:left="3600" w:hanging="360"/>
+      </w:pPr>
+      <w:rPr>
+        <w:rFonts w:ascii="Courier New" w:hAnsi="Courier New" w:cs="Courier New" w:hint="default"/>
+      </w:rPr>
+    </w:lvl>
+    <w:lvl w:ilvl="5" w:tplc="40090005" w:tentative="1">
+      <w:start w:val="1"/>
+      <w:numFmt w:val="bullet"/>
+      <w:lvlText w:val=""/>
+      <w:lvlJc w:val="left"/>
+      <w:pPr>
+        <w:ind w:left="4320" w:hanging="360"/>
+      </w:pPr>
+      <w:rPr>
+        <w:rFonts w:ascii="Wingdings" w:hAnsi="Wingdings" w:hint="default"/>
+      </w:rPr>
+    </w:lvl>
+    <w:lvl w:ilvl="6" w:tplc="40090001" w:tentative="1">
+      <w:start w:val="1"/>
+      <w:numFmt w:val="bullet"/>
+      <w:lvlText w:val=""/>
+      <w:lvlJc w:val="left"/>
+      <w:pPr>
+        <w:ind w:left="5040" w:hanging="360"/>
+      </w:pPr>
+      <w:rPr>
+        <w:rFonts w:ascii="Symbol" w:hAnsi="Symbol" w:hint="default"/>
+      </w:rPr>
+    </w:lvl>
+    <w:lvl w:ilvl="7" w:tplc="40090003" w:tentative="1">
+      <w:start w:val="1"/>
+      <w:numFmt w:val="bullet"/>
+      <w:lvlText w:val="o"/>
+      <w:lvlJc w:val="left"/>
+      <w:pPr>
+        <w:ind w:left="5760" w:hanging="360"/>
+      </w:pPr>
+      <w:rPr>
+        <w:rFonts w:ascii="Courier New" w:hAnsi="Courier New" w:cs="Courier New" w:hint="default"/>
+      </w:rPr>
+    </w:lvl>
+    <w:lvl w:ilvl="8" w:tplc="40090005" w:tentative="1">
+      <w:start w:val="1"/>
+      <w:numFmt w:val="bullet"/>
+      <w:lvlText w:val=""/>
+      <w:lvlJc w:val="left"/>
+      <w:pPr>
+        <w:ind w:left="6480" w:hanging="360"/>
+      </w:pPr>
+      <w:rPr>
+        <w:rFonts w:ascii="Wingdings" w:hAnsi="Wingdings" w:hint="default"/>
+      </w:rPr>
+    </w:lvl>
+  </w:abstractNum>
+  <w:abstractNum w:abstractNumId="10" w15:restartNumberingAfterBreak="0">
     <w:nsid w:val="6D7C70CF"/>
     <w:multiLevelType w:val="hybridMultilevel"/>
     <w:tmpl w:val="293AEE34"/>
@@ -5850,25 +7174,37 @@
     </w:lvl>
   </w:abstractNum>
   <w:num w:numId="1" w16cid:durableId="1708988502">
+    <w:abstractNumId w:val="4"/>
+  </w:num>
+  <w:num w:numId="2" w16cid:durableId="406732299">
+    <w:abstractNumId w:val="10"/>
+  </w:num>
+  <w:num w:numId="3" w16cid:durableId="2119064549">
+    <w:abstractNumId w:val="2"/>
+  </w:num>
+  <w:num w:numId="4" w16cid:durableId="755633525">
+    <w:abstractNumId w:val="1"/>
+  </w:num>
+  <w:num w:numId="5" w16cid:durableId="1896887061">
+    <w:abstractNumId w:val="6"/>
+  </w:num>
+  <w:num w:numId="6" w16cid:durableId="922252310">
+    <w:abstractNumId w:val="7"/>
+  </w:num>
+  <w:num w:numId="7" w16cid:durableId="1520200842">
     <w:abstractNumId w:val="3"/>
   </w:num>
-  <w:num w:numId="2" w16cid:durableId="406732299">
-    <w:abstractNumId w:val="6"/>
-  </w:num>
-  <w:num w:numId="3" w16cid:durableId="2119064549">
-    <w:abstractNumId w:val="1"/>
-  </w:num>
-  <w:num w:numId="4" w16cid:durableId="755633525">
+  <w:num w:numId="8" w16cid:durableId="126626962">
     <w:abstractNumId w:val="0"/>
   </w:num>
-  <w:num w:numId="5" w16cid:durableId="1896887061">
-    <w:abstractNumId w:val="4"/>
+  <w:num w:numId="9" w16cid:durableId="1970554200">
+    <w:abstractNumId w:val="8"/>
   </w:num>
-  <w:num w:numId="6" w16cid:durableId="922252310">
+  <w:num w:numId="10" w16cid:durableId="1727727092">
     <w:abstractNumId w:val="5"/>
   </w:num>
-  <w:num w:numId="7" w16cid:durableId="1520200842">
-    <w:abstractNumId w:val="2"/>
+  <w:num w:numId="11" w16cid:durableId="605574767">
+    <w:abstractNumId w:val="9"/>
   </w:num>
 </w:numbering>
 </file>

</xml_diff>

<commit_message>
2.7 LookUp Functions Completed
</commit_message>
<xml_diff>
--- a/Notes.docx
+++ b/Notes.docx
@@ -80,7 +80,7 @@
           <w:r>
             <w:fldChar w:fldCharType="separate"/>
           </w:r>
-          <w:hyperlink w:anchor="_Toc232598977" w:history="1">
+          <w:hyperlink w:anchor="_Toc232771780" w:history="1">
             <w:r>
               <w:rPr>
                 <w:rStyle w:val="Hyperlink"/>
@@ -124,7 +124,7 @@
                 <w:noProof/>
                 <w:webHidden/>
               </w:rPr>
-              <w:instrText xml:space="preserve"> PAGEREF _Toc232598977 \h </w:instrText>
+              <w:instrText xml:space="preserve"> PAGEREF _Toc232771780 \h </w:instrText>
             </w:r>
             <w:r>
               <w:rPr>
@@ -168,7 +168,7 @@
               <w:lang w:eastAsia="en-IN" w:bidi="gu-IN"/>
             </w:rPr>
           </w:pPr>
-          <w:hyperlink w:anchor="_Toc232598978" w:history="1">
+          <w:hyperlink w:anchor="_Toc232771781" w:history="1">
             <w:r>
               <w:rPr>
                 <w:rStyle w:val="Hyperlink"/>
@@ -196,7 +196,7 @@
                 <w:noProof/>
                 <w:webHidden/>
               </w:rPr>
-              <w:instrText xml:space="preserve"> PAGEREF _Toc232598978 \h </w:instrText>
+              <w:instrText xml:space="preserve"> PAGEREF _Toc232771781 \h </w:instrText>
             </w:r>
             <w:r>
               <w:rPr>
@@ -241,7 +241,7 @@
               <w:lang w:eastAsia="en-IN" w:bidi="gu-IN"/>
             </w:rPr>
           </w:pPr>
-          <w:hyperlink w:anchor="_Toc232598979" w:history="1">
+          <w:hyperlink w:anchor="_Toc232771782" w:history="1">
             <w:r>
               <w:rPr>
                 <w:rStyle w:val="Hyperlink"/>
@@ -286,7 +286,7 @@
                 <w:noProof/>
                 <w:webHidden/>
               </w:rPr>
-              <w:instrText xml:space="preserve"> PAGEREF _Toc232598979 \h </w:instrText>
+              <w:instrText xml:space="preserve"> PAGEREF _Toc232771782 \h </w:instrText>
             </w:r>
             <w:r>
               <w:rPr>
@@ -330,7 +330,7 @@
               <w:lang w:eastAsia="en-IN" w:bidi="gu-IN"/>
             </w:rPr>
           </w:pPr>
-          <w:hyperlink w:anchor="_Toc232598980" w:history="1">
+          <w:hyperlink w:anchor="_Toc232771783" w:history="1">
             <w:r>
               <w:rPr>
                 <w:rStyle w:val="Hyperlink"/>
@@ -358,7 +358,7 @@
                 <w:noProof/>
                 <w:webHidden/>
               </w:rPr>
-              <w:instrText xml:space="preserve"> PAGEREF _Toc232598980 \h </w:instrText>
+              <w:instrText xml:space="preserve"> PAGEREF _Toc232771783 \h </w:instrText>
             </w:r>
             <w:r>
               <w:rPr>
@@ -402,7 +402,7 @@
               <w:lang w:eastAsia="en-IN" w:bidi="gu-IN"/>
             </w:rPr>
           </w:pPr>
-          <w:hyperlink w:anchor="_Toc232598981" w:history="1">
+          <w:hyperlink w:anchor="_Toc232771784" w:history="1">
             <w:r>
               <w:rPr>
                 <w:rStyle w:val="Hyperlink"/>
@@ -430,7 +430,7 @@
                 <w:noProof/>
                 <w:webHidden/>
               </w:rPr>
-              <w:instrText xml:space="preserve"> PAGEREF _Toc232598981 \h </w:instrText>
+              <w:instrText xml:space="preserve"> PAGEREF _Toc232771784 \h </w:instrText>
             </w:r>
             <w:r>
               <w:rPr>
@@ -475,7 +475,7 @@
               <w:lang w:eastAsia="en-IN" w:bidi="gu-IN"/>
             </w:rPr>
           </w:pPr>
-          <w:hyperlink w:anchor="_Toc232598982" w:history="1">
+          <w:hyperlink w:anchor="_Toc232771785" w:history="1">
             <w:r>
               <w:rPr>
                 <w:rStyle w:val="Hyperlink"/>
@@ -520,7 +520,7 @@
                 <w:noProof/>
                 <w:webHidden/>
               </w:rPr>
-              <w:instrText xml:space="preserve"> PAGEREF _Toc232598982 \h </w:instrText>
+              <w:instrText xml:space="preserve"> PAGEREF _Toc232771785 \h </w:instrText>
             </w:r>
             <w:r>
               <w:rPr>
@@ -565,7 +565,7 @@
               <w:lang w:eastAsia="en-IN" w:bidi="gu-IN"/>
             </w:rPr>
           </w:pPr>
-          <w:hyperlink w:anchor="_Toc232598983" w:history="1">
+          <w:hyperlink w:anchor="_Toc232771786" w:history="1">
             <w:r>
               <w:rPr>
                 <w:rStyle w:val="Hyperlink"/>
@@ -610,7 +610,7 @@
                 <w:noProof/>
                 <w:webHidden/>
               </w:rPr>
-              <w:instrText xml:space="preserve"> PAGEREF _Toc232598983 \h </w:instrText>
+              <w:instrText xml:space="preserve"> PAGEREF _Toc232771786 \h </w:instrText>
             </w:r>
             <w:r>
               <w:rPr>
@@ -654,7 +654,7 @@
               <w:lang w:eastAsia="en-IN" w:bidi="gu-IN"/>
             </w:rPr>
           </w:pPr>
-          <w:hyperlink w:anchor="_Toc232598984" w:history="1">
+          <w:hyperlink w:anchor="_Toc232771787" w:history="1">
             <w:r>
               <w:rPr>
                 <w:rStyle w:val="Hyperlink"/>
@@ -682,7 +682,7 @@
                 <w:noProof/>
                 <w:webHidden/>
               </w:rPr>
-              <w:instrText xml:space="preserve"> PAGEREF _Toc232598984 \h </w:instrText>
+              <w:instrText xml:space="preserve"> PAGEREF _Toc232771787 \h </w:instrText>
             </w:r>
             <w:r>
               <w:rPr>
@@ -726,7 +726,7 @@
               <w:lang w:eastAsia="en-IN" w:bidi="gu-IN"/>
             </w:rPr>
           </w:pPr>
-          <w:hyperlink w:anchor="_Toc232598985" w:history="1">
+          <w:hyperlink w:anchor="_Toc232771788" w:history="1">
             <w:r>
               <w:rPr>
                 <w:rStyle w:val="Hyperlink"/>
@@ -754,7 +754,7 @@
                 <w:noProof/>
                 <w:webHidden/>
               </w:rPr>
-              <w:instrText xml:space="preserve"> PAGEREF _Toc232598985 \h </w:instrText>
+              <w:instrText xml:space="preserve"> PAGEREF _Toc232771788 \h </w:instrText>
             </w:r>
             <w:r>
               <w:rPr>
@@ -798,7 +798,7 @@
               <w:lang w:eastAsia="en-IN" w:bidi="gu-IN"/>
             </w:rPr>
           </w:pPr>
-          <w:hyperlink w:anchor="_Toc232598986" w:history="1">
+          <w:hyperlink w:anchor="_Toc232771789" w:history="1">
             <w:r>
               <w:rPr>
                 <w:rStyle w:val="Hyperlink"/>
@@ -826,7 +826,7 @@
                 <w:noProof/>
                 <w:webHidden/>
               </w:rPr>
-              <w:instrText xml:space="preserve"> PAGEREF _Toc232598986 \h </w:instrText>
+              <w:instrText xml:space="preserve"> PAGEREF _Toc232771789 \h </w:instrText>
             </w:r>
             <w:r>
               <w:rPr>
@@ -870,7 +870,7 @@
               <w:lang w:eastAsia="en-IN" w:bidi="gu-IN"/>
             </w:rPr>
           </w:pPr>
-          <w:hyperlink w:anchor="_Toc232598987" w:history="1">
+          <w:hyperlink w:anchor="_Toc232771790" w:history="1">
             <w:r>
               <w:rPr>
                 <w:rStyle w:val="Hyperlink"/>
@@ -898,7 +898,7 @@
                 <w:noProof/>
                 <w:webHidden/>
               </w:rPr>
-              <w:instrText xml:space="preserve"> PAGEREF _Toc232598987 \h </w:instrText>
+              <w:instrText xml:space="preserve"> PAGEREF _Toc232771790 \h </w:instrText>
             </w:r>
             <w:r>
               <w:rPr>
@@ -942,7 +942,7 @@
               <w:lang w:eastAsia="en-IN" w:bidi="gu-IN"/>
             </w:rPr>
           </w:pPr>
-          <w:hyperlink w:anchor="_Toc232598988" w:history="1">
+          <w:hyperlink w:anchor="_Toc232771791" w:history="1">
             <w:r>
               <w:rPr>
                 <w:rStyle w:val="Hyperlink"/>
@@ -969,7 +969,7 @@
                 <w:noProof/>
                 <w:webHidden/>
               </w:rPr>
-              <w:instrText xml:space="preserve"> PAGEREF _Toc232598988 \h </w:instrText>
+              <w:instrText xml:space="preserve"> PAGEREF _Toc232771791 \h </w:instrText>
             </w:r>
             <w:r>
               <w:rPr>
@@ -1013,7 +1013,7 @@
               <w:lang w:eastAsia="en-IN" w:bidi="gu-IN"/>
             </w:rPr>
           </w:pPr>
-          <w:hyperlink w:anchor="_Toc232598989" w:history="1">
+          <w:hyperlink w:anchor="_Toc232771792" w:history="1">
             <w:r>
               <w:rPr>
                 <w:rStyle w:val="Hyperlink"/>
@@ -1040,7 +1040,7 @@
                 <w:noProof/>
                 <w:webHidden/>
               </w:rPr>
-              <w:instrText xml:space="preserve"> PAGEREF _Toc232598989 \h </w:instrText>
+              <w:instrText xml:space="preserve"> PAGEREF _Toc232771792 \h </w:instrText>
             </w:r>
             <w:r>
               <w:rPr>
@@ -1084,7 +1084,7 @@
               <w:lang w:eastAsia="en-IN" w:bidi="gu-IN"/>
             </w:rPr>
           </w:pPr>
-          <w:hyperlink w:anchor="_Toc232598990" w:history="1">
+          <w:hyperlink w:anchor="_Toc232771793" w:history="1">
             <w:r>
               <w:rPr>
                 <w:rStyle w:val="Hyperlink"/>
@@ -1111,7 +1111,7 @@
                 <w:noProof/>
                 <w:webHidden/>
               </w:rPr>
-              <w:instrText xml:space="preserve"> PAGEREF _Toc232598990 \h </w:instrText>
+              <w:instrText xml:space="preserve"> PAGEREF _Toc232771793 \h </w:instrText>
             </w:r>
             <w:r>
               <w:rPr>
@@ -1132,6 +1132,77 @@
                 <w:webHidden/>
               </w:rPr>
               <w:t>12</w:t>
+            </w:r>
+            <w:r>
+              <w:rPr>
+                <w:noProof/>
+                <w:webHidden/>
+              </w:rPr>
+              <w:fldChar w:fldCharType="end"/>
+            </w:r>
+          </w:hyperlink>
+        </w:p>
+        <w:p>
+          <w:pPr>
+            <w:pStyle w:val="TOC2"/>
+            <w:tabs>
+              <w:tab w:val="right" w:leader="dot" w:pos="9016"/>
+            </w:tabs>
+            <w:rPr>
+              <w:rFonts w:asciiTheme="minorHAnsi" w:eastAsiaTheme="minorEastAsia" w:hAnsiTheme="minorHAnsi"/>
+              <w:noProof/>
+              <w:szCs w:val="24"/>
+              <w:lang w:eastAsia="en-IN" w:bidi="gu-IN"/>
+            </w:rPr>
+          </w:pPr>
+          <w:hyperlink w:anchor="_Toc232771794" w:history="1">
+            <w:r>
+              <w:rPr>
+                <w:rStyle w:val="Hyperlink"/>
+                <w:noProof/>
+              </w:rPr>
+              <w:t>2.7 Lookup Functions</w:t>
+            </w:r>
+            <w:r>
+              <w:rPr>
+                <w:noProof/>
+                <w:webHidden/>
+              </w:rPr>
+              <w:tab/>
+            </w:r>
+            <w:r>
+              <w:rPr>
+                <w:noProof/>
+                <w:webHidden/>
+              </w:rPr>
+              <w:fldChar w:fldCharType="begin"/>
+            </w:r>
+            <w:r>
+              <w:rPr>
+                <w:noProof/>
+                <w:webHidden/>
+              </w:rPr>
+              <w:instrText xml:space="preserve"> PAGEREF _Toc232771794 \h </w:instrText>
+            </w:r>
+            <w:r>
+              <w:rPr>
+                <w:noProof/>
+                <w:webHidden/>
+              </w:rPr>
+            </w:r>
+            <w:r>
+              <w:rPr>
+                <w:noProof/>
+                <w:webHidden/>
+              </w:rPr>
+              <w:fldChar w:fldCharType="separate"/>
+            </w:r>
+            <w:r>
+              <w:rPr>
+                <w:noProof/>
+                <w:webHidden/>
+              </w:rPr>
+              <w:t>14</w:t>
             </w:r>
             <w:r>
               <w:rPr>
@@ -1183,7 +1254,7 @@
         </w:numPr>
         <w:ind w:left="420" w:hanging="420"/>
       </w:pPr>
-      <w:bookmarkStart w:id="0" w:name="_Toc232598977"/>
+      <w:bookmarkStart w:id="0" w:name="_Toc232771780"/>
       <w:r>
         <w:t>Short Cuts</w:t>
       </w:r>
@@ -1234,7 +1305,7 @@
           <w:lang w:val="en-US"/>
         </w:rPr>
       </w:pPr>
-      <w:bookmarkStart w:id="1" w:name="_Toc232598978"/>
+      <w:bookmarkStart w:id="1" w:name="_Toc232771781"/>
       <w:r>
         <w:rPr>
           <w:lang w:val="en-US"/>
@@ -1281,7 +1352,7 @@
           <w:lang w:val="en-US"/>
         </w:rPr>
       </w:pPr>
-      <w:bookmarkStart w:id="2" w:name="_Toc232598979"/>
+      <w:bookmarkStart w:id="2" w:name="_Toc232771782"/>
       <w:r>
         <w:rPr>
           <w:lang w:val="en-US"/>
@@ -1392,7 +1463,7 @@
           <w:lang w:val="en-US"/>
         </w:rPr>
       </w:pPr>
-      <w:bookmarkStart w:id="3" w:name="_Toc232598980"/>
+      <w:bookmarkStart w:id="3" w:name="_Toc232771783"/>
       <w:r>
         <w:rPr>
           <w:lang w:val="en-US"/>
@@ -1542,7 +1613,7 @@
           <w:lang w:val="en-US"/>
         </w:rPr>
       </w:pPr>
-      <w:bookmarkStart w:id="4" w:name="_Toc232598981"/>
+      <w:bookmarkStart w:id="4" w:name="_Toc232771784"/>
       <w:r>
         <w:rPr>
           <w:lang w:val="en-US"/>
@@ -1820,7 +1891,7 @@
         </w:rPr>
         <w:br w:type="page"/>
       </w:r>
-      <w:bookmarkStart w:id="5" w:name="_Toc232598982"/>
+      <w:bookmarkStart w:id="5" w:name="_Toc232771785"/>
       <w:r>
         <w:rPr>
           <w:lang w:val="en-US"/>
@@ -2340,7 +2411,7 @@
         </w:rPr>
         <w:br w:type="page"/>
       </w:r>
-      <w:bookmarkStart w:id="6" w:name="_Toc232598983"/>
+      <w:bookmarkStart w:id="6" w:name="_Toc232771786"/>
       <w:r>
         <w:rPr>
           <w:lang w:val="en-US"/>
@@ -3000,7 +3071,7 @@
           <w:lang w:val="en-US"/>
         </w:rPr>
       </w:pPr>
-      <w:bookmarkStart w:id="7" w:name="_Toc232598984"/>
+      <w:bookmarkStart w:id="7" w:name="_Toc232771787"/>
       <w:r>
         <w:rPr>
           <w:lang w:val="en-US"/>
@@ -3023,7 +3094,7 @@
           <w:lang w:val="en-US"/>
         </w:rPr>
       </w:pPr>
-      <w:bookmarkStart w:id="8" w:name="_Toc232598985"/>
+      <w:bookmarkStart w:id="8" w:name="_Toc232771788"/>
       <w:r>
         <w:rPr>
           <w:lang w:val="en-US"/>
@@ -3372,6 +3443,7 @@
       </w:pPr>
       <w:r>
         <w:rPr>
+          <w:noProof/>
           <w:lang w:val="en-US"/>
         </w:rPr>
         <w:drawing>
@@ -3425,7 +3497,7 @@
           <w:lang w:val="en-US"/>
         </w:rPr>
       </w:pPr>
-      <w:bookmarkStart w:id="9" w:name="_Toc232598986"/>
+      <w:bookmarkStart w:id="9" w:name="_Toc232771789"/>
       <w:r>
         <w:rPr>
           <w:lang w:val="en-US"/>
@@ -3976,7 +4048,7 @@
           <w:lang w:val="en-US"/>
         </w:rPr>
       </w:pPr>
-      <w:bookmarkStart w:id="10" w:name="_Toc232598987"/>
+      <w:bookmarkStart w:id="10" w:name="_Toc232771790"/>
       <w:r>
         <w:rPr>
           <w:lang w:val="en-US"/>
@@ -4328,7 +4400,7 @@
       <w:pPr>
         <w:pStyle w:val="Heading2"/>
       </w:pPr>
-      <w:bookmarkStart w:id="11" w:name="_Toc232598988"/>
+      <w:bookmarkStart w:id="11" w:name="_Toc232771791"/>
       <w:r>
         <w:t>2.4 Math Functions</w:t>
       </w:r>
@@ -4740,7 +4812,7 @@
       <w:pPr>
         <w:pStyle w:val="Heading2"/>
       </w:pPr>
-      <w:bookmarkStart w:id="12" w:name="_Toc232598989"/>
+      <w:bookmarkStart w:id="12" w:name="_Toc232771792"/>
       <w:r>
         <w:t>2.5 Statistical Functions</w:t>
       </w:r>
@@ -5244,7 +5316,7 @@
       <w:pPr>
         <w:pStyle w:val="Heading2"/>
       </w:pPr>
-      <w:bookmarkStart w:id="13" w:name="_Toc232598990"/>
+      <w:bookmarkStart w:id="13" w:name="_Toc232771793"/>
       <w:r>
         <w:t>2.6 Array</w:t>
       </w:r>
@@ -5941,6 +6013,1118 @@
       </w:pPr>
     </w:p>
     <w:p/>
+    <w:p>
+      <w:pPr>
+        <w:pStyle w:val="Heading2"/>
+      </w:pPr>
+      <w:bookmarkStart w:id="14" w:name="_Toc232771794"/>
+      <w:r>
+        <w:t>2.7 Lookup Functions</w:t>
+      </w:r>
+      <w:bookmarkEnd w:id="14"/>
+    </w:p>
+    <w:p/>
+    <w:p>
+      <w:pPr>
+        <w:rPr>
+          <w:b/>
+          <w:bCs/>
+          <w:u w:val="single"/>
+        </w:rPr>
+      </w:pPr>
+      <w:r>
+        <w:rPr>
+          <w:b/>
+          <w:bCs/>
+          <w:u w:val="single"/>
+        </w:rPr>
+        <w:sym w:font="Wingdings" w:char="F0E0"/>
+      </w:r>
+      <w:r>
+        <w:rPr>
+          <w:b/>
+          <w:bCs/>
+          <w:u w:val="single"/>
+        </w:rPr>
+        <w:t xml:space="preserve"> </w:t>
+      </w:r>
+      <w:proofErr w:type="gramStart"/>
+      <w:r>
+        <w:rPr>
+          <w:b/>
+          <w:bCs/>
+          <w:u w:val="single"/>
+        </w:rPr>
+        <w:t>VLOOKUP(</w:t>
+      </w:r>
+      <w:proofErr w:type="gramEnd"/>
+      <w:r>
+        <w:rPr>
+          <w:b/>
+          <w:bCs/>
+          <w:u w:val="single"/>
+        </w:rPr>
+        <w:t>)</w:t>
+      </w:r>
+    </w:p>
+    <w:p/>
+    <w:p>
+      <w:r>
+        <w:t>VLOOKUP = Vertical Lookup</w:t>
+      </w:r>
+    </w:p>
+    <w:p>
+      <w:r>
+        <w:t xml:space="preserve">It searches for a value in the </w:t>
+      </w:r>
+      <w:r>
+        <w:rPr>
+          <w:b/>
+          <w:bCs/>
+        </w:rPr>
+        <w:t>first column</w:t>
+      </w:r>
+      <w:r>
+        <w:t xml:space="preserve"> of a table and returns a value from another column in the </w:t>
+      </w:r>
+      <w:r>
+        <w:rPr>
+          <w:b/>
+          <w:bCs/>
+        </w:rPr>
+        <w:t>same row</w:t>
+      </w:r>
+      <w:r>
+        <w:t>.</w:t>
+      </w:r>
+    </w:p>
+    <w:p/>
+    <w:tbl>
+      <w:tblPr>
+        <w:tblStyle w:val="TableGrid"/>
+        <w:tblW w:w="0" w:type="auto"/>
+        <w:tblLook w:val="04A0" w:firstRow="1" w:lastRow="0" w:firstColumn="1" w:lastColumn="0" w:noHBand="0" w:noVBand="1"/>
+      </w:tblPr>
+      <w:tblGrid>
+        <w:gridCol w:w="9016"/>
+      </w:tblGrid>
+      <w:tr>
+        <w:tc>
+          <w:tcPr>
+            <w:tcW w:w="9016" w:type="dxa"/>
+            <w:shd w:val="clear" w:color="auto" w:fill="E7E6E6" w:themeFill="background2"/>
+          </w:tcPr>
+          <w:p>
+            <w:r>
+              <w:t>=</w:t>
+            </w:r>
+            <w:proofErr w:type="gramStart"/>
+            <w:r>
+              <w:t>VLOOKUP(</w:t>
+            </w:r>
+            <w:proofErr w:type="spellStart"/>
+            <w:proofErr w:type="gramEnd"/>
+            <w:r>
+              <w:t>lookup_value</w:t>
+            </w:r>
+            <w:proofErr w:type="spellEnd"/>
+            <w:r>
+              <w:t xml:space="preserve">, </w:t>
+            </w:r>
+            <w:proofErr w:type="spellStart"/>
+            <w:r>
+              <w:t>table_array</w:t>
+            </w:r>
+            <w:proofErr w:type="spellEnd"/>
+            <w:r>
+              <w:t xml:space="preserve">, </w:t>
+            </w:r>
+            <w:proofErr w:type="spellStart"/>
+            <w:r>
+              <w:t>col_index_num</w:t>
+            </w:r>
+            <w:proofErr w:type="spellEnd"/>
+            <w:r>
+              <w:t>, [</w:t>
+            </w:r>
+            <w:proofErr w:type="spellStart"/>
+            <w:r>
+              <w:t>range_lookup</w:t>
+            </w:r>
+            <w:proofErr w:type="spellEnd"/>
+            <w:r>
+              <w:t>])</w:t>
+            </w:r>
+          </w:p>
+        </w:tc>
+      </w:tr>
+    </w:tbl>
+    <w:p/>
+    <w:p/>
+    <w:p/>
+    <w:p>
+      <w:pPr>
+        <w:rPr>
+          <w:b/>
+          <w:bCs/>
+        </w:rPr>
+      </w:pPr>
+      <w:r>
+        <w:rPr>
+          <w:b/>
+          <w:bCs/>
+        </w:rPr>
+        <w:lastRenderedPageBreak/>
+        <w:t>Parameters</w:t>
+      </w:r>
+    </w:p>
+    <w:p>
+      <w:pPr>
+        <w:numPr>
+          <w:ilvl w:val="0"/>
+          <w:numId w:val="12"/>
+        </w:numPr>
+      </w:pPr>
+      <w:proofErr w:type="spellStart"/>
+      <w:r>
+        <w:rPr>
+          <w:b/>
+          <w:bCs/>
+        </w:rPr>
+        <w:t>lookup_value</w:t>
+      </w:r>
+      <w:proofErr w:type="spellEnd"/>
+      <w:r>
+        <w:t xml:space="preserve"> → Value to search for. </w:t>
+      </w:r>
+    </w:p>
+    <w:p>
+      <w:pPr>
+        <w:numPr>
+          <w:ilvl w:val="0"/>
+          <w:numId w:val="12"/>
+        </w:numPr>
+      </w:pPr>
+      <w:proofErr w:type="spellStart"/>
+      <w:r>
+        <w:rPr>
+          <w:b/>
+          <w:bCs/>
+        </w:rPr>
+        <w:t>table_array</w:t>
+      </w:r>
+      <w:proofErr w:type="spellEnd"/>
+      <w:r>
+        <w:t xml:space="preserve"> → Range containing the data. </w:t>
+      </w:r>
+    </w:p>
+    <w:p>
+      <w:pPr>
+        <w:numPr>
+          <w:ilvl w:val="0"/>
+          <w:numId w:val="12"/>
+        </w:numPr>
+      </w:pPr>
+      <w:proofErr w:type="spellStart"/>
+      <w:r>
+        <w:rPr>
+          <w:b/>
+          <w:bCs/>
+        </w:rPr>
+        <w:t>col_index_num</w:t>
+      </w:r>
+      <w:proofErr w:type="spellEnd"/>
+      <w:r>
+        <w:t xml:space="preserve"> → Column number (starting from 1) from which to return the result. </w:t>
+      </w:r>
+    </w:p>
+    <w:p>
+      <w:pPr>
+        <w:numPr>
+          <w:ilvl w:val="0"/>
+          <w:numId w:val="12"/>
+        </w:numPr>
+      </w:pPr>
+      <w:proofErr w:type="spellStart"/>
+      <w:r>
+        <w:rPr>
+          <w:b/>
+          <w:bCs/>
+        </w:rPr>
+        <w:t>range_lookup</w:t>
+      </w:r>
+      <w:proofErr w:type="spellEnd"/>
+      <w:r>
+        <w:t xml:space="preserve"> </w:t>
+      </w:r>
+    </w:p>
+    <w:p>
+      <w:pPr>
+        <w:numPr>
+          <w:ilvl w:val="1"/>
+          <w:numId w:val="12"/>
+        </w:numPr>
+      </w:pPr>
+      <w:r>
+        <w:t xml:space="preserve">FALSE = Exact match (most commonly used) </w:t>
+      </w:r>
+    </w:p>
+    <w:p>
+      <w:pPr>
+        <w:numPr>
+          <w:ilvl w:val="1"/>
+          <w:numId w:val="12"/>
+        </w:numPr>
+      </w:pPr>
+      <w:r>
+        <w:t>TRUE = Approximate match</w:t>
+      </w:r>
+    </w:p>
+    <w:p/>
+    <w:p/>
+    <w:p>
+      <w:r>
+        <w:t xml:space="preserve">In </w:t>
+      </w:r>
+      <w:proofErr w:type="gramStart"/>
+      <w:r>
+        <w:t>VLOOKUP(</w:t>
+      </w:r>
+      <w:proofErr w:type="gramEnd"/>
+      <w:r>
+        <w:t xml:space="preserve">), </w:t>
+      </w:r>
+      <w:proofErr w:type="spellStart"/>
+      <w:r>
+        <w:rPr>
+          <w:b/>
+          <w:bCs/>
+        </w:rPr>
+        <w:t>col_index_num</w:t>
+      </w:r>
+      <w:proofErr w:type="spellEnd"/>
+      <w:r>
+        <w:t xml:space="preserve"> means:</w:t>
+      </w:r>
+    </w:p>
+    <w:p>
+      <w:r>
+        <w:t>The column number from the selected table range from which you want Excel to return a value.</w:t>
+      </w:r>
+    </w:p>
+    <w:p/>
+    <w:p>
+      <w:r>
+        <w:sym w:font="Wingdings" w:char="F0E0"/>
+      </w:r>
+      <w:r>
+        <w:t xml:space="preserve"> </w:t>
+      </w:r>
+      <w:proofErr w:type="gramStart"/>
+      <w:r>
+        <w:t>Generally</w:t>
+      </w:r>
+      <w:proofErr w:type="gramEnd"/>
+      <w:r>
+        <w:t xml:space="preserve"> we use “FALSE” in </w:t>
+      </w:r>
+      <w:proofErr w:type="spellStart"/>
+      <w:r>
+        <w:rPr>
+          <w:i/>
+          <w:iCs/>
+        </w:rPr>
+        <w:t>range_lookup</w:t>
+      </w:r>
+      <w:proofErr w:type="spellEnd"/>
+      <w:r>
+        <w:t xml:space="preserve"> because, by default they expect the values to be sorted but as because in our case they are not sorted, hence we provide FALSE means do Exact match</w:t>
+      </w:r>
+      <w:r>
+        <w:t>.</w:t>
+      </w:r>
+    </w:p>
+    <w:p/>
+    <w:p/>
+    <w:p/>
+    <w:p>
+      <w:pPr>
+        <w:rPr>
+          <w:b/>
+          <w:bCs/>
+          <w:u w:val="single"/>
+        </w:rPr>
+      </w:pPr>
+      <w:r>
+        <w:rPr>
+          <w:b/>
+          <w:bCs/>
+          <w:u w:val="single"/>
+        </w:rPr>
+        <w:sym w:font="Wingdings" w:char="F0E8"/>
+      </w:r>
+      <w:r>
+        <w:rPr>
+          <w:b/>
+          <w:bCs/>
+          <w:u w:val="single"/>
+        </w:rPr>
+        <w:t xml:space="preserve"> </w:t>
+      </w:r>
+      <w:proofErr w:type="gramStart"/>
+      <w:r>
+        <w:rPr>
+          <w:b/>
+          <w:bCs/>
+          <w:u w:val="single"/>
+        </w:rPr>
+        <w:t>HLOOKUP(</w:t>
+      </w:r>
+      <w:proofErr w:type="gramEnd"/>
+      <w:r>
+        <w:rPr>
+          <w:b/>
+          <w:bCs/>
+          <w:u w:val="single"/>
+        </w:rPr>
+        <w:t>):</w:t>
+      </w:r>
+    </w:p>
+    <w:p>
+      <w:r>
+        <w:t>HLOOKUP = Horizontal Lookup</w:t>
+      </w:r>
+    </w:p>
+    <w:p>
+      <w:r>
+        <w:t xml:space="preserve">It searches for a value in the </w:t>
+      </w:r>
+      <w:r>
+        <w:rPr>
+          <w:b/>
+          <w:bCs/>
+        </w:rPr>
+        <w:t>first row</w:t>
+      </w:r>
+      <w:r>
+        <w:t xml:space="preserve"> of a table and returns a value from another row in the </w:t>
+      </w:r>
+      <w:r>
+        <w:rPr>
+          <w:b/>
+          <w:bCs/>
+        </w:rPr>
+        <w:t>same column</w:t>
+      </w:r>
+      <w:r>
+        <w:t>.</w:t>
+      </w:r>
+    </w:p>
+    <w:tbl>
+      <w:tblPr>
+        <w:tblStyle w:val="TableGrid"/>
+        <w:tblW w:w="0" w:type="auto"/>
+        <w:tblLook w:val="04A0" w:firstRow="1" w:lastRow="0" w:firstColumn="1" w:lastColumn="0" w:noHBand="0" w:noVBand="1"/>
+      </w:tblPr>
+      <w:tblGrid>
+        <w:gridCol w:w="9016"/>
+      </w:tblGrid>
+      <w:tr>
+        <w:tc>
+          <w:tcPr>
+            <w:tcW w:w="9016" w:type="dxa"/>
+            <w:shd w:val="clear" w:color="auto" w:fill="E7E6E6" w:themeFill="background2"/>
+          </w:tcPr>
+          <w:p>
+            <w:r>
+              <w:t>=</w:t>
+            </w:r>
+            <w:proofErr w:type="gramStart"/>
+            <w:r>
+              <w:t>HLOOKUP(</w:t>
+            </w:r>
+            <w:proofErr w:type="spellStart"/>
+            <w:proofErr w:type="gramEnd"/>
+            <w:r>
+              <w:t>lookup_value</w:t>
+            </w:r>
+            <w:proofErr w:type="spellEnd"/>
+            <w:r>
+              <w:t xml:space="preserve">, </w:t>
+            </w:r>
+            <w:proofErr w:type="spellStart"/>
+            <w:r>
+              <w:t>table_array</w:t>
+            </w:r>
+            <w:proofErr w:type="spellEnd"/>
+            <w:r>
+              <w:t xml:space="preserve">, </w:t>
+            </w:r>
+            <w:proofErr w:type="spellStart"/>
+            <w:r>
+              <w:t>row_index_num</w:t>
+            </w:r>
+            <w:proofErr w:type="spellEnd"/>
+            <w:r>
+              <w:t>, [</w:t>
+            </w:r>
+            <w:proofErr w:type="spellStart"/>
+            <w:r>
+              <w:t>range_lookup</w:t>
+            </w:r>
+            <w:proofErr w:type="spellEnd"/>
+            <w:r>
+              <w:t>])</w:t>
+            </w:r>
+          </w:p>
+        </w:tc>
+      </w:tr>
+    </w:tbl>
+    <w:p/>
+    <w:p/>
+    <w:p/>
+    <w:p>
+      <w:pPr>
+        <w:rPr>
+          <w:b/>
+          <w:bCs/>
+          <w:u w:val="single"/>
+        </w:rPr>
+      </w:pPr>
+      <w:r>
+        <w:sym w:font="Wingdings" w:char="F0E8"/>
+      </w:r>
+      <w:r>
+        <w:t xml:space="preserve"> </w:t>
+      </w:r>
+      <w:proofErr w:type="gramStart"/>
+      <w:r>
+        <w:rPr>
+          <w:b/>
+          <w:bCs/>
+          <w:u w:val="single"/>
+        </w:rPr>
+        <w:t>MATCH(</w:t>
+      </w:r>
+      <w:proofErr w:type="gramEnd"/>
+      <w:r>
+        <w:rPr>
+          <w:b/>
+          <w:bCs/>
+          <w:u w:val="single"/>
+        </w:rPr>
+        <w:t>):</w:t>
+      </w:r>
+    </w:p>
+    <w:p>
+      <w:r>
+        <w:t xml:space="preserve">The </w:t>
+      </w:r>
+      <w:proofErr w:type="gramStart"/>
+      <w:r>
+        <w:rPr>
+          <w:b/>
+          <w:bCs/>
+        </w:rPr>
+        <w:t>MATCH(</w:t>
+      </w:r>
+      <w:proofErr w:type="gramEnd"/>
+      <w:r>
+        <w:rPr>
+          <w:b/>
+          <w:bCs/>
+        </w:rPr>
+        <w:t>)</w:t>
+      </w:r>
+      <w:r>
+        <w:t xml:space="preserve"> function returns the </w:t>
+      </w:r>
+      <w:r>
+        <w:rPr>
+          <w:b/>
+          <w:bCs/>
+        </w:rPr>
+        <w:t>position</w:t>
+      </w:r>
+      <w:r>
+        <w:t xml:space="preserve"> of a value within a range, not the value itself.</w:t>
+      </w:r>
+    </w:p>
+    <w:tbl>
+      <w:tblPr>
+        <w:tblStyle w:val="TableGrid"/>
+        <w:tblW w:w="0" w:type="auto"/>
+        <w:tblLook w:val="04A0" w:firstRow="1" w:lastRow="0" w:firstColumn="1" w:lastColumn="0" w:noHBand="0" w:noVBand="1"/>
+      </w:tblPr>
+      <w:tblGrid>
+        <w:gridCol w:w="9016"/>
+      </w:tblGrid>
+      <w:tr>
+        <w:tc>
+          <w:tcPr>
+            <w:tcW w:w="9016" w:type="dxa"/>
+            <w:shd w:val="clear" w:color="auto" w:fill="E7E6E6" w:themeFill="background2"/>
+          </w:tcPr>
+          <w:p>
+            <w:r>
+              <w:t>=</w:t>
+            </w:r>
+            <w:proofErr w:type="gramStart"/>
+            <w:r>
+              <w:t>MATCH(</w:t>
+            </w:r>
+            <w:proofErr w:type="spellStart"/>
+            <w:proofErr w:type="gramEnd"/>
+            <w:r>
+              <w:t>lookup_value</w:t>
+            </w:r>
+            <w:proofErr w:type="spellEnd"/>
+            <w:r>
+              <w:t xml:space="preserve">, </w:t>
+            </w:r>
+            <w:proofErr w:type="spellStart"/>
+            <w:r>
+              <w:t>lookup_array</w:t>
+            </w:r>
+            <w:proofErr w:type="spellEnd"/>
+            <w:r>
+              <w:t>, [</w:t>
+            </w:r>
+            <w:proofErr w:type="spellStart"/>
+            <w:r>
+              <w:t>match_type</w:t>
+            </w:r>
+            <w:proofErr w:type="spellEnd"/>
+            <w:r>
+              <w:t>])</w:t>
+            </w:r>
+          </w:p>
+        </w:tc>
+      </w:tr>
+    </w:tbl>
+    <w:p/>
+    <w:p>
+      <w:r>
+        <w:br w:type="page"/>
+      </w:r>
+    </w:p>
+    <w:p>
+      <w:pPr>
+        <w:rPr>
+          <w:b/>
+          <w:bCs/>
+        </w:rPr>
+      </w:pPr>
+      <w:r>
+        <w:rPr>
+          <w:b/>
+          <w:bCs/>
+        </w:rPr>
+        <w:lastRenderedPageBreak/>
+        <w:t>Parameters</w:t>
+      </w:r>
+    </w:p>
+    <w:p>
+      <w:pPr>
+        <w:numPr>
+          <w:ilvl w:val="0"/>
+          <w:numId w:val="13"/>
+        </w:numPr>
+      </w:pPr>
+      <w:proofErr w:type="spellStart"/>
+      <w:r>
+        <w:rPr>
+          <w:b/>
+          <w:bCs/>
+        </w:rPr>
+        <w:t>lookup_value</w:t>
+      </w:r>
+      <w:proofErr w:type="spellEnd"/>
+      <w:r>
+        <w:t xml:space="preserve"> → The value you want to find. </w:t>
+      </w:r>
+    </w:p>
+    <w:p>
+      <w:pPr>
+        <w:numPr>
+          <w:ilvl w:val="0"/>
+          <w:numId w:val="13"/>
+        </w:numPr>
+      </w:pPr>
+      <w:proofErr w:type="spellStart"/>
+      <w:r>
+        <w:rPr>
+          <w:b/>
+          <w:bCs/>
+        </w:rPr>
+        <w:t>lookup_array</w:t>
+      </w:r>
+      <w:proofErr w:type="spellEnd"/>
+      <w:r>
+        <w:t xml:space="preserve"> → The range to search in. </w:t>
+      </w:r>
+    </w:p>
+    <w:p>
+      <w:pPr>
+        <w:numPr>
+          <w:ilvl w:val="0"/>
+          <w:numId w:val="13"/>
+        </w:numPr>
+      </w:pPr>
+      <w:proofErr w:type="spellStart"/>
+      <w:r>
+        <w:rPr>
+          <w:b/>
+          <w:bCs/>
+        </w:rPr>
+        <w:t>match_type</w:t>
+      </w:r>
+      <w:proofErr w:type="spellEnd"/>
+      <w:r>
+        <w:t xml:space="preserve"> (optional): </w:t>
+      </w:r>
+    </w:p>
+    <w:p>
+      <w:pPr>
+        <w:numPr>
+          <w:ilvl w:val="1"/>
+          <w:numId w:val="13"/>
+        </w:numPr>
+      </w:pPr>
+      <w:r>
+        <w:t xml:space="preserve">0 → Exact match (most commonly used) </w:t>
+      </w:r>
+    </w:p>
+    <w:p>
+      <w:pPr>
+        <w:numPr>
+          <w:ilvl w:val="1"/>
+          <w:numId w:val="13"/>
+        </w:numPr>
+      </w:pPr>
+      <w:r>
+        <w:t xml:space="preserve">1 → Largest value ≤ </w:t>
+      </w:r>
+      <w:proofErr w:type="spellStart"/>
+      <w:r>
+        <w:t>lookup_value</w:t>
+      </w:r>
+      <w:proofErr w:type="spellEnd"/>
+      <w:r>
+        <w:t xml:space="preserve"> (ascending order required) </w:t>
+      </w:r>
+    </w:p>
+    <w:p>
+      <w:pPr>
+        <w:numPr>
+          <w:ilvl w:val="1"/>
+          <w:numId w:val="13"/>
+        </w:numPr>
+      </w:pPr>
+      <w:r>
+        <w:t xml:space="preserve">-1 → Smallest value ≥ </w:t>
+      </w:r>
+      <w:proofErr w:type="spellStart"/>
+      <w:r>
+        <w:t>lookup_value</w:t>
+      </w:r>
+      <w:proofErr w:type="spellEnd"/>
+      <w:r>
+        <w:t xml:space="preserve"> (descending order required)</w:t>
+      </w:r>
+    </w:p>
+    <w:p/>
+    <w:p/>
+    <w:p/>
+    <w:p/>
+    <w:p>
+      <w:r>
+        <w:sym w:font="Wingdings" w:char="F0E8"/>
+      </w:r>
+      <w:r>
+        <w:t xml:space="preserve"> </w:t>
+      </w:r>
+      <w:proofErr w:type="gramStart"/>
+      <w:r>
+        <w:rPr>
+          <w:b/>
+          <w:bCs/>
+          <w:u w:val="single"/>
+        </w:rPr>
+        <w:t>XLOOKUP(</w:t>
+      </w:r>
+      <w:proofErr w:type="gramEnd"/>
+      <w:r>
+        <w:rPr>
+          <w:b/>
+          <w:bCs/>
+          <w:u w:val="single"/>
+        </w:rPr>
+        <w:t>):</w:t>
+      </w:r>
+    </w:p>
+    <w:p>
+      <w:proofErr w:type="gramStart"/>
+      <w:r>
+        <w:t>XLOOKUP(</w:t>
+      </w:r>
+      <w:proofErr w:type="gramEnd"/>
+      <w:r>
+        <w:t xml:space="preserve">) is a modern lookup function in Excel that replaces both </w:t>
+      </w:r>
+      <w:proofErr w:type="gramStart"/>
+      <w:r>
+        <w:t>VLOOKUP(</w:t>
+      </w:r>
+      <w:proofErr w:type="gramEnd"/>
+      <w:r>
+        <w:t xml:space="preserve">) and </w:t>
+      </w:r>
+      <w:proofErr w:type="gramStart"/>
+      <w:r>
+        <w:t>HLOOKUP(</w:t>
+      </w:r>
+      <w:proofErr w:type="gramEnd"/>
+      <w:r>
+        <w:t>). It can search vertically or horizontally and is more flexible.</w:t>
+      </w:r>
+    </w:p>
+    <w:tbl>
+      <w:tblPr>
+        <w:tblStyle w:val="TableGrid"/>
+        <w:tblW w:w="0" w:type="auto"/>
+        <w:tblLook w:val="04A0" w:firstRow="1" w:lastRow="0" w:firstColumn="1" w:lastColumn="0" w:noHBand="0" w:noVBand="1"/>
+      </w:tblPr>
+      <w:tblGrid>
+        <w:gridCol w:w="9016"/>
+      </w:tblGrid>
+      <w:tr>
+        <w:tc>
+          <w:tcPr>
+            <w:tcW w:w="9016" w:type="dxa"/>
+            <w:shd w:val="clear" w:color="auto" w:fill="E7E6E6" w:themeFill="background2"/>
+          </w:tcPr>
+          <w:p>
+            <w:r>
+              <w:t>=</w:t>
+            </w:r>
+            <w:proofErr w:type="gramStart"/>
+            <w:r>
+              <w:t>XLOOKUP(</w:t>
+            </w:r>
+            <w:proofErr w:type="spellStart"/>
+            <w:proofErr w:type="gramEnd"/>
+            <w:r>
+              <w:t>lookup_value</w:t>
+            </w:r>
+            <w:proofErr w:type="spellEnd"/>
+            <w:r>
+              <w:t xml:space="preserve">, </w:t>
+            </w:r>
+            <w:proofErr w:type="spellStart"/>
+            <w:r>
+              <w:t>lookup_array</w:t>
+            </w:r>
+            <w:proofErr w:type="spellEnd"/>
+            <w:r>
+              <w:t xml:space="preserve">, </w:t>
+            </w:r>
+            <w:proofErr w:type="spellStart"/>
+            <w:r>
+              <w:t>return_array</w:t>
+            </w:r>
+            <w:proofErr w:type="spellEnd"/>
+            <w:r>
+              <w:t>, [</w:t>
+            </w:r>
+            <w:proofErr w:type="spellStart"/>
+            <w:r>
+              <w:t>if_not_found</w:t>
+            </w:r>
+            <w:proofErr w:type="spellEnd"/>
+            <w:r>
+              <w:t>], [</w:t>
+            </w:r>
+            <w:proofErr w:type="spellStart"/>
+            <w:r>
+              <w:t>match_mode</w:t>
+            </w:r>
+            <w:proofErr w:type="spellEnd"/>
+            <w:r>
+              <w:t>], [</w:t>
+            </w:r>
+            <w:proofErr w:type="spellStart"/>
+            <w:r>
+              <w:t>search_mode</w:t>
+            </w:r>
+            <w:proofErr w:type="spellEnd"/>
+            <w:r>
+              <w:t>])</w:t>
+            </w:r>
+          </w:p>
+        </w:tc>
+      </w:tr>
+    </w:tbl>
+    <w:p/>
+    <w:tbl>
+      <w:tblPr>
+        <w:tblStyle w:val="PlainTable1"/>
+        <w:tblW w:w="0" w:type="auto"/>
+        <w:tblLook w:val="04A0" w:firstRow="1" w:lastRow="0" w:firstColumn="1" w:lastColumn="0" w:noHBand="0" w:noVBand="1"/>
+      </w:tblPr>
+      <w:tblGrid>
+        <w:gridCol w:w="1617"/>
+        <w:gridCol w:w="4282"/>
+      </w:tblGrid>
+      <w:tr>
+        <w:trPr>
+          <w:cnfStyle w:val="100000000000" w:firstRow="1" w:lastRow="0" w:firstColumn="0" w:lastColumn="0" w:oddVBand="0" w:evenVBand="0" w:oddHBand="0" w:evenHBand="0" w:firstRowFirstColumn="0" w:firstRowLastColumn="0" w:lastRowFirstColumn="0" w:lastRowLastColumn="0"/>
+        </w:trPr>
+        <w:tc>
+          <w:tcPr>
+            <w:cnfStyle w:val="001000000000" w:firstRow="0" w:lastRow="0" w:firstColumn="1" w:lastColumn="0" w:oddVBand="0" w:evenVBand="0" w:oddHBand="0" w:evenHBand="0" w:firstRowFirstColumn="0" w:firstRowLastColumn="0" w:lastRowFirstColumn="0" w:lastRowLastColumn="0"/>
+            <w:tcW w:w="0" w:type="auto"/>
+            <w:hideMark/>
+          </w:tcPr>
+          <w:p>
+            <w:pPr>
+              <w:spacing w:after="160" w:line="259" w:lineRule="auto"/>
+            </w:pPr>
+            <w:r>
+              <w:t>Argument</w:t>
+            </w:r>
+          </w:p>
+        </w:tc>
+        <w:tc>
+          <w:tcPr>
+            <w:tcW w:w="0" w:type="auto"/>
+            <w:hideMark/>
+          </w:tcPr>
+          <w:p>
+            <w:pPr>
+              <w:spacing w:after="160" w:line="259" w:lineRule="auto"/>
+              <w:cnfStyle w:val="100000000000" w:firstRow="1" w:lastRow="0" w:firstColumn="0" w:lastColumn="0" w:oddVBand="0" w:evenVBand="0" w:oddHBand="0" w:evenHBand="0" w:firstRowFirstColumn="0" w:firstRowLastColumn="0" w:lastRowFirstColumn="0" w:lastRowLastColumn="0"/>
+            </w:pPr>
+            <w:r>
+              <w:t>Description</w:t>
+            </w:r>
+          </w:p>
+        </w:tc>
+      </w:tr>
+      <w:tr>
+        <w:trPr>
+          <w:cnfStyle w:val="000000100000" w:firstRow="0" w:lastRow="0" w:firstColumn="0" w:lastColumn="0" w:oddVBand="0" w:evenVBand="0" w:oddHBand="1" w:evenHBand="0" w:firstRowFirstColumn="0" w:firstRowLastColumn="0" w:lastRowFirstColumn="0" w:lastRowLastColumn="0"/>
+        </w:trPr>
+        <w:tc>
+          <w:tcPr>
+            <w:cnfStyle w:val="001000000000" w:firstRow="0" w:lastRow="0" w:firstColumn="1" w:lastColumn="0" w:oddVBand="0" w:evenVBand="0" w:oddHBand="0" w:evenHBand="0" w:firstRowFirstColumn="0" w:firstRowLastColumn="0" w:lastRowFirstColumn="0" w:lastRowLastColumn="0"/>
+            <w:tcW w:w="0" w:type="auto"/>
+            <w:hideMark/>
+          </w:tcPr>
+          <w:p>
+            <w:pPr>
+              <w:spacing w:after="160" w:line="259" w:lineRule="auto"/>
+            </w:pPr>
+            <w:proofErr w:type="spellStart"/>
+            <w:r>
+              <w:t>lookup_value</w:t>
+            </w:r>
+            <w:proofErr w:type="spellEnd"/>
+          </w:p>
+        </w:tc>
+        <w:tc>
+          <w:tcPr>
+            <w:tcW w:w="0" w:type="auto"/>
+            <w:hideMark/>
+          </w:tcPr>
+          <w:p>
+            <w:pPr>
+              <w:spacing w:after="160" w:line="259" w:lineRule="auto"/>
+              <w:cnfStyle w:val="000000100000" w:firstRow="0" w:lastRow="0" w:firstColumn="0" w:lastColumn="0" w:oddVBand="0" w:evenVBand="0" w:oddHBand="1" w:evenHBand="0" w:firstRowFirstColumn="0" w:firstRowLastColumn="0" w:lastRowFirstColumn="0" w:lastRowLastColumn="0"/>
+            </w:pPr>
+            <w:r>
+              <w:t>Value you want to find</w:t>
+            </w:r>
+          </w:p>
+        </w:tc>
+      </w:tr>
+      <w:tr>
+        <w:tc>
+          <w:tcPr>
+            <w:cnfStyle w:val="001000000000" w:firstRow="0" w:lastRow="0" w:firstColumn="1" w:lastColumn="0" w:oddVBand="0" w:evenVBand="0" w:oddHBand="0" w:evenHBand="0" w:firstRowFirstColumn="0" w:firstRowLastColumn="0" w:lastRowFirstColumn="0" w:lastRowLastColumn="0"/>
+            <w:tcW w:w="0" w:type="auto"/>
+            <w:hideMark/>
+          </w:tcPr>
+          <w:p>
+            <w:pPr>
+              <w:spacing w:after="160" w:line="259" w:lineRule="auto"/>
+            </w:pPr>
+            <w:proofErr w:type="spellStart"/>
+            <w:r>
+              <w:t>lookup_array</w:t>
+            </w:r>
+            <w:proofErr w:type="spellEnd"/>
+          </w:p>
+        </w:tc>
+        <w:tc>
+          <w:tcPr>
+            <w:tcW w:w="0" w:type="auto"/>
+            <w:hideMark/>
+          </w:tcPr>
+          <w:p>
+            <w:pPr>
+              <w:spacing w:after="160" w:line="259" w:lineRule="auto"/>
+              <w:cnfStyle w:val="000000000000" w:firstRow="0" w:lastRow="0" w:firstColumn="0" w:lastColumn="0" w:oddVBand="0" w:evenVBand="0" w:oddHBand="0" w:evenHBand="0" w:firstRowFirstColumn="0" w:firstRowLastColumn="0" w:lastRowFirstColumn="0" w:lastRowLastColumn="0"/>
+            </w:pPr>
+            <w:r>
+              <w:t>Range where Excel searches for the value</w:t>
+            </w:r>
+          </w:p>
+        </w:tc>
+      </w:tr>
+      <w:tr>
+        <w:trPr>
+          <w:cnfStyle w:val="000000100000" w:firstRow="0" w:lastRow="0" w:firstColumn="0" w:lastColumn="0" w:oddVBand="0" w:evenVBand="0" w:oddHBand="1" w:evenHBand="0" w:firstRowFirstColumn="0" w:firstRowLastColumn="0" w:lastRowFirstColumn="0" w:lastRowLastColumn="0"/>
+        </w:trPr>
+        <w:tc>
+          <w:tcPr>
+            <w:cnfStyle w:val="001000000000" w:firstRow="0" w:lastRow="0" w:firstColumn="1" w:lastColumn="0" w:oddVBand="0" w:evenVBand="0" w:oddHBand="0" w:evenHBand="0" w:firstRowFirstColumn="0" w:firstRowLastColumn="0" w:lastRowFirstColumn="0" w:lastRowLastColumn="0"/>
+            <w:tcW w:w="0" w:type="auto"/>
+            <w:hideMark/>
+          </w:tcPr>
+          <w:p>
+            <w:pPr>
+              <w:spacing w:after="160" w:line="259" w:lineRule="auto"/>
+            </w:pPr>
+            <w:proofErr w:type="spellStart"/>
+            <w:r>
+              <w:t>return_array</w:t>
+            </w:r>
+            <w:proofErr w:type="spellEnd"/>
+          </w:p>
+        </w:tc>
+        <w:tc>
+          <w:tcPr>
+            <w:tcW w:w="0" w:type="auto"/>
+            <w:hideMark/>
+          </w:tcPr>
+          <w:p>
+            <w:pPr>
+              <w:spacing w:after="160" w:line="259" w:lineRule="auto"/>
+              <w:cnfStyle w:val="000000100000" w:firstRow="0" w:lastRow="0" w:firstColumn="0" w:lastColumn="0" w:oddVBand="0" w:evenVBand="0" w:oddHBand="1" w:evenHBand="0" w:firstRowFirstColumn="0" w:firstRowLastColumn="0" w:lastRowFirstColumn="0" w:lastRowLastColumn="0"/>
+            </w:pPr>
+            <w:r>
+              <w:t>Range from which Excel returns the result</w:t>
+            </w:r>
+          </w:p>
+        </w:tc>
+      </w:tr>
+      <w:tr>
+        <w:tc>
+          <w:tcPr>
+            <w:cnfStyle w:val="001000000000" w:firstRow="0" w:lastRow="0" w:firstColumn="1" w:lastColumn="0" w:oddVBand="0" w:evenVBand="0" w:oddHBand="0" w:evenHBand="0" w:firstRowFirstColumn="0" w:firstRowLastColumn="0" w:lastRowFirstColumn="0" w:lastRowLastColumn="0"/>
+            <w:tcW w:w="0" w:type="auto"/>
+            <w:hideMark/>
+          </w:tcPr>
+          <w:p>
+            <w:pPr>
+              <w:spacing w:after="160" w:line="259" w:lineRule="auto"/>
+            </w:pPr>
+            <w:proofErr w:type="spellStart"/>
+            <w:r>
+              <w:t>if_not_found</w:t>
+            </w:r>
+            <w:proofErr w:type="spellEnd"/>
+          </w:p>
+        </w:tc>
+        <w:tc>
+          <w:tcPr>
+            <w:tcW w:w="0" w:type="auto"/>
+            <w:hideMark/>
+          </w:tcPr>
+          <w:p>
+            <w:pPr>
+              <w:spacing w:after="160" w:line="259" w:lineRule="auto"/>
+              <w:cnfStyle w:val="000000000000" w:firstRow="0" w:lastRow="0" w:firstColumn="0" w:lastColumn="0" w:oddVBand="0" w:evenVBand="0" w:oddHBand="0" w:evenHBand="0" w:firstRowFirstColumn="0" w:firstRowLastColumn="0" w:lastRowFirstColumn="0" w:lastRowLastColumn="0"/>
+            </w:pPr>
+            <w:r>
+              <w:t>Optional message if value is not found</w:t>
+            </w:r>
+          </w:p>
+        </w:tc>
+      </w:tr>
+      <w:tr>
+        <w:trPr>
+          <w:cnfStyle w:val="000000100000" w:firstRow="0" w:lastRow="0" w:firstColumn="0" w:lastColumn="0" w:oddVBand="0" w:evenVBand="0" w:oddHBand="1" w:evenHBand="0" w:firstRowFirstColumn="0" w:firstRowLastColumn="0" w:lastRowFirstColumn="0" w:lastRowLastColumn="0"/>
+        </w:trPr>
+        <w:tc>
+          <w:tcPr>
+            <w:cnfStyle w:val="001000000000" w:firstRow="0" w:lastRow="0" w:firstColumn="1" w:lastColumn="0" w:oddVBand="0" w:evenVBand="0" w:oddHBand="0" w:evenHBand="0" w:firstRowFirstColumn="0" w:firstRowLastColumn="0" w:lastRowFirstColumn="0" w:lastRowLastColumn="0"/>
+            <w:tcW w:w="0" w:type="auto"/>
+            <w:hideMark/>
+          </w:tcPr>
+          <w:p>
+            <w:pPr>
+              <w:spacing w:after="160" w:line="259" w:lineRule="auto"/>
+            </w:pPr>
+            <w:proofErr w:type="spellStart"/>
+            <w:r>
+              <w:t>match_mode</w:t>
+            </w:r>
+            <w:proofErr w:type="spellEnd"/>
+          </w:p>
+        </w:tc>
+        <w:tc>
+          <w:tcPr>
+            <w:tcW w:w="0" w:type="auto"/>
+            <w:hideMark/>
+          </w:tcPr>
+          <w:p>
+            <w:pPr>
+              <w:spacing w:after="160" w:line="259" w:lineRule="auto"/>
+              <w:cnfStyle w:val="000000100000" w:firstRow="0" w:lastRow="0" w:firstColumn="0" w:lastColumn="0" w:oddVBand="0" w:evenVBand="0" w:oddHBand="1" w:evenHBand="0" w:firstRowFirstColumn="0" w:firstRowLastColumn="0" w:lastRowFirstColumn="0" w:lastRowLastColumn="0"/>
+            </w:pPr>
+            <w:r>
+              <w:t>Optional match type</w:t>
+            </w:r>
+          </w:p>
+        </w:tc>
+      </w:tr>
+      <w:tr>
+        <w:tc>
+          <w:tcPr>
+            <w:cnfStyle w:val="001000000000" w:firstRow="0" w:lastRow="0" w:firstColumn="1" w:lastColumn="0" w:oddVBand="0" w:evenVBand="0" w:oddHBand="0" w:evenHBand="0" w:firstRowFirstColumn="0" w:firstRowLastColumn="0" w:lastRowFirstColumn="0" w:lastRowLastColumn="0"/>
+            <w:tcW w:w="0" w:type="auto"/>
+            <w:hideMark/>
+          </w:tcPr>
+          <w:p>
+            <w:pPr>
+              <w:spacing w:after="160" w:line="259" w:lineRule="auto"/>
+            </w:pPr>
+            <w:proofErr w:type="spellStart"/>
+            <w:r>
+              <w:t>search_mode</w:t>
+            </w:r>
+            <w:proofErr w:type="spellEnd"/>
+          </w:p>
+        </w:tc>
+        <w:tc>
+          <w:tcPr>
+            <w:tcW w:w="0" w:type="auto"/>
+            <w:hideMark/>
+          </w:tcPr>
+          <w:p>
+            <w:pPr>
+              <w:spacing w:after="160" w:line="259" w:lineRule="auto"/>
+              <w:cnfStyle w:val="000000000000" w:firstRow="0" w:lastRow="0" w:firstColumn="0" w:lastColumn="0" w:oddVBand="0" w:evenVBand="0" w:oddHBand="0" w:evenHBand="0" w:firstRowFirstColumn="0" w:firstRowLastColumn="0" w:lastRowFirstColumn="0" w:lastRowLastColumn="0"/>
+            </w:pPr>
+            <w:r>
+              <w:t>Optional search direction</w:t>
+            </w:r>
+          </w:p>
+        </w:tc>
+      </w:tr>
+    </w:tbl>
     <w:p/>
     <w:sectPr>
       <w:pgSz w:w="11906" w:h="16838"/>
@@ -5955,6 +7139,155 @@
 <file path=word/numbering.xml><?xml version="1.0" encoding="utf-8"?>
 <w:numbering xmlns:wpc="http://schemas.microsoft.com/office/word/2010/wordprocessingCanvas" xmlns:cx="http://schemas.microsoft.com/office/drawing/2014/chartex" xmlns:cx1="http://schemas.microsoft.com/office/drawing/2015/9/8/chartex" xmlns:cx2="http://schemas.microsoft.com/office/drawing/2015/10/21/chartex" xmlns:cx3="http://schemas.microsoft.com/office/drawing/2016/5/9/chartex" xmlns:cx4="http://schemas.microsoft.com/office/drawing/2016/5/10/chartex" xmlns:cx5="http://schemas.microsoft.com/office/drawing/2016/5/11/chartex" xmlns:cx6="http://schemas.microsoft.com/office/drawing/2016/5/12/chartex" xmlns:cx7="http://schemas.microsoft.com/office/drawing/2016/5/13/chartex" xmlns:cx8="http://schemas.microsoft.com/office/drawing/2016/5/14/chartex" xmlns:mc="http://schemas.openxmlformats.org/markup-compatibility/2006" xmlns:aink="http://schemas.microsoft.com/office/drawing/2016/ink" xmlns:am3d="http://schemas.microsoft.com/office/drawing/2017/model3d" xmlns:o="urn:schemas-microsoft-com:office:office" xmlns:oel="http://schemas.microsoft.com/office/2019/extlst" xmlns:r="http://schemas.openxmlformats.org/officeDocument/2006/relationships" xmlns:m="http://schemas.openxmlformats.org/officeDocument/2006/math" xmlns:v="urn:schemas-microsoft-com:vml" xmlns:wp14="http://schemas.microsoft.com/office/word/2010/wordprocessingDrawing" xmlns:wp="http://schemas.openxmlformats.org/drawingml/2006/wordprocessingDrawing" xmlns:w10="urn:schemas-microsoft-com:office:word" xmlns:w="http://schemas.openxmlformats.org/wordprocessingml/2006/main" xmlns:w14="http://schemas.microsoft.com/office/word/2010/wordml" xmlns:w15="http://schemas.microsoft.com/office/word/2012/wordml" xmlns:w16cex="http://schemas.microsoft.com/office/word/2018/wordml/cex" xmlns:w16cid="http://schemas.microsoft.com/office/word/2016/wordml/cid" xmlns:w16="http://schemas.microsoft.com/office/word/2018/wordml" xmlns:w16du="http://schemas.microsoft.com/office/word/2023/wordml/word16du" xmlns:w16sdtdh="http://schemas.microsoft.com/office/word/2020/wordml/sdtdatahash" xmlns:w16sdtfl="http://schemas.microsoft.com/office/word/2024/wordml/sdtformatlock" xmlns:w16se="http://schemas.microsoft.com/office/word/2015/wordml/symex" xmlns:wpg="http://schemas.microsoft.com/office/word/2010/wordprocessingGroup" xmlns:wpi="http://schemas.microsoft.com/office/word/2010/wordprocessingInk" xmlns:wne="http://schemas.microsoft.com/office/word/2006/wordml" xmlns:wps="http://schemas.microsoft.com/office/word/2010/wordprocessingShape" mc:Ignorable="w14 w15 w16se w16cid w16 w16cex w16sdtdh w16sdtfl w16du wp14">
   <w:abstractNum w:abstractNumId="0" w15:restartNumberingAfterBreak="0">
+    <w:nsid w:val="0BF97D9F"/>
+    <w:multiLevelType w:val="multilevel"/>
+    <w:tmpl w:val="3C18BA1A"/>
+    <w:lvl w:ilvl="0">
+      <w:start w:val="1"/>
+      <w:numFmt w:val="bullet"/>
+      <w:lvlText w:val=""/>
+      <w:lvlJc w:val="left"/>
+      <w:pPr>
+        <w:tabs>
+          <w:tab w:val="num" w:pos="720"/>
+        </w:tabs>
+        <w:ind w:left="720" w:hanging="360"/>
+      </w:pPr>
+      <w:rPr>
+        <w:rFonts w:ascii="Symbol" w:hAnsi="Symbol" w:hint="default"/>
+        <w:sz w:val="20"/>
+      </w:rPr>
+    </w:lvl>
+    <w:lvl w:ilvl="1">
+      <w:start w:val="1"/>
+      <w:numFmt w:val="bullet"/>
+      <w:lvlText w:val="o"/>
+      <w:lvlJc w:val="left"/>
+      <w:pPr>
+        <w:tabs>
+          <w:tab w:val="num" w:pos="1440"/>
+        </w:tabs>
+        <w:ind w:left="1440" w:hanging="360"/>
+      </w:pPr>
+      <w:rPr>
+        <w:rFonts w:ascii="Courier New" w:hAnsi="Courier New" w:hint="default"/>
+        <w:sz w:val="20"/>
+      </w:rPr>
+    </w:lvl>
+    <w:lvl w:ilvl="2" w:tentative="1">
+      <w:start w:val="1"/>
+      <w:numFmt w:val="bullet"/>
+      <w:lvlText w:val=""/>
+      <w:lvlJc w:val="left"/>
+      <w:pPr>
+        <w:tabs>
+          <w:tab w:val="num" w:pos="2160"/>
+        </w:tabs>
+        <w:ind w:left="2160" w:hanging="360"/>
+      </w:pPr>
+      <w:rPr>
+        <w:rFonts w:ascii="Wingdings" w:hAnsi="Wingdings" w:hint="default"/>
+        <w:sz w:val="20"/>
+      </w:rPr>
+    </w:lvl>
+    <w:lvl w:ilvl="3" w:tentative="1">
+      <w:start w:val="1"/>
+      <w:numFmt w:val="bullet"/>
+      <w:lvlText w:val=""/>
+      <w:lvlJc w:val="left"/>
+      <w:pPr>
+        <w:tabs>
+          <w:tab w:val="num" w:pos="2880"/>
+        </w:tabs>
+        <w:ind w:left="2880" w:hanging="360"/>
+      </w:pPr>
+      <w:rPr>
+        <w:rFonts w:ascii="Wingdings" w:hAnsi="Wingdings" w:hint="default"/>
+        <w:sz w:val="20"/>
+      </w:rPr>
+    </w:lvl>
+    <w:lvl w:ilvl="4" w:tentative="1">
+      <w:start w:val="1"/>
+      <w:numFmt w:val="bullet"/>
+      <w:lvlText w:val=""/>
+      <w:lvlJc w:val="left"/>
+      <w:pPr>
+        <w:tabs>
+          <w:tab w:val="num" w:pos="3600"/>
+        </w:tabs>
+        <w:ind w:left="3600" w:hanging="360"/>
+      </w:pPr>
+      <w:rPr>
+        <w:rFonts w:ascii="Wingdings" w:hAnsi="Wingdings" w:hint="default"/>
+        <w:sz w:val="20"/>
+      </w:rPr>
+    </w:lvl>
+    <w:lvl w:ilvl="5" w:tentative="1">
+      <w:start w:val="1"/>
+      <w:numFmt w:val="bullet"/>
+      <w:lvlText w:val=""/>
+      <w:lvlJc w:val="left"/>
+      <w:pPr>
+        <w:tabs>
+          <w:tab w:val="num" w:pos="4320"/>
+        </w:tabs>
+        <w:ind w:left="4320" w:hanging="360"/>
+      </w:pPr>
+      <w:rPr>
+        <w:rFonts w:ascii="Wingdings" w:hAnsi="Wingdings" w:hint="default"/>
+        <w:sz w:val="20"/>
+      </w:rPr>
+    </w:lvl>
+    <w:lvl w:ilvl="6" w:tentative="1">
+      <w:start w:val="1"/>
+      <w:numFmt w:val="bullet"/>
+      <w:lvlText w:val=""/>
+      <w:lvlJc w:val="left"/>
+      <w:pPr>
+        <w:tabs>
+          <w:tab w:val="num" w:pos="5040"/>
+        </w:tabs>
+        <w:ind w:left="5040" w:hanging="360"/>
+      </w:pPr>
+      <w:rPr>
+        <w:rFonts w:ascii="Wingdings" w:hAnsi="Wingdings" w:hint="default"/>
+        <w:sz w:val="20"/>
+      </w:rPr>
+    </w:lvl>
+    <w:lvl w:ilvl="7" w:tentative="1">
+      <w:start w:val="1"/>
+      <w:numFmt w:val="bullet"/>
+      <w:lvlText w:val=""/>
+      <w:lvlJc w:val="left"/>
+      <w:pPr>
+        <w:tabs>
+          <w:tab w:val="num" w:pos="5760"/>
+        </w:tabs>
+        <w:ind w:left="5760" w:hanging="360"/>
+      </w:pPr>
+      <w:rPr>
+        <w:rFonts w:ascii="Wingdings" w:hAnsi="Wingdings" w:hint="default"/>
+        <w:sz w:val="20"/>
+      </w:rPr>
+    </w:lvl>
+    <w:lvl w:ilvl="8" w:tentative="1">
+      <w:start w:val="1"/>
+      <w:numFmt w:val="bullet"/>
+      <w:lvlText w:val=""/>
+      <w:lvlJc w:val="left"/>
+      <w:pPr>
+        <w:tabs>
+          <w:tab w:val="num" w:pos="6480"/>
+        </w:tabs>
+        <w:ind w:left="6480" w:hanging="360"/>
+      </w:pPr>
+      <w:rPr>
+        <w:rFonts w:ascii="Wingdings" w:hAnsi="Wingdings" w:hint="default"/>
+        <w:sz w:val="20"/>
+      </w:rPr>
+    </w:lvl>
+  </w:abstractNum>
+  <w:abstractNum w:abstractNumId="1" w15:restartNumberingAfterBreak="0">
     <w:nsid w:val="0EEF14A2"/>
     <w:multiLevelType w:val="hybridMultilevel"/>
     <w:tmpl w:val="87204A02"/>
@@ -6067,7 +7400,7 @@
       </w:rPr>
     </w:lvl>
   </w:abstractNum>
-  <w:abstractNum w:abstractNumId="1" w15:restartNumberingAfterBreak="0">
+  <w:abstractNum w:abstractNumId="2" w15:restartNumberingAfterBreak="0">
     <w:nsid w:val="159405F6"/>
     <w:multiLevelType w:val="hybridMultilevel"/>
     <w:tmpl w:val="EDF44402"/>
@@ -6156,7 +7489,7 @@
       </w:pPr>
     </w:lvl>
   </w:abstractNum>
-  <w:abstractNum w:abstractNumId="2" w15:restartNumberingAfterBreak="0">
+  <w:abstractNum w:abstractNumId="3" w15:restartNumberingAfterBreak="0">
     <w:nsid w:val="1FFF3DEA"/>
     <w:multiLevelType w:val="hybridMultilevel"/>
     <w:tmpl w:val="FFE222E8"/>
@@ -6269,7 +7602,7 @@
       </w:rPr>
     </w:lvl>
   </w:abstractNum>
-  <w:abstractNum w:abstractNumId="3" w15:restartNumberingAfterBreak="0">
+  <w:abstractNum w:abstractNumId="4" w15:restartNumberingAfterBreak="0">
     <w:nsid w:val="2C7F4519"/>
     <w:multiLevelType w:val="hybridMultilevel"/>
     <w:tmpl w:val="489E457C"/>
@@ -6382,7 +7715,156 @@
       </w:rPr>
     </w:lvl>
   </w:abstractNum>
-  <w:abstractNum w:abstractNumId="4" w15:restartNumberingAfterBreak="0">
+  <w:abstractNum w:abstractNumId="5" w15:restartNumberingAfterBreak="0">
+    <w:nsid w:val="395705E0"/>
+    <w:multiLevelType w:val="multilevel"/>
+    <w:tmpl w:val="13343864"/>
+    <w:lvl w:ilvl="0">
+      <w:start w:val="1"/>
+      <w:numFmt w:val="bullet"/>
+      <w:lvlText w:val=""/>
+      <w:lvlJc w:val="left"/>
+      <w:pPr>
+        <w:tabs>
+          <w:tab w:val="num" w:pos="720"/>
+        </w:tabs>
+        <w:ind w:left="720" w:hanging="360"/>
+      </w:pPr>
+      <w:rPr>
+        <w:rFonts w:ascii="Symbol" w:hAnsi="Symbol" w:hint="default"/>
+        <w:sz w:val="20"/>
+      </w:rPr>
+    </w:lvl>
+    <w:lvl w:ilvl="1">
+      <w:start w:val="1"/>
+      <w:numFmt w:val="bullet"/>
+      <w:lvlText w:val="o"/>
+      <w:lvlJc w:val="left"/>
+      <w:pPr>
+        <w:tabs>
+          <w:tab w:val="num" w:pos="1440"/>
+        </w:tabs>
+        <w:ind w:left="1440" w:hanging="360"/>
+      </w:pPr>
+      <w:rPr>
+        <w:rFonts w:ascii="Courier New" w:hAnsi="Courier New" w:hint="default"/>
+        <w:sz w:val="20"/>
+      </w:rPr>
+    </w:lvl>
+    <w:lvl w:ilvl="2" w:tentative="1">
+      <w:start w:val="1"/>
+      <w:numFmt w:val="bullet"/>
+      <w:lvlText w:val=""/>
+      <w:lvlJc w:val="left"/>
+      <w:pPr>
+        <w:tabs>
+          <w:tab w:val="num" w:pos="2160"/>
+        </w:tabs>
+        <w:ind w:left="2160" w:hanging="360"/>
+      </w:pPr>
+      <w:rPr>
+        <w:rFonts w:ascii="Wingdings" w:hAnsi="Wingdings" w:hint="default"/>
+        <w:sz w:val="20"/>
+      </w:rPr>
+    </w:lvl>
+    <w:lvl w:ilvl="3" w:tentative="1">
+      <w:start w:val="1"/>
+      <w:numFmt w:val="bullet"/>
+      <w:lvlText w:val=""/>
+      <w:lvlJc w:val="left"/>
+      <w:pPr>
+        <w:tabs>
+          <w:tab w:val="num" w:pos="2880"/>
+        </w:tabs>
+        <w:ind w:left="2880" w:hanging="360"/>
+      </w:pPr>
+      <w:rPr>
+        <w:rFonts w:ascii="Wingdings" w:hAnsi="Wingdings" w:hint="default"/>
+        <w:sz w:val="20"/>
+      </w:rPr>
+    </w:lvl>
+    <w:lvl w:ilvl="4" w:tentative="1">
+      <w:start w:val="1"/>
+      <w:numFmt w:val="bullet"/>
+      <w:lvlText w:val=""/>
+      <w:lvlJc w:val="left"/>
+      <w:pPr>
+        <w:tabs>
+          <w:tab w:val="num" w:pos="3600"/>
+        </w:tabs>
+        <w:ind w:left="3600" w:hanging="360"/>
+      </w:pPr>
+      <w:rPr>
+        <w:rFonts w:ascii="Wingdings" w:hAnsi="Wingdings" w:hint="default"/>
+        <w:sz w:val="20"/>
+      </w:rPr>
+    </w:lvl>
+    <w:lvl w:ilvl="5" w:tentative="1">
+      <w:start w:val="1"/>
+      <w:numFmt w:val="bullet"/>
+      <w:lvlText w:val=""/>
+      <w:lvlJc w:val="left"/>
+      <w:pPr>
+        <w:tabs>
+          <w:tab w:val="num" w:pos="4320"/>
+        </w:tabs>
+        <w:ind w:left="4320" w:hanging="360"/>
+      </w:pPr>
+      <w:rPr>
+        <w:rFonts w:ascii="Wingdings" w:hAnsi="Wingdings" w:hint="default"/>
+        <w:sz w:val="20"/>
+      </w:rPr>
+    </w:lvl>
+    <w:lvl w:ilvl="6" w:tentative="1">
+      <w:start w:val="1"/>
+      <w:numFmt w:val="bullet"/>
+      <w:lvlText w:val=""/>
+      <w:lvlJc w:val="left"/>
+      <w:pPr>
+        <w:tabs>
+          <w:tab w:val="num" w:pos="5040"/>
+        </w:tabs>
+        <w:ind w:left="5040" w:hanging="360"/>
+      </w:pPr>
+      <w:rPr>
+        <w:rFonts w:ascii="Wingdings" w:hAnsi="Wingdings" w:hint="default"/>
+        <w:sz w:val="20"/>
+      </w:rPr>
+    </w:lvl>
+    <w:lvl w:ilvl="7" w:tentative="1">
+      <w:start w:val="1"/>
+      <w:numFmt w:val="bullet"/>
+      <w:lvlText w:val=""/>
+      <w:lvlJc w:val="left"/>
+      <w:pPr>
+        <w:tabs>
+          <w:tab w:val="num" w:pos="5760"/>
+        </w:tabs>
+        <w:ind w:left="5760" w:hanging="360"/>
+      </w:pPr>
+      <w:rPr>
+        <w:rFonts w:ascii="Wingdings" w:hAnsi="Wingdings" w:hint="default"/>
+        <w:sz w:val="20"/>
+      </w:rPr>
+    </w:lvl>
+    <w:lvl w:ilvl="8" w:tentative="1">
+      <w:start w:val="1"/>
+      <w:numFmt w:val="bullet"/>
+      <w:lvlText w:val=""/>
+      <w:lvlJc w:val="left"/>
+      <w:pPr>
+        <w:tabs>
+          <w:tab w:val="num" w:pos="6480"/>
+        </w:tabs>
+        <w:ind w:left="6480" w:hanging="360"/>
+      </w:pPr>
+      <w:rPr>
+        <w:rFonts w:ascii="Wingdings" w:hAnsi="Wingdings" w:hint="default"/>
+        <w:sz w:val="20"/>
+      </w:rPr>
+    </w:lvl>
+  </w:abstractNum>
+  <w:abstractNum w:abstractNumId="6" w15:restartNumberingAfterBreak="0">
     <w:nsid w:val="43514108"/>
     <w:multiLevelType w:val="multilevel"/>
     <w:tmpl w:val="0EBEFDA2"/>
@@ -6495,7 +7977,7 @@
       </w:rPr>
     </w:lvl>
   </w:abstractNum>
-  <w:abstractNum w:abstractNumId="5" w15:restartNumberingAfterBreak="0">
+  <w:abstractNum w:abstractNumId="7" w15:restartNumberingAfterBreak="0">
     <w:nsid w:val="44DA19B7"/>
     <w:multiLevelType w:val="hybridMultilevel"/>
     <w:tmpl w:val="6EA062E2"/>
@@ -6608,7 +8090,7 @@
       </w:rPr>
     </w:lvl>
   </w:abstractNum>
-  <w:abstractNum w:abstractNumId="6" w15:restartNumberingAfterBreak="0">
+  <w:abstractNum w:abstractNumId="8" w15:restartNumberingAfterBreak="0">
     <w:nsid w:val="454827C2"/>
     <w:multiLevelType w:val="hybridMultilevel"/>
     <w:tmpl w:val="51ACCA48"/>
@@ -6721,7 +8203,7 @@
       </w:rPr>
     </w:lvl>
   </w:abstractNum>
-  <w:abstractNum w:abstractNumId="7" w15:restartNumberingAfterBreak="0">
+  <w:abstractNum w:abstractNumId="9" w15:restartNumberingAfterBreak="0">
     <w:nsid w:val="45953846"/>
     <w:multiLevelType w:val="hybridMultilevel"/>
     <w:tmpl w:val="0CF8C256"/>
@@ -6834,7 +8316,7 @@
       </w:rPr>
     </w:lvl>
   </w:abstractNum>
-  <w:abstractNum w:abstractNumId="8" w15:restartNumberingAfterBreak="0">
+  <w:abstractNum w:abstractNumId="10" w15:restartNumberingAfterBreak="0">
     <w:nsid w:val="60C24978"/>
     <w:multiLevelType w:val="hybridMultilevel"/>
     <w:tmpl w:val="2BB4F0BE"/>
@@ -6947,7 +8429,7 @@
       </w:rPr>
     </w:lvl>
   </w:abstractNum>
-  <w:abstractNum w:abstractNumId="9" w15:restartNumberingAfterBreak="0">
+  <w:abstractNum w:abstractNumId="11" w15:restartNumberingAfterBreak="0">
     <w:nsid w:val="68C75728"/>
     <w:multiLevelType w:val="hybridMultilevel"/>
     <w:tmpl w:val="D646FC02"/>
@@ -7060,7 +8542,7 @@
       </w:rPr>
     </w:lvl>
   </w:abstractNum>
-  <w:abstractNum w:abstractNumId="10" w15:restartNumberingAfterBreak="0">
+  <w:abstractNum w:abstractNumId="12" w15:restartNumberingAfterBreak="0">
     <w:nsid w:val="6D7C70CF"/>
     <w:multiLevelType w:val="hybridMultilevel"/>
     <w:tmpl w:val="293AEE34"/>
@@ -7174,37 +8656,43 @@
     </w:lvl>
   </w:abstractNum>
   <w:num w:numId="1" w16cid:durableId="1708988502">
+    <w:abstractNumId w:val="6"/>
+  </w:num>
+  <w:num w:numId="2" w16cid:durableId="406732299">
+    <w:abstractNumId w:val="12"/>
+  </w:num>
+  <w:num w:numId="3" w16cid:durableId="2119064549">
+    <w:abstractNumId w:val="3"/>
+  </w:num>
+  <w:num w:numId="4" w16cid:durableId="755633525">
+    <w:abstractNumId w:val="2"/>
+  </w:num>
+  <w:num w:numId="5" w16cid:durableId="1896887061">
+    <w:abstractNumId w:val="8"/>
+  </w:num>
+  <w:num w:numId="6" w16cid:durableId="922252310">
+    <w:abstractNumId w:val="9"/>
+  </w:num>
+  <w:num w:numId="7" w16cid:durableId="1520200842">
     <w:abstractNumId w:val="4"/>
   </w:num>
-  <w:num w:numId="2" w16cid:durableId="406732299">
+  <w:num w:numId="8" w16cid:durableId="126626962">
+    <w:abstractNumId w:val="1"/>
+  </w:num>
+  <w:num w:numId="9" w16cid:durableId="1970554200">
     <w:abstractNumId w:val="10"/>
   </w:num>
-  <w:num w:numId="3" w16cid:durableId="2119064549">
-    <w:abstractNumId w:val="2"/>
-  </w:num>
-  <w:num w:numId="4" w16cid:durableId="755633525">
-    <w:abstractNumId w:val="1"/>
-  </w:num>
-  <w:num w:numId="5" w16cid:durableId="1896887061">
-    <w:abstractNumId w:val="6"/>
-  </w:num>
-  <w:num w:numId="6" w16cid:durableId="922252310">
+  <w:num w:numId="10" w16cid:durableId="1727727092">
     <w:abstractNumId w:val="7"/>
   </w:num>
-  <w:num w:numId="7" w16cid:durableId="1520200842">
-    <w:abstractNumId w:val="3"/>
+  <w:num w:numId="11" w16cid:durableId="605574767">
+    <w:abstractNumId w:val="11"/>
   </w:num>
-  <w:num w:numId="8" w16cid:durableId="126626962">
+  <w:num w:numId="12" w16cid:durableId="201789521">
     <w:abstractNumId w:val="0"/>
   </w:num>
-  <w:num w:numId="9" w16cid:durableId="1970554200">
-    <w:abstractNumId w:val="8"/>
-  </w:num>
-  <w:num w:numId="10" w16cid:durableId="1727727092">
+  <w:num w:numId="13" w16cid:durableId="1645040096">
     <w:abstractNumId w:val="5"/>
-  </w:num>
-  <w:num w:numId="11" w16cid:durableId="605574767">
-    <w:abstractNumId w:val="9"/>
   </w:num>
 </w:numbering>
 </file>
@@ -8248,6 +9736,69 @@
       </w:tblBorders>
     </w:tblPr>
   </w:style>
+  <w:style w:type="table" w:styleId="PlainTable1">
+    <w:name w:val="Plain Table 1"/>
+    <w:basedOn w:val="TableNormal"/>
+    <w:uiPriority w:val="41"/>
+    <w:rsid w:val="006071D4"/>
+    <w:pPr>
+      <w:spacing w:after="0" w:line="240" w:lineRule="auto"/>
+    </w:pPr>
+    <w:tblPr>
+      <w:tblStyleRowBandSize w:val="1"/>
+      <w:tblStyleColBandSize w:val="1"/>
+      <w:tblBorders>
+        <w:top w:val="single" w:sz="4" w:space="0" w:color="BFBFBF" w:themeColor="background1" w:themeShade="BF"/>
+        <w:left w:val="single" w:sz="4" w:space="0" w:color="BFBFBF" w:themeColor="background1" w:themeShade="BF"/>
+        <w:bottom w:val="single" w:sz="4" w:space="0" w:color="BFBFBF" w:themeColor="background1" w:themeShade="BF"/>
+        <w:right w:val="single" w:sz="4" w:space="0" w:color="BFBFBF" w:themeColor="background1" w:themeShade="BF"/>
+        <w:insideH w:val="single" w:sz="4" w:space="0" w:color="BFBFBF" w:themeColor="background1" w:themeShade="BF"/>
+        <w:insideV w:val="single" w:sz="4" w:space="0" w:color="BFBFBF" w:themeColor="background1" w:themeShade="BF"/>
+      </w:tblBorders>
+    </w:tblPr>
+    <w:tblStylePr w:type="firstRow">
+      <w:rPr>
+        <w:b/>
+        <w:bCs/>
+      </w:rPr>
+    </w:tblStylePr>
+    <w:tblStylePr w:type="lastRow">
+      <w:rPr>
+        <w:b/>
+        <w:bCs/>
+      </w:rPr>
+      <w:tblPr/>
+      <w:tcPr>
+        <w:tcBorders>
+          <w:top w:val="double" w:sz="4" w:space="0" w:color="BFBFBF" w:themeColor="background1" w:themeShade="BF"/>
+        </w:tcBorders>
+      </w:tcPr>
+    </w:tblStylePr>
+    <w:tblStylePr w:type="firstCol">
+      <w:rPr>
+        <w:b/>
+        <w:bCs/>
+      </w:rPr>
+    </w:tblStylePr>
+    <w:tblStylePr w:type="lastCol">
+      <w:rPr>
+        <w:b/>
+        <w:bCs/>
+      </w:rPr>
+    </w:tblStylePr>
+    <w:tblStylePr w:type="band1Vert">
+      <w:tblPr/>
+      <w:tcPr>
+        <w:shd w:val="clear" w:color="auto" w:fill="F2F2F2" w:themeFill="background1" w:themeFillShade="F2"/>
+      </w:tcPr>
+    </w:tblStylePr>
+    <w:tblStylePr w:type="band1Horz">
+      <w:tblPr/>
+      <w:tcPr>
+        <w:shd w:val="clear" w:color="auto" w:fill="F2F2F2" w:themeFill="background1" w:themeFillShade="F2"/>
+      </w:tcPr>
+    </w:tblStylePr>
+  </w:style>
 </w:styles>
 </file>
 

</xml_diff>

<commit_message>
2.7 TEXT Functions completed
</commit_message>
<xml_diff>
--- a/Notes.docx
+++ b/Notes.docx
@@ -80,7 +80,7 @@
           <w:r>
             <w:fldChar w:fldCharType="separate"/>
           </w:r>
-          <w:hyperlink w:anchor="_Toc232771780" w:history="1">
+          <w:hyperlink w:anchor="_Toc233528082" w:history="1">
             <w:r>
               <w:rPr>
                 <w:rStyle w:val="Hyperlink"/>
@@ -124,7 +124,7 @@
                 <w:noProof/>
                 <w:webHidden/>
               </w:rPr>
-              <w:instrText xml:space="preserve"> PAGEREF _Toc232771780 \h </w:instrText>
+              <w:instrText xml:space="preserve"> PAGEREF _Toc233528082 \h </w:instrText>
             </w:r>
             <w:r>
               <w:rPr>
@@ -168,7 +168,7 @@
               <w:lang w:eastAsia="en-IN" w:bidi="gu-IN"/>
             </w:rPr>
           </w:pPr>
-          <w:hyperlink w:anchor="_Toc232771781" w:history="1">
+          <w:hyperlink w:anchor="_Toc233528083" w:history="1">
             <w:r>
               <w:rPr>
                 <w:rStyle w:val="Hyperlink"/>
@@ -196,7 +196,7 @@
                 <w:noProof/>
                 <w:webHidden/>
               </w:rPr>
-              <w:instrText xml:space="preserve"> PAGEREF _Toc232771781 \h </w:instrText>
+              <w:instrText xml:space="preserve"> PAGEREF _Toc233528083 \h </w:instrText>
             </w:r>
             <w:r>
               <w:rPr>
@@ -241,7 +241,7 @@
               <w:lang w:eastAsia="en-IN" w:bidi="gu-IN"/>
             </w:rPr>
           </w:pPr>
-          <w:hyperlink w:anchor="_Toc232771782" w:history="1">
+          <w:hyperlink w:anchor="_Toc233528084" w:history="1">
             <w:r>
               <w:rPr>
                 <w:rStyle w:val="Hyperlink"/>
@@ -286,7 +286,7 @@
                 <w:noProof/>
                 <w:webHidden/>
               </w:rPr>
-              <w:instrText xml:space="preserve"> PAGEREF _Toc232771782 \h </w:instrText>
+              <w:instrText xml:space="preserve"> PAGEREF _Toc233528084 \h </w:instrText>
             </w:r>
             <w:r>
               <w:rPr>
@@ -330,7 +330,7 @@
               <w:lang w:eastAsia="en-IN" w:bidi="gu-IN"/>
             </w:rPr>
           </w:pPr>
-          <w:hyperlink w:anchor="_Toc232771783" w:history="1">
+          <w:hyperlink w:anchor="_Toc233528085" w:history="1">
             <w:r>
               <w:rPr>
                 <w:rStyle w:val="Hyperlink"/>
@@ -358,7 +358,7 @@
                 <w:noProof/>
                 <w:webHidden/>
               </w:rPr>
-              <w:instrText xml:space="preserve"> PAGEREF _Toc232771783 \h </w:instrText>
+              <w:instrText xml:space="preserve"> PAGEREF _Toc233528085 \h </w:instrText>
             </w:r>
             <w:r>
               <w:rPr>
@@ -402,7 +402,7 @@
               <w:lang w:eastAsia="en-IN" w:bidi="gu-IN"/>
             </w:rPr>
           </w:pPr>
-          <w:hyperlink w:anchor="_Toc232771784" w:history="1">
+          <w:hyperlink w:anchor="_Toc233528086" w:history="1">
             <w:r>
               <w:rPr>
                 <w:rStyle w:val="Hyperlink"/>
@@ -430,7 +430,7 @@
                 <w:noProof/>
                 <w:webHidden/>
               </w:rPr>
-              <w:instrText xml:space="preserve"> PAGEREF _Toc232771784 \h </w:instrText>
+              <w:instrText xml:space="preserve"> PAGEREF _Toc233528086 \h </w:instrText>
             </w:r>
             <w:r>
               <w:rPr>
@@ -475,7 +475,7 @@
               <w:lang w:eastAsia="en-IN" w:bidi="gu-IN"/>
             </w:rPr>
           </w:pPr>
-          <w:hyperlink w:anchor="_Toc232771785" w:history="1">
+          <w:hyperlink w:anchor="_Toc233528087" w:history="1">
             <w:r>
               <w:rPr>
                 <w:rStyle w:val="Hyperlink"/>
@@ -520,7 +520,7 @@
                 <w:noProof/>
                 <w:webHidden/>
               </w:rPr>
-              <w:instrText xml:space="preserve"> PAGEREF _Toc232771785 \h </w:instrText>
+              <w:instrText xml:space="preserve"> PAGEREF _Toc233528087 \h </w:instrText>
             </w:r>
             <w:r>
               <w:rPr>
@@ -565,7 +565,7 @@
               <w:lang w:eastAsia="en-IN" w:bidi="gu-IN"/>
             </w:rPr>
           </w:pPr>
-          <w:hyperlink w:anchor="_Toc232771786" w:history="1">
+          <w:hyperlink w:anchor="_Toc233528088" w:history="1">
             <w:r>
               <w:rPr>
                 <w:rStyle w:val="Hyperlink"/>
@@ -610,7 +610,7 @@
                 <w:noProof/>
                 <w:webHidden/>
               </w:rPr>
-              <w:instrText xml:space="preserve"> PAGEREF _Toc232771786 \h </w:instrText>
+              <w:instrText xml:space="preserve"> PAGEREF _Toc233528088 \h </w:instrText>
             </w:r>
             <w:r>
               <w:rPr>
@@ -654,7 +654,7 @@
               <w:lang w:eastAsia="en-IN" w:bidi="gu-IN"/>
             </w:rPr>
           </w:pPr>
-          <w:hyperlink w:anchor="_Toc232771787" w:history="1">
+          <w:hyperlink w:anchor="_Toc233528089" w:history="1">
             <w:r>
               <w:rPr>
                 <w:rStyle w:val="Hyperlink"/>
@@ -682,7 +682,7 @@
                 <w:noProof/>
                 <w:webHidden/>
               </w:rPr>
-              <w:instrText xml:space="preserve"> PAGEREF _Toc232771787 \h </w:instrText>
+              <w:instrText xml:space="preserve"> PAGEREF _Toc233528089 \h </w:instrText>
             </w:r>
             <w:r>
               <w:rPr>
@@ -726,7 +726,7 @@
               <w:lang w:eastAsia="en-IN" w:bidi="gu-IN"/>
             </w:rPr>
           </w:pPr>
-          <w:hyperlink w:anchor="_Toc232771788" w:history="1">
+          <w:hyperlink w:anchor="_Toc233528090" w:history="1">
             <w:r>
               <w:rPr>
                 <w:rStyle w:val="Hyperlink"/>
@@ -754,7 +754,7 @@
                 <w:noProof/>
                 <w:webHidden/>
               </w:rPr>
-              <w:instrText xml:space="preserve"> PAGEREF _Toc232771788 \h </w:instrText>
+              <w:instrText xml:space="preserve"> PAGEREF _Toc233528090 \h </w:instrText>
             </w:r>
             <w:r>
               <w:rPr>
@@ -798,7 +798,7 @@
               <w:lang w:eastAsia="en-IN" w:bidi="gu-IN"/>
             </w:rPr>
           </w:pPr>
-          <w:hyperlink w:anchor="_Toc232771789" w:history="1">
+          <w:hyperlink w:anchor="_Toc233528091" w:history="1">
             <w:r>
               <w:rPr>
                 <w:rStyle w:val="Hyperlink"/>
@@ -826,7 +826,7 @@
                 <w:noProof/>
                 <w:webHidden/>
               </w:rPr>
-              <w:instrText xml:space="preserve"> PAGEREF _Toc232771789 \h </w:instrText>
+              <w:instrText xml:space="preserve"> PAGEREF _Toc233528091 \h </w:instrText>
             </w:r>
             <w:r>
               <w:rPr>
@@ -870,7 +870,7 @@
               <w:lang w:eastAsia="en-IN" w:bidi="gu-IN"/>
             </w:rPr>
           </w:pPr>
-          <w:hyperlink w:anchor="_Toc232771790" w:history="1">
+          <w:hyperlink w:anchor="_Toc233528092" w:history="1">
             <w:r>
               <w:rPr>
                 <w:rStyle w:val="Hyperlink"/>
@@ -898,7 +898,7 @@
                 <w:noProof/>
                 <w:webHidden/>
               </w:rPr>
-              <w:instrText xml:space="preserve"> PAGEREF _Toc232771790 \h </w:instrText>
+              <w:instrText xml:space="preserve"> PAGEREF _Toc233528092 \h </w:instrText>
             </w:r>
             <w:r>
               <w:rPr>
@@ -942,7 +942,7 @@
               <w:lang w:eastAsia="en-IN" w:bidi="gu-IN"/>
             </w:rPr>
           </w:pPr>
-          <w:hyperlink w:anchor="_Toc232771791" w:history="1">
+          <w:hyperlink w:anchor="_Toc233528093" w:history="1">
             <w:r>
               <w:rPr>
                 <w:rStyle w:val="Hyperlink"/>
@@ -969,7 +969,7 @@
                 <w:noProof/>
                 <w:webHidden/>
               </w:rPr>
-              <w:instrText xml:space="preserve"> PAGEREF _Toc232771791 \h </w:instrText>
+              <w:instrText xml:space="preserve"> PAGEREF _Toc233528093 \h </w:instrText>
             </w:r>
             <w:r>
               <w:rPr>
@@ -1013,7 +1013,7 @@
               <w:lang w:eastAsia="en-IN" w:bidi="gu-IN"/>
             </w:rPr>
           </w:pPr>
-          <w:hyperlink w:anchor="_Toc232771792" w:history="1">
+          <w:hyperlink w:anchor="_Toc233528094" w:history="1">
             <w:r>
               <w:rPr>
                 <w:rStyle w:val="Hyperlink"/>
@@ -1040,7 +1040,7 @@
                 <w:noProof/>
                 <w:webHidden/>
               </w:rPr>
-              <w:instrText xml:space="preserve"> PAGEREF _Toc232771792 \h </w:instrText>
+              <w:instrText xml:space="preserve"> PAGEREF _Toc233528094 \h </w:instrText>
             </w:r>
             <w:r>
               <w:rPr>
@@ -1084,7 +1084,7 @@
               <w:lang w:eastAsia="en-IN" w:bidi="gu-IN"/>
             </w:rPr>
           </w:pPr>
-          <w:hyperlink w:anchor="_Toc232771793" w:history="1">
+          <w:hyperlink w:anchor="_Toc233528095" w:history="1">
             <w:r>
               <w:rPr>
                 <w:rStyle w:val="Hyperlink"/>
@@ -1111,7 +1111,7 @@
                 <w:noProof/>
                 <w:webHidden/>
               </w:rPr>
-              <w:instrText xml:space="preserve"> PAGEREF _Toc232771793 \h </w:instrText>
+              <w:instrText xml:space="preserve"> PAGEREF _Toc233528095 \h </w:instrText>
             </w:r>
             <w:r>
               <w:rPr>
@@ -1155,7 +1155,7 @@
               <w:lang w:eastAsia="en-IN" w:bidi="gu-IN"/>
             </w:rPr>
           </w:pPr>
-          <w:hyperlink w:anchor="_Toc232771794" w:history="1">
+          <w:hyperlink w:anchor="_Toc233528096" w:history="1">
             <w:r>
               <w:rPr>
                 <w:rStyle w:val="Hyperlink"/>
@@ -1182,7 +1182,7 @@
                 <w:noProof/>
                 <w:webHidden/>
               </w:rPr>
-              <w:instrText xml:space="preserve"> PAGEREF _Toc232771794 \h </w:instrText>
+              <w:instrText xml:space="preserve"> PAGEREF _Toc233528096 \h </w:instrText>
             </w:r>
             <w:r>
               <w:rPr>
@@ -1203,6 +1203,77 @@
                 <w:webHidden/>
               </w:rPr>
               <w:t>14</w:t>
+            </w:r>
+            <w:r>
+              <w:rPr>
+                <w:noProof/>
+                <w:webHidden/>
+              </w:rPr>
+              <w:fldChar w:fldCharType="end"/>
+            </w:r>
+          </w:hyperlink>
+        </w:p>
+        <w:p>
+          <w:pPr>
+            <w:pStyle w:val="TOC2"/>
+            <w:tabs>
+              <w:tab w:val="right" w:leader="dot" w:pos="9016"/>
+            </w:tabs>
+            <w:rPr>
+              <w:rFonts w:asciiTheme="minorHAnsi" w:eastAsiaTheme="minorEastAsia" w:hAnsiTheme="minorHAnsi"/>
+              <w:noProof/>
+              <w:szCs w:val="24"/>
+              <w:lang w:eastAsia="en-IN" w:bidi="gu-IN"/>
+            </w:rPr>
+          </w:pPr>
+          <w:hyperlink w:anchor="_Toc233528097" w:history="1">
+            <w:r>
+              <w:rPr>
+                <w:rStyle w:val="Hyperlink"/>
+                <w:noProof/>
+              </w:rPr>
+              <w:t>2.8 TEXT Functions</w:t>
+            </w:r>
+            <w:r>
+              <w:rPr>
+                <w:noProof/>
+                <w:webHidden/>
+              </w:rPr>
+              <w:tab/>
+            </w:r>
+            <w:r>
+              <w:rPr>
+                <w:noProof/>
+                <w:webHidden/>
+              </w:rPr>
+              <w:fldChar w:fldCharType="begin"/>
+            </w:r>
+            <w:r>
+              <w:rPr>
+                <w:noProof/>
+                <w:webHidden/>
+              </w:rPr>
+              <w:instrText xml:space="preserve"> PAGEREF _Toc233528097 \h </w:instrText>
+            </w:r>
+            <w:r>
+              <w:rPr>
+                <w:noProof/>
+                <w:webHidden/>
+              </w:rPr>
+            </w:r>
+            <w:r>
+              <w:rPr>
+                <w:noProof/>
+                <w:webHidden/>
+              </w:rPr>
+              <w:fldChar w:fldCharType="separate"/>
+            </w:r>
+            <w:r>
+              <w:rPr>
+                <w:noProof/>
+                <w:webHidden/>
+              </w:rPr>
+              <w:t>16</w:t>
             </w:r>
             <w:r>
               <w:rPr>
@@ -1254,7 +1325,7 @@
         </w:numPr>
         <w:ind w:left="420" w:hanging="420"/>
       </w:pPr>
-      <w:bookmarkStart w:id="0" w:name="_Toc232771780"/>
+      <w:bookmarkStart w:id="0" w:name="_Toc233528082"/>
       <w:r>
         <w:t>Short Cuts</w:t>
       </w:r>
@@ -1305,7 +1376,7 @@
           <w:lang w:val="en-US"/>
         </w:rPr>
       </w:pPr>
-      <w:bookmarkStart w:id="1" w:name="_Toc232771781"/>
+      <w:bookmarkStart w:id="1" w:name="_Toc233528083"/>
       <w:r>
         <w:rPr>
           <w:lang w:val="en-US"/>
@@ -1352,7 +1423,7 @@
           <w:lang w:val="en-US"/>
         </w:rPr>
       </w:pPr>
-      <w:bookmarkStart w:id="2" w:name="_Toc232771782"/>
+      <w:bookmarkStart w:id="2" w:name="_Toc233528084"/>
       <w:r>
         <w:rPr>
           <w:lang w:val="en-US"/>
@@ -1463,7 +1534,7 @@
           <w:lang w:val="en-US"/>
         </w:rPr>
       </w:pPr>
-      <w:bookmarkStart w:id="3" w:name="_Toc232771783"/>
+      <w:bookmarkStart w:id="3" w:name="_Toc233528085"/>
       <w:r>
         <w:rPr>
           <w:lang w:val="en-US"/>
@@ -1490,15 +1561,7 @@
           <w:bdr w:val="single" w:sz="4" w:space="0" w:color="auto"/>
           <w:lang w:val="en-US"/>
         </w:rPr>
-        <w:t>= A1</w:t>
-      </w:r>
-      <w:proofErr w:type="gramStart"/>
-      <w:r>
-        <w:rPr>
-          <w:bdr w:val="single" w:sz="4" w:space="0" w:color="auto"/>
-          <w:lang w:val="en-US"/>
-        </w:rPr>
-        <w:t>&amp;</w:t>
+        <w:t>= A1&amp;</w:t>
       </w:r>
       <w:r>
         <w:rPr>
@@ -1513,15 +1576,7 @@
           <w:bdr w:val="single" w:sz="4" w:space="0" w:color="auto"/>
           <w:lang w:val="en-US"/>
         </w:rPr>
-        <w:t>&amp;</w:t>
-      </w:r>
-      <w:proofErr w:type="gramEnd"/>
-      <w:r>
-        <w:rPr>
-          <w:bdr w:val="single" w:sz="4" w:space="0" w:color="auto"/>
-          <w:lang w:val="en-US"/>
-        </w:rPr>
-        <w:t>E1</w:t>
+        <w:t>&amp;E1</w:t>
       </w:r>
       <w:r>
         <w:rPr>
@@ -1539,21 +1594,7 @@
         <w:rPr>
           <w:lang w:val="en-US"/>
         </w:rPr>
-        <w:t xml:space="preserve"> This Will Add </w:t>
-      </w:r>
-      <w:proofErr w:type="spellStart"/>
-      <w:r>
-        <w:rPr>
-          <w:lang w:val="en-US"/>
-        </w:rPr>
-        <w:t>Hypen</w:t>
-      </w:r>
-      <w:proofErr w:type="spellEnd"/>
-      <w:r>
-        <w:rPr>
-          <w:lang w:val="en-US"/>
-        </w:rPr>
-        <w:t xml:space="preserve"> (-) between data of A1 and E1 cells</w:t>
+        <w:t xml:space="preserve"> This Will Add Hypen (-) between data of A1 and E1 cells</w:t>
       </w:r>
       <w:r>
         <w:rPr>
@@ -1566,93 +1607,153 @@
           <w:color w:val="4472C4" w:themeColor="accent1"/>
           <w:lang w:val="en-US"/>
         </w:rPr>
-        <w:t xml:space="preserve">(Quotes </w:t>
-      </w:r>
-      <w:proofErr w:type="gramStart"/>
+        <w:t xml:space="preserve">(Quotes are </w:t>
+      </w:r>
       <w:r>
         <w:rPr>
           <w:color w:val="4472C4" w:themeColor="accent1"/>
           <w:lang w:val="en-US"/>
         </w:rPr>
-        <w:t xml:space="preserve">are </w:t>
+        <w:t xml:space="preserve"> </w:t>
       </w:r>
       <w:r>
         <w:rPr>
           <w:color w:val="4472C4" w:themeColor="accent1"/>
           <w:lang w:val="en-US"/>
         </w:rPr>
-        <w:t xml:space="preserve"> </w:t>
-      </w:r>
-      <w:r>
-        <w:rPr>
-          <w:color w:val="4472C4" w:themeColor="accent1"/>
-          <w:lang w:val="en-US"/>
-        </w:rPr>
-        <w:t>mandatory</w:t>
-      </w:r>
-      <w:proofErr w:type="gramEnd"/>
-      <w:r>
-        <w:rPr>
-          <w:color w:val="4472C4" w:themeColor="accent1"/>
+        <w:t>mandatory)</w:t>
+      </w:r>
+    </w:p>
+    <w:p>
+      <w:pPr>
+        <w:rPr>
+          <w:lang w:val="en-US"/>
+        </w:rPr>
+      </w:pPr>
+    </w:p>
+    <w:p>
+      <w:pPr>
+        <w:pStyle w:val="Heading3"/>
+        <w:rPr>
+          <w:lang w:val="en-US"/>
+        </w:rPr>
+      </w:pPr>
+      <w:bookmarkStart w:id="4" w:name="_Toc233528086"/>
+      <w:r>
+        <w:rPr>
+          <w:lang w:val="en-US"/>
+        </w:rPr>
+        <w:t>Ranges – Collection of Cells</w:t>
+      </w:r>
+      <w:bookmarkEnd w:id="4"/>
+    </w:p>
+    <w:p>
+      <w:pPr>
+        <w:rPr>
+          <w:lang w:val="en-US"/>
+        </w:rPr>
+      </w:pPr>
+    </w:p>
+    <w:p>
+      <w:pPr>
+        <w:rPr>
+          <w:lang w:val="en-US"/>
+        </w:rPr>
+      </w:pPr>
+      <w:r>
+        <w:rPr>
+          <w:lang w:val="en-US"/>
+        </w:rPr>
+        <w:t>While selecting you may notice this inside Name Box:</w:t>
+      </w:r>
+    </w:p>
+    <w:p>
+      <w:pPr>
+        <w:rPr>
+          <w:lang w:val="en-US"/>
+        </w:rPr>
+      </w:pPr>
+      <w:r>
+        <w:rPr>
+          <w:lang w:val="en-US"/>
+        </w:rPr>
+        <w:t xml:space="preserve">5R X 2C </w:t>
+      </w:r>
+      <w:r>
+        <w:rPr>
+          <w:lang w:val="en-US"/>
+        </w:rPr>
+        <w:sym w:font="Wingdings" w:char="F0E0"/>
+      </w:r>
+      <w:r>
+        <w:rPr>
+          <w:lang w:val="en-US"/>
+        </w:rPr>
+        <w:t xml:space="preserve"> Which means you have selected 5 Rows and 2 Columns</w:t>
+      </w:r>
+    </w:p>
+    <w:p>
+      <w:pPr>
+        <w:rPr>
+          <w:lang w:val="en-US"/>
+        </w:rPr>
+      </w:pPr>
+    </w:p>
+    <w:p>
+      <w:pPr>
+        <w:rPr>
+          <w:lang w:val="en-US"/>
+        </w:rPr>
+      </w:pPr>
+      <w:r>
+        <w:rPr>
+          <w:lang w:val="en-US"/>
+        </w:rPr>
+        <w:t>To Copy:</w:t>
+      </w:r>
+    </w:p>
+    <w:p>
+      <w:pPr>
+        <w:rPr>
+          <w:lang w:val="en-US"/>
+        </w:rPr>
+      </w:pPr>
+      <w:r>
+        <w:rPr>
+          <w:lang w:val="en-US"/>
+        </w:rPr>
+        <w:t xml:space="preserve">AKA (Also </w:t>
+      </w:r>
+      <w:r>
+        <w:rPr>
+          <w:lang w:val="en-US"/>
+        </w:rPr>
+        <w:t>Known as</w:t>
+      </w:r>
+      <w:r>
+        <w:rPr>
           <w:lang w:val="en-US"/>
         </w:rPr>
         <w:t>)</w:t>
       </w:r>
-    </w:p>
-    <w:p>
-      <w:pPr>
-        <w:rPr>
-          <w:lang w:val="en-US"/>
-        </w:rPr>
-      </w:pPr>
-    </w:p>
-    <w:p>
-      <w:pPr>
-        <w:pStyle w:val="Heading3"/>
-        <w:rPr>
-          <w:lang w:val="en-US"/>
-        </w:rPr>
-      </w:pPr>
-      <w:bookmarkStart w:id="4" w:name="_Toc232771784"/>
-      <w:r>
-        <w:rPr>
-          <w:lang w:val="en-US"/>
-        </w:rPr>
-        <w:t>Ranges – Collection of Cells</w:t>
-      </w:r>
-      <w:bookmarkEnd w:id="4"/>
-    </w:p>
-    <w:p>
-      <w:pPr>
-        <w:rPr>
-          <w:lang w:val="en-US"/>
-        </w:rPr>
-      </w:pPr>
-    </w:p>
-    <w:p>
-      <w:pPr>
-        <w:rPr>
-          <w:lang w:val="en-US"/>
-        </w:rPr>
-      </w:pPr>
-      <w:r>
-        <w:rPr>
-          <w:lang w:val="en-US"/>
-        </w:rPr>
-        <w:t>While selecting you may notice this inside Name Box:</w:t>
-      </w:r>
-    </w:p>
-    <w:p>
-      <w:pPr>
-        <w:rPr>
-          <w:lang w:val="en-US"/>
-        </w:rPr>
-      </w:pPr>
-      <w:r>
-        <w:rPr>
-          <w:lang w:val="en-US"/>
-        </w:rPr>
-        <w:t xml:space="preserve">5R X 2C </w:t>
+      <w:r>
+        <w:rPr>
+          <w:lang w:val="en-US"/>
+        </w:rPr>
+        <w:t xml:space="preserve"> Dynamic Ranges</w:t>
+      </w:r>
+    </w:p>
+    <w:p>
+      <w:pPr>
+        <w:rPr>
+          <w:lang w:val="en-US"/>
+        </w:rPr>
+      </w:pPr>
+      <w:r>
+        <w:rPr>
+          <w:lang w:val="en-US"/>
+        </w:rPr>
+        <w:t xml:space="preserve">=A1:G6 </w:t>
       </w:r>
       <w:r>
         <w:rPr>
@@ -1664,82 +1765,6 @@
         <w:rPr>
           <w:lang w:val="en-US"/>
         </w:rPr>
-        <w:t xml:space="preserve"> Which means you have selected 5 Rows and 2 Columns</w:t>
-      </w:r>
-    </w:p>
-    <w:p>
-      <w:pPr>
-        <w:rPr>
-          <w:lang w:val="en-US"/>
-        </w:rPr>
-      </w:pPr>
-    </w:p>
-    <w:p>
-      <w:pPr>
-        <w:rPr>
-          <w:lang w:val="en-US"/>
-        </w:rPr>
-      </w:pPr>
-      <w:r>
-        <w:rPr>
-          <w:lang w:val="en-US"/>
-        </w:rPr>
-        <w:t>To Copy:</w:t>
-      </w:r>
-    </w:p>
-    <w:p>
-      <w:pPr>
-        <w:rPr>
-          <w:lang w:val="en-US"/>
-        </w:rPr>
-      </w:pPr>
-      <w:r>
-        <w:rPr>
-          <w:lang w:val="en-US"/>
-        </w:rPr>
-        <w:t xml:space="preserve">AKA (Also </w:t>
-      </w:r>
-      <w:r>
-        <w:rPr>
-          <w:lang w:val="en-US"/>
-        </w:rPr>
-        <w:t>Known as</w:t>
-      </w:r>
-      <w:r>
-        <w:rPr>
-          <w:lang w:val="en-US"/>
-        </w:rPr>
-        <w:t>)</w:t>
-      </w:r>
-      <w:r>
-        <w:rPr>
-          <w:lang w:val="en-US"/>
-        </w:rPr>
-        <w:t xml:space="preserve"> Dynamic Ranges</w:t>
-      </w:r>
-    </w:p>
-    <w:p>
-      <w:pPr>
-        <w:rPr>
-          <w:lang w:val="en-US"/>
-        </w:rPr>
-      </w:pPr>
-      <w:r>
-        <w:rPr>
-          <w:lang w:val="en-US"/>
-        </w:rPr>
-        <w:t xml:space="preserve">=A1:G6 </w:t>
-      </w:r>
-      <w:r>
-        <w:rPr>
-          <w:lang w:val="en-US"/>
-        </w:rPr>
-        <w:sym w:font="Wingdings" w:char="F0E0"/>
-      </w:r>
-      <w:r>
-        <w:rPr>
-          <w:lang w:val="en-US"/>
-        </w:rPr>
         <w:t xml:space="preserve"> It will copy content from A1 cell till G6 cell to current cell</w:t>
       </w:r>
     </w:p>
@@ -1773,21 +1798,7 @@
         <w:rPr>
           <w:lang w:val="en-US"/>
         </w:rPr>
-        <w:t>=</w:t>
-      </w:r>
-      <w:proofErr w:type="gramStart"/>
-      <w:r>
-        <w:rPr>
-          <w:lang w:val="en-US"/>
-        </w:rPr>
-        <w:t>A:A</w:t>
-      </w:r>
-      <w:proofErr w:type="gramEnd"/>
-      <w:r>
-        <w:rPr>
-          <w:lang w:val="en-US"/>
-        </w:rPr>
-        <w:t xml:space="preserve"> </w:t>
+        <w:t xml:space="preserve">=A:A </w:t>
       </w:r>
       <w:r>
         <w:rPr>
@@ -1891,7 +1902,7 @@
         </w:rPr>
         <w:br w:type="page"/>
       </w:r>
-      <w:bookmarkStart w:id="5" w:name="_Toc232771785"/>
+      <w:bookmarkStart w:id="5" w:name="_Toc233528087"/>
       <w:r>
         <w:rPr>
           <w:lang w:val="en-US"/>
@@ -2046,21 +2057,7 @@
         <w:rPr>
           <w:lang w:val="en-US"/>
         </w:rPr>
-        <w:t xml:space="preserve">We just need to select the cells in the other workbook – It will automatically take </w:t>
-      </w:r>
-      <w:proofErr w:type="gramStart"/>
-      <w:r>
-        <w:rPr>
-          <w:lang w:val="en-US"/>
-        </w:rPr>
-        <w:t>this formulas</w:t>
-      </w:r>
-      <w:proofErr w:type="gramEnd"/>
-      <w:r>
-        <w:rPr>
-          <w:lang w:val="en-US"/>
-        </w:rPr>
-        <w:t>.</w:t>
+        <w:t>We just need to select the cells in the other workbook – It will automatically take this formulas.</w:t>
       </w:r>
     </w:p>
     <w:p>
@@ -2212,35 +2209,7 @@
         <w:rPr>
           <w:lang w:val="en-US"/>
         </w:rPr>
-        <w:t xml:space="preserve">Simply go to Data Workbook, </w:t>
-      </w:r>
-      <w:proofErr w:type="gramStart"/>
-      <w:r>
-        <w:rPr>
-          <w:lang w:val="en-US"/>
-        </w:rPr>
-        <w:t>Copy</w:t>
-      </w:r>
-      <w:proofErr w:type="gramEnd"/>
-      <w:r>
-        <w:rPr>
-          <w:lang w:val="en-US"/>
-        </w:rPr>
-        <w:t xml:space="preserve"> all the content and </w:t>
-      </w:r>
-      <w:proofErr w:type="gramStart"/>
-      <w:r>
-        <w:rPr>
-          <w:lang w:val="en-US"/>
-        </w:rPr>
-        <w:t>Paste</w:t>
-      </w:r>
-      <w:proofErr w:type="gramEnd"/>
-      <w:r>
-        <w:rPr>
-          <w:lang w:val="en-US"/>
-        </w:rPr>
-        <w:t xml:space="preserve"> it in a new Workbook</w:t>
+        <w:t>Simply go to Data Workbook, Copy all the content and Paste it in a new Workbook</w:t>
       </w:r>
     </w:p>
     <w:p>
@@ -2411,7 +2380,7 @@
         </w:rPr>
         <w:br w:type="page"/>
       </w:r>
-      <w:bookmarkStart w:id="6" w:name="_Toc232771786"/>
+      <w:bookmarkStart w:id="6" w:name="_Toc233528088"/>
       <w:r>
         <w:rPr>
           <w:lang w:val="en-US"/>
@@ -2521,21 +2490,7 @@
         <w:rPr>
           <w:lang w:val="en-US"/>
         </w:rPr>
-        <w:t xml:space="preserve">Select all (full / complete) columns and all the columns and just double click on the last one to open, </w:t>
-      </w:r>
-      <w:proofErr w:type="gramStart"/>
-      <w:r>
-        <w:rPr>
-          <w:lang w:val="en-US"/>
-        </w:rPr>
-        <w:t>It</w:t>
-      </w:r>
-      <w:proofErr w:type="gramEnd"/>
-      <w:r>
-        <w:rPr>
-          <w:lang w:val="en-US"/>
-        </w:rPr>
-        <w:t xml:space="preserve"> will open all the columns selected.</w:t>
+        <w:t>Select all (full / complete) columns and all the columns and just double click on the last one to open, It will open all the columns selected.</w:t>
       </w:r>
     </w:p>
     <w:p>
@@ -2971,21 +2926,7 @@
           <w:lang w:val="en-US"/>
         </w:rPr>
         <w:lastRenderedPageBreak/>
-        <w:t xml:space="preserve">Similarly, </w:t>
-      </w:r>
-      <w:proofErr w:type="gramStart"/>
-      <w:r>
-        <w:rPr>
-          <w:lang w:val="en-US"/>
-        </w:rPr>
-        <w:t>If</w:t>
-      </w:r>
-      <w:proofErr w:type="gramEnd"/>
-      <w:r>
-        <w:rPr>
-          <w:lang w:val="en-US"/>
-        </w:rPr>
-        <w:t xml:space="preserve"> you want to clear all the applied filters then:</w:t>
+        <w:t>Similarly, If you want to clear all the applied filters then:</w:t>
       </w:r>
     </w:p>
     <w:p>
@@ -3071,7 +3012,7 @@
           <w:lang w:val="en-US"/>
         </w:rPr>
       </w:pPr>
-      <w:bookmarkStart w:id="7" w:name="_Toc232771787"/>
+      <w:bookmarkStart w:id="7" w:name="_Toc233528089"/>
       <w:r>
         <w:rPr>
           <w:lang w:val="en-US"/>
@@ -3094,7 +3035,7 @@
           <w:lang w:val="en-US"/>
         </w:rPr>
       </w:pPr>
-      <w:bookmarkStart w:id="8" w:name="_Toc232771788"/>
+      <w:bookmarkStart w:id="8" w:name="_Toc233528090"/>
       <w:r>
         <w:rPr>
           <w:lang w:val="en-US"/>
@@ -3120,21 +3061,7 @@
         <w:rPr>
           <w:lang w:val="en-US"/>
         </w:rPr>
-        <w:t xml:space="preserve">- Note that </w:t>
-      </w:r>
-      <w:proofErr w:type="gramStart"/>
-      <w:r>
-        <w:rPr>
-          <w:lang w:val="en-US"/>
-        </w:rPr>
-        <w:t>In</w:t>
-      </w:r>
-      <w:proofErr w:type="gramEnd"/>
-      <w:r>
-        <w:rPr>
-          <w:lang w:val="en-US"/>
-        </w:rPr>
-        <w:t xml:space="preserve"> comparison operator for EQUALS we have only one (=) instead of (==)</w:t>
+        <w:t>- Note that In comparison operator for EQUALS we have only one (=) instead of (==)</w:t>
       </w:r>
     </w:p>
     <w:p>
@@ -3242,21 +3169,7 @@
         <w:rPr>
           <w:lang w:val="en-US"/>
         </w:rPr>
-        <w:t xml:space="preserve">, </w:t>
-      </w:r>
-      <w:proofErr w:type="gramStart"/>
-      <w:r>
-        <w:rPr>
-          <w:lang w:val="en-US"/>
-        </w:rPr>
-        <w:t>It</w:t>
-      </w:r>
-      <w:proofErr w:type="gramEnd"/>
-      <w:r>
-        <w:rPr>
-          <w:lang w:val="en-US"/>
-        </w:rPr>
-        <w:t xml:space="preserve"> will automatically add ‘$’ before row and column.</w:t>
+        <w:t>, It will automatically add ‘$’ before row and column.</w:t>
       </w:r>
     </w:p>
     <w:p>
@@ -3359,21 +3272,7 @@
         <w:rPr>
           <w:lang w:val="en-US"/>
         </w:rPr>
-        <w:t xml:space="preserve"> Will lock 15 </w:t>
-      </w:r>
-      <w:proofErr w:type="gramStart"/>
-      <w:r>
-        <w:rPr>
-          <w:lang w:val="en-US"/>
-        </w:rPr>
-        <w:t>row</w:t>
-      </w:r>
-      <w:proofErr w:type="gramEnd"/>
-      <w:r>
-        <w:rPr>
-          <w:lang w:val="en-US"/>
-        </w:rPr>
-        <w:t xml:space="preserve"> but will iterate through columns</w:t>
+        <w:t xml:space="preserve"> Will lock 15 row but will iterate through columns</w:t>
       </w:r>
     </w:p>
     <w:p>
@@ -3418,21 +3317,7 @@
         <w:rPr>
           <w:lang w:val="en-US"/>
         </w:rPr>
-        <w:t xml:space="preserve">If You want to Write function as a String, </w:t>
-      </w:r>
-      <w:proofErr w:type="gramStart"/>
-      <w:r>
-        <w:rPr>
-          <w:lang w:val="en-US"/>
-        </w:rPr>
-        <w:t>You</w:t>
-      </w:r>
-      <w:proofErr w:type="gramEnd"/>
-      <w:r>
-        <w:rPr>
-          <w:lang w:val="en-US"/>
-        </w:rPr>
-        <w:t xml:space="preserve"> can add one Quote ahead of that and insert it!</w:t>
+        <w:t>If You want to Write function as a String, You can add one Quote ahead of that and insert it!</w:t>
       </w:r>
     </w:p>
     <w:p>
@@ -3497,7 +3382,7 @@
           <w:lang w:val="en-US"/>
         </w:rPr>
       </w:pPr>
-      <w:bookmarkStart w:id="9" w:name="_Toc232771789"/>
+      <w:bookmarkStart w:id="9" w:name="_Toc233528091"/>
       <w:r>
         <w:rPr>
           <w:lang w:val="en-US"/>
@@ -3530,90 +3415,40 @@
         <w:rPr>
           <w:lang w:val="en-US"/>
         </w:rPr>
-        <w:t>=</w:t>
-      </w:r>
-      <w:proofErr w:type="gramStart"/>
-      <w:r>
-        <w:rPr>
-          <w:lang w:val="en-US"/>
-        </w:rPr>
-        <w:t>AVERAGE(</w:t>
-      </w:r>
-      <w:proofErr w:type="gramEnd"/>
-      <w:r>
-        <w:rPr>
-          <w:lang w:val="en-US"/>
-        </w:rPr>
-        <w:t>)</w:t>
-      </w:r>
-    </w:p>
-    <w:p>
-      <w:pPr>
-        <w:rPr>
-          <w:lang w:val="en-US"/>
-        </w:rPr>
-      </w:pPr>
-      <w:r>
-        <w:rPr>
-          <w:lang w:val="en-US"/>
-        </w:rPr>
-        <w:t>=</w:t>
-      </w:r>
-      <w:proofErr w:type="gramStart"/>
-      <w:r>
-        <w:rPr>
-          <w:lang w:val="en-US"/>
-        </w:rPr>
-        <w:t>AND(</w:t>
-      </w:r>
-      <w:proofErr w:type="gramEnd"/>
-      <w:r>
-        <w:rPr>
-          <w:lang w:val="en-US"/>
-        </w:rPr>
-        <w:t xml:space="preserve">) </w:t>
-      </w:r>
-    </w:p>
-    <w:p>
-      <w:pPr>
-        <w:rPr>
-          <w:lang w:val="en-US"/>
-        </w:rPr>
-      </w:pPr>
-    </w:p>
-    <w:p>
-      <w:pPr>
-        <w:rPr>
-          <w:lang w:val="en-US"/>
-        </w:rPr>
-      </w:pPr>
-      <w:proofErr w:type="gramStart"/>
-      <w:r>
-        <w:rPr>
-          <w:lang w:val="en-US"/>
-        </w:rPr>
-        <w:t>Also</w:t>
-      </w:r>
-      <w:proofErr w:type="gramEnd"/>
-      <w:r>
-        <w:rPr>
-          <w:lang w:val="en-US"/>
-        </w:rPr>
-        <w:t xml:space="preserve"> If we are not able to recall the function name, </w:t>
-      </w:r>
-      <w:proofErr w:type="gramStart"/>
-      <w:r>
-        <w:rPr>
-          <w:lang w:val="en-US"/>
-        </w:rPr>
-        <w:t>Then</w:t>
-      </w:r>
-      <w:proofErr w:type="gramEnd"/>
-      <w:r>
-        <w:rPr>
-          <w:lang w:val="en-US"/>
-        </w:rPr>
-        <w:t xml:space="preserve"> we can use this</w:t>
+        <w:t>=AVERAGE()</w:t>
+      </w:r>
+    </w:p>
+    <w:p>
+      <w:pPr>
+        <w:rPr>
+          <w:lang w:val="en-US"/>
+        </w:rPr>
+      </w:pPr>
+      <w:r>
+        <w:rPr>
+          <w:lang w:val="en-US"/>
+        </w:rPr>
+        <w:t xml:space="preserve">=AND() </w:t>
+      </w:r>
+    </w:p>
+    <w:p>
+      <w:pPr>
+        <w:rPr>
+          <w:lang w:val="en-US"/>
+        </w:rPr>
+      </w:pPr>
+    </w:p>
+    <w:p>
+      <w:pPr>
+        <w:rPr>
+          <w:lang w:val="en-US"/>
+        </w:rPr>
+      </w:pPr>
+      <w:r>
+        <w:rPr>
+          <w:lang w:val="en-US"/>
+        </w:rPr>
+        <w:t>Also If we are not able to recall the function name, Then we can use this</w:t>
       </w:r>
     </w:p>
     <w:p>
@@ -3772,19 +3607,11 @@
         </w:rPr>
         <w:t xml:space="preserve">If you face error like this: </w:t>
       </w:r>
-      <w:proofErr w:type="gramStart"/>
-      <w:r>
-        <w:rPr>
-          <w:lang w:val="en-US"/>
-        </w:rPr>
-        <w:t>COUNTIF(</w:t>
-      </w:r>
-      <w:proofErr w:type="gramEnd"/>
-      <w:r>
-        <w:rPr>
-          <w:lang w:val="en-US"/>
-        </w:rPr>
-        <w:t>)</w:t>
+      <w:r>
+        <w:rPr>
+          <w:lang w:val="en-US"/>
+        </w:rPr>
+        <w:t>COUNTIF()</w:t>
       </w:r>
     </w:p>
     <w:p>
@@ -3860,7 +3687,6 @@
         </w:rPr>
         <w:t xml:space="preserve">Then to solve this, we need to wrap our conditional operators around </w:t>
       </w:r>
-      <w:proofErr w:type="gramStart"/>
       <w:r>
         <w:rPr>
           <w:color w:val="4472C4" w:themeColor="accent1"/>
@@ -3882,7 +3708,6 @@
         </w:rPr>
         <w:t>”</w:t>
       </w:r>
-      <w:proofErr w:type="gramEnd"/>
       <w:r>
         <w:rPr>
           <w:lang w:val="en-US"/>
@@ -3921,21 +3746,7 @@
           <w:lang w:val="en-US"/>
         </w:rPr>
         <w:lastRenderedPageBreak/>
-        <w:t xml:space="preserve">If we want to Refer a cell inside complicated functions like </w:t>
-      </w:r>
-      <w:proofErr w:type="gramStart"/>
-      <w:r>
-        <w:rPr>
-          <w:lang w:val="en-US"/>
-        </w:rPr>
-        <w:t>COUNTIF(</w:t>
-      </w:r>
-      <w:proofErr w:type="gramEnd"/>
-      <w:r>
-        <w:rPr>
-          <w:lang w:val="en-US"/>
-        </w:rPr>
-        <w:t>), We need to use “</w:t>
+        <w:t>If we want to Refer a cell inside complicated functions like COUNTIF(), We need to use “</w:t>
       </w:r>
       <w:r>
         <w:rPr>
@@ -4048,7 +3859,7 @@
           <w:lang w:val="en-US"/>
         </w:rPr>
       </w:pPr>
-      <w:bookmarkStart w:id="10" w:name="_Toc232771790"/>
+      <w:bookmarkStart w:id="10" w:name="_Toc233528092"/>
       <w:r>
         <w:rPr>
           <w:lang w:val="en-US"/>
@@ -4070,19 +3881,11 @@
           <w:lang w:val="en-US"/>
         </w:rPr>
       </w:pPr>
-      <w:proofErr w:type="gramStart"/>
-      <w:r>
-        <w:rPr>
-          <w:lang w:val="en-US"/>
-        </w:rPr>
-        <w:t>IF(</w:t>
-      </w:r>
-      <w:proofErr w:type="gramEnd"/>
-      <w:r>
-        <w:rPr>
-          <w:lang w:val="en-US"/>
-        </w:rPr>
-        <w:t xml:space="preserve">) </w:t>
+      <w:r>
+        <w:rPr>
+          <w:lang w:val="en-US"/>
+        </w:rPr>
+        <w:t xml:space="preserve">IF() </w:t>
       </w:r>
       <w:r>
         <w:rPr>
@@ -4094,16 +3897,8 @@
         <w:rPr>
           <w:lang w:val="en-US"/>
         </w:rPr>
-        <w:t xml:space="preserve"> </w:t>
-      </w:r>
-      <w:proofErr w:type="gramStart"/>
-      <w:r>
-        <w:rPr>
-          <w:lang w:val="en-US"/>
-        </w:rPr>
-        <w:t>IF(</w:t>
-      </w:r>
-      <w:proofErr w:type="gramEnd"/>
+        <w:t xml:space="preserve"> IF(</w:t>
+      </w:r>
       <w:r>
         <w:rPr>
           <w:i/>
@@ -4162,14 +3957,12 @@
           <w:lang w:val="en-US"/>
         </w:rPr>
       </w:pPr>
-      <w:proofErr w:type="gramStart"/>
       <w:r>
         <w:rPr>
           <w:lang w:val="en-US"/>
         </w:rPr>
         <w:t>IF(</w:t>
       </w:r>
-      <w:proofErr w:type="gramEnd"/>
       <w:r>
         <w:rPr>
           <w:i/>
@@ -4196,16 +3989,8 @@
         <w:rPr>
           <w:lang w:val="en-US"/>
         </w:rPr>
-        <w:t xml:space="preserve">”, </w:t>
-      </w:r>
-      <w:proofErr w:type="gramStart"/>
-      <w:r>
-        <w:rPr>
-          <w:lang w:val="en-US"/>
-        </w:rPr>
-        <w:t>IF(</w:t>
-      </w:r>
-      <w:proofErr w:type="gramEnd"/>
+        <w:t>”, IF(</w:t>
+      </w:r>
       <w:r>
         <w:rPr>
           <w:i/>
@@ -4307,19 +4092,11 @@
         </w:rPr>
         <w:t xml:space="preserve">- </w:t>
       </w:r>
-      <w:proofErr w:type="gramStart"/>
-      <w:r>
-        <w:rPr>
-          <w:lang w:val="en-US"/>
-        </w:rPr>
-        <w:t>IFS(</w:t>
-      </w:r>
-      <w:proofErr w:type="gramEnd"/>
-      <w:r>
-        <w:rPr>
-          <w:lang w:val="en-US"/>
-        </w:rPr>
-        <w:t>“Condition1”,</w:t>
+      <w:r>
+        <w:rPr>
+          <w:lang w:val="en-US"/>
+        </w:rPr>
+        <w:t>IFS(“Condition1”,</w:t>
       </w:r>
       <w:r>
         <w:rPr>
@@ -4400,7 +4177,7 @@
       <w:pPr>
         <w:pStyle w:val="Heading2"/>
       </w:pPr>
-      <w:bookmarkStart w:id="11" w:name="_Toc232771791"/>
+      <w:bookmarkStart w:id="11" w:name="_Toc233528093"/>
       <w:r>
         <w:t>2.4 Math Functions</w:t>
       </w:r>
@@ -4474,21 +4251,12 @@
             <w:pPr>
               <w:spacing w:after="160" w:line="259" w:lineRule="auto"/>
             </w:pPr>
-            <w:proofErr w:type="gramStart"/>
             <w:r>
               <w:rPr>
                 <w:b/>
                 <w:bCs/>
               </w:rPr>
-              <w:t>COUNT(</w:t>
-            </w:r>
-            <w:proofErr w:type="gramEnd"/>
-            <w:r>
-              <w:rPr>
-                <w:b/>
-                <w:bCs/>
-              </w:rPr>
-              <w:t>)</w:t>
+              <w:t>COUNT()</w:t>
             </w:r>
           </w:p>
         </w:tc>
@@ -4524,21 +4292,12 @@
             <w:pPr>
               <w:spacing w:after="160" w:line="259" w:lineRule="auto"/>
             </w:pPr>
-            <w:proofErr w:type="gramStart"/>
             <w:r>
               <w:rPr>
                 <w:b/>
                 <w:bCs/>
               </w:rPr>
-              <w:t>COUNTA(</w:t>
-            </w:r>
-            <w:proofErr w:type="gramEnd"/>
-            <w:r>
-              <w:rPr>
-                <w:b/>
-                <w:bCs/>
-              </w:rPr>
-              <w:t>)</w:t>
+              <w:t>COUNTA()</w:t>
             </w:r>
           </w:p>
         </w:tc>
@@ -4579,11 +4338,9 @@
       </w:r>
     </w:p>
     <w:p>
-      <w:proofErr w:type="gramStart"/>
       <w:r>
         <w:t>SUMIF(</w:t>
       </w:r>
-      <w:proofErr w:type="gramEnd"/>
       <w:r>
         <w:rPr>
           <w:i/>
@@ -4595,81 +4352,102 @@
       <w:r>
         <w:t xml:space="preserve">, </w:t>
       </w:r>
-      <w:proofErr w:type="gramStart"/>
       <w:r>
         <w:rPr>
           <w:i/>
           <w:iCs/>
           <w:color w:val="ED7D31" w:themeColor="accent2"/>
         </w:rPr>
-        <w:t>To</w:t>
-      </w:r>
-      <w:proofErr w:type="gramEnd"/>
+        <w:t>To match with?</w:t>
+      </w:r>
+      <w:r>
+        <w:t xml:space="preserve">, </w:t>
+      </w:r>
+      <w:r>
+        <w:rPr>
+          <w:i/>
+          <w:iCs/>
+          <w:color w:val="70AD47" w:themeColor="accent6"/>
+        </w:rPr>
+        <w:t>Range for sum</w:t>
+      </w:r>
+      <w:r>
+        <w:t>)</w:t>
+      </w:r>
+    </w:p>
+    <w:p/>
+    <w:p>
+      <w:r>
+        <w:sym w:font="Wingdings" w:char="F0E0"/>
+      </w:r>
+      <w:r>
+        <w:t xml:space="preserve"> SUMIFS:</w:t>
+      </w:r>
+    </w:p>
+    <w:p>
+      <w:r>
+        <w:t>SUMIFS(</w:t>
+      </w:r>
+      <w:r>
+        <w:rPr>
+          <w:i/>
+          <w:iCs/>
+          <w:color w:val="70AD47" w:themeColor="accent6"/>
+        </w:rPr>
+        <w:t>Range for sum</w:t>
+      </w:r>
+      <w:r>
+        <w:rPr>
+          <w:i/>
+          <w:iCs/>
+          <w:color w:val="70AD47" w:themeColor="accent6"/>
+        </w:rPr>
+        <w:t xml:space="preserve">, </w:t>
+      </w:r>
+      <w:r>
+        <w:rPr>
+          <w:i/>
+          <w:iCs/>
+          <w:color w:val="4472C4" w:themeColor="accent1"/>
+        </w:rPr>
+        <w:t>Range to check condition</w:t>
+      </w:r>
+      <w:r>
+        <w:rPr>
+          <w:i/>
+          <w:iCs/>
+          <w:color w:val="4472C4" w:themeColor="accent1"/>
+        </w:rPr>
+        <w:t>1</w:t>
+      </w:r>
+      <w:r>
+        <w:t xml:space="preserve">, </w:t>
+      </w:r>
       <w:r>
         <w:rPr>
           <w:i/>
           <w:iCs/>
           <w:color w:val="ED7D31" w:themeColor="accent2"/>
         </w:rPr>
-        <w:t xml:space="preserve"> match </w:t>
-      </w:r>
-      <w:proofErr w:type="gramStart"/>
+        <w:t>To match with</w:t>
+      </w:r>
       <w:r>
         <w:rPr>
           <w:i/>
           <w:iCs/>
           <w:color w:val="ED7D31" w:themeColor="accent2"/>
         </w:rPr>
-        <w:t>with?</w:t>
-      </w:r>
-      <w:r>
-        <w:t>,</w:t>
-      </w:r>
-      <w:proofErr w:type="gramEnd"/>
-      <w:r>
-        <w:t xml:space="preserve"> </w:t>
+        <w:t>1</w:t>
       </w:r>
       <w:r>
         <w:rPr>
           <w:i/>
           <w:iCs/>
-          <w:color w:val="70AD47" w:themeColor="accent6"/>
-        </w:rPr>
-        <w:t>Range for sum</w:t>
-      </w:r>
-      <w:r>
-        <w:t>)</w:t>
-      </w:r>
-    </w:p>
-    <w:p/>
-    <w:p>
-      <w:r>
-        <w:sym w:font="Wingdings" w:char="F0E0"/>
-      </w:r>
-      <w:r>
-        <w:t xml:space="preserve"> SUMIFS:</w:t>
-      </w:r>
-    </w:p>
-    <w:p>
-      <w:proofErr w:type="gramStart"/>
-      <w:r>
-        <w:t>SUMIFS(</w:t>
-      </w:r>
-      <w:proofErr w:type="gramEnd"/>
-      <w:r>
-        <w:rPr>
-          <w:i/>
-          <w:iCs/>
-          <w:color w:val="70AD47" w:themeColor="accent6"/>
-        </w:rPr>
-        <w:t>Range for sum</w:t>
-      </w:r>
-      <w:r>
-        <w:rPr>
-          <w:i/>
-          <w:iCs/>
-          <w:color w:val="70AD47" w:themeColor="accent6"/>
-        </w:rPr>
+          <w:color w:val="ED7D31" w:themeColor="accent2"/>
+        </w:rPr>
+        <w:t>?</w:t>
+      </w:r>
+      <w:r>
         <w:t xml:space="preserve">, </w:t>
       </w:r>
       <w:r>
@@ -4686,107 +4464,36 @@
           <w:iCs/>
           <w:color w:val="4472C4" w:themeColor="accent1"/>
         </w:rPr>
-        <w:t>1</w:t>
+        <w:t>2</w:t>
       </w:r>
       <w:r>
         <w:t xml:space="preserve">, </w:t>
       </w:r>
-      <w:proofErr w:type="gramStart"/>
       <w:r>
         <w:rPr>
           <w:i/>
           <w:iCs/>
           <w:color w:val="ED7D31" w:themeColor="accent2"/>
         </w:rPr>
-        <w:t>To</w:t>
-      </w:r>
-      <w:proofErr w:type="gramEnd"/>
+        <w:t>To match with</w:t>
+      </w:r>
       <w:r>
         <w:rPr>
           <w:i/>
           <w:iCs/>
           <w:color w:val="ED7D31" w:themeColor="accent2"/>
         </w:rPr>
-        <w:t xml:space="preserve"> match with</w:t>
-      </w:r>
-      <w:proofErr w:type="gramStart"/>
+        <w:t>2</w:t>
+      </w:r>
       <w:r>
         <w:rPr>
           <w:i/>
           <w:iCs/>
           <w:color w:val="ED7D31" w:themeColor="accent2"/>
         </w:rPr>
-        <w:t>1</w:t>
-      </w:r>
-      <w:r>
-        <w:rPr>
-          <w:i/>
-          <w:iCs/>
-          <w:color w:val="ED7D31" w:themeColor="accent2"/>
-        </w:rPr>
         <w:t>?</w:t>
       </w:r>
       <w:r>
-        <w:t>,</w:t>
-      </w:r>
-      <w:proofErr w:type="gramEnd"/>
-      <w:r>
-        <w:t xml:space="preserve"> </w:t>
-      </w:r>
-      <w:r>
-        <w:rPr>
-          <w:i/>
-          <w:iCs/>
-          <w:color w:val="4472C4" w:themeColor="accent1"/>
-        </w:rPr>
-        <w:t>Range to check condition</w:t>
-      </w:r>
-      <w:r>
-        <w:rPr>
-          <w:i/>
-          <w:iCs/>
-          <w:color w:val="4472C4" w:themeColor="accent1"/>
-        </w:rPr>
-        <w:t>2</w:t>
-      </w:r>
-      <w:r>
-        <w:t xml:space="preserve">, </w:t>
-      </w:r>
-      <w:proofErr w:type="gramStart"/>
-      <w:r>
-        <w:rPr>
-          <w:i/>
-          <w:iCs/>
-          <w:color w:val="ED7D31" w:themeColor="accent2"/>
-        </w:rPr>
-        <w:t>To</w:t>
-      </w:r>
-      <w:proofErr w:type="gramEnd"/>
-      <w:r>
-        <w:rPr>
-          <w:i/>
-          <w:iCs/>
-          <w:color w:val="ED7D31" w:themeColor="accent2"/>
-        </w:rPr>
-        <w:t xml:space="preserve"> match with</w:t>
-      </w:r>
-      <w:r>
-        <w:rPr>
-          <w:i/>
-          <w:iCs/>
-          <w:color w:val="ED7D31" w:themeColor="accent2"/>
-        </w:rPr>
-        <w:t>2</w:t>
-      </w:r>
-      <w:r>
-        <w:rPr>
-          <w:i/>
-          <w:iCs/>
-          <w:color w:val="ED7D31" w:themeColor="accent2"/>
-        </w:rPr>
-        <w:t>?</w:t>
-      </w:r>
-      <w:r>
         <w:t>)</w:t>
       </w:r>
     </w:p>
@@ -4812,7 +4519,7 @@
       <w:pPr>
         <w:pStyle w:val="Heading2"/>
       </w:pPr>
-      <w:bookmarkStart w:id="12" w:name="_Toc232771792"/>
+      <w:bookmarkStart w:id="12" w:name="_Toc233528094"/>
       <w:r>
         <w:t>2.5 Statistical Functions</w:t>
       </w:r>
@@ -4820,24 +4527,11 @@
     </w:p>
     <w:p/>
     <w:p>
-      <w:proofErr w:type="gramStart"/>
       <w:r>
         <w:t>Median</w:t>
       </w:r>
       <w:r>
-        <w:t>(</w:t>
-      </w:r>
-      <w:proofErr w:type="gramEnd"/>
-      <w:r>
-        <w:t xml:space="preserve">), </w:t>
-      </w:r>
-      <w:proofErr w:type="gramStart"/>
-      <w:r>
-        <w:t>Min() ,Max</w:t>
-      </w:r>
-      <w:proofErr w:type="gramEnd"/>
-      <w:r>
-        <w:t>()</w:t>
+        <w:t>(), Min() ,Max()</w:t>
       </w:r>
     </w:p>
     <w:p>
@@ -4857,15 +4551,7 @@
         <w:sym w:font="Wingdings" w:char="F0E0"/>
       </w:r>
       <w:r>
-        <w:t xml:space="preserve"> </w:t>
-      </w:r>
-      <w:proofErr w:type="gramStart"/>
-      <w:r>
-        <w:t>Quartile.INC(</w:t>
-      </w:r>
-      <w:proofErr w:type="gramEnd"/>
-      <w:r>
-        <w:t>array,</w:t>
+        <w:t xml:space="preserve"> Quartile.INC(array,</w:t>
       </w:r>
       <w:r>
         <w:t xml:space="preserve"> quartile)</w:t>
@@ -4876,15 +4562,7 @@
         <w:sym w:font="Wingdings" w:char="F0E0"/>
       </w:r>
       <w:r>
-        <w:t xml:space="preserve"> </w:t>
-      </w:r>
-      <w:proofErr w:type="gramStart"/>
-      <w:r>
-        <w:t>Quartile.EXC(</w:t>
-      </w:r>
-      <w:proofErr w:type="gramEnd"/>
-      <w:r>
-        <w:t>array, quartile)</w:t>
+        <w:t xml:space="preserve"> Quartile.EXC(array, quartile)</w:t>
       </w:r>
     </w:p>
     <w:p/>
@@ -4893,15 +4571,7 @@
         <w:sym w:font="Wingdings" w:char="F0E8"/>
       </w:r>
       <w:r>
-        <w:t xml:space="preserve"> Quartile Inclusive and Exclusive both provides same result, just the difference between them is </w:t>
-      </w:r>
-      <w:proofErr w:type="gramStart"/>
-      <w:r>
-        <w:t>Quartile.EXC(</w:t>
-      </w:r>
-      <w:proofErr w:type="gramEnd"/>
-      <w:r>
-        <w:t>) – excludes quartile 0 and 4 that MIN and MAX.</w:t>
+        <w:t xml:space="preserve"> Quartile Inclusive and Exclusive both provides same result, just the difference between them is Quartile.EXC() – excludes quartile 0 and 4 that MIN and MAX.</w:t>
       </w:r>
     </w:p>
     <w:p/>
@@ -4928,28 +4598,12 @@
     </w:p>
     <w:p>
       <w:r>
-        <w:t xml:space="preserve">quartile 0 = gives similar value to </w:t>
-      </w:r>
-      <w:proofErr w:type="gramStart"/>
-      <w:r>
-        <w:t>MIN(</w:t>
-      </w:r>
-      <w:proofErr w:type="gramEnd"/>
-      <w:r>
-        <w:t>)</w:t>
-      </w:r>
-    </w:p>
-    <w:p>
-      <w:r>
-        <w:t xml:space="preserve">quartile 4 = gives similar value to </w:t>
-      </w:r>
-      <w:proofErr w:type="gramStart"/>
-      <w:r>
-        <w:t>MAX(</w:t>
-      </w:r>
-      <w:proofErr w:type="gramEnd"/>
-      <w:r>
-        <w:t>)</w:t>
+        <w:t>quartile 0 = gives similar value to MIN()</w:t>
+      </w:r>
+    </w:p>
+    <w:p>
+      <w:r>
+        <w:t>quartile 4 = gives similar value to MAX()</w:t>
       </w:r>
     </w:p>
     <w:p/>
@@ -4960,33 +4614,17 @@
         <w:sym w:font="Wingdings" w:char="F0E0"/>
       </w:r>
       <w:r>
-        <w:t xml:space="preserve"> =</w:t>
-      </w:r>
-      <w:proofErr w:type="gramStart"/>
-      <w:r>
-        <w:t>MODE(</w:t>
-      </w:r>
-      <w:proofErr w:type="gramEnd"/>
-      <w:r>
-        <w:t>)</w:t>
-      </w:r>
-    </w:p>
-    <w:p>
-      <w:pPr>
-        <w:rPr>
-          <w:lang w:val="en-US"/>
-        </w:rPr>
-      </w:pPr>
-      <w:r>
-        <w:t>In Excel, =</w:t>
-      </w:r>
-      <w:proofErr w:type="gramStart"/>
-      <w:r>
-        <w:t>MODE(</w:t>
-      </w:r>
-      <w:proofErr w:type="gramEnd"/>
-      <w:r>
-        <w:t xml:space="preserve">) is used to find the </w:t>
+        <w:t xml:space="preserve"> =MODE()</w:t>
+      </w:r>
+    </w:p>
+    <w:p>
+      <w:pPr>
+        <w:rPr>
+          <w:lang w:val="en-US"/>
+        </w:rPr>
+      </w:pPr>
+      <w:r>
+        <w:t xml:space="preserve">In Excel, =MODE() is used to find the </w:t>
       </w:r>
       <w:r>
         <w:rPr>
@@ -5228,15 +4866,7 @@
     <w:p/>
     <w:p>
       <w:r>
-        <w:t>=</w:t>
-      </w:r>
-      <w:proofErr w:type="gramStart"/>
-      <w:r>
-        <w:t>MODE(</w:t>
-      </w:r>
-      <w:proofErr w:type="gramEnd"/>
-      <w:r>
-        <w:t>A1:A6)</w:t>
+        <w:t>=MODE(A1:A6)</w:t>
       </w:r>
     </w:p>
     <w:p>
@@ -5272,27 +4902,11 @@
           <w:b/>
           <w:bCs/>
         </w:rPr>
+        <w:t xml:space="preserve"> RANK():</w:t>
+      </w:r>
+      <w:r>
         <w:t xml:space="preserve"> </w:t>
       </w:r>
-      <w:proofErr w:type="gramStart"/>
-      <w:r>
-        <w:rPr>
-          <w:b/>
-          <w:bCs/>
-        </w:rPr>
-        <w:t>RANK(</w:t>
-      </w:r>
-      <w:proofErr w:type="gramEnd"/>
-      <w:r>
-        <w:rPr>
-          <w:b/>
-          <w:bCs/>
-        </w:rPr>
-        <w:t>):</w:t>
-      </w:r>
-      <w:r>
-        <w:t xml:space="preserve"> </w:t>
-      </w:r>
     </w:p>
     <w:p>
       <w:r>
@@ -5300,13 +4914,8 @@
       </w:r>
     </w:p>
     <w:p>
-      <w:proofErr w:type="gramStart"/>
-      <w:r>
-        <w:t>RANK(</w:t>
-      </w:r>
-      <w:proofErr w:type="gramEnd"/>
-      <w:r>
-        <w:t>current cell’s rank reference, All the values (Array - Range))</w:t>
+      <w:r>
+        <w:t>RANK(current cell’s rank reference, All the values (Array - Range))</w:t>
       </w:r>
     </w:p>
     <w:p/>
@@ -5316,7 +4925,7 @@
       <w:pPr>
         <w:pStyle w:val="Heading2"/>
       </w:pPr>
-      <w:bookmarkStart w:id="13" w:name="_Toc232771793"/>
+      <w:bookmarkStart w:id="13" w:name="_Toc233528095"/>
       <w:r>
         <w:t>2.6 Array</w:t>
       </w:r>
@@ -5331,11 +4940,7 @@
         <w:t>Modern (Dynamic) Arrays</w:t>
       </w:r>
       <w:r>
-        <w:t xml:space="preserve"> </w:t>
-      </w:r>
-      <w:proofErr w:type="gramStart"/>
-      <w:r>
-        <w:t xml:space="preserve">| </w:t>
+        <w:t xml:space="preserve"> | </w:t>
       </w:r>
       <w:r>
         <w:t xml:space="preserve"> </w:t>
@@ -5350,26 +4955,17 @@
         </w:rPr>
         <w:t>VS</w:t>
       </w:r>
-      <w:proofErr w:type="gramEnd"/>
       <w:r>
         <w:t xml:space="preserve"> </w:t>
       </w:r>
       <w:r>
+        <w:t xml:space="preserve"> | </w:t>
+      </w:r>
+      <w:r>
         <w:t xml:space="preserve"> </w:t>
       </w:r>
-      <w:proofErr w:type="gramStart"/>
-      <w:r>
-        <w:t xml:space="preserve">| </w:t>
-      </w:r>
-      <w:r>
-        <w:t xml:space="preserve"> </w:t>
-      </w:r>
-      <w:r>
-        <w:t>Classic</w:t>
-      </w:r>
-      <w:proofErr w:type="gramEnd"/>
-      <w:r>
-        <w:t>(Old) Arrays</w:t>
+      <w:r>
+        <w:t>Classic(Old) Arrays</w:t>
       </w:r>
     </w:p>
     <w:p/>
@@ -5448,23 +5044,7 @@
         </w:numPr>
       </w:pPr>
       <w:r>
-        <w:t xml:space="preserve">When you click on one of the </w:t>
-      </w:r>
-      <w:proofErr w:type="gramStart"/>
-      <w:r>
-        <w:t>cell</w:t>
-      </w:r>
-      <w:proofErr w:type="gramEnd"/>
-      <w:r>
-        <w:t xml:space="preserve"> in it </w:t>
-      </w:r>
-      <w:proofErr w:type="gramStart"/>
-      <w:r>
-        <w:t>-  borders</w:t>
-      </w:r>
-      <w:proofErr w:type="gramEnd"/>
-      <w:r>
-        <w:t xml:space="preserve"> becomes have some shadows (in excel)</w:t>
+        <w:t>When you click on one of the cell in it -  borders becomes have some shadows (in excel)</w:t>
       </w:r>
     </w:p>
     <w:p>
@@ -5574,13 +5154,8 @@
           <w:numId w:val="8"/>
         </w:numPr>
       </w:pPr>
-      <w:proofErr w:type="gramStart"/>
-      <w:r>
-        <w:t>First</w:t>
-      </w:r>
-      <w:proofErr w:type="gramEnd"/>
-      <w:r>
-        <w:t xml:space="preserve"> we need to select the cells and then need to write formula</w:t>
+      <w:r>
+        <w:t>First we need to select the cells and then need to write formula</w:t>
       </w:r>
     </w:p>
     <w:p/>
@@ -5592,13 +5167,8 @@
         <w:sym w:font="Wingdings" w:char="F0E0"/>
       </w:r>
       <w:r>
-        <w:t xml:space="preserve"> =</w:t>
-      </w:r>
-      <w:proofErr w:type="gramStart"/>
-      <w:r>
-        <w:t>UNIQUE(</w:t>
-      </w:r>
-      <w:proofErr w:type="gramEnd"/>
+        <w:t xml:space="preserve"> =UNIQUE(</w:t>
+      </w:r>
       <w:r>
         <w:t>)</w:t>
       </w:r>
@@ -5615,15 +5185,7 @@
         <w:sym w:font="Wingdings" w:char="F0E0"/>
       </w:r>
       <w:r>
-        <w:t xml:space="preserve"> =</w:t>
-      </w:r>
-      <w:proofErr w:type="gramStart"/>
-      <w:r>
-        <w:t>SORT(</w:t>
-      </w:r>
-      <w:proofErr w:type="gramEnd"/>
-      <w:r>
-        <w:t>range)</w:t>
+        <w:t xml:space="preserve"> =SORT(range)</w:t>
       </w:r>
     </w:p>
     <w:p>
@@ -5632,13 +5194,8 @@
       </w:r>
     </w:p>
     <w:p>
-      <w:proofErr w:type="gramStart"/>
-      <w:r>
-        <w:t>So</w:t>
-      </w:r>
-      <w:proofErr w:type="gramEnd"/>
-      <w:r>
-        <w:t xml:space="preserve"> specify here spill range</w:t>
+      <w:r>
+        <w:t>So specify here spill range</w:t>
       </w:r>
     </w:p>
     <w:p/>
@@ -5662,15 +5219,7 @@
         <w:t>When We have Spill</w:t>
       </w:r>
       <w:r>
-        <w:t xml:space="preserve">ed range, and if we try to change a single cell, then it will give us SPILL Error </w:t>
-      </w:r>
-      <w:proofErr w:type="gramStart"/>
-      <w:r>
-        <w:t>-  Because</w:t>
-      </w:r>
-      <w:proofErr w:type="gramEnd"/>
-      <w:r>
-        <w:t xml:space="preserve"> we are manually modifying the cell and destroying the consistency.</w:t>
+        <w:t>ed range, and if we try to change a single cell, then it will give us SPILL Error -  Because we are manually modifying the cell and destroying the consistency.</w:t>
       </w:r>
     </w:p>
     <w:p/>
@@ -5684,42 +5233,13 @@
         <w:lastRenderedPageBreak/>
         <w:sym w:font="Wingdings" w:char="F0E0"/>
       </w:r>
-      <w:proofErr w:type="gramStart"/>
-      <w:r>
-        <w:t>MEDIANIF(</w:t>
-      </w:r>
-      <w:proofErr w:type="gramEnd"/>
-      <w:r>
-        <w:t>):</w:t>
-      </w:r>
-    </w:p>
-    <w:p>
-      <w:r>
-        <w:t xml:space="preserve">By </w:t>
-      </w:r>
-      <w:proofErr w:type="gramStart"/>
-      <w:r>
-        <w:t>default</w:t>
-      </w:r>
-      <w:proofErr w:type="gramEnd"/>
-      <w:r>
-        <w:t xml:space="preserve"> Excel does not provide </w:t>
-      </w:r>
-      <w:proofErr w:type="gramStart"/>
-      <w:r>
-        <w:t>MEDIANIF(</w:t>
-      </w:r>
-      <w:proofErr w:type="gramEnd"/>
-      <w:r>
-        <w:t>), So to have that We need to put IF condition inside MEDIAN(</w:t>
-      </w:r>
-      <w:proofErr w:type="gramStart"/>
-      <w:r>
-        <w:t>IF(</w:t>
-      </w:r>
-      <w:proofErr w:type="gramEnd"/>
-      <w:r>
-        <w:t>))</w:t>
+      <w:r>
+        <w:t>MEDIANIF():</w:t>
+      </w:r>
+    </w:p>
+    <w:p>
+      <w:r>
+        <w:t>By default Excel does not provide MEDIANIF(), So to have that We need to put IF condition inside MEDIAN(IF())</w:t>
       </w:r>
     </w:p>
     <w:p>
@@ -5750,66 +5270,52 @@
               <w:rPr>
                 <w:color w:val="4472C4" w:themeColor="accent1"/>
               </w:rPr>
-              <w:t>$A$</w:t>
-            </w:r>
-            <w:proofErr w:type="gramStart"/>
+              <w:t>$A$2</w:t>
+            </w:r>
+            <w:r>
+              <w:t>:</w:t>
+            </w:r>
             <w:r>
               <w:rPr>
                 <w:color w:val="4472C4" w:themeColor="accent1"/>
               </w:rPr>
-              <w:t>2</w:t>
+              <w:t>$A$32673</w:t>
+            </w:r>
+            <w:r>
+              <w:t>=</w:t>
+            </w:r>
+            <w:r>
+              <w:rPr>
+                <w:color w:val="EE0000"/>
+              </w:rPr>
+              <w:t>$AA2</w:t>
+            </w:r>
+            <w:r>
+              <w:t>)*(</w:t>
+            </w:r>
+            <w:r>
+              <w:rPr>
+                <w:color w:val="7030A0"/>
+              </w:rPr>
+              <w:t>$M$2</w:t>
             </w:r>
             <w:r>
               <w:t>:</w:t>
             </w:r>
             <w:r>
               <w:rPr>
-                <w:color w:val="4472C4" w:themeColor="accent1"/>
-              </w:rPr>
-              <w:t>$</w:t>
-            </w:r>
-            <w:proofErr w:type="gramEnd"/>
-            <w:r>
-              <w:rPr>
-                <w:color w:val="4472C4" w:themeColor="accent1"/>
-              </w:rPr>
-              <w:t>A$32673</w:t>
-            </w:r>
-            <w:r>
-              <w:t>=</w:t>
-            </w:r>
-            <w:r>
-              <w:rPr>
-                <w:color w:val="EE0000"/>
-              </w:rPr>
-              <w:t>$AA</w:t>
-            </w:r>
-            <w:proofErr w:type="gramStart"/>
-            <w:r>
-              <w:rPr>
-                <w:color w:val="EE0000"/>
-              </w:rPr>
-              <w:t>2</w:t>
-            </w:r>
-            <w:r>
-              <w:t>)*</w:t>
-            </w:r>
-            <w:proofErr w:type="gramEnd"/>
-            <w:r>
-              <w:t>(</w:t>
-            </w:r>
-            <w:r>
-              <w:rPr>
                 <w:color w:val="7030A0"/>
               </w:rPr>
-              <w:t>$M$</w:t>
-            </w:r>
-            <w:proofErr w:type="gramStart"/>
+              <w:t>$M$32673</w:t>
+            </w:r>
+            <w:r>
+              <w:t>&lt;&gt;""),</w:t>
+            </w:r>
             <w:r>
               <w:rPr>
                 <w:color w:val="7030A0"/>
               </w:rPr>
-              <w:t>2</w:t>
+              <w:t>$M$2</w:t>
             </w:r>
             <w:r>
               <w:t>:</w:t>
@@ -5818,57 +5324,7 @@
               <w:rPr>
                 <w:color w:val="7030A0"/>
               </w:rPr>
-              <w:t>$</w:t>
-            </w:r>
-            <w:proofErr w:type="gramEnd"/>
-            <w:r>
-              <w:rPr>
-                <w:color w:val="7030A0"/>
-              </w:rPr>
-              <w:t>M$32673</w:t>
-            </w:r>
-            <w:r>
-              <w:t>&lt;&gt;""</w:t>
-            </w:r>
-            <w:proofErr w:type="gramStart"/>
-            <w:r>
-              <w:t>),</w:t>
-            </w:r>
-            <w:r>
-              <w:rPr>
-                <w:color w:val="7030A0"/>
-              </w:rPr>
-              <w:t>$</w:t>
-            </w:r>
-            <w:proofErr w:type="gramEnd"/>
-            <w:r>
-              <w:rPr>
-                <w:color w:val="7030A0"/>
-              </w:rPr>
-              <w:t>M$</w:t>
-            </w:r>
-            <w:proofErr w:type="gramStart"/>
-            <w:r>
-              <w:rPr>
-                <w:color w:val="7030A0"/>
-              </w:rPr>
-              <w:t>2</w:t>
-            </w:r>
-            <w:r>
-              <w:t>:</w:t>
-            </w:r>
-            <w:r>
-              <w:rPr>
-                <w:color w:val="7030A0"/>
-              </w:rPr>
-              <w:t>$</w:t>
-            </w:r>
-            <w:proofErr w:type="gramEnd"/>
-            <w:r>
-              <w:rPr>
-                <w:color w:val="7030A0"/>
-              </w:rPr>
-              <w:t>M$32673</w:t>
+              <w:t>$M$32673</w:t>
             </w:r>
             <w:r>
               <w:t>))</w:t>
@@ -5904,15 +5360,7 @@
         <w:t xml:space="preserve">function </w:t>
       </w:r>
       <w:r>
-        <w:t xml:space="preserve">as having the IF functionality, by providing </w:t>
-      </w:r>
-      <w:proofErr w:type="gramStart"/>
-      <w:r>
-        <w:t>IF(</w:t>
-      </w:r>
-      <w:proofErr w:type="gramEnd"/>
-      <w:r>
-        <w:t>) inside that function.</w:t>
+        <w:t>as having the IF functionality, by providing IF() inside that function.</w:t>
       </w:r>
     </w:p>
     <w:p/>
@@ -5964,13 +5412,8 @@
         <w:t xml:space="preserve"> 1</w:t>
       </w:r>
       <w:r>
-        <w:t xml:space="preserve"> (Negates two time – means - - = </w:t>
-      </w:r>
-      <w:proofErr w:type="gramStart"/>
-      <w:r>
-        <w:t>+ )</w:t>
-      </w:r>
-      <w:proofErr w:type="gramEnd"/>
+        <w:t xml:space="preserve"> (Negates two time – means - - = + )</w:t>
+      </w:r>
     </w:p>
     <w:p/>
     <w:p/>
@@ -5979,15 +5422,7 @@
         <w:sym w:font="Wingdings" w:char="F0E0"/>
       </w:r>
       <w:r>
-        <w:t xml:space="preserve"> </w:t>
-      </w:r>
-      <w:proofErr w:type="gramStart"/>
-      <w:r>
-        <w:t>TEXT(</w:t>
-      </w:r>
-      <w:proofErr w:type="gramEnd"/>
-      <w:r>
-        <w:t>) function</w:t>
+        <w:t xml:space="preserve"> TEXT() function</w:t>
       </w:r>
     </w:p>
     <w:p>
@@ -6017,7 +5452,7 @@
       <w:pPr>
         <w:pStyle w:val="Heading2"/>
       </w:pPr>
-      <w:bookmarkStart w:id="14" w:name="_Toc232771794"/>
+      <w:bookmarkStart w:id="14" w:name="_Toc233528096"/>
       <w:r>
         <w:t>2.7 Lookup Functions</w:t>
       </w:r>
@@ -6046,25 +5481,7 @@
           <w:bCs/>
           <w:u w:val="single"/>
         </w:rPr>
-        <w:t xml:space="preserve"> </w:t>
-      </w:r>
-      <w:proofErr w:type="gramStart"/>
-      <w:r>
-        <w:rPr>
-          <w:b/>
-          <w:bCs/>
-          <w:u w:val="single"/>
-        </w:rPr>
-        <w:t>VLOOKUP(</w:t>
-      </w:r>
-      <w:proofErr w:type="gramEnd"/>
-      <w:r>
-        <w:rPr>
-          <w:b/>
-          <w:bCs/>
-          <w:u w:val="single"/>
-        </w:rPr>
-        <w:t>)</w:t>
+        <w:t xml:space="preserve"> VLOOKUP()</w:t>
       </w:r>
     </w:p>
     <w:p/>
@@ -6116,44 +5533,7 @@
           </w:tcPr>
           <w:p>
             <w:r>
-              <w:t>=</w:t>
-            </w:r>
-            <w:proofErr w:type="gramStart"/>
-            <w:r>
-              <w:t>VLOOKUP(</w:t>
-            </w:r>
-            <w:proofErr w:type="spellStart"/>
-            <w:proofErr w:type="gramEnd"/>
-            <w:r>
-              <w:t>lookup_value</w:t>
-            </w:r>
-            <w:proofErr w:type="spellEnd"/>
-            <w:r>
-              <w:t xml:space="preserve">, </w:t>
-            </w:r>
-            <w:proofErr w:type="spellStart"/>
-            <w:r>
-              <w:t>table_array</w:t>
-            </w:r>
-            <w:proofErr w:type="spellEnd"/>
-            <w:r>
-              <w:t xml:space="preserve">, </w:t>
-            </w:r>
-            <w:proofErr w:type="spellStart"/>
-            <w:r>
-              <w:t>col_index_num</w:t>
-            </w:r>
-            <w:proofErr w:type="spellEnd"/>
-            <w:r>
-              <w:t>, [</w:t>
-            </w:r>
-            <w:proofErr w:type="spellStart"/>
-            <w:r>
-              <w:t>range_lookup</w:t>
-            </w:r>
-            <w:proofErr w:type="spellEnd"/>
-            <w:r>
-              <w:t>])</w:t>
+              <w:t>=VLOOKUP(lookup_value, table_array, col_index_num, [range_lookup])</w:t>
             </w:r>
           </w:p>
         </w:tc>
@@ -6185,7 +5565,6 @@
           <w:numId w:val="12"/>
         </w:numPr>
       </w:pPr>
-      <w:proofErr w:type="spellStart"/>
       <w:r>
         <w:rPr>
           <w:b/>
@@ -6193,7 +5572,6 @@
         </w:rPr>
         <w:t>lookup_value</w:t>
       </w:r>
-      <w:proofErr w:type="spellEnd"/>
       <w:r>
         <w:t xml:space="preserve"> → Value to search for. </w:t>
       </w:r>
@@ -6205,7 +5583,6 @@
           <w:numId w:val="12"/>
         </w:numPr>
       </w:pPr>
-      <w:proofErr w:type="spellStart"/>
       <w:r>
         <w:rPr>
           <w:b/>
@@ -6213,7 +5590,6 @@
         </w:rPr>
         <w:t>table_array</w:t>
       </w:r>
-      <w:proofErr w:type="spellEnd"/>
       <w:r>
         <w:t xml:space="preserve"> → Range containing the data. </w:t>
       </w:r>
@@ -6225,7 +5601,6 @@
           <w:numId w:val="12"/>
         </w:numPr>
       </w:pPr>
-      <w:proofErr w:type="spellStart"/>
       <w:r>
         <w:rPr>
           <w:b/>
@@ -6233,7 +5608,6 @@
         </w:rPr>
         <w:t>col_index_num</w:t>
       </w:r>
-      <w:proofErr w:type="spellEnd"/>
       <w:r>
         <w:t xml:space="preserve"> → Column number (starting from 1) from which to return the result. </w:t>
       </w:r>
@@ -6245,7 +5619,6 @@
           <w:numId w:val="12"/>
         </w:numPr>
       </w:pPr>
-      <w:proofErr w:type="spellStart"/>
       <w:r>
         <w:rPr>
           <w:b/>
@@ -6253,7 +5626,6 @@
         </w:rPr>
         <w:t>range_lookup</w:t>
       </w:r>
-      <w:proofErr w:type="spellEnd"/>
       <w:r>
         <w:t xml:space="preserve"> </w:t>
       </w:r>
@@ -6284,17 +5656,8 @@
     <w:p/>
     <w:p>
       <w:r>
-        <w:t xml:space="preserve">In </w:t>
-      </w:r>
-      <w:proofErr w:type="gramStart"/>
-      <w:r>
-        <w:t>VLOOKUP(</w:t>
-      </w:r>
-      <w:proofErr w:type="gramEnd"/>
-      <w:r>
-        <w:t xml:space="preserve">), </w:t>
-      </w:r>
-      <w:proofErr w:type="spellStart"/>
+        <w:t xml:space="preserve">In VLOOKUP(), </w:t>
+      </w:r>
       <w:r>
         <w:rPr>
           <w:b/>
@@ -6302,7 +5665,6 @@
         </w:rPr>
         <w:t>col_index_num</w:t>
       </w:r>
-      <w:proofErr w:type="spellEnd"/>
       <w:r>
         <w:t xml:space="preserve"> means:</w:t>
       </w:r>
@@ -6318,17 +5680,8 @@
         <w:sym w:font="Wingdings" w:char="F0E0"/>
       </w:r>
       <w:r>
-        <w:t xml:space="preserve"> </w:t>
-      </w:r>
-      <w:proofErr w:type="gramStart"/>
-      <w:r>
-        <w:t>Generally</w:t>
-      </w:r>
-      <w:proofErr w:type="gramEnd"/>
-      <w:r>
-        <w:t xml:space="preserve"> we use “FALSE” in </w:t>
-      </w:r>
-      <w:proofErr w:type="spellStart"/>
+        <w:t xml:space="preserve"> Generally we use “FALSE” in </w:t>
+      </w:r>
       <w:r>
         <w:rPr>
           <w:i/>
@@ -6336,7 +5689,6 @@
         </w:rPr>
         <w:t>range_lookup</w:t>
       </w:r>
-      <w:proofErr w:type="spellEnd"/>
       <w:r>
         <w:t xml:space="preserve"> because, by default they expect the values to be sorted but as because in our case they are not sorted, hence we provide FALSE means do Exact match</w:t>
       </w:r>
@@ -6369,25 +5721,7 @@
           <w:bCs/>
           <w:u w:val="single"/>
         </w:rPr>
-        <w:t xml:space="preserve"> </w:t>
-      </w:r>
-      <w:proofErr w:type="gramStart"/>
-      <w:r>
-        <w:rPr>
-          <w:b/>
-          <w:bCs/>
-          <w:u w:val="single"/>
-        </w:rPr>
-        <w:t>HLOOKUP(</w:t>
-      </w:r>
-      <w:proofErr w:type="gramEnd"/>
-      <w:r>
-        <w:rPr>
-          <w:b/>
-          <w:bCs/>
-          <w:u w:val="single"/>
-        </w:rPr>
-        <w:t>):</w:t>
+        <w:t xml:space="preserve"> HLOOKUP():</w:t>
       </w:r>
     </w:p>
     <w:p>
@@ -6437,44 +5771,7 @@
           </w:tcPr>
           <w:p>
             <w:r>
-              <w:t>=</w:t>
-            </w:r>
-            <w:proofErr w:type="gramStart"/>
-            <w:r>
-              <w:t>HLOOKUP(</w:t>
-            </w:r>
-            <w:proofErr w:type="spellStart"/>
-            <w:proofErr w:type="gramEnd"/>
-            <w:r>
-              <w:t>lookup_value</w:t>
-            </w:r>
-            <w:proofErr w:type="spellEnd"/>
-            <w:r>
-              <w:t xml:space="preserve">, </w:t>
-            </w:r>
-            <w:proofErr w:type="spellStart"/>
-            <w:r>
-              <w:t>table_array</w:t>
-            </w:r>
-            <w:proofErr w:type="spellEnd"/>
-            <w:r>
-              <w:t xml:space="preserve">, </w:t>
-            </w:r>
-            <w:proofErr w:type="spellStart"/>
-            <w:r>
-              <w:t>row_index_num</w:t>
-            </w:r>
-            <w:proofErr w:type="spellEnd"/>
-            <w:r>
-              <w:t>, [</w:t>
-            </w:r>
-            <w:proofErr w:type="spellStart"/>
-            <w:r>
-              <w:t>range_lookup</w:t>
-            </w:r>
-            <w:proofErr w:type="spellEnd"/>
-            <w:r>
-              <w:t>])</w:t>
+              <w:t>=HLOOKUP(lookup_value, table_array, row_index_num, [range_lookup])</w:t>
             </w:r>
           </w:p>
         </w:tc>
@@ -6497,44 +5794,25 @@
       <w:r>
         <w:t xml:space="preserve"> </w:t>
       </w:r>
-      <w:proofErr w:type="gramStart"/>
       <w:r>
         <w:rPr>
           <w:b/>
           <w:bCs/>
           <w:u w:val="single"/>
         </w:rPr>
-        <w:t>MATCH(</w:t>
-      </w:r>
-      <w:proofErr w:type="gramEnd"/>
+        <w:t>MATCH():</w:t>
+      </w:r>
+    </w:p>
+    <w:p>
+      <w:r>
+        <w:t xml:space="preserve">The </w:t>
+      </w:r>
       <w:r>
         <w:rPr>
           <w:b/>
           <w:bCs/>
-          <w:u w:val="single"/>
-        </w:rPr>
-        <w:t>):</w:t>
-      </w:r>
-    </w:p>
-    <w:p>
-      <w:r>
-        <w:t xml:space="preserve">The </w:t>
-      </w:r>
-      <w:proofErr w:type="gramStart"/>
-      <w:r>
-        <w:rPr>
-          <w:b/>
-          <w:bCs/>
-        </w:rPr>
-        <w:t>MATCH(</w:t>
-      </w:r>
-      <w:proofErr w:type="gramEnd"/>
-      <w:r>
-        <w:rPr>
-          <w:b/>
-          <w:bCs/>
-        </w:rPr>
-        <w:t>)</w:t>
+        </w:rPr>
+        <w:t>MATCH()</w:t>
       </w:r>
       <w:r>
         <w:t xml:space="preserve"> function returns the </w:t>
@@ -6567,36 +5845,7 @@
           </w:tcPr>
           <w:p>
             <w:r>
-              <w:t>=</w:t>
-            </w:r>
-            <w:proofErr w:type="gramStart"/>
-            <w:r>
-              <w:t>MATCH(</w:t>
-            </w:r>
-            <w:proofErr w:type="spellStart"/>
-            <w:proofErr w:type="gramEnd"/>
-            <w:r>
-              <w:t>lookup_value</w:t>
-            </w:r>
-            <w:proofErr w:type="spellEnd"/>
-            <w:r>
-              <w:t xml:space="preserve">, </w:t>
-            </w:r>
-            <w:proofErr w:type="spellStart"/>
-            <w:r>
-              <w:t>lookup_array</w:t>
-            </w:r>
-            <w:proofErr w:type="spellEnd"/>
-            <w:r>
-              <w:t>, [</w:t>
-            </w:r>
-            <w:proofErr w:type="spellStart"/>
-            <w:r>
-              <w:t>match_type</w:t>
-            </w:r>
-            <w:proofErr w:type="spellEnd"/>
-            <w:r>
-              <w:t>])</w:t>
+              <w:t>=MATCH(lookup_value, lookup_array, [match_type])</w:t>
             </w:r>
           </w:p>
         </w:tc>
@@ -6631,7 +5880,6 @@
           <w:numId w:val="13"/>
         </w:numPr>
       </w:pPr>
-      <w:proofErr w:type="spellStart"/>
       <w:r>
         <w:rPr>
           <w:b/>
@@ -6639,7 +5887,6 @@
         </w:rPr>
         <w:t>lookup_value</w:t>
       </w:r>
-      <w:proofErr w:type="spellEnd"/>
       <w:r>
         <w:t xml:space="preserve"> → The value you want to find. </w:t>
       </w:r>
@@ -6651,7 +5898,6 @@
           <w:numId w:val="13"/>
         </w:numPr>
       </w:pPr>
-      <w:proofErr w:type="spellStart"/>
       <w:r>
         <w:rPr>
           <w:b/>
@@ -6659,7 +5905,6 @@
         </w:rPr>
         <w:t>lookup_array</w:t>
       </w:r>
-      <w:proofErr w:type="spellEnd"/>
       <w:r>
         <w:t xml:space="preserve"> → The range to search in. </w:t>
       </w:r>
@@ -6671,7 +5916,6 @@
           <w:numId w:val="13"/>
         </w:numPr>
       </w:pPr>
-      <w:proofErr w:type="spellStart"/>
       <w:r>
         <w:rPr>
           <w:b/>
@@ -6679,7 +5923,6 @@
         </w:rPr>
         <w:t>match_type</w:t>
       </w:r>
-      <w:proofErr w:type="spellEnd"/>
       <w:r>
         <w:t xml:space="preserve"> (optional): </w:t>
       </w:r>
@@ -6703,15 +5946,7 @@
         </w:numPr>
       </w:pPr>
       <w:r>
-        <w:t xml:space="preserve">1 → Largest value ≤ </w:t>
-      </w:r>
-      <w:proofErr w:type="spellStart"/>
-      <w:r>
-        <w:t>lookup_value</w:t>
-      </w:r>
-      <w:proofErr w:type="spellEnd"/>
-      <w:r>
-        <w:t xml:space="preserve"> (ascending order required) </w:t>
+        <w:t xml:space="preserve">1 → Largest value ≤ lookup_value (ascending order required) </w:t>
       </w:r>
     </w:p>
     <w:p>
@@ -6722,15 +5957,7 @@
         </w:numPr>
       </w:pPr>
       <w:r>
-        <w:t xml:space="preserve">-1 → Smallest value ≥ </w:t>
-      </w:r>
-      <w:proofErr w:type="spellStart"/>
-      <w:r>
-        <w:t>lookup_value</w:t>
-      </w:r>
-      <w:proofErr w:type="spellEnd"/>
-      <w:r>
-        <w:t xml:space="preserve"> (descending order required)</w:t>
+        <w:t>-1 → Smallest value ≥ lookup_value (descending order required)</w:t>
       </w:r>
     </w:p>
     <w:p/>
@@ -6744,49 +5971,18 @@
       <w:r>
         <w:t xml:space="preserve"> </w:t>
       </w:r>
-      <w:proofErr w:type="gramStart"/>
       <w:r>
         <w:rPr>
           <w:b/>
           <w:bCs/>
           <w:u w:val="single"/>
         </w:rPr>
-        <w:t>XLOOKUP(</w:t>
-      </w:r>
-      <w:proofErr w:type="gramEnd"/>
-      <w:r>
-        <w:rPr>
-          <w:b/>
-          <w:bCs/>
-          <w:u w:val="single"/>
-        </w:rPr>
-        <w:t>):</w:t>
-      </w:r>
-    </w:p>
-    <w:p>
-      <w:proofErr w:type="gramStart"/>
-      <w:r>
-        <w:t>XLOOKUP(</w:t>
-      </w:r>
-      <w:proofErr w:type="gramEnd"/>
-      <w:r>
-        <w:t xml:space="preserve">) is a modern lookup function in Excel that replaces both </w:t>
-      </w:r>
-      <w:proofErr w:type="gramStart"/>
-      <w:r>
-        <w:t>VLOOKUP(</w:t>
-      </w:r>
-      <w:proofErr w:type="gramEnd"/>
-      <w:r>
-        <w:t xml:space="preserve">) and </w:t>
-      </w:r>
-      <w:proofErr w:type="gramStart"/>
-      <w:r>
-        <w:t>HLOOKUP(</w:t>
-      </w:r>
-      <w:proofErr w:type="gramEnd"/>
-      <w:r>
-        <w:t>). It can search vertically or horizontally and is more flexible.</w:t>
+        <w:t>XLOOKUP():</w:t>
+      </w:r>
+    </w:p>
+    <w:p>
+      <w:r>
+        <w:t>XLOOKUP() is a modern lookup function in Excel that replaces both VLOOKUP() and HLOOKUP(). It can search vertically or horizontally and is more flexible.</w:t>
       </w:r>
     </w:p>
     <w:tbl>
@@ -6806,60 +6002,7 @@
           </w:tcPr>
           <w:p>
             <w:r>
-              <w:t>=</w:t>
-            </w:r>
-            <w:proofErr w:type="gramStart"/>
-            <w:r>
-              <w:t>XLOOKUP(</w:t>
-            </w:r>
-            <w:proofErr w:type="spellStart"/>
-            <w:proofErr w:type="gramEnd"/>
-            <w:r>
-              <w:t>lookup_value</w:t>
-            </w:r>
-            <w:proofErr w:type="spellEnd"/>
-            <w:r>
-              <w:t xml:space="preserve">, </w:t>
-            </w:r>
-            <w:proofErr w:type="spellStart"/>
-            <w:r>
-              <w:t>lookup_array</w:t>
-            </w:r>
-            <w:proofErr w:type="spellEnd"/>
-            <w:r>
-              <w:t xml:space="preserve">, </w:t>
-            </w:r>
-            <w:proofErr w:type="spellStart"/>
-            <w:r>
-              <w:t>return_array</w:t>
-            </w:r>
-            <w:proofErr w:type="spellEnd"/>
-            <w:r>
-              <w:t>, [</w:t>
-            </w:r>
-            <w:proofErr w:type="spellStart"/>
-            <w:r>
-              <w:t>if_not_found</w:t>
-            </w:r>
-            <w:proofErr w:type="spellEnd"/>
-            <w:r>
-              <w:t>], [</w:t>
-            </w:r>
-            <w:proofErr w:type="spellStart"/>
-            <w:r>
-              <w:t>match_mode</w:t>
-            </w:r>
-            <w:proofErr w:type="spellEnd"/>
-            <w:r>
-              <w:t>], [</w:t>
-            </w:r>
-            <w:proofErr w:type="spellStart"/>
-            <w:r>
-              <w:t>search_mode</w:t>
-            </w:r>
-            <w:proofErr w:type="spellEnd"/>
-            <w:r>
-              <w:t>])</w:t>
+              <w:t>=XLOOKUP(lookup_value, lookup_array, return_array, [if_not_found], [match_mode], [search_mode])</w:t>
             </w:r>
           </w:p>
         </w:tc>
@@ -6925,11 +6068,9 @@
             <w:pPr>
               <w:spacing w:after="160" w:line="259" w:lineRule="auto"/>
             </w:pPr>
-            <w:proofErr w:type="spellStart"/>
             <w:r>
               <w:t>lookup_value</w:t>
             </w:r>
-            <w:proofErr w:type="spellEnd"/>
           </w:p>
         </w:tc>
         <w:tc>
@@ -6959,11 +6100,9 @@
             <w:pPr>
               <w:spacing w:after="160" w:line="259" w:lineRule="auto"/>
             </w:pPr>
-            <w:proofErr w:type="spellStart"/>
             <w:r>
               <w:t>lookup_array</w:t>
             </w:r>
-            <w:proofErr w:type="spellEnd"/>
           </w:p>
         </w:tc>
         <w:tc>
@@ -6996,11 +6135,9 @@
             <w:pPr>
               <w:spacing w:after="160" w:line="259" w:lineRule="auto"/>
             </w:pPr>
-            <w:proofErr w:type="spellStart"/>
             <w:r>
               <w:t>return_array</w:t>
             </w:r>
-            <w:proofErr w:type="spellEnd"/>
           </w:p>
         </w:tc>
         <w:tc>
@@ -7030,11 +6167,9 @@
             <w:pPr>
               <w:spacing w:after="160" w:line="259" w:lineRule="auto"/>
             </w:pPr>
-            <w:proofErr w:type="spellStart"/>
             <w:r>
               <w:t>if_not_found</w:t>
             </w:r>
-            <w:proofErr w:type="spellEnd"/>
           </w:p>
         </w:tc>
         <w:tc>
@@ -7067,11 +6202,9 @@
             <w:pPr>
               <w:spacing w:after="160" w:line="259" w:lineRule="auto"/>
             </w:pPr>
-            <w:proofErr w:type="spellStart"/>
             <w:r>
               <w:t>match_mode</w:t>
             </w:r>
-            <w:proofErr w:type="spellEnd"/>
           </w:p>
         </w:tc>
         <w:tc>
@@ -7101,11 +6234,9 @@
             <w:pPr>
               <w:spacing w:after="160" w:line="259" w:lineRule="auto"/>
             </w:pPr>
-            <w:proofErr w:type="spellStart"/>
             <w:r>
               <w:t>search_mode</w:t>
             </w:r>
-            <w:proofErr w:type="spellEnd"/>
           </w:p>
         </w:tc>
         <w:tc>
@@ -7125,6 +6256,1119 @@
         </w:tc>
       </w:tr>
     </w:tbl>
+    <w:p/>
+    <w:p/>
+    <w:p>
+      <w:pPr>
+        <w:pStyle w:val="Heading2"/>
+      </w:pPr>
+      <w:bookmarkStart w:id="15" w:name="_Toc233528097"/>
+      <w:r>
+        <w:t>2.8 TEXT Functions</w:t>
+      </w:r>
+      <w:bookmarkEnd w:id="15"/>
+    </w:p>
+    <w:p/>
+    <w:p>
+      <w:r>
+        <w:sym w:font="Wingdings" w:char="F0E8"/>
+      </w:r>
+      <w:r>
+        <w:t xml:space="preserve"> </w:t>
+      </w:r>
+      <w:r>
+        <w:rPr>
+          <w:b/>
+          <w:bCs/>
+          <w:u w:val="single"/>
+        </w:rPr>
+        <w:t>TEXTJOIN():</w:t>
+      </w:r>
+    </w:p>
+    <w:p>
+      <w:r>
+        <w:t>TEXTJOIN() combines text from multiple cells into a single string and lets you specify a separator (delimiter).</w:t>
+      </w:r>
+    </w:p>
+    <w:tbl>
+      <w:tblPr>
+        <w:tblStyle w:val="TableGrid"/>
+        <w:tblW w:w="0" w:type="auto"/>
+        <w:tblLook w:val="04A0" w:firstRow="1" w:lastRow="0" w:firstColumn="1" w:lastColumn="0" w:noHBand="0" w:noVBand="1"/>
+      </w:tblPr>
+      <w:tblGrid>
+        <w:gridCol w:w="9016"/>
+      </w:tblGrid>
+      <w:tr>
+        <w:tc>
+          <w:tcPr>
+            <w:tcW w:w="9016" w:type="dxa"/>
+            <w:shd w:val="clear" w:color="auto" w:fill="E7E6E6" w:themeFill="background2"/>
+          </w:tcPr>
+          <w:p>
+            <w:r>
+              <w:t>=TEXTJOIN(delimiter, ignore_empty, text1, [text2], ...)</w:t>
+            </w:r>
+          </w:p>
+        </w:tc>
+      </w:tr>
+    </w:tbl>
+    <w:p/>
+    <w:tbl>
+      <w:tblPr>
+        <w:tblStyle w:val="PlainTable1"/>
+        <w:tblW w:w="0" w:type="auto"/>
+        <w:tblLook w:val="04A0" w:firstRow="1" w:lastRow="0" w:firstColumn="1" w:lastColumn="0" w:noHBand="0" w:noVBand="1"/>
+      </w:tblPr>
+      <w:tblGrid>
+        <w:gridCol w:w="1625"/>
+        <w:gridCol w:w="5031"/>
+      </w:tblGrid>
+      <w:tr>
+        <w:trPr>
+          <w:cnfStyle w:val="100000000000" w:firstRow="1" w:lastRow="0" w:firstColumn="0" w:lastColumn="0" w:oddVBand="0" w:evenVBand="0" w:oddHBand="0" w:evenHBand="0" w:firstRowFirstColumn="0" w:firstRowLastColumn="0" w:lastRowFirstColumn="0" w:lastRowLastColumn="0"/>
+        </w:trPr>
+        <w:tc>
+          <w:tcPr>
+            <w:cnfStyle w:val="001000000000" w:firstRow="0" w:lastRow="0" w:firstColumn="1" w:lastColumn="0" w:oddVBand="0" w:evenVBand="0" w:oddHBand="0" w:evenHBand="0" w:firstRowFirstColumn="0" w:firstRowLastColumn="0" w:lastRowFirstColumn="0" w:lastRowLastColumn="0"/>
+            <w:tcW w:w="0" w:type="auto"/>
+            <w:hideMark/>
+          </w:tcPr>
+          <w:p>
+            <w:pPr>
+              <w:spacing w:after="160" w:line="259" w:lineRule="auto"/>
+            </w:pPr>
+            <w:r>
+              <w:t>Argument</w:t>
+            </w:r>
+          </w:p>
+        </w:tc>
+        <w:tc>
+          <w:tcPr>
+            <w:tcW w:w="0" w:type="auto"/>
+            <w:hideMark/>
+          </w:tcPr>
+          <w:p>
+            <w:pPr>
+              <w:spacing w:after="160" w:line="259" w:lineRule="auto"/>
+              <w:cnfStyle w:val="100000000000" w:firstRow="1" w:lastRow="0" w:firstColumn="0" w:lastColumn="0" w:oddVBand="0" w:evenVBand="0" w:oddHBand="0" w:evenHBand="0" w:firstRowFirstColumn="0" w:firstRowLastColumn="0" w:lastRowFirstColumn="0" w:lastRowLastColumn="0"/>
+            </w:pPr>
+            <w:r>
+              <w:t>Description</w:t>
+            </w:r>
+          </w:p>
+        </w:tc>
+      </w:tr>
+      <w:tr>
+        <w:trPr>
+          <w:cnfStyle w:val="000000100000" w:firstRow="0" w:lastRow="0" w:firstColumn="0" w:lastColumn="0" w:oddVBand="0" w:evenVBand="0" w:oddHBand="1" w:evenHBand="0" w:firstRowFirstColumn="0" w:firstRowLastColumn="0" w:lastRowFirstColumn="0" w:lastRowLastColumn="0"/>
+        </w:trPr>
+        <w:tc>
+          <w:tcPr>
+            <w:cnfStyle w:val="001000000000" w:firstRow="0" w:lastRow="0" w:firstColumn="1" w:lastColumn="0" w:oddVBand="0" w:evenVBand="0" w:oddHBand="0" w:evenHBand="0" w:firstRowFirstColumn="0" w:firstRowLastColumn="0" w:lastRowFirstColumn="0" w:lastRowLastColumn="0"/>
+            <w:tcW w:w="0" w:type="auto"/>
+            <w:hideMark/>
+          </w:tcPr>
+          <w:p>
+            <w:pPr>
+              <w:spacing w:after="160" w:line="259" w:lineRule="auto"/>
+            </w:pPr>
+            <w:r>
+              <w:t>delimiter</w:t>
+            </w:r>
+          </w:p>
+        </w:tc>
+        <w:tc>
+          <w:tcPr>
+            <w:tcW w:w="0" w:type="auto"/>
+            <w:hideMark/>
+          </w:tcPr>
+          <w:p>
+            <w:pPr>
+              <w:spacing w:after="160" w:line="259" w:lineRule="auto"/>
+              <w:cnfStyle w:val="000000100000" w:firstRow="0" w:lastRow="0" w:firstColumn="0" w:lastColumn="0" w:oddVBand="0" w:evenVBand="0" w:oddHBand="1" w:evenHBand="0" w:firstRowFirstColumn="0" w:firstRowLastColumn="0" w:lastRowFirstColumn="0" w:lastRowLastColumn="0"/>
+            </w:pPr>
+            <w:r>
+              <w:t>Character(s) between values (e.g., ", ", " - ", " ")</w:t>
+            </w:r>
+          </w:p>
+        </w:tc>
+      </w:tr>
+      <w:tr>
+        <w:tc>
+          <w:tcPr>
+            <w:cnfStyle w:val="001000000000" w:firstRow="0" w:lastRow="0" w:firstColumn="1" w:lastColumn="0" w:oddVBand="0" w:evenVBand="0" w:oddHBand="0" w:evenHBand="0" w:firstRowFirstColumn="0" w:firstRowLastColumn="0" w:lastRowFirstColumn="0" w:lastRowLastColumn="0"/>
+            <w:tcW w:w="0" w:type="auto"/>
+            <w:hideMark/>
+          </w:tcPr>
+          <w:p>
+            <w:pPr>
+              <w:spacing w:after="160" w:line="259" w:lineRule="auto"/>
+            </w:pPr>
+            <w:r>
+              <w:t>ignore_empty</w:t>
+            </w:r>
+          </w:p>
+        </w:tc>
+        <w:tc>
+          <w:tcPr>
+            <w:tcW w:w="0" w:type="auto"/>
+            <w:hideMark/>
+          </w:tcPr>
+          <w:p>
+            <w:pPr>
+              <w:spacing w:after="160" w:line="259" w:lineRule="auto"/>
+              <w:cnfStyle w:val="000000000000" w:firstRow="0" w:lastRow="0" w:firstColumn="0" w:lastColumn="0" w:oddVBand="0" w:evenVBand="0" w:oddHBand="0" w:evenHBand="0" w:firstRowFirstColumn="0" w:firstRowLastColumn="0" w:lastRowFirstColumn="0" w:lastRowLastColumn="0"/>
+            </w:pPr>
+            <w:r>
+              <w:t>TRUE to skip blank cells, FALSE to include them</w:t>
+            </w:r>
+          </w:p>
+        </w:tc>
+      </w:tr>
+      <w:tr>
+        <w:trPr>
+          <w:cnfStyle w:val="000000100000" w:firstRow="0" w:lastRow="0" w:firstColumn="0" w:lastColumn="0" w:oddVBand="0" w:evenVBand="0" w:oddHBand="1" w:evenHBand="0" w:firstRowFirstColumn="0" w:firstRowLastColumn="0" w:lastRowFirstColumn="0" w:lastRowLastColumn="0"/>
+        </w:trPr>
+        <w:tc>
+          <w:tcPr>
+            <w:cnfStyle w:val="001000000000" w:firstRow="0" w:lastRow="0" w:firstColumn="1" w:lastColumn="0" w:oddVBand="0" w:evenVBand="0" w:oddHBand="0" w:evenHBand="0" w:firstRowFirstColumn="0" w:firstRowLastColumn="0" w:lastRowFirstColumn="0" w:lastRowLastColumn="0"/>
+            <w:tcW w:w="0" w:type="auto"/>
+            <w:hideMark/>
+          </w:tcPr>
+          <w:p>
+            <w:pPr>
+              <w:spacing w:after="160" w:line="259" w:lineRule="auto"/>
+            </w:pPr>
+            <w:r>
+              <w:t>text1, text2...</w:t>
+            </w:r>
+          </w:p>
+        </w:tc>
+        <w:tc>
+          <w:tcPr>
+            <w:tcW w:w="0" w:type="auto"/>
+            <w:hideMark/>
+          </w:tcPr>
+          <w:p>
+            <w:pPr>
+              <w:spacing w:after="160" w:line="259" w:lineRule="auto"/>
+              <w:cnfStyle w:val="000000100000" w:firstRow="0" w:lastRow="0" w:firstColumn="0" w:lastColumn="0" w:oddVBand="0" w:evenVBand="0" w:oddHBand="1" w:evenHBand="0" w:firstRowFirstColumn="0" w:firstRowLastColumn="0" w:lastRowFirstColumn="0" w:lastRowLastColumn="0"/>
+            </w:pPr>
+            <w:r>
+              <w:t>Cells, ranges, or text to join</w:t>
+            </w:r>
+          </w:p>
+        </w:tc>
+      </w:tr>
+    </w:tbl>
+    <w:p/>
+    <w:p/>
+    <w:p/>
+    <w:p>
+      <w:pPr>
+        <w:rPr>
+          <w:b/>
+          <w:bCs/>
+          <w:u w:val="single"/>
+        </w:rPr>
+      </w:pPr>
+      <w:r>
+        <w:sym w:font="Wingdings" w:char="F0E8"/>
+      </w:r>
+      <w:r>
+        <w:t xml:space="preserve"> </w:t>
+      </w:r>
+      <w:r>
+        <w:rPr>
+          <w:b/>
+          <w:bCs/>
+          <w:u w:val="single"/>
+        </w:rPr>
+        <w:t>TEXTSPLIT():</w:t>
+      </w:r>
+    </w:p>
+    <w:p>
+      <w:r>
+        <w:t xml:space="preserve">TEXTSPLIT() is an Excel function used to </w:t>
+      </w:r>
+      <w:r>
+        <w:rPr>
+          <w:b/>
+          <w:bCs/>
+        </w:rPr>
+        <w:t>split text into multiple cells</w:t>
+      </w:r>
+      <w:r>
+        <w:t xml:space="preserve"> based on a delimiter (separator).</w:t>
+      </w:r>
+    </w:p>
+    <w:tbl>
+      <w:tblPr>
+        <w:tblStyle w:val="TableGrid"/>
+        <w:tblW w:w="0" w:type="auto"/>
+        <w:tblLook w:val="04A0" w:firstRow="1" w:lastRow="0" w:firstColumn="1" w:lastColumn="0" w:noHBand="0" w:noVBand="1"/>
+      </w:tblPr>
+      <w:tblGrid>
+        <w:gridCol w:w="9016"/>
+      </w:tblGrid>
+      <w:tr>
+        <w:tc>
+          <w:tcPr>
+            <w:tcW w:w="9016" w:type="dxa"/>
+            <w:shd w:val="clear" w:color="auto" w:fill="E7E6E6" w:themeFill="background2"/>
+          </w:tcPr>
+          <w:p>
+            <w:r>
+              <w:t>=TEXTSPLIT(text, col_delimiter, [row_delimiter])</w:t>
+            </w:r>
+          </w:p>
+        </w:tc>
+      </w:tr>
+    </w:tbl>
+    <w:p/>
+    <w:p>
+      <w:pPr>
+        <w:rPr>
+          <w:b/>
+          <w:bCs/>
+        </w:rPr>
+      </w:pPr>
+      <w:r>
+        <w:rPr>
+          <w:b/>
+          <w:bCs/>
+        </w:rPr>
+        <w:t>Parameters</w:t>
+      </w:r>
+    </w:p>
+    <w:p>
+      <w:pPr>
+        <w:numPr>
+          <w:ilvl w:val="0"/>
+          <w:numId w:val="14"/>
+        </w:numPr>
+      </w:pPr>
+      <w:r>
+        <w:rPr>
+          <w:b/>
+          <w:bCs/>
+        </w:rPr>
+        <w:t>text</w:t>
+      </w:r>
+      <w:r>
+        <w:t xml:space="preserve"> → Text to split </w:t>
+      </w:r>
+    </w:p>
+    <w:p>
+      <w:pPr>
+        <w:numPr>
+          <w:ilvl w:val="0"/>
+          <w:numId w:val="14"/>
+        </w:numPr>
+      </w:pPr>
+      <w:r>
+        <w:rPr>
+          <w:b/>
+          <w:bCs/>
+        </w:rPr>
+        <w:t>col_delimiter</w:t>
+      </w:r>
+      <w:r>
+        <w:t xml:space="preserve"> → Character(s) where text should be split into columns </w:t>
+      </w:r>
+    </w:p>
+    <w:p>
+      <w:pPr>
+        <w:numPr>
+          <w:ilvl w:val="0"/>
+          <w:numId w:val="14"/>
+        </w:numPr>
+      </w:pPr>
+      <w:r>
+        <w:rPr>
+          <w:b/>
+          <w:bCs/>
+        </w:rPr>
+        <w:t>row_delimiter</w:t>
+      </w:r>
+      <w:r>
+        <w:t xml:space="preserve"> </w:t>
+      </w:r>
+      <w:r>
+        <w:rPr>
+          <w:i/>
+          <w:iCs/>
+        </w:rPr>
+        <w:t>(optional)</w:t>
+      </w:r>
+      <w:r>
+        <w:t xml:space="preserve"> → Character(s) where text should be split into rows </w:t>
+      </w:r>
+    </w:p>
+    <w:p/>
+    <w:p/>
+    <w:p>
+      <w:r>
+        <w:sym w:font="Wingdings" w:char="F0E8"/>
+      </w:r>
+      <w:r>
+        <w:t xml:space="preserve"> </w:t>
+      </w:r>
+      <w:r>
+        <w:rPr>
+          <w:b/>
+          <w:bCs/>
+          <w:u w:val="single"/>
+        </w:rPr>
+        <w:t>RIGHT():</w:t>
+      </w:r>
+    </w:p>
+    <w:p>
+      <w:r>
+        <w:t xml:space="preserve">RIGHT() Excel function is used to extract characters from the </w:t>
+      </w:r>
+      <w:r>
+        <w:rPr>
+          <w:b/>
+          <w:bCs/>
+        </w:rPr>
+        <w:t>right side</w:t>
+      </w:r>
+      <w:r>
+        <w:t xml:space="preserve"> of a text string.</w:t>
+      </w:r>
+      <w:r>
+        <w:t xml:space="preserve"> (i.e. from the end of the text string)</w:t>
+      </w:r>
+    </w:p>
+    <w:tbl>
+      <w:tblPr>
+        <w:tblStyle w:val="TableGrid"/>
+        <w:tblW w:w="0" w:type="auto"/>
+        <w:tblLook w:val="04A0" w:firstRow="1" w:lastRow="0" w:firstColumn="1" w:lastColumn="0" w:noHBand="0" w:noVBand="1"/>
+      </w:tblPr>
+      <w:tblGrid>
+        <w:gridCol w:w="9016"/>
+      </w:tblGrid>
+      <w:tr>
+        <w:tc>
+          <w:tcPr>
+            <w:tcW w:w="9016" w:type="dxa"/>
+            <w:shd w:val="clear" w:color="auto" w:fill="E7E6E6" w:themeFill="background2"/>
+          </w:tcPr>
+          <w:p>
+            <w:r>
+              <w:t>=RIGHT(text, [num_chars])</w:t>
+            </w:r>
+          </w:p>
+        </w:tc>
+      </w:tr>
+    </w:tbl>
+    <w:p/>
+    <w:p>
+      <w:pPr>
+        <w:rPr>
+          <w:b/>
+          <w:bCs/>
+        </w:rPr>
+      </w:pPr>
+      <w:r>
+        <w:rPr>
+          <w:b/>
+          <w:bCs/>
+        </w:rPr>
+        <w:t>Parameters</w:t>
+      </w:r>
+    </w:p>
+    <w:p>
+      <w:pPr>
+        <w:numPr>
+          <w:ilvl w:val="0"/>
+          <w:numId w:val="15"/>
+        </w:numPr>
+      </w:pPr>
+      <w:r>
+        <w:rPr>
+          <w:b/>
+          <w:bCs/>
+        </w:rPr>
+        <w:t>text</w:t>
+      </w:r>
+      <w:r>
+        <w:t xml:space="preserve"> → The text or cell reference. </w:t>
+      </w:r>
+    </w:p>
+    <w:p>
+      <w:pPr>
+        <w:numPr>
+          <w:ilvl w:val="0"/>
+          <w:numId w:val="15"/>
+        </w:numPr>
+      </w:pPr>
+      <w:r>
+        <w:rPr>
+          <w:b/>
+          <w:bCs/>
+        </w:rPr>
+        <w:t>num_chars</w:t>
+      </w:r>
+      <w:r>
+        <w:t xml:space="preserve"> </w:t>
+      </w:r>
+      <w:r>
+        <w:rPr>
+          <w:i/>
+          <w:iCs/>
+        </w:rPr>
+        <w:t>(optional)</w:t>
+      </w:r>
+      <w:r>
+        <w:t xml:space="preserve"> → Number of characters to return from the right. Default is 1. </w:t>
+      </w:r>
+    </w:p>
+    <w:p/>
+    <w:p/>
+    <w:p>
+      <w:pPr>
+        <w:pBdr>
+          <w:top w:val="single" w:sz="4" w:space="1" w:color="auto"/>
+        </w:pBdr>
+      </w:pPr>
+      <w:r>
+        <w:rPr>
+          <w:b/>
+          <w:bCs/>
+          <w:color w:val="EE0000"/>
+          <w:u w:val="single"/>
+        </w:rPr>
+        <w:t>NOTE:</w:t>
+      </w:r>
+      <w:r>
+        <w:rPr>
+          <w:color w:val="EE0000"/>
+        </w:rPr>
+        <w:t xml:space="preserve"> </w:t>
+      </w:r>
+      <w:r>
+        <w:t>In Excel String Indexing starts from 1.</w:t>
+      </w:r>
+    </w:p>
+    <w:p>
+      <w:pPr>
+        <w:pBdr>
+          <w:top w:val="single" w:sz="4" w:space="1" w:color="auto"/>
+        </w:pBdr>
+      </w:pPr>
+    </w:p>
+    <w:p>
+      <w:pPr>
+        <w:pBdr>
+          <w:top w:val="single" w:sz="4" w:space="1" w:color="auto"/>
+        </w:pBdr>
+      </w:pPr>
+    </w:p>
+    <w:p>
+      <w:pPr>
+        <w:pBdr>
+          <w:top w:val="single" w:sz="4" w:space="1" w:color="auto"/>
+        </w:pBdr>
+      </w:pPr>
+      <w:r>
+        <w:lastRenderedPageBreak/>
+        <w:sym w:font="Wingdings" w:char="F0E8"/>
+      </w:r>
+      <w:r>
+        <w:t xml:space="preserve"> </w:t>
+      </w:r>
+      <w:r>
+        <w:rPr>
+          <w:b/>
+          <w:bCs/>
+          <w:u w:val="single"/>
+        </w:rPr>
+        <w:t>FIND():</w:t>
+      </w:r>
+    </w:p>
+    <w:p>
+      <w:pPr>
+        <w:pBdr>
+          <w:top w:val="single" w:sz="4" w:space="1" w:color="auto"/>
+        </w:pBdr>
+      </w:pPr>
+      <w:r>
+        <w:t>Finds the position of a character or text string within another text string.</w:t>
+      </w:r>
+    </w:p>
+    <w:tbl>
+      <w:tblPr>
+        <w:tblStyle w:val="TableGrid"/>
+        <w:tblW w:w="0" w:type="auto"/>
+        <w:tblLook w:val="04A0" w:firstRow="1" w:lastRow="0" w:firstColumn="1" w:lastColumn="0" w:noHBand="0" w:noVBand="1"/>
+      </w:tblPr>
+      <w:tblGrid>
+        <w:gridCol w:w="9016"/>
+      </w:tblGrid>
+      <w:tr>
+        <w:tc>
+          <w:tcPr>
+            <w:tcW w:w="9016" w:type="dxa"/>
+            <w:shd w:val="clear" w:color="auto" w:fill="E7E6E6" w:themeFill="background2"/>
+          </w:tcPr>
+          <w:p>
+            <w:r>
+              <w:t>=FIND(find_text, within_text, [start_num])</w:t>
+            </w:r>
+          </w:p>
+        </w:tc>
+      </w:tr>
+    </w:tbl>
+    <w:p>
+      <w:pPr>
+        <w:pBdr>
+          <w:top w:val="single" w:sz="4" w:space="1" w:color="auto"/>
+        </w:pBdr>
+      </w:pPr>
+    </w:p>
+    <w:p>
+      <w:pPr>
+        <w:pBdr>
+          <w:top w:val="single" w:sz="4" w:space="1" w:color="auto"/>
+        </w:pBdr>
+      </w:pPr>
+    </w:p>
+    <w:p>
+      <w:pPr>
+        <w:pBdr>
+          <w:top w:val="single" w:sz="4" w:space="1" w:color="auto"/>
+        </w:pBdr>
+      </w:pPr>
+      <w:r>
+        <w:sym w:font="Wingdings" w:char="F0E8"/>
+      </w:r>
+      <w:r>
+        <w:t xml:space="preserve"> </w:t>
+      </w:r>
+      <w:r>
+        <w:rPr>
+          <w:b/>
+          <w:bCs/>
+          <w:u w:val="single"/>
+        </w:rPr>
+        <w:t>LEN():</w:t>
+      </w:r>
+    </w:p>
+    <w:p>
+      <w:pPr>
+        <w:pBdr>
+          <w:top w:val="single" w:sz="4" w:space="1" w:color="auto"/>
+        </w:pBdr>
+      </w:pPr>
+      <w:r>
+        <w:t>Returns the number of characters in a text string, including spaces.</w:t>
+      </w:r>
+    </w:p>
+    <w:tbl>
+      <w:tblPr>
+        <w:tblStyle w:val="TableGrid"/>
+        <w:tblW w:w="0" w:type="auto"/>
+        <w:tblLook w:val="04A0" w:firstRow="1" w:lastRow="0" w:firstColumn="1" w:lastColumn="0" w:noHBand="0" w:noVBand="1"/>
+      </w:tblPr>
+      <w:tblGrid>
+        <w:gridCol w:w="9016"/>
+      </w:tblGrid>
+      <w:tr>
+        <w:tc>
+          <w:tcPr>
+            <w:tcW w:w="9016" w:type="dxa"/>
+            <w:shd w:val="clear" w:color="auto" w:fill="E7E6E6" w:themeFill="background2"/>
+          </w:tcPr>
+          <w:p>
+            <w:r>
+              <w:t>=LEN(text)</w:t>
+            </w:r>
+          </w:p>
+        </w:tc>
+      </w:tr>
+    </w:tbl>
+    <w:p>
+      <w:pPr>
+        <w:pBdr>
+          <w:top w:val="single" w:sz="4" w:space="1" w:color="auto"/>
+        </w:pBdr>
+      </w:pPr>
+    </w:p>
+    <w:p>
+      <w:pPr>
+        <w:pBdr>
+          <w:top w:val="single" w:sz="4" w:space="1" w:color="auto"/>
+        </w:pBdr>
+      </w:pPr>
+    </w:p>
+    <w:p>
+      <w:pPr>
+        <w:pBdr>
+          <w:top w:val="single" w:sz="4" w:space="1" w:color="auto"/>
+        </w:pBdr>
+      </w:pPr>
+      <w:r>
+        <w:sym w:font="Wingdings" w:char="F0E8"/>
+      </w:r>
+      <w:r>
+        <w:t xml:space="preserve"> </w:t>
+      </w:r>
+      <w:r>
+        <w:rPr>
+          <w:b/>
+          <w:bCs/>
+          <w:u w:val="single"/>
+        </w:rPr>
+        <w:t>MID():</w:t>
+      </w:r>
+    </w:p>
+    <w:p>
+      <w:pPr>
+        <w:pBdr>
+          <w:top w:val="single" w:sz="4" w:space="1" w:color="auto"/>
+        </w:pBdr>
+      </w:pPr>
+      <w:r>
+        <w:t>Extracts a specific number of characters from the middle of a text string.</w:t>
+      </w:r>
+    </w:p>
+    <w:tbl>
+      <w:tblPr>
+        <w:tblStyle w:val="TableGrid"/>
+        <w:tblW w:w="0" w:type="auto"/>
+        <w:tblLook w:val="04A0" w:firstRow="1" w:lastRow="0" w:firstColumn="1" w:lastColumn="0" w:noHBand="0" w:noVBand="1"/>
+      </w:tblPr>
+      <w:tblGrid>
+        <w:gridCol w:w="9016"/>
+      </w:tblGrid>
+      <w:tr>
+        <w:tc>
+          <w:tcPr>
+            <w:tcW w:w="9016" w:type="dxa"/>
+            <w:shd w:val="clear" w:color="auto" w:fill="E7E6E6" w:themeFill="background2"/>
+          </w:tcPr>
+          <w:p>
+            <w:r>
+              <w:t>=MID(text, start_num, num_chars)</w:t>
+            </w:r>
+          </w:p>
+        </w:tc>
+      </w:tr>
+    </w:tbl>
+    <w:p>
+      <w:pPr>
+        <w:pBdr>
+          <w:top w:val="single" w:sz="4" w:space="1" w:color="auto"/>
+        </w:pBdr>
+      </w:pPr>
+    </w:p>
+    <w:p>
+      <w:pPr>
+        <w:pBdr>
+          <w:top w:val="single" w:sz="4" w:space="1" w:color="auto"/>
+        </w:pBdr>
+      </w:pPr>
+      <w:r>
+        <w:t xml:space="preserve">Eg: </w:t>
+      </w:r>
+    </w:p>
+    <w:p>
+      <w:pPr>
+        <w:pBdr>
+          <w:top w:val="single" w:sz="4" w:space="1" w:color="auto"/>
+        </w:pBdr>
+      </w:pPr>
+      <w:r>
+        <w:t>=MID("Nazil Dhalwala",7,8)</w:t>
+      </w:r>
+    </w:p>
+    <w:p>
+      <w:pPr>
+        <w:pBdr>
+          <w:top w:val="single" w:sz="4" w:space="1" w:color="auto"/>
+        </w:pBdr>
+      </w:pPr>
+      <w:r>
+        <w:rPr>
+          <w:b/>
+          <w:bCs/>
+        </w:rPr>
+        <w:t>Result:</w:t>
+      </w:r>
+      <w:r>
+        <w:t xml:space="preserve"> Dhalwala</w:t>
+      </w:r>
+    </w:p>
+    <w:p>
+      <w:pPr>
+        <w:pBdr>
+          <w:top w:val="single" w:sz="4" w:space="1" w:color="auto"/>
+        </w:pBdr>
+      </w:pPr>
+    </w:p>
+    <w:p>
+      <w:pPr>
+        <w:spacing w:before="100" w:beforeAutospacing="1" w:after="100" w:afterAutospacing="1" w:line="240" w:lineRule="auto"/>
+        <w:rPr>
+          <w:rFonts w:eastAsia="Times New Roman" w:cs="Times New Roman"/>
+          <w:kern w:val="0"/>
+          <w:szCs w:val="24"/>
+          <w:lang w:eastAsia="en-IN" w:bidi="gu-IN"/>
+          <w14:ligatures w14:val="none"/>
+        </w:rPr>
+      </w:pPr>
+      <w:r>
+        <w:rPr>
+          <w:rFonts w:eastAsia="Times New Roman" w:cs="Times New Roman"/>
+          <w:kern w:val="0"/>
+          <w:szCs w:val="24"/>
+          <w:lang w:eastAsia="en-IN" w:bidi="gu-IN"/>
+          <w14:ligatures w14:val="none"/>
+        </w:rPr>
+        <w:t>Explanation:</w:t>
+      </w:r>
+    </w:p>
+    <w:p>
+      <w:pPr>
+        <w:numPr>
+          <w:ilvl w:val="0"/>
+          <w:numId w:val="16"/>
+        </w:numPr>
+        <w:spacing w:before="100" w:beforeAutospacing="1" w:after="100" w:afterAutospacing="1" w:line="240" w:lineRule="auto"/>
+        <w:rPr>
+          <w:rFonts w:eastAsia="Times New Roman" w:cs="Times New Roman"/>
+          <w:kern w:val="0"/>
+          <w:szCs w:val="24"/>
+          <w:lang w:eastAsia="en-IN" w:bidi="gu-IN"/>
+          <w14:ligatures w14:val="none"/>
+        </w:rPr>
+      </w:pPr>
+      <w:r>
+        <w:rPr>
+          <w:rFonts w:eastAsia="Times New Roman" w:cs="Times New Roman"/>
+          <w:kern w:val="0"/>
+          <w:szCs w:val="24"/>
+          <w:lang w:eastAsia="en-IN" w:bidi="gu-IN"/>
+          <w14:ligatures w14:val="none"/>
+        </w:rPr>
+        <w:t xml:space="preserve">Start from position 7 </w:t>
+      </w:r>
+    </w:p>
+    <w:p>
+      <w:pPr>
+        <w:numPr>
+          <w:ilvl w:val="0"/>
+          <w:numId w:val="16"/>
+        </w:numPr>
+        <w:spacing w:before="100" w:beforeAutospacing="1" w:after="100" w:afterAutospacing="1" w:line="240" w:lineRule="auto"/>
+        <w:rPr>
+          <w:rFonts w:eastAsia="Times New Roman" w:cs="Times New Roman"/>
+          <w:kern w:val="0"/>
+          <w:szCs w:val="24"/>
+          <w:lang w:eastAsia="en-IN" w:bidi="gu-IN"/>
+          <w14:ligatures w14:val="none"/>
+        </w:rPr>
+      </w:pPr>
+      <w:r>
+        <w:rPr>
+          <w:rFonts w:eastAsia="Times New Roman" w:cs="Times New Roman"/>
+          <w:kern w:val="0"/>
+          <w:szCs w:val="24"/>
+          <w:lang w:eastAsia="en-IN" w:bidi="gu-IN"/>
+          <w14:ligatures w14:val="none"/>
+        </w:rPr>
+        <w:t>Extract 8 characters</w:t>
+      </w:r>
+    </w:p>
+    <w:p/>
+    <w:p/>
+    <w:p>
+      <w:r>
+        <w:sym w:font="Wingdings" w:char="F0E8"/>
+      </w:r>
+      <w:r>
+        <w:t xml:space="preserve"> </w:t>
+      </w:r>
+      <w:r>
+        <w:rPr>
+          <w:b/>
+          <w:bCs/>
+          <w:u w:val="single"/>
+        </w:rPr>
+        <w:t>TRANSPOSE():</w:t>
+      </w:r>
+    </w:p>
+    <w:p>
+      <w:r>
+        <w:t xml:space="preserve">TRANSPOSE() in Excel is used to </w:t>
+      </w:r>
+      <w:r>
+        <w:rPr>
+          <w:b/>
+          <w:bCs/>
+        </w:rPr>
+        <w:t>change the orientation of a range of cells</w:t>
+      </w:r>
+      <w:r>
+        <w:t xml:space="preserve">—it converts </w:t>
+      </w:r>
+      <w:r>
+        <w:rPr>
+          <w:b/>
+          <w:bCs/>
+        </w:rPr>
+        <w:t>rows into columns</w:t>
+      </w:r>
+      <w:r>
+        <w:t xml:space="preserve"> or </w:t>
+      </w:r>
+      <w:r>
+        <w:rPr>
+          <w:b/>
+          <w:bCs/>
+        </w:rPr>
+        <w:t>columns into rows</w:t>
+      </w:r>
+      <w:r>
+        <w:t>.</w:t>
+      </w:r>
+    </w:p>
+    <w:tbl>
+      <w:tblPr>
+        <w:tblStyle w:val="TableGrid"/>
+        <w:tblW w:w="0" w:type="auto"/>
+        <w:tblLook w:val="04A0" w:firstRow="1" w:lastRow="0" w:firstColumn="1" w:lastColumn="0" w:noHBand="0" w:noVBand="1"/>
+      </w:tblPr>
+      <w:tblGrid>
+        <w:gridCol w:w="9016"/>
+      </w:tblGrid>
+      <w:tr>
+        <w:tc>
+          <w:tcPr>
+            <w:tcW w:w="9016" w:type="dxa"/>
+            <w:shd w:val="clear" w:color="auto" w:fill="E7E6E6" w:themeFill="background2"/>
+          </w:tcPr>
+          <w:p>
+            <w:r>
+              <w:t>=TRANSPOSE(array)</w:t>
+            </w:r>
+          </w:p>
+        </w:tc>
+      </w:tr>
+    </w:tbl>
+    <w:p/>
+    <w:p/>
+    <w:p>
+      <w:r>
+        <w:sym w:font="Wingdings" w:char="F0E8"/>
+      </w:r>
+      <w:r>
+        <w:rPr>
+          <w:b/>
+          <w:bCs/>
+          <w:u w:val="single"/>
+        </w:rPr>
+        <w:t>UNIQUE():</w:t>
+      </w:r>
+    </w:p>
+    <w:p>
+      <w:r>
+        <w:t xml:space="preserve">UNIQUE() in Excel returns </w:t>
+      </w:r>
+      <w:r>
+        <w:rPr>
+          <w:b/>
+          <w:bCs/>
+        </w:rPr>
+        <w:t>only the distinct (unique) values</w:t>
+      </w:r>
+      <w:r>
+        <w:t xml:space="preserve"> from a range or array by removing duplicates.</w:t>
+      </w:r>
+    </w:p>
+    <w:tbl>
+      <w:tblPr>
+        <w:tblStyle w:val="TableGrid"/>
+        <w:tblW w:w="0" w:type="auto"/>
+        <w:tblLook w:val="04A0" w:firstRow="1" w:lastRow="0" w:firstColumn="1" w:lastColumn="0" w:noHBand="0" w:noVBand="1"/>
+      </w:tblPr>
+      <w:tblGrid>
+        <w:gridCol w:w="9016"/>
+      </w:tblGrid>
+      <w:tr>
+        <w:tc>
+          <w:tcPr>
+            <w:tcW w:w="9016" w:type="dxa"/>
+            <w:shd w:val="clear" w:color="auto" w:fill="E7E6E6" w:themeFill="background2"/>
+          </w:tcPr>
+          <w:p>
+            <w:r>
+              <w:lastRenderedPageBreak/>
+              <w:t>=UNIQUE(array, [by_col], [exactly_once])</w:t>
+            </w:r>
+          </w:p>
+        </w:tc>
+      </w:tr>
+    </w:tbl>
+    <w:p/>
+    <w:p/>
+    <w:p>
+      <w:pPr>
+        <w:rPr>
+          <w:b/>
+          <w:bCs/>
+        </w:rPr>
+      </w:pPr>
+      <w:r>
+        <w:rPr>
+          <w:b/>
+          <w:bCs/>
+        </w:rPr>
+        <w:t>Arguments</w:t>
+      </w:r>
+    </w:p>
+    <w:p>
+      <w:pPr>
+        <w:numPr>
+          <w:ilvl w:val="0"/>
+          <w:numId w:val="17"/>
+        </w:numPr>
+      </w:pPr>
+      <w:r>
+        <w:rPr>
+          <w:b/>
+          <w:bCs/>
+        </w:rPr>
+        <w:t>array</w:t>
+      </w:r>
+      <w:r>
+        <w:t xml:space="preserve"> </w:t>
+      </w:r>
+      <w:r>
+        <w:rPr>
+          <w:i/>
+          <w:iCs/>
+        </w:rPr>
+        <w:t>(required)</w:t>
+      </w:r>
+      <w:r>
+        <w:t xml:space="preserve">: The range or array from which you want unique values. </w:t>
+      </w:r>
+    </w:p>
+    <w:p>
+      <w:pPr>
+        <w:numPr>
+          <w:ilvl w:val="0"/>
+          <w:numId w:val="17"/>
+        </w:numPr>
+      </w:pPr>
+      <w:r>
+        <w:rPr>
+          <w:b/>
+          <w:bCs/>
+        </w:rPr>
+        <w:t>by_col</w:t>
+      </w:r>
+      <w:r>
+        <w:t xml:space="preserve"> </w:t>
+      </w:r>
+      <w:r>
+        <w:rPr>
+          <w:i/>
+          <w:iCs/>
+        </w:rPr>
+        <w:t>(optional)</w:t>
+      </w:r>
+      <w:r>
+        <w:t xml:space="preserve">: </w:t>
+      </w:r>
+    </w:p>
+    <w:p>
+      <w:pPr>
+        <w:numPr>
+          <w:ilvl w:val="1"/>
+          <w:numId w:val="17"/>
+        </w:numPr>
+      </w:pPr>
+      <w:r>
+        <w:t xml:space="preserve">FALSE (default): Compare rows. </w:t>
+      </w:r>
+    </w:p>
+    <w:p>
+      <w:pPr>
+        <w:numPr>
+          <w:ilvl w:val="1"/>
+          <w:numId w:val="17"/>
+        </w:numPr>
+      </w:pPr>
+      <w:r>
+        <w:t xml:space="preserve">TRUE: Compare columns. </w:t>
+      </w:r>
+    </w:p>
+    <w:p>
+      <w:pPr>
+        <w:numPr>
+          <w:ilvl w:val="0"/>
+          <w:numId w:val="17"/>
+        </w:numPr>
+      </w:pPr>
+      <w:r>
+        <w:rPr>
+          <w:b/>
+          <w:bCs/>
+        </w:rPr>
+        <w:t>exactly_once</w:t>
+      </w:r>
+      <w:r>
+        <w:t xml:space="preserve"> </w:t>
+      </w:r>
+      <w:r>
+        <w:rPr>
+          <w:i/>
+          <w:iCs/>
+        </w:rPr>
+        <w:t>(optional)</w:t>
+      </w:r>
+      <w:r>
+        <w:t xml:space="preserve">: </w:t>
+      </w:r>
+    </w:p>
+    <w:p>
+      <w:pPr>
+        <w:numPr>
+          <w:ilvl w:val="1"/>
+          <w:numId w:val="17"/>
+        </w:numPr>
+      </w:pPr>
+      <w:r>
+        <w:t xml:space="preserve">FALSE (default): Returns all distinct values (each value appears once in the result). </w:t>
+      </w:r>
+    </w:p>
+    <w:p>
+      <w:pPr>
+        <w:numPr>
+          <w:ilvl w:val="1"/>
+          <w:numId w:val="17"/>
+        </w:numPr>
+      </w:pPr>
+      <w:r>
+        <w:t xml:space="preserve">TRUE: Returns only values that appear </w:t>
+      </w:r>
+      <w:r>
+        <w:rPr>
+          <w:b/>
+          <w:bCs/>
+        </w:rPr>
+        <w:t>exactly one time</w:t>
+      </w:r>
+      <w:r>
+        <w:t xml:space="preserve"> in the source data.</w:t>
+      </w:r>
+    </w:p>
     <w:p/>
     <w:sectPr>
       <w:pgSz w:w="11906" w:h="16838"/>
@@ -7139,6 +7383,304 @@
 <file path=word/numbering.xml><?xml version="1.0" encoding="utf-8"?>
 <w:numbering xmlns:wpc="http://schemas.microsoft.com/office/word/2010/wordprocessingCanvas" xmlns:cx="http://schemas.microsoft.com/office/drawing/2014/chartex" xmlns:cx1="http://schemas.microsoft.com/office/drawing/2015/9/8/chartex" xmlns:cx2="http://schemas.microsoft.com/office/drawing/2015/10/21/chartex" xmlns:cx3="http://schemas.microsoft.com/office/drawing/2016/5/9/chartex" xmlns:cx4="http://schemas.microsoft.com/office/drawing/2016/5/10/chartex" xmlns:cx5="http://schemas.microsoft.com/office/drawing/2016/5/11/chartex" xmlns:cx6="http://schemas.microsoft.com/office/drawing/2016/5/12/chartex" xmlns:cx7="http://schemas.microsoft.com/office/drawing/2016/5/13/chartex" xmlns:cx8="http://schemas.microsoft.com/office/drawing/2016/5/14/chartex" xmlns:mc="http://schemas.openxmlformats.org/markup-compatibility/2006" xmlns:aink="http://schemas.microsoft.com/office/drawing/2016/ink" xmlns:am3d="http://schemas.microsoft.com/office/drawing/2017/model3d" xmlns:o="urn:schemas-microsoft-com:office:office" xmlns:oel="http://schemas.microsoft.com/office/2019/extlst" xmlns:r="http://schemas.openxmlformats.org/officeDocument/2006/relationships" xmlns:m="http://schemas.openxmlformats.org/officeDocument/2006/math" xmlns:v="urn:schemas-microsoft-com:vml" xmlns:wp14="http://schemas.microsoft.com/office/word/2010/wordprocessingDrawing" xmlns:wp="http://schemas.openxmlformats.org/drawingml/2006/wordprocessingDrawing" xmlns:w10="urn:schemas-microsoft-com:office:word" xmlns:w="http://schemas.openxmlformats.org/wordprocessingml/2006/main" xmlns:w14="http://schemas.microsoft.com/office/word/2010/wordml" xmlns:w15="http://schemas.microsoft.com/office/word/2012/wordml" xmlns:w16cex="http://schemas.microsoft.com/office/word/2018/wordml/cex" xmlns:w16cid="http://schemas.microsoft.com/office/word/2016/wordml/cid" xmlns:w16="http://schemas.microsoft.com/office/word/2018/wordml" xmlns:w16du="http://schemas.microsoft.com/office/word/2023/wordml/word16du" xmlns:w16sdtdh="http://schemas.microsoft.com/office/word/2020/wordml/sdtdatahash" xmlns:w16sdtfl="http://schemas.microsoft.com/office/word/2024/wordml/sdtformatlock" xmlns:w16se="http://schemas.microsoft.com/office/word/2015/wordml/symex" xmlns:wpg="http://schemas.microsoft.com/office/word/2010/wordprocessingGroup" xmlns:wpi="http://schemas.microsoft.com/office/word/2010/wordprocessingInk" xmlns:wne="http://schemas.microsoft.com/office/word/2006/wordml" xmlns:wps="http://schemas.microsoft.com/office/word/2010/wordprocessingShape" mc:Ignorable="w14 w15 w16se w16cid w16 w16cex w16sdtdh w16sdtfl w16du wp14">
   <w:abstractNum w:abstractNumId="0" w15:restartNumberingAfterBreak="0">
+    <w:nsid w:val="02A479AD"/>
+    <w:multiLevelType w:val="multilevel"/>
+    <w:tmpl w:val="74044978"/>
+    <w:lvl w:ilvl="0">
+      <w:start w:val="1"/>
+      <w:numFmt w:val="bullet"/>
+      <w:lvlText w:val=""/>
+      <w:lvlJc w:val="left"/>
+      <w:pPr>
+        <w:tabs>
+          <w:tab w:val="num" w:pos="720"/>
+        </w:tabs>
+        <w:ind w:left="720" w:hanging="360"/>
+      </w:pPr>
+      <w:rPr>
+        <w:rFonts w:ascii="Symbol" w:hAnsi="Symbol" w:hint="default"/>
+        <w:sz w:val="20"/>
+      </w:rPr>
+    </w:lvl>
+    <w:lvl w:ilvl="1" w:tentative="1">
+      <w:start w:val="1"/>
+      <w:numFmt w:val="bullet"/>
+      <w:lvlText w:val="o"/>
+      <w:lvlJc w:val="left"/>
+      <w:pPr>
+        <w:tabs>
+          <w:tab w:val="num" w:pos="1440"/>
+        </w:tabs>
+        <w:ind w:left="1440" w:hanging="360"/>
+      </w:pPr>
+      <w:rPr>
+        <w:rFonts w:ascii="Courier New" w:hAnsi="Courier New" w:hint="default"/>
+        <w:sz w:val="20"/>
+      </w:rPr>
+    </w:lvl>
+    <w:lvl w:ilvl="2" w:tentative="1">
+      <w:start w:val="1"/>
+      <w:numFmt w:val="bullet"/>
+      <w:lvlText w:val=""/>
+      <w:lvlJc w:val="left"/>
+      <w:pPr>
+        <w:tabs>
+          <w:tab w:val="num" w:pos="2160"/>
+        </w:tabs>
+        <w:ind w:left="2160" w:hanging="360"/>
+      </w:pPr>
+      <w:rPr>
+        <w:rFonts w:ascii="Wingdings" w:hAnsi="Wingdings" w:hint="default"/>
+        <w:sz w:val="20"/>
+      </w:rPr>
+    </w:lvl>
+    <w:lvl w:ilvl="3" w:tentative="1">
+      <w:start w:val="1"/>
+      <w:numFmt w:val="bullet"/>
+      <w:lvlText w:val=""/>
+      <w:lvlJc w:val="left"/>
+      <w:pPr>
+        <w:tabs>
+          <w:tab w:val="num" w:pos="2880"/>
+        </w:tabs>
+        <w:ind w:left="2880" w:hanging="360"/>
+      </w:pPr>
+      <w:rPr>
+        <w:rFonts w:ascii="Wingdings" w:hAnsi="Wingdings" w:hint="default"/>
+        <w:sz w:val="20"/>
+      </w:rPr>
+    </w:lvl>
+    <w:lvl w:ilvl="4" w:tentative="1">
+      <w:start w:val="1"/>
+      <w:numFmt w:val="bullet"/>
+      <w:lvlText w:val=""/>
+      <w:lvlJc w:val="left"/>
+      <w:pPr>
+        <w:tabs>
+          <w:tab w:val="num" w:pos="3600"/>
+        </w:tabs>
+        <w:ind w:left="3600" w:hanging="360"/>
+      </w:pPr>
+      <w:rPr>
+        <w:rFonts w:ascii="Wingdings" w:hAnsi="Wingdings" w:hint="default"/>
+        <w:sz w:val="20"/>
+      </w:rPr>
+    </w:lvl>
+    <w:lvl w:ilvl="5" w:tentative="1">
+      <w:start w:val="1"/>
+      <w:numFmt w:val="bullet"/>
+      <w:lvlText w:val=""/>
+      <w:lvlJc w:val="left"/>
+      <w:pPr>
+        <w:tabs>
+          <w:tab w:val="num" w:pos="4320"/>
+        </w:tabs>
+        <w:ind w:left="4320" w:hanging="360"/>
+      </w:pPr>
+      <w:rPr>
+        <w:rFonts w:ascii="Wingdings" w:hAnsi="Wingdings" w:hint="default"/>
+        <w:sz w:val="20"/>
+      </w:rPr>
+    </w:lvl>
+    <w:lvl w:ilvl="6" w:tentative="1">
+      <w:start w:val="1"/>
+      <w:numFmt w:val="bullet"/>
+      <w:lvlText w:val=""/>
+      <w:lvlJc w:val="left"/>
+      <w:pPr>
+        <w:tabs>
+          <w:tab w:val="num" w:pos="5040"/>
+        </w:tabs>
+        <w:ind w:left="5040" w:hanging="360"/>
+      </w:pPr>
+      <w:rPr>
+        <w:rFonts w:ascii="Wingdings" w:hAnsi="Wingdings" w:hint="default"/>
+        <w:sz w:val="20"/>
+      </w:rPr>
+    </w:lvl>
+    <w:lvl w:ilvl="7" w:tentative="1">
+      <w:start w:val="1"/>
+      <w:numFmt w:val="bullet"/>
+      <w:lvlText w:val=""/>
+      <w:lvlJc w:val="left"/>
+      <w:pPr>
+        <w:tabs>
+          <w:tab w:val="num" w:pos="5760"/>
+        </w:tabs>
+        <w:ind w:left="5760" w:hanging="360"/>
+      </w:pPr>
+      <w:rPr>
+        <w:rFonts w:ascii="Wingdings" w:hAnsi="Wingdings" w:hint="default"/>
+        <w:sz w:val="20"/>
+      </w:rPr>
+    </w:lvl>
+    <w:lvl w:ilvl="8" w:tentative="1">
+      <w:start w:val="1"/>
+      <w:numFmt w:val="bullet"/>
+      <w:lvlText w:val=""/>
+      <w:lvlJc w:val="left"/>
+      <w:pPr>
+        <w:tabs>
+          <w:tab w:val="num" w:pos="6480"/>
+        </w:tabs>
+        <w:ind w:left="6480" w:hanging="360"/>
+      </w:pPr>
+      <w:rPr>
+        <w:rFonts w:ascii="Wingdings" w:hAnsi="Wingdings" w:hint="default"/>
+        <w:sz w:val="20"/>
+      </w:rPr>
+    </w:lvl>
+  </w:abstractNum>
+  <w:abstractNum w:abstractNumId="1" w15:restartNumberingAfterBreak="0">
+    <w:nsid w:val="09DD16A1"/>
+    <w:multiLevelType w:val="multilevel"/>
+    <w:tmpl w:val="A5D21C8C"/>
+    <w:lvl w:ilvl="0">
+      <w:start w:val="1"/>
+      <w:numFmt w:val="bullet"/>
+      <w:lvlText w:val=""/>
+      <w:lvlJc w:val="left"/>
+      <w:pPr>
+        <w:tabs>
+          <w:tab w:val="num" w:pos="720"/>
+        </w:tabs>
+        <w:ind w:left="720" w:hanging="360"/>
+      </w:pPr>
+      <w:rPr>
+        <w:rFonts w:ascii="Symbol" w:hAnsi="Symbol" w:hint="default"/>
+        <w:sz w:val="20"/>
+      </w:rPr>
+    </w:lvl>
+    <w:lvl w:ilvl="1">
+      <w:start w:val="1"/>
+      <w:numFmt w:val="bullet"/>
+      <w:lvlText w:val="o"/>
+      <w:lvlJc w:val="left"/>
+      <w:pPr>
+        <w:tabs>
+          <w:tab w:val="num" w:pos="1440"/>
+        </w:tabs>
+        <w:ind w:left="1440" w:hanging="360"/>
+      </w:pPr>
+      <w:rPr>
+        <w:rFonts w:ascii="Courier New" w:hAnsi="Courier New" w:hint="default"/>
+        <w:sz w:val="20"/>
+      </w:rPr>
+    </w:lvl>
+    <w:lvl w:ilvl="2" w:tentative="1">
+      <w:start w:val="1"/>
+      <w:numFmt w:val="bullet"/>
+      <w:lvlText w:val=""/>
+      <w:lvlJc w:val="left"/>
+      <w:pPr>
+        <w:tabs>
+          <w:tab w:val="num" w:pos="2160"/>
+        </w:tabs>
+        <w:ind w:left="2160" w:hanging="360"/>
+      </w:pPr>
+      <w:rPr>
+        <w:rFonts w:ascii="Wingdings" w:hAnsi="Wingdings" w:hint="default"/>
+        <w:sz w:val="20"/>
+      </w:rPr>
+    </w:lvl>
+    <w:lvl w:ilvl="3" w:tentative="1">
+      <w:start w:val="1"/>
+      <w:numFmt w:val="bullet"/>
+      <w:lvlText w:val=""/>
+      <w:lvlJc w:val="left"/>
+      <w:pPr>
+        <w:tabs>
+          <w:tab w:val="num" w:pos="2880"/>
+        </w:tabs>
+        <w:ind w:left="2880" w:hanging="360"/>
+      </w:pPr>
+      <w:rPr>
+        <w:rFonts w:ascii="Wingdings" w:hAnsi="Wingdings" w:hint="default"/>
+        <w:sz w:val="20"/>
+      </w:rPr>
+    </w:lvl>
+    <w:lvl w:ilvl="4" w:tentative="1">
+      <w:start w:val="1"/>
+      <w:numFmt w:val="bullet"/>
+      <w:lvlText w:val=""/>
+      <w:lvlJc w:val="left"/>
+      <w:pPr>
+        <w:tabs>
+          <w:tab w:val="num" w:pos="3600"/>
+        </w:tabs>
+        <w:ind w:left="3600" w:hanging="360"/>
+      </w:pPr>
+      <w:rPr>
+        <w:rFonts w:ascii="Wingdings" w:hAnsi="Wingdings" w:hint="default"/>
+        <w:sz w:val="20"/>
+      </w:rPr>
+    </w:lvl>
+    <w:lvl w:ilvl="5" w:tentative="1">
+      <w:start w:val="1"/>
+      <w:numFmt w:val="bullet"/>
+      <w:lvlText w:val=""/>
+      <w:lvlJc w:val="left"/>
+      <w:pPr>
+        <w:tabs>
+          <w:tab w:val="num" w:pos="4320"/>
+        </w:tabs>
+        <w:ind w:left="4320" w:hanging="360"/>
+      </w:pPr>
+      <w:rPr>
+        <w:rFonts w:ascii="Wingdings" w:hAnsi="Wingdings" w:hint="default"/>
+        <w:sz w:val="20"/>
+      </w:rPr>
+    </w:lvl>
+    <w:lvl w:ilvl="6" w:tentative="1">
+      <w:start w:val="1"/>
+      <w:numFmt w:val="bullet"/>
+      <w:lvlText w:val=""/>
+      <w:lvlJc w:val="left"/>
+      <w:pPr>
+        <w:tabs>
+          <w:tab w:val="num" w:pos="5040"/>
+        </w:tabs>
+        <w:ind w:left="5040" w:hanging="360"/>
+      </w:pPr>
+      <w:rPr>
+        <w:rFonts w:ascii="Wingdings" w:hAnsi="Wingdings" w:hint="default"/>
+        <w:sz w:val="20"/>
+      </w:rPr>
+    </w:lvl>
+    <w:lvl w:ilvl="7" w:tentative="1">
+      <w:start w:val="1"/>
+      <w:numFmt w:val="bullet"/>
+      <w:lvlText w:val=""/>
+      <w:lvlJc w:val="left"/>
+      <w:pPr>
+        <w:tabs>
+          <w:tab w:val="num" w:pos="5760"/>
+        </w:tabs>
+        <w:ind w:left="5760" w:hanging="360"/>
+      </w:pPr>
+      <w:rPr>
+        <w:rFonts w:ascii="Wingdings" w:hAnsi="Wingdings" w:hint="default"/>
+        <w:sz w:val="20"/>
+      </w:rPr>
+    </w:lvl>
+    <w:lvl w:ilvl="8" w:tentative="1">
+      <w:start w:val="1"/>
+      <w:numFmt w:val="bullet"/>
+      <w:lvlText w:val=""/>
+      <w:lvlJc w:val="left"/>
+      <w:pPr>
+        <w:tabs>
+          <w:tab w:val="num" w:pos="6480"/>
+        </w:tabs>
+        <w:ind w:left="6480" w:hanging="360"/>
+      </w:pPr>
+      <w:rPr>
+        <w:rFonts w:ascii="Wingdings" w:hAnsi="Wingdings" w:hint="default"/>
+        <w:sz w:val="20"/>
+      </w:rPr>
+    </w:lvl>
+  </w:abstractNum>
+  <w:abstractNum w:abstractNumId="2" w15:restartNumberingAfterBreak="0">
     <w:nsid w:val="0BF97D9F"/>
     <w:multiLevelType w:val="multilevel"/>
     <w:tmpl w:val="3C18BA1A"/>
@@ -7287,7 +7829,156 @@
       </w:rPr>
     </w:lvl>
   </w:abstractNum>
-  <w:abstractNum w:abstractNumId="1" w15:restartNumberingAfterBreak="0">
+  <w:abstractNum w:abstractNumId="3" w15:restartNumberingAfterBreak="0">
+    <w:nsid w:val="0D441685"/>
+    <w:multiLevelType w:val="multilevel"/>
+    <w:tmpl w:val="51D6F06A"/>
+    <w:lvl w:ilvl="0">
+      <w:start w:val="1"/>
+      <w:numFmt w:val="bullet"/>
+      <w:lvlText w:val=""/>
+      <w:lvlJc w:val="left"/>
+      <w:pPr>
+        <w:tabs>
+          <w:tab w:val="num" w:pos="720"/>
+        </w:tabs>
+        <w:ind w:left="720" w:hanging="360"/>
+      </w:pPr>
+      <w:rPr>
+        <w:rFonts w:ascii="Symbol" w:hAnsi="Symbol" w:hint="default"/>
+        <w:sz w:val="20"/>
+      </w:rPr>
+    </w:lvl>
+    <w:lvl w:ilvl="1" w:tentative="1">
+      <w:start w:val="1"/>
+      <w:numFmt w:val="bullet"/>
+      <w:lvlText w:val="o"/>
+      <w:lvlJc w:val="left"/>
+      <w:pPr>
+        <w:tabs>
+          <w:tab w:val="num" w:pos="1440"/>
+        </w:tabs>
+        <w:ind w:left="1440" w:hanging="360"/>
+      </w:pPr>
+      <w:rPr>
+        <w:rFonts w:ascii="Courier New" w:hAnsi="Courier New" w:hint="default"/>
+        <w:sz w:val="20"/>
+      </w:rPr>
+    </w:lvl>
+    <w:lvl w:ilvl="2" w:tentative="1">
+      <w:start w:val="1"/>
+      <w:numFmt w:val="bullet"/>
+      <w:lvlText w:val=""/>
+      <w:lvlJc w:val="left"/>
+      <w:pPr>
+        <w:tabs>
+          <w:tab w:val="num" w:pos="2160"/>
+        </w:tabs>
+        <w:ind w:left="2160" w:hanging="360"/>
+      </w:pPr>
+      <w:rPr>
+        <w:rFonts w:ascii="Wingdings" w:hAnsi="Wingdings" w:hint="default"/>
+        <w:sz w:val="20"/>
+      </w:rPr>
+    </w:lvl>
+    <w:lvl w:ilvl="3" w:tentative="1">
+      <w:start w:val="1"/>
+      <w:numFmt w:val="bullet"/>
+      <w:lvlText w:val=""/>
+      <w:lvlJc w:val="left"/>
+      <w:pPr>
+        <w:tabs>
+          <w:tab w:val="num" w:pos="2880"/>
+        </w:tabs>
+        <w:ind w:left="2880" w:hanging="360"/>
+      </w:pPr>
+      <w:rPr>
+        <w:rFonts w:ascii="Wingdings" w:hAnsi="Wingdings" w:hint="default"/>
+        <w:sz w:val="20"/>
+      </w:rPr>
+    </w:lvl>
+    <w:lvl w:ilvl="4" w:tentative="1">
+      <w:start w:val="1"/>
+      <w:numFmt w:val="bullet"/>
+      <w:lvlText w:val=""/>
+      <w:lvlJc w:val="left"/>
+      <w:pPr>
+        <w:tabs>
+          <w:tab w:val="num" w:pos="3600"/>
+        </w:tabs>
+        <w:ind w:left="3600" w:hanging="360"/>
+      </w:pPr>
+      <w:rPr>
+        <w:rFonts w:ascii="Wingdings" w:hAnsi="Wingdings" w:hint="default"/>
+        <w:sz w:val="20"/>
+      </w:rPr>
+    </w:lvl>
+    <w:lvl w:ilvl="5" w:tentative="1">
+      <w:start w:val="1"/>
+      <w:numFmt w:val="bullet"/>
+      <w:lvlText w:val=""/>
+      <w:lvlJc w:val="left"/>
+      <w:pPr>
+        <w:tabs>
+          <w:tab w:val="num" w:pos="4320"/>
+        </w:tabs>
+        <w:ind w:left="4320" w:hanging="360"/>
+      </w:pPr>
+      <w:rPr>
+        <w:rFonts w:ascii="Wingdings" w:hAnsi="Wingdings" w:hint="default"/>
+        <w:sz w:val="20"/>
+      </w:rPr>
+    </w:lvl>
+    <w:lvl w:ilvl="6" w:tentative="1">
+      <w:start w:val="1"/>
+      <w:numFmt w:val="bullet"/>
+      <w:lvlText w:val=""/>
+      <w:lvlJc w:val="left"/>
+      <w:pPr>
+        <w:tabs>
+          <w:tab w:val="num" w:pos="5040"/>
+        </w:tabs>
+        <w:ind w:left="5040" w:hanging="360"/>
+      </w:pPr>
+      <w:rPr>
+        <w:rFonts w:ascii="Wingdings" w:hAnsi="Wingdings" w:hint="default"/>
+        <w:sz w:val="20"/>
+      </w:rPr>
+    </w:lvl>
+    <w:lvl w:ilvl="7" w:tentative="1">
+      <w:start w:val="1"/>
+      <w:numFmt w:val="bullet"/>
+      <w:lvlText w:val=""/>
+      <w:lvlJc w:val="left"/>
+      <w:pPr>
+        <w:tabs>
+          <w:tab w:val="num" w:pos="5760"/>
+        </w:tabs>
+        <w:ind w:left="5760" w:hanging="360"/>
+      </w:pPr>
+      <w:rPr>
+        <w:rFonts w:ascii="Wingdings" w:hAnsi="Wingdings" w:hint="default"/>
+        <w:sz w:val="20"/>
+      </w:rPr>
+    </w:lvl>
+    <w:lvl w:ilvl="8" w:tentative="1">
+      <w:start w:val="1"/>
+      <w:numFmt w:val="bullet"/>
+      <w:lvlText w:val=""/>
+      <w:lvlJc w:val="left"/>
+      <w:pPr>
+        <w:tabs>
+          <w:tab w:val="num" w:pos="6480"/>
+        </w:tabs>
+        <w:ind w:left="6480" w:hanging="360"/>
+      </w:pPr>
+      <w:rPr>
+        <w:rFonts w:ascii="Wingdings" w:hAnsi="Wingdings" w:hint="default"/>
+        <w:sz w:val="20"/>
+      </w:rPr>
+    </w:lvl>
+  </w:abstractNum>
+  <w:abstractNum w:abstractNumId="4" w15:restartNumberingAfterBreak="0">
     <w:nsid w:val="0EEF14A2"/>
     <w:multiLevelType w:val="hybridMultilevel"/>
     <w:tmpl w:val="87204A02"/>
@@ -7400,7 +8091,7 @@
       </w:rPr>
     </w:lvl>
   </w:abstractNum>
-  <w:abstractNum w:abstractNumId="2" w15:restartNumberingAfterBreak="0">
+  <w:abstractNum w:abstractNumId="5" w15:restartNumberingAfterBreak="0">
     <w:nsid w:val="159405F6"/>
     <w:multiLevelType w:val="hybridMultilevel"/>
     <w:tmpl w:val="EDF44402"/>
@@ -7489,7 +8180,7 @@
       </w:pPr>
     </w:lvl>
   </w:abstractNum>
-  <w:abstractNum w:abstractNumId="3" w15:restartNumberingAfterBreak="0">
+  <w:abstractNum w:abstractNumId="6" w15:restartNumberingAfterBreak="0">
     <w:nsid w:val="1FFF3DEA"/>
     <w:multiLevelType w:val="hybridMultilevel"/>
     <w:tmpl w:val="FFE222E8"/>
@@ -7602,7 +8293,7 @@
       </w:rPr>
     </w:lvl>
   </w:abstractNum>
-  <w:abstractNum w:abstractNumId="4" w15:restartNumberingAfterBreak="0">
+  <w:abstractNum w:abstractNumId="7" w15:restartNumberingAfterBreak="0">
     <w:nsid w:val="2C7F4519"/>
     <w:multiLevelType w:val="hybridMultilevel"/>
     <w:tmpl w:val="489E457C"/>
@@ -7715,7 +8406,7 @@
       </w:rPr>
     </w:lvl>
   </w:abstractNum>
-  <w:abstractNum w:abstractNumId="5" w15:restartNumberingAfterBreak="0">
+  <w:abstractNum w:abstractNumId="8" w15:restartNumberingAfterBreak="0">
     <w:nsid w:val="395705E0"/>
     <w:multiLevelType w:val="multilevel"/>
     <w:tmpl w:val="13343864"/>
@@ -7864,7 +8555,7 @@
       </w:rPr>
     </w:lvl>
   </w:abstractNum>
-  <w:abstractNum w:abstractNumId="6" w15:restartNumberingAfterBreak="0">
+  <w:abstractNum w:abstractNumId="9" w15:restartNumberingAfterBreak="0">
     <w:nsid w:val="43514108"/>
     <w:multiLevelType w:val="multilevel"/>
     <w:tmpl w:val="0EBEFDA2"/>
@@ -7977,7 +8668,7 @@
       </w:rPr>
     </w:lvl>
   </w:abstractNum>
-  <w:abstractNum w:abstractNumId="7" w15:restartNumberingAfterBreak="0">
+  <w:abstractNum w:abstractNumId="10" w15:restartNumberingAfterBreak="0">
     <w:nsid w:val="44DA19B7"/>
     <w:multiLevelType w:val="hybridMultilevel"/>
     <w:tmpl w:val="6EA062E2"/>
@@ -8090,7 +8781,7 @@
       </w:rPr>
     </w:lvl>
   </w:abstractNum>
-  <w:abstractNum w:abstractNumId="8" w15:restartNumberingAfterBreak="0">
+  <w:abstractNum w:abstractNumId="11" w15:restartNumberingAfterBreak="0">
     <w:nsid w:val="454827C2"/>
     <w:multiLevelType w:val="hybridMultilevel"/>
     <w:tmpl w:val="51ACCA48"/>
@@ -8203,7 +8894,7 @@
       </w:rPr>
     </w:lvl>
   </w:abstractNum>
-  <w:abstractNum w:abstractNumId="9" w15:restartNumberingAfterBreak="0">
+  <w:abstractNum w:abstractNumId="12" w15:restartNumberingAfterBreak="0">
     <w:nsid w:val="45953846"/>
     <w:multiLevelType w:val="hybridMultilevel"/>
     <w:tmpl w:val="0CF8C256"/>
@@ -8316,7 +9007,156 @@
       </w:rPr>
     </w:lvl>
   </w:abstractNum>
-  <w:abstractNum w:abstractNumId="10" w15:restartNumberingAfterBreak="0">
+  <w:abstractNum w:abstractNumId="13" w15:restartNumberingAfterBreak="0">
+    <w:nsid w:val="487866AD"/>
+    <w:multiLevelType w:val="multilevel"/>
+    <w:tmpl w:val="B3463C32"/>
+    <w:lvl w:ilvl="0">
+      <w:start w:val="1"/>
+      <w:numFmt w:val="bullet"/>
+      <w:lvlText w:val=""/>
+      <w:lvlJc w:val="left"/>
+      <w:pPr>
+        <w:tabs>
+          <w:tab w:val="num" w:pos="720"/>
+        </w:tabs>
+        <w:ind w:left="720" w:hanging="360"/>
+      </w:pPr>
+      <w:rPr>
+        <w:rFonts w:ascii="Symbol" w:hAnsi="Symbol" w:hint="default"/>
+        <w:sz w:val="20"/>
+      </w:rPr>
+    </w:lvl>
+    <w:lvl w:ilvl="1" w:tentative="1">
+      <w:start w:val="1"/>
+      <w:numFmt w:val="bullet"/>
+      <w:lvlText w:val="o"/>
+      <w:lvlJc w:val="left"/>
+      <w:pPr>
+        <w:tabs>
+          <w:tab w:val="num" w:pos="1440"/>
+        </w:tabs>
+        <w:ind w:left="1440" w:hanging="360"/>
+      </w:pPr>
+      <w:rPr>
+        <w:rFonts w:ascii="Courier New" w:hAnsi="Courier New" w:hint="default"/>
+        <w:sz w:val="20"/>
+      </w:rPr>
+    </w:lvl>
+    <w:lvl w:ilvl="2" w:tentative="1">
+      <w:start w:val="1"/>
+      <w:numFmt w:val="bullet"/>
+      <w:lvlText w:val=""/>
+      <w:lvlJc w:val="left"/>
+      <w:pPr>
+        <w:tabs>
+          <w:tab w:val="num" w:pos="2160"/>
+        </w:tabs>
+        <w:ind w:left="2160" w:hanging="360"/>
+      </w:pPr>
+      <w:rPr>
+        <w:rFonts w:ascii="Wingdings" w:hAnsi="Wingdings" w:hint="default"/>
+        <w:sz w:val="20"/>
+      </w:rPr>
+    </w:lvl>
+    <w:lvl w:ilvl="3" w:tentative="1">
+      <w:start w:val="1"/>
+      <w:numFmt w:val="bullet"/>
+      <w:lvlText w:val=""/>
+      <w:lvlJc w:val="left"/>
+      <w:pPr>
+        <w:tabs>
+          <w:tab w:val="num" w:pos="2880"/>
+        </w:tabs>
+        <w:ind w:left="2880" w:hanging="360"/>
+      </w:pPr>
+      <w:rPr>
+        <w:rFonts w:ascii="Wingdings" w:hAnsi="Wingdings" w:hint="default"/>
+        <w:sz w:val="20"/>
+      </w:rPr>
+    </w:lvl>
+    <w:lvl w:ilvl="4" w:tentative="1">
+      <w:start w:val="1"/>
+      <w:numFmt w:val="bullet"/>
+      <w:lvlText w:val=""/>
+      <w:lvlJc w:val="left"/>
+      <w:pPr>
+        <w:tabs>
+          <w:tab w:val="num" w:pos="3600"/>
+        </w:tabs>
+        <w:ind w:left="3600" w:hanging="360"/>
+      </w:pPr>
+      <w:rPr>
+        <w:rFonts w:ascii="Wingdings" w:hAnsi="Wingdings" w:hint="default"/>
+        <w:sz w:val="20"/>
+      </w:rPr>
+    </w:lvl>
+    <w:lvl w:ilvl="5" w:tentative="1">
+      <w:start w:val="1"/>
+      <w:numFmt w:val="bullet"/>
+      <w:lvlText w:val=""/>
+      <w:lvlJc w:val="left"/>
+      <w:pPr>
+        <w:tabs>
+          <w:tab w:val="num" w:pos="4320"/>
+        </w:tabs>
+        <w:ind w:left="4320" w:hanging="360"/>
+      </w:pPr>
+      <w:rPr>
+        <w:rFonts w:ascii="Wingdings" w:hAnsi="Wingdings" w:hint="default"/>
+        <w:sz w:val="20"/>
+      </w:rPr>
+    </w:lvl>
+    <w:lvl w:ilvl="6" w:tentative="1">
+      <w:start w:val="1"/>
+      <w:numFmt w:val="bullet"/>
+      <w:lvlText w:val=""/>
+      <w:lvlJc w:val="left"/>
+      <w:pPr>
+        <w:tabs>
+          <w:tab w:val="num" w:pos="5040"/>
+        </w:tabs>
+        <w:ind w:left="5040" w:hanging="360"/>
+      </w:pPr>
+      <w:rPr>
+        <w:rFonts w:ascii="Wingdings" w:hAnsi="Wingdings" w:hint="default"/>
+        <w:sz w:val="20"/>
+      </w:rPr>
+    </w:lvl>
+    <w:lvl w:ilvl="7" w:tentative="1">
+      <w:start w:val="1"/>
+      <w:numFmt w:val="bullet"/>
+      <w:lvlText w:val=""/>
+      <w:lvlJc w:val="left"/>
+      <w:pPr>
+        <w:tabs>
+          <w:tab w:val="num" w:pos="5760"/>
+        </w:tabs>
+        <w:ind w:left="5760" w:hanging="360"/>
+      </w:pPr>
+      <w:rPr>
+        <w:rFonts w:ascii="Wingdings" w:hAnsi="Wingdings" w:hint="default"/>
+        <w:sz w:val="20"/>
+      </w:rPr>
+    </w:lvl>
+    <w:lvl w:ilvl="8" w:tentative="1">
+      <w:start w:val="1"/>
+      <w:numFmt w:val="bullet"/>
+      <w:lvlText w:val=""/>
+      <w:lvlJc w:val="left"/>
+      <w:pPr>
+        <w:tabs>
+          <w:tab w:val="num" w:pos="6480"/>
+        </w:tabs>
+        <w:ind w:left="6480" w:hanging="360"/>
+      </w:pPr>
+      <w:rPr>
+        <w:rFonts w:ascii="Wingdings" w:hAnsi="Wingdings" w:hint="default"/>
+        <w:sz w:val="20"/>
+      </w:rPr>
+    </w:lvl>
+  </w:abstractNum>
+  <w:abstractNum w:abstractNumId="14" w15:restartNumberingAfterBreak="0">
     <w:nsid w:val="60C24978"/>
     <w:multiLevelType w:val="hybridMultilevel"/>
     <w:tmpl w:val="2BB4F0BE"/>
@@ -8429,7 +9269,7 @@
       </w:rPr>
     </w:lvl>
   </w:abstractNum>
-  <w:abstractNum w:abstractNumId="11" w15:restartNumberingAfterBreak="0">
+  <w:abstractNum w:abstractNumId="15" w15:restartNumberingAfterBreak="0">
     <w:nsid w:val="68C75728"/>
     <w:multiLevelType w:val="hybridMultilevel"/>
     <w:tmpl w:val="D646FC02"/>
@@ -8542,7 +9382,7 @@
       </w:rPr>
     </w:lvl>
   </w:abstractNum>
-  <w:abstractNum w:abstractNumId="12" w15:restartNumberingAfterBreak="0">
+  <w:abstractNum w:abstractNumId="16" w15:restartNumberingAfterBreak="0">
     <w:nsid w:val="6D7C70CF"/>
     <w:multiLevelType w:val="hybridMultilevel"/>
     <w:tmpl w:val="293AEE34"/>
@@ -8656,43 +9496,55 @@
     </w:lvl>
   </w:abstractNum>
   <w:num w:numId="1" w16cid:durableId="1708988502">
+    <w:abstractNumId w:val="9"/>
+  </w:num>
+  <w:num w:numId="2" w16cid:durableId="406732299">
+    <w:abstractNumId w:val="16"/>
+  </w:num>
+  <w:num w:numId="3" w16cid:durableId="2119064549">
     <w:abstractNumId w:val="6"/>
   </w:num>
-  <w:num w:numId="2" w16cid:durableId="406732299">
+  <w:num w:numId="4" w16cid:durableId="755633525">
+    <w:abstractNumId w:val="5"/>
+  </w:num>
+  <w:num w:numId="5" w16cid:durableId="1896887061">
+    <w:abstractNumId w:val="11"/>
+  </w:num>
+  <w:num w:numId="6" w16cid:durableId="922252310">
     <w:abstractNumId w:val="12"/>
   </w:num>
-  <w:num w:numId="3" w16cid:durableId="2119064549">
+  <w:num w:numId="7" w16cid:durableId="1520200842">
+    <w:abstractNumId w:val="7"/>
+  </w:num>
+  <w:num w:numId="8" w16cid:durableId="126626962">
+    <w:abstractNumId w:val="4"/>
+  </w:num>
+  <w:num w:numId="9" w16cid:durableId="1970554200">
+    <w:abstractNumId w:val="14"/>
+  </w:num>
+  <w:num w:numId="10" w16cid:durableId="1727727092">
+    <w:abstractNumId w:val="10"/>
+  </w:num>
+  <w:num w:numId="11" w16cid:durableId="605574767">
+    <w:abstractNumId w:val="15"/>
+  </w:num>
+  <w:num w:numId="12" w16cid:durableId="201789521">
+    <w:abstractNumId w:val="2"/>
+  </w:num>
+  <w:num w:numId="13" w16cid:durableId="1645040096">
+    <w:abstractNumId w:val="8"/>
+  </w:num>
+  <w:num w:numId="14" w16cid:durableId="1782871077">
     <w:abstractNumId w:val="3"/>
   </w:num>
-  <w:num w:numId="4" w16cid:durableId="755633525">
-    <w:abstractNumId w:val="2"/>
-  </w:num>
-  <w:num w:numId="5" w16cid:durableId="1896887061">
-    <w:abstractNumId w:val="8"/>
-  </w:num>
-  <w:num w:numId="6" w16cid:durableId="922252310">
-    <w:abstractNumId w:val="9"/>
-  </w:num>
-  <w:num w:numId="7" w16cid:durableId="1520200842">
-    <w:abstractNumId w:val="4"/>
-  </w:num>
-  <w:num w:numId="8" w16cid:durableId="126626962">
-    <w:abstractNumId w:val="1"/>
-  </w:num>
-  <w:num w:numId="9" w16cid:durableId="1970554200">
-    <w:abstractNumId w:val="10"/>
-  </w:num>
-  <w:num w:numId="10" w16cid:durableId="1727727092">
-    <w:abstractNumId w:val="7"/>
-  </w:num>
-  <w:num w:numId="11" w16cid:durableId="605574767">
-    <w:abstractNumId w:val="11"/>
-  </w:num>
-  <w:num w:numId="12" w16cid:durableId="201789521">
+  <w:num w:numId="15" w16cid:durableId="1805804000">
     <w:abstractNumId w:val="0"/>
   </w:num>
-  <w:num w:numId="13" w16cid:durableId="1645040096">
-    <w:abstractNumId w:val="5"/>
+  <w:num w:numId="16" w16cid:durableId="1372730377">
+    <w:abstractNumId w:val="13"/>
+  </w:num>
+  <w:num w:numId="17" w16cid:durableId="1235312651">
+    <w:abstractNumId w:val="1"/>
   </w:num>
 </w:numbering>
 </file>

</xml_diff>

<commit_message>
2.9 Date & Time Functions Completed
</commit_message>
<xml_diff>
--- a/Notes.docx
+++ b/Notes.docx
@@ -1561,7 +1561,15 @@
           <w:bdr w:val="single" w:sz="4" w:space="0" w:color="auto"/>
           <w:lang w:val="en-US"/>
         </w:rPr>
-        <w:t>= A1&amp;</w:t>
+        <w:t>= A1</w:t>
+      </w:r>
+      <w:proofErr w:type="gramStart"/>
+      <w:r>
+        <w:rPr>
+          <w:bdr w:val="single" w:sz="4" w:space="0" w:color="auto"/>
+          <w:lang w:val="en-US"/>
+        </w:rPr>
+        <w:t>&amp;</w:t>
       </w:r>
       <w:r>
         <w:rPr>
@@ -1576,7 +1584,15 @@
           <w:bdr w:val="single" w:sz="4" w:space="0" w:color="auto"/>
           <w:lang w:val="en-US"/>
         </w:rPr>
-        <w:t>&amp;E1</w:t>
+        <w:t>&amp;</w:t>
+      </w:r>
+      <w:proofErr w:type="gramEnd"/>
+      <w:r>
+        <w:rPr>
+          <w:bdr w:val="single" w:sz="4" w:space="0" w:color="auto"/>
+          <w:lang w:val="en-US"/>
+        </w:rPr>
+        <w:t>E1</w:t>
       </w:r>
       <w:r>
         <w:rPr>
@@ -1594,7 +1610,21 @@
         <w:rPr>
           <w:lang w:val="en-US"/>
         </w:rPr>
-        <w:t xml:space="preserve"> This Will Add Hypen (-) between data of A1 and E1 cells</w:t>
+        <w:t xml:space="preserve"> This Will Add </w:t>
+      </w:r>
+      <w:proofErr w:type="spellStart"/>
+      <w:r>
+        <w:rPr>
+          <w:lang w:val="en-US"/>
+        </w:rPr>
+        <w:t>Hypen</w:t>
+      </w:r>
+      <w:proofErr w:type="spellEnd"/>
+      <w:r>
+        <w:rPr>
+          <w:lang w:val="en-US"/>
+        </w:rPr>
+        <w:t xml:space="preserve"> (-) between data of A1 and E1 cells</w:t>
       </w:r>
       <w:r>
         <w:rPr>
@@ -1607,13 +1637,21 @@
           <w:color w:val="4472C4" w:themeColor="accent1"/>
           <w:lang w:val="en-US"/>
         </w:rPr>
-        <w:t xml:space="preserve">(Quotes are </w:t>
-      </w:r>
+        <w:t xml:space="preserve">(Quotes </w:t>
+      </w:r>
+      <w:proofErr w:type="gramStart"/>
       <w:r>
         <w:rPr>
           <w:color w:val="4472C4" w:themeColor="accent1"/>
           <w:lang w:val="en-US"/>
         </w:rPr>
+        <w:t xml:space="preserve">are </w:t>
+      </w:r>
+      <w:r>
+        <w:rPr>
+          <w:color w:val="4472C4" w:themeColor="accent1"/>
+          <w:lang w:val="en-US"/>
+        </w:rPr>
         <w:t xml:space="preserve"> </w:t>
       </w:r>
       <w:r>
@@ -1621,7 +1659,15 @@
           <w:color w:val="4472C4" w:themeColor="accent1"/>
           <w:lang w:val="en-US"/>
         </w:rPr>
-        <w:t>mandatory)</w:t>
+        <w:t>mandatory</w:t>
+      </w:r>
+      <w:proofErr w:type="gramEnd"/>
+      <w:r>
+        <w:rPr>
+          <w:color w:val="4472C4" w:themeColor="accent1"/>
+          <w:lang w:val="en-US"/>
+        </w:rPr>
+        <w:t>)</w:t>
       </w:r>
     </w:p>
     <w:p>
@@ -1798,7 +1844,21 @@
         <w:rPr>
           <w:lang w:val="en-US"/>
         </w:rPr>
-        <w:t xml:space="preserve">=A:A </w:t>
+        <w:t>=</w:t>
+      </w:r>
+      <w:proofErr w:type="gramStart"/>
+      <w:r>
+        <w:rPr>
+          <w:lang w:val="en-US"/>
+        </w:rPr>
+        <w:t>A:A</w:t>
+      </w:r>
+      <w:proofErr w:type="gramEnd"/>
+      <w:r>
+        <w:rPr>
+          <w:lang w:val="en-US"/>
+        </w:rPr>
+        <w:t xml:space="preserve"> </w:t>
       </w:r>
       <w:r>
         <w:rPr>
@@ -5533,7 +5593,39 @@
           </w:tcPr>
           <w:p>
             <w:r>
-              <w:t>=VLOOKUP(lookup_value, table_array, col_index_num, [range_lookup])</w:t>
+              <w:t>=VLOOKUP(</w:t>
+            </w:r>
+            <w:proofErr w:type="spellStart"/>
+            <w:r>
+              <w:t>lookup_value</w:t>
+            </w:r>
+            <w:proofErr w:type="spellEnd"/>
+            <w:r>
+              <w:t xml:space="preserve">, </w:t>
+            </w:r>
+            <w:proofErr w:type="spellStart"/>
+            <w:r>
+              <w:t>table_array</w:t>
+            </w:r>
+            <w:proofErr w:type="spellEnd"/>
+            <w:r>
+              <w:t xml:space="preserve">, </w:t>
+            </w:r>
+            <w:proofErr w:type="spellStart"/>
+            <w:r>
+              <w:t>col_index_num</w:t>
+            </w:r>
+            <w:proofErr w:type="spellEnd"/>
+            <w:r>
+              <w:t>, [</w:t>
+            </w:r>
+            <w:proofErr w:type="spellStart"/>
+            <w:r>
+              <w:t>range_lookup</w:t>
+            </w:r>
+            <w:proofErr w:type="spellEnd"/>
+            <w:r>
+              <w:t>])</w:t>
             </w:r>
           </w:p>
         </w:tc>
@@ -5565,6 +5657,7 @@
           <w:numId w:val="12"/>
         </w:numPr>
       </w:pPr>
+      <w:proofErr w:type="spellStart"/>
       <w:r>
         <w:rPr>
           <w:b/>
@@ -5572,6 +5665,7 @@
         </w:rPr>
         <w:t>lookup_value</w:t>
       </w:r>
+      <w:proofErr w:type="spellEnd"/>
       <w:r>
         <w:t xml:space="preserve"> → Value to search for. </w:t>
       </w:r>
@@ -5583,6 +5677,7 @@
           <w:numId w:val="12"/>
         </w:numPr>
       </w:pPr>
+      <w:proofErr w:type="spellStart"/>
       <w:r>
         <w:rPr>
           <w:b/>
@@ -5590,6 +5685,7 @@
         </w:rPr>
         <w:t>table_array</w:t>
       </w:r>
+      <w:proofErr w:type="spellEnd"/>
       <w:r>
         <w:t xml:space="preserve"> → Range containing the data. </w:t>
       </w:r>
@@ -5601,6 +5697,7 @@
           <w:numId w:val="12"/>
         </w:numPr>
       </w:pPr>
+      <w:proofErr w:type="spellStart"/>
       <w:r>
         <w:rPr>
           <w:b/>
@@ -5608,6 +5705,7 @@
         </w:rPr>
         <w:t>col_index_num</w:t>
       </w:r>
+      <w:proofErr w:type="spellEnd"/>
       <w:r>
         <w:t xml:space="preserve"> → Column number (starting from 1) from which to return the result. </w:t>
       </w:r>
@@ -5619,6 +5717,7 @@
           <w:numId w:val="12"/>
         </w:numPr>
       </w:pPr>
+      <w:proofErr w:type="spellStart"/>
       <w:r>
         <w:rPr>
           <w:b/>
@@ -5626,6 +5725,7 @@
         </w:rPr>
         <w:t>range_lookup</w:t>
       </w:r>
+      <w:proofErr w:type="spellEnd"/>
       <w:r>
         <w:t xml:space="preserve"> </w:t>
       </w:r>
@@ -5658,6 +5758,7 @@
       <w:r>
         <w:t xml:space="preserve">In VLOOKUP(), </w:t>
       </w:r>
+      <w:proofErr w:type="spellStart"/>
       <w:r>
         <w:rPr>
           <w:b/>
@@ -5665,6 +5766,7 @@
         </w:rPr>
         <w:t>col_index_num</w:t>
       </w:r>
+      <w:proofErr w:type="spellEnd"/>
       <w:r>
         <w:t xml:space="preserve"> means:</w:t>
       </w:r>
@@ -5682,6 +5784,7 @@
       <w:r>
         <w:t xml:space="preserve"> Generally we use “FALSE” in </w:t>
       </w:r>
+      <w:proofErr w:type="spellStart"/>
       <w:r>
         <w:rPr>
           <w:i/>
@@ -5689,6 +5792,7 @@
         </w:rPr>
         <w:t>range_lookup</w:t>
       </w:r>
+      <w:proofErr w:type="spellEnd"/>
       <w:r>
         <w:t xml:space="preserve"> because, by default they expect the values to be sorted but as because in our case they are not sorted, hence we provide FALSE means do Exact match</w:t>
       </w:r>
@@ -5771,7 +5875,39 @@
           </w:tcPr>
           <w:p>
             <w:r>
-              <w:t>=HLOOKUP(lookup_value, table_array, row_index_num, [range_lookup])</w:t>
+              <w:t>=HLOOKUP(</w:t>
+            </w:r>
+            <w:proofErr w:type="spellStart"/>
+            <w:r>
+              <w:t>lookup_value</w:t>
+            </w:r>
+            <w:proofErr w:type="spellEnd"/>
+            <w:r>
+              <w:t xml:space="preserve">, </w:t>
+            </w:r>
+            <w:proofErr w:type="spellStart"/>
+            <w:r>
+              <w:t>table_array</w:t>
+            </w:r>
+            <w:proofErr w:type="spellEnd"/>
+            <w:r>
+              <w:t xml:space="preserve">, </w:t>
+            </w:r>
+            <w:proofErr w:type="spellStart"/>
+            <w:r>
+              <w:t>row_index_num</w:t>
+            </w:r>
+            <w:proofErr w:type="spellEnd"/>
+            <w:r>
+              <w:t>, [</w:t>
+            </w:r>
+            <w:proofErr w:type="spellStart"/>
+            <w:r>
+              <w:t>range_lookup</w:t>
+            </w:r>
+            <w:proofErr w:type="spellEnd"/>
+            <w:r>
+              <w:t>])</w:t>
             </w:r>
           </w:p>
         </w:tc>
@@ -5845,7 +5981,31 @@
           </w:tcPr>
           <w:p>
             <w:r>
-              <w:t>=MATCH(lookup_value, lookup_array, [match_type])</w:t>
+              <w:t>=MATCH(</w:t>
+            </w:r>
+            <w:proofErr w:type="spellStart"/>
+            <w:r>
+              <w:t>lookup_value</w:t>
+            </w:r>
+            <w:proofErr w:type="spellEnd"/>
+            <w:r>
+              <w:t xml:space="preserve">, </w:t>
+            </w:r>
+            <w:proofErr w:type="spellStart"/>
+            <w:r>
+              <w:t>lookup_array</w:t>
+            </w:r>
+            <w:proofErr w:type="spellEnd"/>
+            <w:r>
+              <w:t>, [</w:t>
+            </w:r>
+            <w:proofErr w:type="spellStart"/>
+            <w:r>
+              <w:t>match_type</w:t>
+            </w:r>
+            <w:proofErr w:type="spellEnd"/>
+            <w:r>
+              <w:t>])</w:t>
             </w:r>
           </w:p>
         </w:tc>
@@ -5880,6 +6040,7 @@
           <w:numId w:val="13"/>
         </w:numPr>
       </w:pPr>
+      <w:proofErr w:type="spellStart"/>
       <w:r>
         <w:rPr>
           <w:b/>
@@ -5887,6 +6048,7 @@
         </w:rPr>
         <w:t>lookup_value</w:t>
       </w:r>
+      <w:proofErr w:type="spellEnd"/>
       <w:r>
         <w:t xml:space="preserve"> → The value you want to find. </w:t>
       </w:r>
@@ -5898,6 +6060,7 @@
           <w:numId w:val="13"/>
         </w:numPr>
       </w:pPr>
+      <w:proofErr w:type="spellStart"/>
       <w:r>
         <w:rPr>
           <w:b/>
@@ -5905,6 +6068,7 @@
         </w:rPr>
         <w:t>lookup_array</w:t>
       </w:r>
+      <w:proofErr w:type="spellEnd"/>
       <w:r>
         <w:t xml:space="preserve"> → The range to search in. </w:t>
       </w:r>
@@ -5916,6 +6080,7 @@
           <w:numId w:val="13"/>
         </w:numPr>
       </w:pPr>
+      <w:proofErr w:type="spellStart"/>
       <w:r>
         <w:rPr>
           <w:b/>
@@ -5923,6 +6088,7 @@
         </w:rPr>
         <w:t>match_type</w:t>
       </w:r>
+      <w:proofErr w:type="spellEnd"/>
       <w:r>
         <w:t xml:space="preserve"> (optional): </w:t>
       </w:r>
@@ -5946,7 +6112,15 @@
         </w:numPr>
       </w:pPr>
       <w:r>
-        <w:t xml:space="preserve">1 → Largest value ≤ lookup_value (ascending order required) </w:t>
+        <w:t xml:space="preserve">1 → Largest value ≤ </w:t>
+      </w:r>
+      <w:proofErr w:type="spellStart"/>
+      <w:r>
+        <w:t>lookup_value</w:t>
+      </w:r>
+      <w:proofErr w:type="spellEnd"/>
+      <w:r>
+        <w:t xml:space="preserve"> (ascending order required) </w:t>
       </w:r>
     </w:p>
     <w:p>
@@ -5957,7 +6131,15 @@
         </w:numPr>
       </w:pPr>
       <w:r>
-        <w:t>-1 → Smallest value ≥ lookup_value (descending order required)</w:t>
+        <w:t xml:space="preserve">-1 → Smallest value ≥ </w:t>
+      </w:r>
+      <w:proofErr w:type="spellStart"/>
+      <w:r>
+        <w:t>lookup_value</w:t>
+      </w:r>
+      <w:proofErr w:type="spellEnd"/>
+      <w:r>
+        <w:t xml:space="preserve"> (descending order required)</w:t>
       </w:r>
     </w:p>
     <w:p/>
@@ -6002,7 +6184,55 @@
           </w:tcPr>
           <w:p>
             <w:r>
-              <w:t>=XLOOKUP(lookup_value, lookup_array, return_array, [if_not_found], [match_mode], [search_mode])</w:t>
+              <w:t>=XLOOKUP(</w:t>
+            </w:r>
+            <w:proofErr w:type="spellStart"/>
+            <w:r>
+              <w:t>lookup_value</w:t>
+            </w:r>
+            <w:proofErr w:type="spellEnd"/>
+            <w:r>
+              <w:t xml:space="preserve">, </w:t>
+            </w:r>
+            <w:proofErr w:type="spellStart"/>
+            <w:r>
+              <w:t>lookup_array</w:t>
+            </w:r>
+            <w:proofErr w:type="spellEnd"/>
+            <w:r>
+              <w:t xml:space="preserve">, </w:t>
+            </w:r>
+            <w:proofErr w:type="spellStart"/>
+            <w:r>
+              <w:t>return_array</w:t>
+            </w:r>
+            <w:proofErr w:type="spellEnd"/>
+            <w:r>
+              <w:t>, [</w:t>
+            </w:r>
+            <w:proofErr w:type="spellStart"/>
+            <w:r>
+              <w:t>if_not_found</w:t>
+            </w:r>
+            <w:proofErr w:type="spellEnd"/>
+            <w:r>
+              <w:t>], [</w:t>
+            </w:r>
+            <w:proofErr w:type="spellStart"/>
+            <w:r>
+              <w:t>match_mode</w:t>
+            </w:r>
+            <w:proofErr w:type="spellEnd"/>
+            <w:r>
+              <w:t>], [</w:t>
+            </w:r>
+            <w:proofErr w:type="spellStart"/>
+            <w:r>
+              <w:t>search_mode</w:t>
+            </w:r>
+            <w:proofErr w:type="spellEnd"/>
+            <w:r>
+              <w:t>])</w:t>
             </w:r>
           </w:p>
         </w:tc>
@@ -6068,9 +6298,11 @@
             <w:pPr>
               <w:spacing w:after="160" w:line="259" w:lineRule="auto"/>
             </w:pPr>
+            <w:proofErr w:type="spellStart"/>
             <w:r>
               <w:t>lookup_value</w:t>
             </w:r>
+            <w:proofErr w:type="spellEnd"/>
           </w:p>
         </w:tc>
         <w:tc>
@@ -6100,9 +6332,11 @@
             <w:pPr>
               <w:spacing w:after="160" w:line="259" w:lineRule="auto"/>
             </w:pPr>
+            <w:proofErr w:type="spellStart"/>
             <w:r>
               <w:t>lookup_array</w:t>
             </w:r>
+            <w:proofErr w:type="spellEnd"/>
           </w:p>
         </w:tc>
         <w:tc>
@@ -6135,9 +6369,11 @@
             <w:pPr>
               <w:spacing w:after="160" w:line="259" w:lineRule="auto"/>
             </w:pPr>
+            <w:proofErr w:type="spellStart"/>
             <w:r>
               <w:t>return_array</w:t>
             </w:r>
+            <w:proofErr w:type="spellEnd"/>
           </w:p>
         </w:tc>
         <w:tc>
@@ -6167,9 +6403,11 @@
             <w:pPr>
               <w:spacing w:after="160" w:line="259" w:lineRule="auto"/>
             </w:pPr>
+            <w:proofErr w:type="spellStart"/>
             <w:r>
               <w:t>if_not_found</w:t>
             </w:r>
+            <w:proofErr w:type="spellEnd"/>
           </w:p>
         </w:tc>
         <w:tc>
@@ -6202,9 +6440,11 @@
             <w:pPr>
               <w:spacing w:after="160" w:line="259" w:lineRule="auto"/>
             </w:pPr>
+            <w:proofErr w:type="spellStart"/>
             <w:r>
               <w:t>match_mode</w:t>
             </w:r>
+            <w:proofErr w:type="spellEnd"/>
           </w:p>
         </w:tc>
         <w:tc>
@@ -6234,9 +6474,11 @@
             <w:pPr>
               <w:spacing w:after="160" w:line="259" w:lineRule="auto"/>
             </w:pPr>
+            <w:proofErr w:type="spellStart"/>
             <w:r>
               <w:t>search_mode</w:t>
             </w:r>
+            <w:proofErr w:type="spellEnd"/>
           </w:p>
         </w:tc>
         <w:tc>
@@ -6276,18 +6518,33 @@
       <w:r>
         <w:t xml:space="preserve"> </w:t>
       </w:r>
+      <w:proofErr w:type="gramStart"/>
       <w:r>
         <w:rPr>
           <w:b/>
           <w:bCs/>
           <w:u w:val="single"/>
         </w:rPr>
-        <w:t>TEXTJOIN():</w:t>
-      </w:r>
-    </w:p>
-    <w:p>
-      <w:r>
-        <w:t>TEXTJOIN() combines text from multiple cells into a single string and lets you specify a separator (delimiter).</w:t>
+        <w:t>TEXTJOIN(</w:t>
+      </w:r>
+      <w:proofErr w:type="gramEnd"/>
+      <w:r>
+        <w:rPr>
+          <w:b/>
+          <w:bCs/>
+          <w:u w:val="single"/>
+        </w:rPr>
+        <w:t>):</w:t>
+      </w:r>
+    </w:p>
+    <w:p>
+      <w:proofErr w:type="gramStart"/>
+      <w:r>
+        <w:t>TEXTJOIN(</w:t>
+      </w:r>
+      <w:proofErr w:type="gramEnd"/>
+      <w:r>
+        <w:t>) combines text from multiple cells into a single string and lets you specify a separator (delimiter).</w:t>
       </w:r>
     </w:p>
     <w:tbl>
@@ -6307,7 +6564,23 @@
           </w:tcPr>
           <w:p>
             <w:r>
-              <w:t>=TEXTJOIN(delimiter, ignore_empty, text1, [text2], ...)</w:t>
+              <w:t>=</w:t>
+            </w:r>
+            <w:proofErr w:type="gramStart"/>
+            <w:r>
+              <w:t>TEXTJOIN(</w:t>
+            </w:r>
+            <w:proofErr w:type="gramEnd"/>
+            <w:r>
+              <w:t xml:space="preserve">delimiter, </w:t>
+            </w:r>
+            <w:proofErr w:type="spellStart"/>
+            <w:r>
+              <w:t>ignore_empty</w:t>
+            </w:r>
+            <w:proofErr w:type="spellEnd"/>
+            <w:r>
+              <w:t>, text1, [text2], ...)</w:t>
             </w:r>
           </w:p>
         </w:tc>
@@ -6405,9 +6678,11 @@
             <w:pPr>
               <w:spacing w:after="160" w:line="259" w:lineRule="auto"/>
             </w:pPr>
+            <w:proofErr w:type="spellStart"/>
             <w:r>
               <w:t>ignore_empty</w:t>
             </w:r>
+            <w:proofErr w:type="spellEnd"/>
           </w:p>
         </w:tc>
         <w:tc>
@@ -6479,18 +6754,33 @@
       <w:r>
         <w:t xml:space="preserve"> </w:t>
       </w:r>
+      <w:proofErr w:type="gramStart"/>
       <w:r>
         <w:rPr>
           <w:b/>
           <w:bCs/>
           <w:u w:val="single"/>
         </w:rPr>
-        <w:t>TEXTSPLIT():</w:t>
-      </w:r>
-    </w:p>
-    <w:p>
-      <w:r>
-        <w:t xml:space="preserve">TEXTSPLIT() is an Excel function used to </w:t>
+        <w:t>TEXTSPLIT(</w:t>
+      </w:r>
+      <w:proofErr w:type="gramEnd"/>
+      <w:r>
+        <w:rPr>
+          <w:b/>
+          <w:bCs/>
+          <w:u w:val="single"/>
+        </w:rPr>
+        <w:t>):</w:t>
+      </w:r>
+    </w:p>
+    <w:p>
+      <w:proofErr w:type="gramStart"/>
+      <w:r>
+        <w:t>TEXTSPLIT(</w:t>
+      </w:r>
+      <w:proofErr w:type="gramEnd"/>
+      <w:r>
+        <w:t xml:space="preserve">) is an Excel function used to </w:t>
       </w:r>
       <w:r>
         <w:rPr>
@@ -6520,7 +6810,31 @@
           </w:tcPr>
           <w:p>
             <w:r>
-              <w:t>=TEXTSPLIT(text, col_delimiter, [row_delimiter])</w:t>
+              <w:t>=</w:t>
+            </w:r>
+            <w:proofErr w:type="gramStart"/>
+            <w:r>
+              <w:t>TEXTSPLIT(</w:t>
+            </w:r>
+            <w:proofErr w:type="gramEnd"/>
+            <w:r>
+              <w:t xml:space="preserve">text, </w:t>
+            </w:r>
+            <w:proofErr w:type="spellStart"/>
+            <w:r>
+              <w:t>col_delimiter</w:t>
+            </w:r>
+            <w:proofErr w:type="spellEnd"/>
+            <w:r>
+              <w:t>, [</w:t>
+            </w:r>
+            <w:proofErr w:type="spellStart"/>
+            <w:r>
+              <w:t>row_delimiter</w:t>
+            </w:r>
+            <w:proofErr w:type="spellEnd"/>
+            <w:r>
+              <w:t>])</w:t>
             </w:r>
           </w:p>
         </w:tc>
@@ -6567,6 +6881,7 @@
           <w:numId w:val="14"/>
         </w:numPr>
       </w:pPr>
+      <w:proofErr w:type="spellStart"/>
       <w:r>
         <w:rPr>
           <w:b/>
@@ -6574,6 +6889,7 @@
         </w:rPr>
         <w:t>col_delimiter</w:t>
       </w:r>
+      <w:proofErr w:type="spellEnd"/>
       <w:r>
         <w:t xml:space="preserve"> → Character(s) where text should be split into columns </w:t>
       </w:r>
@@ -6585,6 +6901,7 @@
           <w:numId w:val="14"/>
         </w:numPr>
       </w:pPr>
+      <w:proofErr w:type="spellStart"/>
       <w:r>
         <w:rPr>
           <w:b/>
@@ -6592,6 +6909,7 @@
         </w:rPr>
         <w:t>row_delimiter</w:t>
       </w:r>
+      <w:proofErr w:type="spellEnd"/>
       <w:r>
         <w:t xml:space="preserve"> </w:t>
       </w:r>
@@ -6615,18 +6933,33 @@
       <w:r>
         <w:t xml:space="preserve"> </w:t>
       </w:r>
+      <w:proofErr w:type="gramStart"/>
       <w:r>
         <w:rPr>
           <w:b/>
           <w:bCs/>
           <w:u w:val="single"/>
         </w:rPr>
-        <w:t>RIGHT():</w:t>
-      </w:r>
-    </w:p>
-    <w:p>
-      <w:r>
-        <w:t xml:space="preserve">RIGHT() Excel function is used to extract characters from the </w:t>
+        <w:t>RIGHT(</w:t>
+      </w:r>
+      <w:proofErr w:type="gramEnd"/>
+      <w:r>
+        <w:rPr>
+          <w:b/>
+          <w:bCs/>
+          <w:u w:val="single"/>
+        </w:rPr>
+        <w:t>):</w:t>
+      </w:r>
+    </w:p>
+    <w:p>
+      <w:proofErr w:type="gramStart"/>
+      <w:r>
+        <w:t>RIGHT(</w:t>
+      </w:r>
+      <w:proofErr w:type="gramEnd"/>
+      <w:r>
+        <w:t xml:space="preserve">) Excel function is used to extract characters from the </w:t>
       </w:r>
       <w:r>
         <w:rPr>
@@ -6659,7 +6992,23 @@
           </w:tcPr>
           <w:p>
             <w:r>
-              <w:t>=RIGHT(text, [num_chars])</w:t>
+              <w:t>=</w:t>
+            </w:r>
+            <w:proofErr w:type="gramStart"/>
+            <w:r>
+              <w:t>RIGHT(</w:t>
+            </w:r>
+            <w:proofErr w:type="gramEnd"/>
+            <w:r>
+              <w:t>text, [</w:t>
+            </w:r>
+            <w:proofErr w:type="spellStart"/>
+            <w:r>
+              <w:t>num_chars</w:t>
+            </w:r>
+            <w:proofErr w:type="spellEnd"/>
+            <w:r>
+              <w:t>])</w:t>
             </w:r>
           </w:p>
         </w:tc>
@@ -6706,6 +7055,7 @@
           <w:numId w:val="15"/>
         </w:numPr>
       </w:pPr>
+      <w:proofErr w:type="spellStart"/>
       <w:r>
         <w:rPr>
           <w:b/>
@@ -6713,6 +7063,7 @@
         </w:rPr>
         <w:t>num_chars</w:t>
       </w:r>
+      <w:proofErr w:type="spellEnd"/>
       <w:r>
         <w:t xml:space="preserve"> </w:t>
       </w:r>
@@ -6781,13 +7132,23 @@
       <w:r>
         <w:t xml:space="preserve"> </w:t>
       </w:r>
+      <w:proofErr w:type="gramStart"/>
       <w:r>
         <w:rPr>
           <w:b/>
           <w:bCs/>
           <w:u w:val="single"/>
         </w:rPr>
-        <w:t>FIND():</w:t>
+        <w:t>FIND(</w:t>
+      </w:r>
+      <w:proofErr w:type="gramEnd"/>
+      <w:r>
+        <w:rPr>
+          <w:b/>
+          <w:bCs/>
+          <w:u w:val="single"/>
+        </w:rPr>
+        <w:t>):</w:t>
       </w:r>
     </w:p>
     <w:p>
@@ -6817,7 +7178,36 @@
           </w:tcPr>
           <w:p>
             <w:r>
-              <w:t>=FIND(find_text, within_text, [start_num])</w:t>
+              <w:t>=</w:t>
+            </w:r>
+            <w:proofErr w:type="gramStart"/>
+            <w:r>
+              <w:t>FIND(</w:t>
+            </w:r>
+            <w:proofErr w:type="spellStart"/>
+            <w:proofErr w:type="gramEnd"/>
+            <w:r>
+              <w:t>find_text</w:t>
+            </w:r>
+            <w:proofErr w:type="spellEnd"/>
+            <w:r>
+              <w:t xml:space="preserve">, </w:t>
+            </w:r>
+            <w:proofErr w:type="spellStart"/>
+            <w:r>
+              <w:t>within_text</w:t>
+            </w:r>
+            <w:proofErr w:type="spellEnd"/>
+            <w:r>
+              <w:t>, [</w:t>
+            </w:r>
+            <w:proofErr w:type="spellStart"/>
+            <w:r>
+              <w:t>start_num</w:t>
+            </w:r>
+            <w:proofErr w:type="spellEnd"/>
+            <w:r>
+              <w:t>])</w:t>
             </w:r>
           </w:p>
         </w:tc>
@@ -6849,13 +7239,23 @@
       <w:r>
         <w:t xml:space="preserve"> </w:t>
       </w:r>
+      <w:proofErr w:type="gramStart"/>
       <w:r>
         <w:rPr>
           <w:b/>
           <w:bCs/>
           <w:u w:val="single"/>
         </w:rPr>
-        <w:t>LEN():</w:t>
+        <w:t>LEN(</w:t>
+      </w:r>
+      <w:proofErr w:type="gramEnd"/>
+      <w:r>
+        <w:rPr>
+          <w:b/>
+          <w:bCs/>
+          <w:u w:val="single"/>
+        </w:rPr>
+        <w:t>):</w:t>
       </w:r>
     </w:p>
     <w:p>
@@ -6885,7 +7285,15 @@
           </w:tcPr>
           <w:p>
             <w:r>
-              <w:t>=LEN(text)</w:t>
+              <w:t>=</w:t>
+            </w:r>
+            <w:proofErr w:type="gramStart"/>
+            <w:r>
+              <w:t>LEN(</w:t>
+            </w:r>
+            <w:proofErr w:type="gramEnd"/>
+            <w:r>
+              <w:t>text)</w:t>
             </w:r>
           </w:p>
         </w:tc>
@@ -6917,13 +7325,23 @@
       <w:r>
         <w:t xml:space="preserve"> </w:t>
       </w:r>
+      <w:proofErr w:type="gramStart"/>
       <w:r>
         <w:rPr>
           <w:b/>
           <w:bCs/>
           <w:u w:val="single"/>
         </w:rPr>
-        <w:t>MID():</w:t>
+        <w:t>MID(</w:t>
+      </w:r>
+      <w:proofErr w:type="gramEnd"/>
+      <w:r>
+        <w:rPr>
+          <w:b/>
+          <w:bCs/>
+          <w:u w:val="single"/>
+        </w:rPr>
+        <w:t>):</w:t>
       </w:r>
     </w:p>
     <w:p>
@@ -6953,7 +7371,31 @@
           </w:tcPr>
           <w:p>
             <w:r>
-              <w:t>=MID(text, start_num, num_chars)</w:t>
+              <w:t>=</w:t>
+            </w:r>
+            <w:proofErr w:type="gramStart"/>
+            <w:r>
+              <w:t>MID(</w:t>
+            </w:r>
+            <w:proofErr w:type="gramEnd"/>
+            <w:r>
+              <w:t xml:space="preserve">text, </w:t>
+            </w:r>
+            <w:proofErr w:type="spellStart"/>
+            <w:r>
+              <w:t>start_num</w:t>
+            </w:r>
+            <w:proofErr w:type="spellEnd"/>
+            <w:r>
+              <w:t xml:space="preserve">, </w:t>
+            </w:r>
+            <w:proofErr w:type="spellStart"/>
+            <w:r>
+              <w:t>num_chars</w:t>
+            </w:r>
+            <w:proofErr w:type="spellEnd"/>
+            <w:r>
+              <w:t>)</w:t>
             </w:r>
           </w:p>
         </w:tc>
@@ -6983,7 +7425,15 @@
         </w:pBdr>
       </w:pPr>
       <w:r>
-        <w:t>=MID("Nazil Dhalwala",7,8)</w:t>
+        <w:t>=</w:t>
+      </w:r>
+      <w:proofErr w:type="gramStart"/>
+      <w:r>
+        <w:t>MID(</w:t>
+      </w:r>
+      <w:proofErr w:type="gramEnd"/>
+      <w:r>
+        <w:t>"Nazil Dhalwala",7,8)</w:t>
       </w:r>
     </w:p>
     <w:p>
@@ -7093,18 +7543,33 @@
       <w:r>
         <w:t xml:space="preserve"> </w:t>
       </w:r>
+      <w:proofErr w:type="gramStart"/>
       <w:r>
         <w:rPr>
           <w:b/>
           <w:bCs/>
           <w:u w:val="single"/>
         </w:rPr>
-        <w:t>TRANSPOSE():</w:t>
-      </w:r>
-    </w:p>
-    <w:p>
-      <w:r>
-        <w:t xml:space="preserve">TRANSPOSE() in Excel is used to </w:t>
+        <w:t>TRANSPOSE(</w:t>
+      </w:r>
+      <w:proofErr w:type="gramEnd"/>
+      <w:r>
+        <w:rPr>
+          <w:b/>
+          <w:bCs/>
+          <w:u w:val="single"/>
+        </w:rPr>
+        <w:t>):</w:t>
+      </w:r>
+    </w:p>
+    <w:p>
+      <w:proofErr w:type="gramStart"/>
+      <w:r>
+        <w:t>TRANSPOSE(</w:t>
+      </w:r>
+      <w:proofErr w:type="gramEnd"/>
+      <w:r>
+        <w:t xml:space="preserve">) in Excel is used to </w:t>
       </w:r>
       <w:r>
         <w:rPr>
@@ -7154,7 +7619,15 @@
           </w:tcPr>
           <w:p>
             <w:r>
-              <w:t>=TRANSPOSE(array)</w:t>
+              <w:t>=</w:t>
+            </w:r>
+            <w:proofErr w:type="gramStart"/>
+            <w:r>
+              <w:t>TRANSPOSE(</w:t>
+            </w:r>
+            <w:proofErr w:type="gramEnd"/>
+            <w:r>
+              <w:t>array)</w:t>
             </w:r>
           </w:p>
         </w:tc>
@@ -7166,18 +7639,33 @@
       <w:r>
         <w:sym w:font="Wingdings" w:char="F0E8"/>
       </w:r>
+      <w:proofErr w:type="gramStart"/>
       <w:r>
         <w:rPr>
           <w:b/>
           <w:bCs/>
           <w:u w:val="single"/>
         </w:rPr>
-        <w:t>UNIQUE():</w:t>
-      </w:r>
-    </w:p>
-    <w:p>
-      <w:r>
-        <w:t xml:space="preserve">UNIQUE() in Excel returns </w:t>
+        <w:t>UNIQUE(</w:t>
+      </w:r>
+      <w:proofErr w:type="gramEnd"/>
+      <w:r>
+        <w:rPr>
+          <w:b/>
+          <w:bCs/>
+          <w:u w:val="single"/>
+        </w:rPr>
+        <w:t>):</w:t>
+      </w:r>
+    </w:p>
+    <w:p>
+      <w:proofErr w:type="gramStart"/>
+      <w:r>
+        <w:t>UNIQUE(</w:t>
+      </w:r>
+      <w:proofErr w:type="gramEnd"/>
+      <w:r>
+        <w:t xml:space="preserve">) in Excel returns </w:t>
       </w:r>
       <w:r>
         <w:rPr>
@@ -7208,7 +7696,31 @@
           <w:p>
             <w:r>
               <w:lastRenderedPageBreak/>
-              <w:t>=UNIQUE(array, [by_col], [exactly_once])</w:t>
+              <w:t>=</w:t>
+            </w:r>
+            <w:proofErr w:type="gramStart"/>
+            <w:r>
+              <w:t>UNIQUE(</w:t>
+            </w:r>
+            <w:proofErr w:type="gramEnd"/>
+            <w:r>
+              <w:t>array, [</w:t>
+            </w:r>
+            <w:proofErr w:type="spellStart"/>
+            <w:r>
+              <w:t>by_col</w:t>
+            </w:r>
+            <w:proofErr w:type="spellEnd"/>
+            <w:r>
+              <w:t>], [</w:t>
+            </w:r>
+            <w:proofErr w:type="spellStart"/>
+            <w:r>
+              <w:t>exactly_once</w:t>
+            </w:r>
+            <w:proofErr w:type="spellEnd"/>
+            <w:r>
+              <w:t>])</w:t>
             </w:r>
           </w:p>
         </w:tc>
@@ -7266,6 +7778,7 @@
           <w:numId w:val="17"/>
         </w:numPr>
       </w:pPr>
+      <w:proofErr w:type="spellStart"/>
       <w:r>
         <w:rPr>
           <w:b/>
@@ -7273,6 +7786,7 @@
         </w:rPr>
         <w:t>by_col</w:t>
       </w:r>
+      <w:proofErr w:type="spellEnd"/>
       <w:r>
         <w:t xml:space="preserve"> </w:t>
       </w:r>
@@ -7316,6 +7830,7 @@
           <w:numId w:val="17"/>
         </w:numPr>
       </w:pPr>
+      <w:proofErr w:type="spellStart"/>
       <w:r>
         <w:rPr>
           <w:b/>
@@ -7323,6 +7838,7 @@
         </w:rPr>
         <w:t>exactly_once</w:t>
       </w:r>
+      <w:proofErr w:type="spellEnd"/>
       <w:r>
         <w:t xml:space="preserve"> </w:t>
       </w:r>
@@ -7369,6 +7885,213 @@
         <w:t xml:space="preserve"> in the source data.</w:t>
       </w:r>
     </w:p>
+    <w:p/>
+    <w:p/>
+    <w:p/>
+    <w:p/>
+    <w:p>
+      <w:pPr>
+        <w:pStyle w:val="Heading2"/>
+      </w:pPr>
+      <w:r>
+        <w:t>2.9</w:t>
+      </w:r>
+      <w:r>
+        <w:t>)</w:t>
+      </w:r>
+      <w:r>
+        <w:t xml:space="preserve"> Date &amp; Time Functions</w:t>
+      </w:r>
+    </w:p>
+    <w:p/>
+    <w:p/>
+    <w:p>
+      <w:r>
+        <w:sym w:font="Wingdings" w:char="F0E8"/>
+      </w:r>
+      <w:r>
+        <w:t xml:space="preserve"> </w:t>
+      </w:r>
+      <w:proofErr w:type="gramStart"/>
+      <w:r>
+        <w:t>MONTH(</w:t>
+      </w:r>
+      <w:proofErr w:type="gramEnd"/>
+      <w:r>
+        <w:t>):</w:t>
+      </w:r>
+    </w:p>
+    <w:p>
+      <w:r>
+        <w:sym w:font="Wingdings" w:char="F0E8"/>
+      </w:r>
+      <w:r>
+        <w:t xml:space="preserve"> </w:t>
+      </w:r>
+      <w:proofErr w:type="gramStart"/>
+      <w:r>
+        <w:t>DAY(</w:t>
+      </w:r>
+      <w:proofErr w:type="gramEnd"/>
+      <w:r>
+        <w:t>):</w:t>
+      </w:r>
+    </w:p>
+    <w:p>
+      <w:r>
+        <w:sym w:font="Wingdings" w:char="F0E8"/>
+      </w:r>
+      <w:r>
+        <w:t xml:space="preserve"> </w:t>
+      </w:r>
+      <w:proofErr w:type="gramStart"/>
+      <w:r>
+        <w:t>YEAR(</w:t>
+      </w:r>
+      <w:proofErr w:type="gramEnd"/>
+      <w:r>
+        <w:t>):</w:t>
+      </w:r>
+    </w:p>
+    <w:p>
+      <w:r>
+        <w:sym w:font="Wingdings" w:char="F0E8"/>
+      </w:r>
+      <w:r>
+        <w:t xml:space="preserve"> </w:t>
+      </w:r>
+      <w:proofErr w:type="gramStart"/>
+      <w:r>
+        <w:t>DATE(</w:t>
+      </w:r>
+      <w:proofErr w:type="gramEnd"/>
+      <w:r>
+        <w:t>)</w:t>
+      </w:r>
+      <w:r>
+        <w:t>:</w:t>
+      </w:r>
+    </w:p>
+    <w:p>
+      <w:r>
+        <w:sym w:font="Wingdings" w:char="F0E8"/>
+      </w:r>
+      <w:r>
+        <w:t xml:space="preserve"> </w:t>
+      </w:r>
+      <w:proofErr w:type="gramStart"/>
+      <w:r>
+        <w:t>TODAY(</w:t>
+      </w:r>
+      <w:proofErr w:type="gramEnd"/>
+      <w:r>
+        <w:t>):</w:t>
+      </w:r>
+    </w:p>
+    <w:p>
+      <w:r>
+        <w:sym w:font="Wingdings" w:char="F0E8"/>
+      </w:r>
+      <w:r>
+        <w:t xml:space="preserve"> </w:t>
+      </w:r>
+      <w:proofErr w:type="gramStart"/>
+      <w:r>
+        <w:t>DATEDIF(</w:t>
+      </w:r>
+      <w:proofErr w:type="gramEnd"/>
+      <w:r>
+        <w:t>“Start date (from)”, “to date”, “D” [format]</w:t>
+      </w:r>
+      <w:r>
+        <w:t>):</w:t>
+      </w:r>
+    </w:p>
+    <w:p/>
+    <w:p>
+      <w:r>
+        <w:sym w:font="Wingdings" w:char="F0E8"/>
+      </w:r>
+      <w:r>
+        <w:t xml:space="preserve"> </w:t>
+      </w:r>
+      <w:proofErr w:type="gramStart"/>
+      <w:r>
+        <w:t>HOUR(</w:t>
+      </w:r>
+      <w:proofErr w:type="gramEnd"/>
+      <w:r>
+        <w:t>):</w:t>
+      </w:r>
+    </w:p>
+    <w:p>
+      <w:r>
+        <w:sym w:font="Wingdings" w:char="F0E8"/>
+      </w:r>
+      <w:r>
+        <w:t xml:space="preserve"> </w:t>
+      </w:r>
+      <w:proofErr w:type="gramStart"/>
+      <w:r>
+        <w:t>MINUTE(</w:t>
+      </w:r>
+      <w:proofErr w:type="gramEnd"/>
+      <w:r>
+        <w:t>):</w:t>
+      </w:r>
+    </w:p>
+    <w:p>
+      <w:r>
+        <w:sym w:font="Wingdings" w:char="F0E8"/>
+      </w:r>
+      <w:r>
+        <w:t xml:space="preserve"> </w:t>
+      </w:r>
+      <w:proofErr w:type="gramStart"/>
+      <w:r>
+        <w:t>SECOND(</w:t>
+      </w:r>
+      <w:proofErr w:type="gramEnd"/>
+      <w:r>
+        <w:t>):</w:t>
+      </w:r>
+    </w:p>
+    <w:p>
+      <w:r>
+        <w:sym w:font="Wingdings" w:char="F0E8"/>
+      </w:r>
+      <w:r>
+        <w:t xml:space="preserve"> </w:t>
+      </w:r>
+      <w:proofErr w:type="gramStart"/>
+      <w:r>
+        <w:t>TIME(</w:t>
+      </w:r>
+      <w:proofErr w:type="gramEnd"/>
+      <w:r>
+        <w:t>):</w:t>
+      </w:r>
+    </w:p>
+    <w:p>
+      <w:r>
+        <w:sym w:font="Wingdings" w:char="F0E8"/>
+      </w:r>
+      <w:r>
+        <w:t xml:space="preserve"> </w:t>
+      </w:r>
+      <w:proofErr w:type="gramStart"/>
+      <w:r>
+        <w:t>SEQUENCE(</w:t>
+      </w:r>
+      <w:proofErr w:type="gramEnd"/>
+      <w:r>
+        <w:t>):</w:t>
+      </w:r>
+    </w:p>
+    <w:p/>
+    <w:p/>
+    <w:p/>
+    <w:p/>
     <w:p/>
     <w:sectPr>
       <w:pgSz w:w="11906" w:h="16838"/>

</xml_diff>

<commit_message>
Project-1: Salary Dashboard Completed
</commit_message>
<xml_diff>
--- a/Notes.docx
+++ b/Notes.docx
@@ -80,7 +80,7 @@
           <w:r>
             <w:fldChar w:fldCharType="separate"/>
           </w:r>
-          <w:hyperlink w:anchor="_Toc233723496" w:history="1">
+          <w:hyperlink w:anchor="_Toc233787922" w:history="1">
             <w:r>
               <w:rPr>
                 <w:rStyle w:val="Hyperlink"/>
@@ -124,7 +124,7 @@
                 <w:noProof/>
                 <w:webHidden/>
               </w:rPr>
-              <w:instrText xml:space="preserve"> PAGEREF _Toc233723496 \h </w:instrText>
+              <w:instrText xml:space="preserve"> PAGEREF _Toc233787922 \h </w:instrText>
             </w:r>
             <w:r>
               <w:rPr>
@@ -168,7 +168,7 @@
               <w:lang w:eastAsia="en-IN" w:bidi="gu-IN"/>
             </w:rPr>
           </w:pPr>
-          <w:hyperlink w:anchor="_Toc233723497" w:history="1">
+          <w:hyperlink w:anchor="_Toc233787923" w:history="1">
             <w:r>
               <w:rPr>
                 <w:rStyle w:val="Hyperlink"/>
@@ -196,7 +196,7 @@
                 <w:noProof/>
                 <w:webHidden/>
               </w:rPr>
-              <w:instrText xml:space="preserve"> PAGEREF _Toc233723497 \h </w:instrText>
+              <w:instrText xml:space="preserve"> PAGEREF _Toc233787923 \h </w:instrText>
             </w:r>
             <w:r>
               <w:rPr>
@@ -241,7 +241,7 @@
               <w:lang w:eastAsia="en-IN" w:bidi="gu-IN"/>
             </w:rPr>
           </w:pPr>
-          <w:hyperlink w:anchor="_Toc233723498" w:history="1">
+          <w:hyperlink w:anchor="_Toc233787924" w:history="1">
             <w:r>
               <w:rPr>
                 <w:rStyle w:val="Hyperlink"/>
@@ -286,7 +286,7 @@
                 <w:noProof/>
                 <w:webHidden/>
               </w:rPr>
-              <w:instrText xml:space="preserve"> PAGEREF _Toc233723498 \h </w:instrText>
+              <w:instrText xml:space="preserve"> PAGEREF _Toc233787924 \h </w:instrText>
             </w:r>
             <w:r>
               <w:rPr>
@@ -330,7 +330,7 @@
               <w:lang w:eastAsia="en-IN" w:bidi="gu-IN"/>
             </w:rPr>
           </w:pPr>
-          <w:hyperlink w:anchor="_Toc233723499" w:history="1">
+          <w:hyperlink w:anchor="_Toc233787925" w:history="1">
             <w:r>
               <w:rPr>
                 <w:rStyle w:val="Hyperlink"/>
@@ -358,7 +358,7 @@
                 <w:noProof/>
                 <w:webHidden/>
               </w:rPr>
-              <w:instrText xml:space="preserve"> PAGEREF _Toc233723499 \h </w:instrText>
+              <w:instrText xml:space="preserve"> PAGEREF _Toc233787925 \h </w:instrText>
             </w:r>
             <w:r>
               <w:rPr>
@@ -402,7 +402,7 @@
               <w:lang w:eastAsia="en-IN" w:bidi="gu-IN"/>
             </w:rPr>
           </w:pPr>
-          <w:hyperlink w:anchor="_Toc233723500" w:history="1">
+          <w:hyperlink w:anchor="_Toc233787926" w:history="1">
             <w:r>
               <w:rPr>
                 <w:rStyle w:val="Hyperlink"/>
@@ -430,7 +430,7 @@
                 <w:noProof/>
                 <w:webHidden/>
               </w:rPr>
-              <w:instrText xml:space="preserve"> PAGEREF _Toc233723500 \h </w:instrText>
+              <w:instrText xml:space="preserve"> PAGEREF _Toc233787926 \h </w:instrText>
             </w:r>
             <w:r>
               <w:rPr>
@@ -475,7 +475,7 @@
               <w:lang w:eastAsia="en-IN" w:bidi="gu-IN"/>
             </w:rPr>
           </w:pPr>
-          <w:hyperlink w:anchor="_Toc233723501" w:history="1">
+          <w:hyperlink w:anchor="_Toc233787927" w:history="1">
             <w:r>
               <w:rPr>
                 <w:rStyle w:val="Hyperlink"/>
@@ -520,7 +520,7 @@
                 <w:noProof/>
                 <w:webHidden/>
               </w:rPr>
-              <w:instrText xml:space="preserve"> PAGEREF _Toc233723501 \h </w:instrText>
+              <w:instrText xml:space="preserve"> PAGEREF _Toc233787927 \h </w:instrText>
             </w:r>
             <w:r>
               <w:rPr>
@@ -565,7 +565,7 @@
               <w:lang w:eastAsia="en-IN" w:bidi="gu-IN"/>
             </w:rPr>
           </w:pPr>
-          <w:hyperlink w:anchor="_Toc233723502" w:history="1">
+          <w:hyperlink w:anchor="_Toc233787928" w:history="1">
             <w:r>
               <w:rPr>
                 <w:rStyle w:val="Hyperlink"/>
@@ -610,7 +610,7 @@
                 <w:noProof/>
                 <w:webHidden/>
               </w:rPr>
-              <w:instrText xml:space="preserve"> PAGEREF _Toc233723502 \h </w:instrText>
+              <w:instrText xml:space="preserve"> PAGEREF _Toc233787928 \h </w:instrText>
             </w:r>
             <w:r>
               <w:rPr>
@@ -654,7 +654,7 @@
               <w:lang w:eastAsia="en-IN" w:bidi="gu-IN"/>
             </w:rPr>
           </w:pPr>
-          <w:hyperlink w:anchor="_Toc233723503" w:history="1">
+          <w:hyperlink w:anchor="_Toc233787929" w:history="1">
             <w:r>
               <w:rPr>
                 <w:rStyle w:val="Hyperlink"/>
@@ -682,7 +682,7 @@
                 <w:noProof/>
                 <w:webHidden/>
               </w:rPr>
-              <w:instrText xml:space="preserve"> PAGEREF _Toc233723503 \h </w:instrText>
+              <w:instrText xml:space="preserve"> PAGEREF _Toc233787929 \h </w:instrText>
             </w:r>
             <w:r>
               <w:rPr>
@@ -726,7 +726,7 @@
               <w:lang w:eastAsia="en-IN" w:bidi="gu-IN"/>
             </w:rPr>
           </w:pPr>
-          <w:hyperlink w:anchor="_Toc233723504" w:history="1">
+          <w:hyperlink w:anchor="_Toc233787930" w:history="1">
             <w:r>
               <w:rPr>
                 <w:rStyle w:val="Hyperlink"/>
@@ -754,7 +754,7 @@
                 <w:noProof/>
                 <w:webHidden/>
               </w:rPr>
-              <w:instrText xml:space="preserve"> PAGEREF _Toc233723504 \h </w:instrText>
+              <w:instrText xml:space="preserve"> PAGEREF _Toc233787930 \h </w:instrText>
             </w:r>
             <w:r>
               <w:rPr>
@@ -798,7 +798,7 @@
               <w:lang w:eastAsia="en-IN" w:bidi="gu-IN"/>
             </w:rPr>
           </w:pPr>
-          <w:hyperlink w:anchor="_Toc233723505" w:history="1">
+          <w:hyperlink w:anchor="_Toc233787931" w:history="1">
             <w:r>
               <w:rPr>
                 <w:rStyle w:val="Hyperlink"/>
@@ -826,7 +826,7 @@
                 <w:noProof/>
                 <w:webHidden/>
               </w:rPr>
-              <w:instrText xml:space="preserve"> PAGEREF _Toc233723505 \h </w:instrText>
+              <w:instrText xml:space="preserve"> PAGEREF _Toc233787931 \h </w:instrText>
             </w:r>
             <w:r>
               <w:rPr>
@@ -870,7 +870,7 @@
               <w:lang w:eastAsia="en-IN" w:bidi="gu-IN"/>
             </w:rPr>
           </w:pPr>
-          <w:hyperlink w:anchor="_Toc233723506" w:history="1">
+          <w:hyperlink w:anchor="_Toc233787932" w:history="1">
             <w:r>
               <w:rPr>
                 <w:rStyle w:val="Hyperlink"/>
@@ -898,7 +898,7 @@
                 <w:noProof/>
                 <w:webHidden/>
               </w:rPr>
-              <w:instrText xml:space="preserve"> PAGEREF _Toc233723506 \h </w:instrText>
+              <w:instrText xml:space="preserve"> PAGEREF _Toc233787932 \h </w:instrText>
             </w:r>
             <w:r>
               <w:rPr>
@@ -942,7 +942,7 @@
               <w:lang w:eastAsia="en-IN" w:bidi="gu-IN"/>
             </w:rPr>
           </w:pPr>
-          <w:hyperlink w:anchor="_Toc233723507" w:history="1">
+          <w:hyperlink w:anchor="_Toc233787933" w:history="1">
             <w:r>
               <w:rPr>
                 <w:rStyle w:val="Hyperlink"/>
@@ -969,7 +969,7 @@
                 <w:noProof/>
                 <w:webHidden/>
               </w:rPr>
-              <w:instrText xml:space="preserve"> PAGEREF _Toc233723507 \h </w:instrText>
+              <w:instrText xml:space="preserve"> PAGEREF _Toc233787933 \h </w:instrText>
             </w:r>
             <w:r>
               <w:rPr>
@@ -1013,7 +1013,7 @@
               <w:lang w:eastAsia="en-IN" w:bidi="gu-IN"/>
             </w:rPr>
           </w:pPr>
-          <w:hyperlink w:anchor="_Toc233723508" w:history="1">
+          <w:hyperlink w:anchor="_Toc233787934" w:history="1">
             <w:r>
               <w:rPr>
                 <w:rStyle w:val="Hyperlink"/>
@@ -1040,7 +1040,7 @@
                 <w:noProof/>
                 <w:webHidden/>
               </w:rPr>
-              <w:instrText xml:space="preserve"> PAGEREF _Toc233723508 \h </w:instrText>
+              <w:instrText xml:space="preserve"> PAGEREF _Toc233787934 \h </w:instrText>
             </w:r>
             <w:r>
               <w:rPr>
@@ -1084,7 +1084,7 @@
               <w:lang w:eastAsia="en-IN" w:bidi="gu-IN"/>
             </w:rPr>
           </w:pPr>
-          <w:hyperlink w:anchor="_Toc233723509" w:history="1">
+          <w:hyperlink w:anchor="_Toc233787935" w:history="1">
             <w:r>
               <w:rPr>
                 <w:rStyle w:val="Hyperlink"/>
@@ -1111,7 +1111,7 @@
                 <w:noProof/>
                 <w:webHidden/>
               </w:rPr>
-              <w:instrText xml:space="preserve"> PAGEREF _Toc233723509 \h </w:instrText>
+              <w:instrText xml:space="preserve"> PAGEREF _Toc233787935 \h </w:instrText>
             </w:r>
             <w:r>
               <w:rPr>
@@ -1155,7 +1155,7 @@
               <w:lang w:eastAsia="en-IN" w:bidi="gu-IN"/>
             </w:rPr>
           </w:pPr>
-          <w:hyperlink w:anchor="_Toc233723510" w:history="1">
+          <w:hyperlink w:anchor="_Toc233787936" w:history="1">
             <w:r>
               <w:rPr>
                 <w:rStyle w:val="Hyperlink"/>
@@ -1182,7 +1182,7 @@
                 <w:noProof/>
                 <w:webHidden/>
               </w:rPr>
-              <w:instrText xml:space="preserve"> PAGEREF _Toc233723510 \h </w:instrText>
+              <w:instrText xml:space="preserve"> PAGEREF _Toc233787936 \h </w:instrText>
             </w:r>
             <w:r>
               <w:rPr>
@@ -1226,7 +1226,7 @@
               <w:lang w:eastAsia="en-IN" w:bidi="gu-IN"/>
             </w:rPr>
           </w:pPr>
-          <w:hyperlink w:anchor="_Toc233723511" w:history="1">
+          <w:hyperlink w:anchor="_Toc233787937" w:history="1">
             <w:r>
               <w:rPr>
                 <w:rStyle w:val="Hyperlink"/>
@@ -1253,7 +1253,7 @@
                 <w:noProof/>
                 <w:webHidden/>
               </w:rPr>
-              <w:instrText xml:space="preserve"> PAGEREF _Toc233723511 \h </w:instrText>
+              <w:instrText xml:space="preserve"> PAGEREF _Toc233787937 \h </w:instrText>
             </w:r>
             <w:r>
               <w:rPr>
@@ -1297,7 +1297,7 @@
               <w:lang w:eastAsia="en-IN" w:bidi="gu-IN"/>
             </w:rPr>
           </w:pPr>
-          <w:hyperlink w:anchor="_Toc233723512" w:history="1">
+          <w:hyperlink w:anchor="_Toc233787938" w:history="1">
             <w:r>
               <w:rPr>
                 <w:rStyle w:val="Hyperlink"/>
@@ -1324,7 +1324,7 @@
                 <w:noProof/>
                 <w:webHidden/>
               </w:rPr>
-              <w:instrText xml:space="preserve"> PAGEREF _Toc233723512 \h </w:instrText>
+              <w:instrText xml:space="preserve"> PAGEREF _Toc233787938 \h </w:instrText>
             </w:r>
             <w:r>
               <w:rPr>
@@ -1368,7 +1368,7 @@
               <w:lang w:eastAsia="en-IN" w:bidi="gu-IN"/>
             </w:rPr>
           </w:pPr>
-          <w:hyperlink w:anchor="_Toc233723513" w:history="1">
+          <w:hyperlink w:anchor="_Toc233787939" w:history="1">
             <w:r>
               <w:rPr>
                 <w:rStyle w:val="Hyperlink"/>
@@ -1395,7 +1395,7 @@
                 <w:noProof/>
                 <w:webHidden/>
               </w:rPr>
-              <w:instrText xml:space="preserve"> PAGEREF _Toc233723513 \h </w:instrText>
+              <w:instrText xml:space="preserve"> PAGEREF _Toc233787939 \h </w:instrText>
             </w:r>
             <w:r>
               <w:rPr>
@@ -1439,7 +1439,7 @@
               <w:lang w:eastAsia="en-IN" w:bidi="gu-IN"/>
             </w:rPr>
           </w:pPr>
-          <w:hyperlink w:anchor="_Toc233723514" w:history="1">
+          <w:hyperlink w:anchor="_Toc233787940" w:history="1">
             <w:r>
               <w:rPr>
                 <w:rStyle w:val="Hyperlink"/>
@@ -1466,7 +1466,7 @@
                 <w:noProof/>
                 <w:webHidden/>
               </w:rPr>
-              <w:instrText xml:space="preserve"> PAGEREF _Toc233723514 \h </w:instrText>
+              <w:instrText xml:space="preserve"> PAGEREF _Toc233787940 \h </w:instrText>
             </w:r>
             <w:r>
               <w:rPr>
@@ -1510,7 +1510,7 @@
               <w:lang w:eastAsia="en-IN" w:bidi="gu-IN"/>
             </w:rPr>
           </w:pPr>
-          <w:hyperlink w:anchor="_Toc233723515" w:history="1">
+          <w:hyperlink w:anchor="_Toc233787941" w:history="1">
             <w:r>
               <w:rPr>
                 <w:rStyle w:val="Hyperlink"/>
@@ -1537,7 +1537,7 @@
                 <w:noProof/>
                 <w:webHidden/>
               </w:rPr>
-              <w:instrText xml:space="preserve"> PAGEREF _Toc233723515 \h </w:instrText>
+              <w:instrText xml:space="preserve"> PAGEREF _Toc233787941 \h </w:instrText>
             </w:r>
             <w:r>
               <w:rPr>
@@ -1581,7 +1581,7 @@
               <w:lang w:eastAsia="en-IN" w:bidi="gu-IN"/>
             </w:rPr>
           </w:pPr>
-          <w:hyperlink w:anchor="_Toc233723516" w:history="1">
+          <w:hyperlink w:anchor="_Toc233787942" w:history="1">
             <w:r>
               <w:rPr>
                 <w:rStyle w:val="Hyperlink"/>
@@ -1608,7 +1608,7 @@
                 <w:noProof/>
                 <w:webHidden/>
               </w:rPr>
-              <w:instrText xml:space="preserve"> PAGEREF _Toc233723516 \h </w:instrText>
+              <w:instrText xml:space="preserve"> PAGEREF _Toc233787942 \h </w:instrText>
             </w:r>
             <w:r>
               <w:rPr>
@@ -1652,7 +1652,7 @@
               <w:lang w:eastAsia="en-IN" w:bidi="gu-IN"/>
             </w:rPr>
           </w:pPr>
-          <w:hyperlink w:anchor="_Toc233723517" w:history="1">
+          <w:hyperlink w:anchor="_Toc233787943" w:history="1">
             <w:r>
               <w:rPr>
                 <w:rStyle w:val="Hyperlink"/>
@@ -1679,7 +1679,7 @@
                 <w:noProof/>
                 <w:webHidden/>
               </w:rPr>
-              <w:instrText xml:space="preserve"> PAGEREF _Toc233723517 \h </w:instrText>
+              <w:instrText xml:space="preserve"> PAGEREF _Toc233787943 \h </w:instrText>
             </w:r>
             <w:r>
               <w:rPr>
@@ -1723,7 +1723,7 @@
               <w:lang w:eastAsia="en-IN" w:bidi="gu-IN"/>
             </w:rPr>
           </w:pPr>
-          <w:hyperlink w:anchor="_Toc233723518" w:history="1">
+          <w:hyperlink w:anchor="_Toc233787944" w:history="1">
             <w:r>
               <w:rPr>
                 <w:rStyle w:val="Hyperlink"/>
@@ -1750,7 +1750,7 @@
                 <w:noProof/>
                 <w:webHidden/>
               </w:rPr>
-              <w:instrText xml:space="preserve"> PAGEREF _Toc233723518 \h </w:instrText>
+              <w:instrText xml:space="preserve"> PAGEREF _Toc233787944 \h </w:instrText>
             </w:r>
             <w:r>
               <w:rPr>
@@ -1794,7 +1794,7 @@
               <w:lang w:eastAsia="en-IN" w:bidi="gu-IN"/>
             </w:rPr>
           </w:pPr>
-          <w:hyperlink w:anchor="_Toc233723519" w:history="1">
+          <w:hyperlink w:anchor="_Toc233787945" w:history="1">
             <w:r>
               <w:rPr>
                 <w:rStyle w:val="Hyperlink"/>
@@ -1821,7 +1821,7 @@
                 <w:noProof/>
                 <w:webHidden/>
               </w:rPr>
-              <w:instrText xml:space="preserve"> PAGEREF _Toc233723519 \h </w:instrText>
+              <w:instrText xml:space="preserve"> PAGEREF _Toc233787945 \h </w:instrText>
             </w:r>
             <w:r>
               <w:rPr>
@@ -1865,7 +1865,7 @@
               <w:lang w:eastAsia="en-IN" w:bidi="gu-IN"/>
             </w:rPr>
           </w:pPr>
-          <w:hyperlink w:anchor="_Toc233723520" w:history="1">
+          <w:hyperlink w:anchor="_Toc233787946" w:history="1">
             <w:r>
               <w:rPr>
                 <w:rStyle w:val="Hyperlink"/>
@@ -1892,7 +1892,7 @@
                 <w:noProof/>
                 <w:webHidden/>
               </w:rPr>
-              <w:instrText xml:space="preserve"> PAGEREF _Toc233723520 \h </w:instrText>
+              <w:instrText xml:space="preserve"> PAGEREF _Toc233787946 \h </w:instrText>
             </w:r>
             <w:r>
               <w:rPr>
@@ -1936,27 +1936,84 @@
               <w:lang w:eastAsia="en-IN" w:bidi="gu-IN"/>
             </w:rPr>
           </w:pPr>
-          <w:hyperlink w:anchor="_Toc233723521" w:history="1">
+          <w:hyperlink w:anchor="_Toc233787947" w:history="1">
             <w:r>
               <w:rPr>
                 <w:rStyle w:val="Hyperlink"/>
                 <w:noProof/>
               </w:rPr>
-              <w:t>How to protect Wo</w:t>
-            </w:r>
+              <w:t>How to protect Workbooks?</w:t>
+            </w:r>
+            <w:r>
+              <w:rPr>
+                <w:noProof/>
+                <w:webHidden/>
+              </w:rPr>
+              <w:tab/>
+            </w:r>
+            <w:r>
+              <w:rPr>
+                <w:noProof/>
+                <w:webHidden/>
+              </w:rPr>
+              <w:fldChar w:fldCharType="begin"/>
+            </w:r>
+            <w:r>
+              <w:rPr>
+                <w:noProof/>
+                <w:webHidden/>
+              </w:rPr>
+              <w:instrText xml:space="preserve"> PAGEREF _Toc233787947 \h </w:instrText>
+            </w:r>
+            <w:r>
+              <w:rPr>
+                <w:noProof/>
+                <w:webHidden/>
+              </w:rPr>
+            </w:r>
+            <w:r>
+              <w:rPr>
+                <w:noProof/>
+                <w:webHidden/>
+              </w:rPr>
+              <w:fldChar w:fldCharType="separate"/>
+            </w:r>
+            <w:r>
+              <w:rPr>
+                <w:noProof/>
+                <w:webHidden/>
+              </w:rPr>
+              <w:t>26</w:t>
+            </w:r>
+            <w:r>
+              <w:rPr>
+                <w:noProof/>
+                <w:webHidden/>
+              </w:rPr>
+              <w:fldChar w:fldCharType="end"/>
+            </w:r>
+          </w:hyperlink>
+        </w:p>
+        <w:p>
+          <w:pPr>
+            <w:pStyle w:val="TOC1"/>
+            <w:tabs>
+              <w:tab w:val="right" w:leader="dot" w:pos="9016"/>
+            </w:tabs>
+            <w:rPr>
+              <w:rFonts w:asciiTheme="minorHAnsi" w:eastAsiaTheme="minorEastAsia" w:hAnsiTheme="minorHAnsi"/>
+              <w:noProof/>
+              <w:szCs w:val="24"/>
+              <w:lang w:eastAsia="en-IN" w:bidi="gu-IN"/>
+            </w:rPr>
+          </w:pPr>
+          <w:hyperlink w:anchor="_Toc233787948" w:history="1">
             <w:r>
               <w:rPr>
                 <w:rStyle w:val="Hyperlink"/>
                 <w:noProof/>
               </w:rPr>
-              <w:t>r</w:t>
-            </w:r>
-            <w:r>
-              <w:rPr>
-                <w:rStyle w:val="Hyperlink"/>
-                <w:noProof/>
-              </w:rPr>
-              <w:t>kbooks?</w:t>
+              <w:t>Project 1: Dashboard</w:t>
             </w:r>
             <w:r>
               <w:rPr>
@@ -1977,7 +2034,7 @@
                 <w:noProof/>
                 <w:webHidden/>
               </w:rPr>
-              <w:instrText xml:space="preserve"> PAGEREF _Toc233723521 \h </w:instrText>
+              <w:instrText xml:space="preserve"> PAGEREF _Toc233787948 \h </w:instrText>
             </w:r>
             <w:r>
               <w:rPr>
@@ -1997,7 +2054,7 @@
                 <w:noProof/>
                 <w:webHidden/>
               </w:rPr>
-              <w:t>26</w:t>
+              <w:t>27</w:t>
             </w:r>
             <w:r>
               <w:rPr>
@@ -2049,7 +2106,7 @@
         </w:numPr>
         <w:ind w:left="420" w:hanging="420"/>
       </w:pPr>
-      <w:bookmarkStart w:id="0" w:name="_Toc233723496"/>
+      <w:bookmarkStart w:id="0" w:name="_Toc233787922"/>
       <w:r>
         <w:t>Short Cuts</w:t>
       </w:r>
@@ -2083,6 +2140,111 @@
     <w:p>
       <w:pPr>
         <w:rPr>
+          <w:rFonts w:cs="Times New Roman"/>
+        </w:rPr>
+      </w:pPr>
+      <w:r>
+        <w:rPr>
+          <w:b/>
+          <w:bCs/>
+        </w:rPr>
+        <w:t>Ctrl + Shift + Arrow key (</w:t>
+      </w:r>
+      <w:r>
+        <w:rPr>
+          <w:rFonts w:ascii="Cambria Math" w:hAnsi="Cambria Math" w:cs="Cambria Math"/>
+          <w:b/>
+          <w:bCs/>
+        </w:rPr>
+        <w:t>⬇</w:t>
+      </w:r>
+      <w:proofErr w:type="gramStart"/>
+      <w:r>
+        <w:rPr>
+          <w:rFonts w:ascii="Cambria Math" w:hAnsi="Cambria Math" w:cs="Cambria Math"/>
+          <w:b/>
+          <w:bCs/>
+        </w:rPr>
+        <w:t>️,</w:t>
+      </w:r>
+      <w:r>
+        <w:rPr>
+          <w:rFonts w:ascii="Segoe UI Symbol" w:hAnsi="Segoe UI Symbol" w:cs="Segoe UI Symbol"/>
+          <w:b/>
+          <w:bCs/>
+        </w:rPr>
+        <w:t>➡️,⬆️,⬅</w:t>
+      </w:r>
+      <w:proofErr w:type="gramEnd"/>
+      <w:r>
+        <w:rPr>
+          <w:rFonts w:ascii="Segoe UI Symbol" w:hAnsi="Segoe UI Symbol" w:cs="Segoe UI Symbol"/>
+          <w:b/>
+          <w:bCs/>
+        </w:rPr>
+        <w:t>️):</w:t>
+      </w:r>
+      <w:r>
+        <w:rPr>
+          <w:rFonts w:ascii="Segoe UI Symbol" w:hAnsi="Segoe UI Symbol" w:cs="Segoe UI Symbol"/>
+        </w:rPr>
+        <w:t xml:space="preserve"> </w:t>
+      </w:r>
+      <w:r>
+        <w:rPr>
+          <w:rFonts w:cs="Times New Roman"/>
+        </w:rPr>
+        <w:t xml:space="preserve">To select </w:t>
+      </w:r>
+      <w:r>
+        <w:rPr>
+          <w:rFonts w:cs="Times New Roman"/>
+        </w:rPr>
+        <w:t>all content in particular column</w:t>
+      </w:r>
+    </w:p>
+    <w:p>
+      <w:pPr>
+        <w:rPr>
+          <w:rFonts w:cs="Times New Roman"/>
+        </w:rPr>
+      </w:pPr>
+      <w:r>
+        <w:rPr>
+          <w:rFonts w:cs="Times New Roman"/>
+          <w:b/>
+          <w:bCs/>
+        </w:rPr>
+        <w:t>Ctrl + Shift + U:</w:t>
+      </w:r>
+      <w:r>
+        <w:rPr>
+          <w:rFonts w:cs="Times New Roman"/>
+        </w:rPr>
+        <w:t xml:space="preserve"> </w:t>
+      </w:r>
+      <w:r>
+        <w:rPr>
+          <w:rFonts w:cs="Times New Roman"/>
+        </w:rPr>
+        <w:t xml:space="preserve">To Expand Formula </w:t>
+      </w:r>
+      <w:r>
+        <w:rPr>
+          <w:rFonts w:cs="Times New Roman"/>
+        </w:rPr>
+        <w:t>Input box</w:t>
+      </w:r>
+      <w:r>
+        <w:rPr>
+          <w:rFonts w:cs="Times New Roman"/>
+        </w:rPr>
+        <w:t xml:space="preserve"> </w:t>
+      </w:r>
+    </w:p>
+    <w:p>
+      <w:pPr>
+        <w:rPr>
           <w:lang w:val="en-US"/>
         </w:rPr>
       </w:pPr>
@@ -2100,7 +2262,7 @@
           <w:lang w:val="en-US"/>
         </w:rPr>
       </w:pPr>
-      <w:bookmarkStart w:id="1" w:name="_Toc233723497"/>
+      <w:bookmarkStart w:id="1" w:name="_Toc233787923"/>
       <w:r>
         <w:rPr>
           <w:lang w:val="en-US"/>
@@ -2147,7 +2309,7 @@
           <w:lang w:val="en-US"/>
         </w:rPr>
       </w:pPr>
-      <w:bookmarkStart w:id="2" w:name="_Toc233723498"/>
+      <w:bookmarkStart w:id="2" w:name="_Toc233787924"/>
       <w:r>
         <w:rPr>
           <w:lang w:val="en-US"/>
@@ -2258,7 +2420,7 @@
           <w:lang w:val="en-US"/>
         </w:rPr>
       </w:pPr>
-      <w:bookmarkStart w:id="3" w:name="_Toc233723499"/>
+      <w:bookmarkStart w:id="3" w:name="_Toc233787925"/>
       <w:r>
         <w:rPr>
           <w:lang w:val="en-US"/>
@@ -2408,7 +2570,7 @@
           <w:lang w:val="en-US"/>
         </w:rPr>
       </w:pPr>
-      <w:bookmarkStart w:id="4" w:name="_Toc233723500"/>
+      <w:bookmarkStart w:id="4" w:name="_Toc233787926"/>
       <w:r>
         <w:rPr>
           <w:lang w:val="en-US"/>
@@ -2686,7 +2848,7 @@
         </w:rPr>
         <w:br w:type="page"/>
       </w:r>
-      <w:bookmarkStart w:id="5" w:name="_Toc233723501"/>
+      <w:bookmarkStart w:id="5" w:name="_Toc233787927"/>
       <w:r>
         <w:rPr>
           <w:lang w:val="en-US"/>
@@ -3206,7 +3368,7 @@
         </w:rPr>
         <w:br w:type="page"/>
       </w:r>
-      <w:bookmarkStart w:id="6" w:name="_Toc233723502"/>
+      <w:bookmarkStart w:id="6" w:name="_Toc233787928"/>
       <w:r>
         <w:rPr>
           <w:lang w:val="en-US"/>
@@ -3866,7 +4028,7 @@
           <w:lang w:val="en-US"/>
         </w:rPr>
       </w:pPr>
-      <w:bookmarkStart w:id="7" w:name="_Toc233723503"/>
+      <w:bookmarkStart w:id="7" w:name="_Toc233787929"/>
       <w:r>
         <w:rPr>
           <w:lang w:val="en-US"/>
@@ -3889,7 +4051,7 @@
           <w:lang w:val="en-US"/>
         </w:rPr>
       </w:pPr>
-      <w:bookmarkStart w:id="8" w:name="_Toc233723504"/>
+      <w:bookmarkStart w:id="8" w:name="_Toc233787930"/>
       <w:r>
         <w:rPr>
           <w:lang w:val="en-US"/>
@@ -4292,7 +4454,7 @@
           <w:lang w:val="en-US"/>
         </w:rPr>
       </w:pPr>
-      <w:bookmarkStart w:id="9" w:name="_Toc233723505"/>
+      <w:bookmarkStart w:id="9" w:name="_Toc233787931"/>
       <w:r>
         <w:rPr>
           <w:lang w:val="en-US"/>
@@ -4843,7 +5005,7 @@
           <w:lang w:val="en-US"/>
         </w:rPr>
       </w:pPr>
-      <w:bookmarkStart w:id="10" w:name="_Toc233723506"/>
+      <w:bookmarkStart w:id="10" w:name="_Toc233787932"/>
       <w:r>
         <w:rPr>
           <w:lang w:val="en-US"/>
@@ -5201,7 +5363,7 @@
       <w:pPr>
         <w:pStyle w:val="Heading2"/>
       </w:pPr>
-      <w:bookmarkStart w:id="11" w:name="_Toc233723507"/>
+      <w:bookmarkStart w:id="11" w:name="_Toc233787933"/>
       <w:r>
         <w:t>2.4 Math Functions</w:t>
       </w:r>
@@ -5613,7 +5775,7 @@
       <w:pPr>
         <w:pStyle w:val="Heading2"/>
       </w:pPr>
-      <w:bookmarkStart w:id="12" w:name="_Toc233723508"/>
+      <w:bookmarkStart w:id="12" w:name="_Toc233787934"/>
       <w:r>
         <w:t>2.5 Statistical Functions</w:t>
       </w:r>
@@ -6127,7 +6289,7 @@
       <w:pPr>
         <w:pStyle w:val="Heading2"/>
       </w:pPr>
-      <w:bookmarkStart w:id="13" w:name="_Toc233723509"/>
+      <w:bookmarkStart w:id="13" w:name="_Toc233787935"/>
       <w:r>
         <w:t>2.6 Array</w:t>
       </w:r>
@@ -6828,7 +6990,7 @@
       <w:pPr>
         <w:pStyle w:val="Heading2"/>
       </w:pPr>
-      <w:bookmarkStart w:id="14" w:name="_Toc233723510"/>
+      <w:bookmarkStart w:id="14" w:name="_Toc233787936"/>
       <w:r>
         <w:t>2.7 Lookup Functions</w:t>
       </w:r>
@@ -7942,7 +8104,7 @@
       <w:pPr>
         <w:pStyle w:val="Heading2"/>
       </w:pPr>
-      <w:bookmarkStart w:id="15" w:name="_Toc233723511"/>
+      <w:bookmarkStart w:id="15" w:name="_Toc233787937"/>
       <w:r>
         <w:t>2.8 TEXT Functions</w:t>
       </w:r>
@@ -9331,7 +9493,7 @@
       <w:pPr>
         <w:pStyle w:val="Heading2"/>
       </w:pPr>
-      <w:bookmarkStart w:id="16" w:name="_Toc233723512"/>
+      <w:bookmarkStart w:id="16" w:name="_Toc233787938"/>
       <w:r>
         <w:t>2.9 Date &amp; Time Functions</w:t>
       </w:r>
@@ -9529,7 +9691,7 @@
       <w:pPr>
         <w:pStyle w:val="Heading1"/>
       </w:pPr>
-      <w:bookmarkStart w:id="17" w:name="_Toc233723513"/>
+      <w:bookmarkStart w:id="17" w:name="_Toc233787939"/>
       <w:r>
         <w:lastRenderedPageBreak/>
         <w:t xml:space="preserve">3. </w:t>
@@ -9544,7 +9706,7 @@
       <w:pPr>
         <w:pStyle w:val="Heading2"/>
       </w:pPr>
-      <w:bookmarkStart w:id="18" w:name="_Toc233723514"/>
+      <w:bookmarkStart w:id="18" w:name="_Toc233787940"/>
       <w:r>
         <w:t>3.3 Charts – Statistics</w:t>
       </w:r>
@@ -9614,7 +9776,7 @@
       <w:pPr>
         <w:pStyle w:val="Heading2"/>
       </w:pPr>
-      <w:bookmarkStart w:id="19" w:name="_Toc233723515"/>
+      <w:bookmarkStart w:id="19" w:name="_Toc233787941"/>
       <w:r>
         <w:t>3.4 Sparklines</w:t>
       </w:r>
@@ -9679,7 +9841,7 @@
       <w:pPr>
         <w:pStyle w:val="Heading1"/>
       </w:pPr>
-      <w:bookmarkStart w:id="20" w:name="_Toc233723516"/>
+      <w:bookmarkStart w:id="20" w:name="_Toc233787942"/>
       <w:r>
         <w:lastRenderedPageBreak/>
         <w:t xml:space="preserve">4. </w:t>
@@ -9695,7 +9857,7 @@
       <w:pPr>
         <w:pStyle w:val="Heading2"/>
       </w:pPr>
-      <w:bookmarkStart w:id="21" w:name="_Toc233723517"/>
+      <w:bookmarkStart w:id="21" w:name="_Toc233787943"/>
       <w:r>
         <w:t>4.1 Tables</w:t>
       </w:r>
@@ -10478,7 +10640,7 @@
       <w:pPr>
         <w:pStyle w:val="Heading2"/>
       </w:pPr>
-      <w:bookmarkStart w:id="22" w:name="_Toc233723518"/>
+      <w:bookmarkStart w:id="22" w:name="_Toc233787944"/>
       <w:r>
         <w:t>4.3 Collaboration</w:t>
       </w:r>
@@ -10490,7 +10652,7 @@
       <w:pPr>
         <w:pStyle w:val="Heading3"/>
       </w:pPr>
-      <w:bookmarkStart w:id="23" w:name="_Toc233723519"/>
+      <w:bookmarkStart w:id="23" w:name="_Toc233787945"/>
       <w:r>
         <w:t>Data Validation</w:t>
       </w:r>
@@ -10518,6 +10680,9 @@
         <w:jc w:val="center"/>
       </w:pPr>
       <w:r>
+        <w:rPr>
+          <w:noProof/>
+        </w:rPr>
         <w:drawing>
           <wp:inline distT="0" distB="0" distL="0" distR="0" wp14:anchorId="3489D399" wp14:editId="26CE0C87">
             <wp:extent cx="5731510" cy="2358390"/>
@@ -10595,6 +10760,9 @@
     </w:p>
     <w:p>
       <w:r>
+        <w:rPr>
+          <w:noProof/>
+        </w:rPr>
         <w:drawing>
           <wp:inline distT="0" distB="0" distL="0" distR="0" wp14:anchorId="43BC490D" wp14:editId="1595731C">
             <wp:extent cx="3839308" cy="1443890"/>
@@ -10712,7 +10880,7 @@
           </mc:Choice>
           <mc:Fallback>
             <w:pict>
-              <v:shapetype w14:anchorId="2CF62D91" id="_x0000_t38" coordsize="21600,21600" o:spt="38" o:oned="t" path="m,c@0,0@1,5400@1,10800@1,16200@2,21600,21600,21600e" filled="f">
+              <v:shapetype w14:anchorId="23A1462A" id="_x0000_t38" coordsize="21600,21600" o:spt="38" o:oned="t" path="m,c@0,0@1,5400@1,10800@1,16200@2,21600,21600,21600e" filled="f">
                 <v:formulas>
                   <v:f eqn="mid #0 0"/>
                   <v:f eqn="val #0"/>
@@ -10797,7 +10965,7 @@
           </mc:Choice>
           <mc:Fallback>
             <w:pict>
-              <v:line w14:anchorId="325F175A" id="Straight Connector 3" o:spid="_x0000_s1026" style="position:absolute;z-index:251661312;visibility:visible;mso-wrap-style:square;mso-wrap-distance-left:9pt;mso-wrap-distance-top:0;mso-wrap-distance-right:9pt;mso-wrap-distance-bottom:0;mso-position-horizontal:absolute;mso-position-horizontal-relative:text;mso-position-vertical:absolute;mso-position-vertical-relative:text" from="45.65pt,16.7pt" to="57.2pt,16.7pt" o:gfxdata="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" strokecolor="#e00" strokeweight="6pt">
+              <v:line w14:anchorId="500D1B6E" id="Straight Connector 3" o:spid="_x0000_s1026" style="position:absolute;z-index:251661312;visibility:visible;mso-wrap-style:square;mso-wrap-distance-left:9pt;mso-wrap-distance-top:0;mso-wrap-distance-right:9pt;mso-wrap-distance-bottom:0;mso-position-horizontal:absolute;mso-position-horizontal-relative:text;mso-position-vertical:absolute;mso-position-vertical-relative:text" from="45.65pt,16.7pt" to="57.2pt,16.7pt" o:gfxdata="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" strokecolor="#e00" strokeweight="6pt">
                 <v:stroke joinstyle="miter"/>
               </v:line>
             </w:pict>
@@ -10805,6 +10973,9 @@
         </mc:AlternateContent>
       </w:r>
       <w:r>
+        <w:rPr>
+          <w:noProof/>
+        </w:rPr>
         <w:drawing>
           <wp:inline distT="0" distB="0" distL="0" distR="0" wp14:anchorId="28E36C82" wp14:editId="47113B6F">
             <wp:extent cx="5568462" cy="1578739"/>
@@ -10850,7 +11021,7 @@
       <w:pPr>
         <w:pStyle w:val="Heading3"/>
       </w:pPr>
-      <w:bookmarkStart w:id="24" w:name="_Toc233723520"/>
+      <w:bookmarkStart w:id="24" w:name="_Toc233787946"/>
       <w:r>
         <w:t xml:space="preserve">How to Protect </w:t>
       </w:r>
@@ -10881,6 +11052,9 @@
         <w:jc w:val="center"/>
       </w:pPr>
       <w:r>
+        <w:rPr>
+          <w:noProof/>
+        </w:rPr>
         <w:lastRenderedPageBreak/>
         <w:drawing>
           <wp:inline distT="0" distB="0" distL="0" distR="0" wp14:anchorId="5703D327" wp14:editId="5E07D132">
@@ -10935,6 +11109,9 @@
     </w:p>
     <w:p>
       <w:r>
+        <w:rPr>
+          <w:noProof/>
+        </w:rPr>
         <w:drawing>
           <wp:inline distT="0" distB="0" distL="0" distR="0" wp14:anchorId="6001BD1E" wp14:editId="761CDAAB">
             <wp:extent cx="5731510" cy="2562225"/>
@@ -11047,6 +11224,9 @@
     </w:p>
     <w:p>
       <w:r>
+        <w:rPr>
+          <w:noProof/>
+        </w:rPr>
         <w:drawing>
           <wp:inline distT="0" distB="0" distL="0" distR="0" wp14:anchorId="1EC5B47F" wp14:editId="18152539">
             <wp:extent cx="5731510" cy="2661920"/>
@@ -11090,6 +11270,9 @@
         <w:jc w:val="center"/>
       </w:pPr>
       <w:r>
+        <w:rPr>
+          <w:noProof/>
+        </w:rPr>
         <w:drawing>
           <wp:inline distT="0" distB="0" distL="0" distR="0" wp14:anchorId="723279C6" wp14:editId="32F73440">
             <wp:extent cx="2296886" cy="2695819"/>
@@ -11133,7 +11316,7 @@
       <w:pPr>
         <w:pStyle w:val="Heading3"/>
       </w:pPr>
-      <w:bookmarkStart w:id="25" w:name="_Toc233723521"/>
+      <w:bookmarkStart w:id="25" w:name="_Toc233787947"/>
       <w:r>
         <w:t>How to protect Workbooks?</w:t>
       </w:r>
@@ -11188,6 +11371,9 @@
         <w:jc w:val="center"/>
       </w:pPr>
       <w:r>
+        <w:rPr>
+          <w:noProof/>
+        </w:rPr>
         <w:lastRenderedPageBreak/>
         <w:drawing>
           <wp:inline distT="0" distB="0" distL="0" distR="0" wp14:anchorId="5EA8E644" wp14:editId="28751FD6">
@@ -11238,6 +11424,9 @@
         <w:jc w:val="center"/>
       </w:pPr>
       <w:r>
+        <w:rPr>
+          <w:noProof/>
+        </w:rPr>
         <w:drawing>
           <wp:inline distT="0" distB="0" distL="0" distR="0" wp14:anchorId="25AED792" wp14:editId="72F6D701">
             <wp:extent cx="1785257" cy="2478892"/>
@@ -11263,6 +11452,1394 @@
                     <a:xfrm>
                       <a:off x="0" y="0"/>
                       <a:ext cx="1793010" cy="2489657"/>
+                    </a:xfrm>
+                    <a:prstGeom prst="rect">
+                      <a:avLst/>
+                    </a:prstGeom>
+                  </pic:spPr>
+                </pic:pic>
+              </a:graphicData>
+            </a:graphic>
+          </wp:inline>
+        </w:drawing>
+      </w:r>
+    </w:p>
+    <w:p/>
+    <w:p/>
+    <w:p/>
+    <w:p>
+      <w:pPr>
+        <w:pStyle w:val="Heading1"/>
+      </w:pPr>
+      <w:bookmarkStart w:id="26" w:name="_Toc233787948"/>
+      <w:r>
+        <w:t>Project 1: Dash</w:t>
+      </w:r>
+      <w:r>
+        <w:t>b</w:t>
+      </w:r>
+      <w:r>
+        <w:t>oard</w:t>
+      </w:r>
+      <w:bookmarkEnd w:id="26"/>
+    </w:p>
+    <w:p/>
+    <w:p>
+      <w:pPr>
+        <w:rPr>
+          <w:b/>
+          <w:bCs/>
+          <w:u w:val="single"/>
+        </w:rPr>
+      </w:pPr>
+      <w:r>
+        <w:sym w:font="Wingdings" w:char="F0E8"/>
+      </w:r>
+      <w:r>
+        <w:t xml:space="preserve"> </w:t>
+      </w:r>
+      <w:proofErr w:type="gramStart"/>
+      <w:r>
+        <w:rPr>
+          <w:b/>
+          <w:bCs/>
+          <w:u w:val="single"/>
+        </w:rPr>
+        <w:t>SEARCH(</w:t>
+      </w:r>
+      <w:proofErr w:type="gramEnd"/>
+      <w:r>
+        <w:rPr>
+          <w:b/>
+          <w:bCs/>
+          <w:u w:val="single"/>
+        </w:rPr>
+        <w:t>):</w:t>
+      </w:r>
+    </w:p>
+    <w:p>
+      <w:r>
+        <w:t xml:space="preserve">The </w:t>
+      </w:r>
+      <w:proofErr w:type="gramStart"/>
+      <w:r>
+        <w:rPr>
+          <w:b/>
+          <w:bCs/>
+        </w:rPr>
+        <w:t>SEARCH(</w:t>
+      </w:r>
+      <w:proofErr w:type="gramEnd"/>
+      <w:r>
+        <w:rPr>
+          <w:b/>
+          <w:bCs/>
+        </w:rPr>
+        <w:t>)</w:t>
+      </w:r>
+      <w:r>
+        <w:t xml:space="preserve"> function in Microsoft Excel finds the </w:t>
+      </w:r>
+      <w:r>
+        <w:rPr>
+          <w:b/>
+          <w:bCs/>
+        </w:rPr>
+        <w:t>position of one text string inside another</w:t>
+      </w:r>
+      <w:r>
+        <w:t xml:space="preserve">. It is </w:t>
+      </w:r>
+      <w:r>
+        <w:rPr>
+          <w:b/>
+          <w:bCs/>
+        </w:rPr>
+        <w:t>not case-sensitive</w:t>
+      </w:r>
+      <w:r>
+        <w:t>.</w:t>
+      </w:r>
+    </w:p>
+    <w:tbl>
+      <w:tblPr>
+        <w:tblStyle w:val="TableGrid"/>
+        <w:tblW w:w="0" w:type="auto"/>
+        <w:tblLook w:val="04A0" w:firstRow="1" w:lastRow="0" w:firstColumn="1" w:lastColumn="0" w:noHBand="0" w:noVBand="1"/>
+      </w:tblPr>
+      <w:tblGrid>
+        <w:gridCol w:w="9016"/>
+      </w:tblGrid>
+      <w:tr>
+        <w:tc>
+          <w:tcPr>
+            <w:tcW w:w="9016" w:type="dxa"/>
+            <w:shd w:val="clear" w:color="auto" w:fill="E7E6E6" w:themeFill="background2"/>
+          </w:tcPr>
+          <w:p>
+            <w:r>
+              <w:t>=</w:t>
+            </w:r>
+            <w:proofErr w:type="gramStart"/>
+            <w:r>
+              <w:t>SEARCH(</w:t>
+            </w:r>
+            <w:proofErr w:type="spellStart"/>
+            <w:proofErr w:type="gramEnd"/>
+            <w:r>
+              <w:t>find_text</w:t>
+            </w:r>
+            <w:proofErr w:type="spellEnd"/>
+            <w:r>
+              <w:t xml:space="preserve">, </w:t>
+            </w:r>
+            <w:proofErr w:type="spellStart"/>
+            <w:r>
+              <w:t>within_text</w:t>
+            </w:r>
+            <w:proofErr w:type="spellEnd"/>
+            <w:r>
+              <w:t>, [</w:t>
+            </w:r>
+            <w:proofErr w:type="spellStart"/>
+            <w:r>
+              <w:t>start_num</w:t>
+            </w:r>
+            <w:proofErr w:type="spellEnd"/>
+            <w:r>
+              <w:t>])</w:t>
+            </w:r>
+          </w:p>
+        </w:tc>
+      </w:tr>
+    </w:tbl>
+    <w:p/>
+    <w:p>
+      <w:pPr>
+        <w:rPr>
+          <w:b/>
+          <w:bCs/>
+        </w:rPr>
+      </w:pPr>
+      <w:r>
+        <w:rPr>
+          <w:b/>
+          <w:bCs/>
+        </w:rPr>
+        <w:t xml:space="preserve">Arguments: </w:t>
+      </w:r>
+    </w:p>
+    <w:p>
+      <w:pPr>
+        <w:pStyle w:val="ListParagraph"/>
+        <w:numPr>
+          <w:ilvl w:val="0"/>
+          <w:numId w:val="19"/>
+        </w:numPr>
+        <w:spacing w:after="0" w:line="240" w:lineRule="auto"/>
+        <w:rPr>
+          <w:rFonts w:eastAsia="Times New Roman" w:cs="Times New Roman"/>
+          <w:kern w:val="0"/>
+          <w:szCs w:val="24"/>
+          <w:lang w:eastAsia="en-IN" w:bidi="gu-IN"/>
+          <w14:ligatures w14:val="none"/>
+        </w:rPr>
+      </w:pPr>
+      <w:proofErr w:type="spellStart"/>
+      <w:r>
+        <w:rPr>
+          <w:rFonts w:eastAsia="Times New Roman" w:cs="Times New Roman"/>
+          <w:b/>
+          <w:bCs/>
+          <w:kern w:val="0"/>
+          <w:szCs w:val="24"/>
+          <w:lang w:eastAsia="en-IN" w:bidi="gu-IN"/>
+          <w14:ligatures w14:val="none"/>
+        </w:rPr>
+        <w:t>find_text</w:t>
+      </w:r>
+      <w:proofErr w:type="spellEnd"/>
+      <w:r>
+        <w:rPr>
+          <w:rFonts w:eastAsia="Times New Roman" w:cs="Times New Roman"/>
+          <w:kern w:val="0"/>
+          <w:szCs w:val="24"/>
+          <w:lang w:eastAsia="en-IN" w:bidi="gu-IN"/>
+          <w14:ligatures w14:val="none"/>
+        </w:rPr>
+        <w:t xml:space="preserve"> – The text you want to find. </w:t>
+      </w:r>
+    </w:p>
+    <w:p>
+      <w:pPr>
+        <w:pStyle w:val="ListParagraph"/>
+        <w:numPr>
+          <w:ilvl w:val="0"/>
+          <w:numId w:val="19"/>
+        </w:numPr>
+        <w:spacing w:after="0" w:line="240" w:lineRule="auto"/>
+        <w:rPr>
+          <w:rFonts w:eastAsia="Times New Roman" w:cs="Times New Roman"/>
+          <w:kern w:val="0"/>
+          <w:szCs w:val="24"/>
+          <w:lang w:eastAsia="en-IN" w:bidi="gu-IN"/>
+          <w14:ligatures w14:val="none"/>
+        </w:rPr>
+      </w:pPr>
+      <w:proofErr w:type="spellStart"/>
+      <w:r>
+        <w:rPr>
+          <w:rFonts w:eastAsia="Times New Roman" w:cs="Times New Roman"/>
+          <w:b/>
+          <w:bCs/>
+          <w:kern w:val="0"/>
+          <w:szCs w:val="24"/>
+          <w:lang w:eastAsia="en-IN" w:bidi="gu-IN"/>
+          <w14:ligatures w14:val="none"/>
+        </w:rPr>
+        <w:lastRenderedPageBreak/>
+        <w:t>within_text</w:t>
+      </w:r>
+      <w:proofErr w:type="spellEnd"/>
+      <w:r>
+        <w:rPr>
+          <w:rFonts w:eastAsia="Times New Roman" w:cs="Times New Roman"/>
+          <w:kern w:val="0"/>
+          <w:szCs w:val="24"/>
+          <w:lang w:eastAsia="en-IN" w:bidi="gu-IN"/>
+          <w14:ligatures w14:val="none"/>
+        </w:rPr>
+        <w:t xml:space="preserve"> – The text in which you want to search. </w:t>
+      </w:r>
+    </w:p>
+    <w:p>
+      <w:pPr>
+        <w:pStyle w:val="ListParagraph"/>
+        <w:numPr>
+          <w:ilvl w:val="0"/>
+          <w:numId w:val="19"/>
+        </w:numPr>
+      </w:pPr>
+      <w:proofErr w:type="spellStart"/>
+      <w:r>
+        <w:rPr>
+          <w:rFonts w:eastAsia="Times New Roman" w:cs="Times New Roman"/>
+          <w:b/>
+          <w:bCs/>
+          <w:kern w:val="0"/>
+          <w:szCs w:val="24"/>
+          <w:lang w:eastAsia="en-IN" w:bidi="gu-IN"/>
+          <w14:ligatures w14:val="none"/>
+        </w:rPr>
+        <w:t>start_num</w:t>
+      </w:r>
+      <w:proofErr w:type="spellEnd"/>
+      <w:r>
+        <w:rPr>
+          <w:rFonts w:eastAsia="Times New Roman" w:cs="Times New Roman"/>
+          <w:kern w:val="0"/>
+          <w:szCs w:val="24"/>
+          <w:lang w:eastAsia="en-IN" w:bidi="gu-IN"/>
+          <w14:ligatures w14:val="none"/>
+        </w:rPr>
+        <w:t xml:space="preserve"> </w:t>
+      </w:r>
+      <w:r>
+        <w:rPr>
+          <w:rFonts w:eastAsia="Times New Roman" w:cs="Times New Roman"/>
+          <w:i/>
+          <w:iCs/>
+          <w:kern w:val="0"/>
+          <w:szCs w:val="24"/>
+          <w:lang w:eastAsia="en-IN" w:bidi="gu-IN"/>
+          <w14:ligatures w14:val="none"/>
+        </w:rPr>
+        <w:t>(optional)</w:t>
+      </w:r>
+      <w:r>
+        <w:rPr>
+          <w:rFonts w:eastAsia="Times New Roman" w:cs="Times New Roman"/>
+          <w:kern w:val="0"/>
+          <w:szCs w:val="24"/>
+          <w:lang w:eastAsia="en-IN" w:bidi="gu-IN"/>
+          <w14:ligatures w14:val="none"/>
+        </w:rPr>
+        <w:t xml:space="preserve"> – The position from which to start searching.</w:t>
+      </w:r>
+    </w:p>
+    <w:p/>
+    <w:p/>
+    <w:p>
+      <w:r>
+        <w:sym w:font="Wingdings" w:char="F0E8"/>
+      </w:r>
+      <w:r>
+        <w:t xml:space="preserve"> </w:t>
+      </w:r>
+      <w:proofErr w:type="gramStart"/>
+      <w:r>
+        <w:rPr>
+          <w:b/>
+          <w:bCs/>
+          <w:u w:val="single"/>
+        </w:rPr>
+        <w:t>FILTER(</w:t>
+      </w:r>
+      <w:proofErr w:type="gramEnd"/>
+      <w:r>
+        <w:rPr>
+          <w:b/>
+          <w:bCs/>
+          <w:u w:val="single"/>
+        </w:rPr>
+        <w:t>):</w:t>
+      </w:r>
+    </w:p>
+    <w:p>
+      <w:r>
+        <w:t xml:space="preserve">The </w:t>
+      </w:r>
+      <w:proofErr w:type="gramStart"/>
+      <w:r>
+        <w:t>FILTER(</w:t>
+      </w:r>
+      <w:proofErr w:type="gramEnd"/>
+      <w:r>
+        <w:t>) function returns only the rows or columns that meet a condition.</w:t>
+      </w:r>
+    </w:p>
+    <w:tbl>
+      <w:tblPr>
+        <w:tblStyle w:val="TableGrid"/>
+        <w:tblW w:w="0" w:type="auto"/>
+        <w:tblLook w:val="04A0" w:firstRow="1" w:lastRow="0" w:firstColumn="1" w:lastColumn="0" w:noHBand="0" w:noVBand="1"/>
+      </w:tblPr>
+      <w:tblGrid>
+        <w:gridCol w:w="9016"/>
+      </w:tblGrid>
+      <w:tr>
+        <w:tc>
+          <w:tcPr>
+            <w:tcW w:w="9016" w:type="dxa"/>
+            <w:shd w:val="clear" w:color="auto" w:fill="E7E6E6" w:themeFill="background2"/>
+          </w:tcPr>
+          <w:p>
+            <w:r>
+              <w:t>=</w:t>
+            </w:r>
+            <w:proofErr w:type="gramStart"/>
+            <w:r>
+              <w:t>FILTER(</w:t>
+            </w:r>
+            <w:proofErr w:type="gramEnd"/>
+            <w:r>
+              <w:t>array, include, [</w:t>
+            </w:r>
+            <w:proofErr w:type="spellStart"/>
+            <w:r>
+              <w:t>if_empty</w:t>
+            </w:r>
+            <w:proofErr w:type="spellEnd"/>
+            <w:r>
+              <w:t>])</w:t>
+            </w:r>
+          </w:p>
+        </w:tc>
+      </w:tr>
+    </w:tbl>
+    <w:p/>
+    <w:p>
+      <w:pPr>
+        <w:rPr>
+          <w:b/>
+          <w:bCs/>
+        </w:rPr>
+      </w:pPr>
+      <w:r>
+        <w:rPr>
+          <w:b/>
+          <w:bCs/>
+        </w:rPr>
+        <w:t>Arguments:</w:t>
+      </w:r>
+    </w:p>
+    <w:p>
+      <w:pPr>
+        <w:pStyle w:val="ListParagraph"/>
+        <w:numPr>
+          <w:ilvl w:val="0"/>
+          <w:numId w:val="19"/>
+        </w:numPr>
+        <w:spacing w:after="0" w:line="240" w:lineRule="auto"/>
+        <w:rPr>
+          <w:rFonts w:eastAsia="Times New Roman" w:cs="Times New Roman"/>
+          <w:kern w:val="0"/>
+          <w:szCs w:val="24"/>
+          <w:lang w:eastAsia="en-IN" w:bidi="gu-IN"/>
+          <w14:ligatures w14:val="none"/>
+        </w:rPr>
+      </w:pPr>
+      <w:r>
+        <w:rPr>
+          <w:rFonts w:eastAsia="Times New Roman" w:cs="Times New Roman"/>
+          <w:b/>
+          <w:bCs/>
+          <w:kern w:val="0"/>
+          <w:szCs w:val="24"/>
+          <w:lang w:eastAsia="en-IN" w:bidi="gu-IN"/>
+          <w14:ligatures w14:val="none"/>
+        </w:rPr>
+        <w:t>array</w:t>
+      </w:r>
+      <w:r>
+        <w:rPr>
+          <w:rFonts w:eastAsia="Times New Roman" w:cs="Times New Roman"/>
+          <w:kern w:val="0"/>
+          <w:szCs w:val="24"/>
+          <w:lang w:eastAsia="en-IN" w:bidi="gu-IN"/>
+          <w14:ligatures w14:val="none"/>
+        </w:rPr>
+        <w:t xml:space="preserve"> – Data to filter. </w:t>
+      </w:r>
+    </w:p>
+    <w:p>
+      <w:pPr>
+        <w:pStyle w:val="ListParagraph"/>
+        <w:numPr>
+          <w:ilvl w:val="0"/>
+          <w:numId w:val="19"/>
+        </w:numPr>
+        <w:spacing w:after="0" w:line="240" w:lineRule="auto"/>
+        <w:rPr>
+          <w:rFonts w:eastAsia="Times New Roman" w:cs="Times New Roman"/>
+          <w:kern w:val="0"/>
+          <w:szCs w:val="24"/>
+          <w:lang w:eastAsia="en-IN" w:bidi="gu-IN"/>
+          <w14:ligatures w14:val="none"/>
+        </w:rPr>
+      </w:pPr>
+      <w:r>
+        <w:rPr>
+          <w:rFonts w:eastAsia="Times New Roman" w:cs="Times New Roman"/>
+          <w:b/>
+          <w:bCs/>
+          <w:kern w:val="0"/>
+          <w:szCs w:val="24"/>
+          <w:lang w:eastAsia="en-IN" w:bidi="gu-IN"/>
+          <w14:ligatures w14:val="none"/>
+        </w:rPr>
+        <w:t>include</w:t>
+      </w:r>
+      <w:r>
+        <w:rPr>
+          <w:rFonts w:eastAsia="Times New Roman" w:cs="Times New Roman"/>
+          <w:kern w:val="0"/>
+          <w:szCs w:val="24"/>
+          <w:lang w:eastAsia="en-IN" w:bidi="gu-IN"/>
+          <w14:ligatures w14:val="none"/>
+        </w:rPr>
+        <w:t xml:space="preserve"> – Condition (TRUE/FALSE). </w:t>
+      </w:r>
+    </w:p>
+    <w:p>
+      <w:pPr>
+        <w:pStyle w:val="ListParagraph"/>
+        <w:numPr>
+          <w:ilvl w:val="0"/>
+          <w:numId w:val="19"/>
+        </w:numPr>
+        <w:rPr>
+          <w:b/>
+          <w:bCs/>
+        </w:rPr>
+      </w:pPr>
+      <w:proofErr w:type="spellStart"/>
+      <w:r>
+        <w:rPr>
+          <w:rFonts w:eastAsia="Times New Roman" w:cs="Times New Roman"/>
+          <w:b/>
+          <w:bCs/>
+          <w:kern w:val="0"/>
+          <w:szCs w:val="24"/>
+          <w:lang w:eastAsia="en-IN" w:bidi="gu-IN"/>
+          <w14:ligatures w14:val="none"/>
+        </w:rPr>
+        <w:t>if_empty</w:t>
+      </w:r>
+      <w:proofErr w:type="spellEnd"/>
+      <w:r>
+        <w:rPr>
+          <w:rFonts w:eastAsia="Times New Roman" w:cs="Times New Roman"/>
+          <w:kern w:val="0"/>
+          <w:szCs w:val="24"/>
+          <w:lang w:eastAsia="en-IN" w:bidi="gu-IN"/>
+          <w14:ligatures w14:val="none"/>
+        </w:rPr>
+        <w:t xml:space="preserve"> </w:t>
+      </w:r>
+      <w:r>
+        <w:rPr>
+          <w:rFonts w:eastAsia="Times New Roman" w:cs="Times New Roman"/>
+          <w:i/>
+          <w:iCs/>
+          <w:kern w:val="0"/>
+          <w:szCs w:val="24"/>
+          <w:lang w:eastAsia="en-IN" w:bidi="gu-IN"/>
+          <w14:ligatures w14:val="none"/>
+        </w:rPr>
+        <w:t>(optional)</w:t>
+      </w:r>
+      <w:r>
+        <w:rPr>
+          <w:rFonts w:eastAsia="Times New Roman" w:cs="Times New Roman"/>
+          <w:kern w:val="0"/>
+          <w:szCs w:val="24"/>
+          <w:lang w:eastAsia="en-IN" w:bidi="gu-IN"/>
+          <w14:ligatures w14:val="none"/>
+        </w:rPr>
+        <w:t xml:space="preserve"> – Value to return if nothing matches.</w:t>
+      </w:r>
+    </w:p>
+    <w:p/>
+    <w:p>
+      <w:r>
+        <w:sym w:font="Wingdings" w:char="F0E8"/>
+      </w:r>
+      <w:r>
+        <w:t xml:space="preserve"> </w:t>
+      </w:r>
+      <w:proofErr w:type="gramStart"/>
+      <w:r>
+        <w:rPr>
+          <w:b/>
+          <w:bCs/>
+          <w:u w:val="single"/>
+        </w:rPr>
+        <w:t>NOT(</w:t>
+      </w:r>
+      <w:proofErr w:type="gramEnd"/>
+      <w:r>
+        <w:rPr>
+          <w:b/>
+          <w:bCs/>
+          <w:u w:val="single"/>
+        </w:rPr>
+        <w:t>):</w:t>
+      </w:r>
+    </w:p>
+    <w:p>
+      <w:r>
+        <w:t xml:space="preserve">The </w:t>
+      </w:r>
+      <w:proofErr w:type="gramStart"/>
+      <w:r>
+        <w:t>NOT(</w:t>
+      </w:r>
+      <w:proofErr w:type="gramEnd"/>
+      <w:r>
+        <w:t>) function reverses a logical value.</w:t>
+      </w:r>
+    </w:p>
+    <w:p>
+      <w:pPr>
+        <w:numPr>
+          <w:ilvl w:val="0"/>
+          <w:numId w:val="21"/>
+        </w:numPr>
+      </w:pPr>
+      <w:r>
+        <w:t xml:space="preserve">TRUE → FALSE </w:t>
+      </w:r>
+    </w:p>
+    <w:p>
+      <w:pPr>
+        <w:numPr>
+          <w:ilvl w:val="0"/>
+          <w:numId w:val="21"/>
+        </w:numPr>
+      </w:pPr>
+      <w:r>
+        <w:t>FALSE → TRUE</w:t>
+      </w:r>
+    </w:p>
+    <w:tbl>
+      <w:tblPr>
+        <w:tblStyle w:val="TableGrid"/>
+        <w:tblW w:w="0" w:type="auto"/>
+        <w:tblLook w:val="04A0" w:firstRow="1" w:lastRow="0" w:firstColumn="1" w:lastColumn="0" w:noHBand="0" w:noVBand="1"/>
+      </w:tblPr>
+      <w:tblGrid>
+        <w:gridCol w:w="9016"/>
+      </w:tblGrid>
+      <w:tr>
+        <w:tc>
+          <w:tcPr>
+            <w:tcW w:w="9016" w:type="dxa"/>
+            <w:shd w:val="clear" w:color="auto" w:fill="E7E6E6" w:themeFill="background2"/>
+          </w:tcPr>
+          <w:p>
+            <w:r>
+              <w:t>=</w:t>
+            </w:r>
+            <w:proofErr w:type="gramStart"/>
+            <w:r>
+              <w:t>NOT(</w:t>
+            </w:r>
+            <w:proofErr w:type="gramEnd"/>
+            <w:r>
+              <w:t>logical)</w:t>
+            </w:r>
+          </w:p>
+        </w:tc>
+      </w:tr>
+    </w:tbl>
+    <w:p/>
+    <w:p/>
+    <w:p/>
+    <w:p>
+      <w:r>
+        <w:sym w:font="Wingdings" w:char="F0E8"/>
+      </w:r>
+      <w:r>
+        <w:t xml:space="preserve"> </w:t>
+      </w:r>
+      <w:proofErr w:type="gramStart"/>
+      <w:r>
+        <w:rPr>
+          <w:b/>
+          <w:bCs/>
+          <w:u w:val="single"/>
+        </w:rPr>
+        <w:t>ISNUMBER(</w:t>
+      </w:r>
+      <w:proofErr w:type="gramEnd"/>
+      <w:r>
+        <w:rPr>
+          <w:b/>
+          <w:bCs/>
+          <w:u w:val="single"/>
+        </w:rPr>
+        <w:t>):</w:t>
+      </w:r>
+    </w:p>
+    <w:p>
+      <w:r>
+        <w:t xml:space="preserve">The </w:t>
+      </w:r>
+      <w:proofErr w:type="gramStart"/>
+      <w:r>
+        <w:t>ISNUMBER(</w:t>
+      </w:r>
+      <w:proofErr w:type="gramEnd"/>
+      <w:r>
+        <w:t>) function checks whether a value is a number.</w:t>
+      </w:r>
+    </w:p>
+    <w:tbl>
+      <w:tblPr>
+        <w:tblStyle w:val="TableGrid"/>
+        <w:tblW w:w="0" w:type="auto"/>
+        <w:tblLook w:val="04A0" w:firstRow="1" w:lastRow="0" w:firstColumn="1" w:lastColumn="0" w:noHBand="0" w:noVBand="1"/>
+      </w:tblPr>
+      <w:tblGrid>
+        <w:gridCol w:w="9016"/>
+      </w:tblGrid>
+      <w:tr>
+        <w:tc>
+          <w:tcPr>
+            <w:tcW w:w="9016" w:type="dxa"/>
+            <w:shd w:val="clear" w:color="auto" w:fill="E7E6E6" w:themeFill="background2"/>
+          </w:tcPr>
+          <w:p>
+            <w:r>
+              <w:t>=</w:t>
+            </w:r>
+            <w:proofErr w:type="gramStart"/>
+            <w:r>
+              <w:t>ISNUMBER(</w:t>
+            </w:r>
+            <w:proofErr w:type="gramEnd"/>
+            <w:r>
+              <w:t>value)</w:t>
+            </w:r>
+          </w:p>
+        </w:tc>
+      </w:tr>
+    </w:tbl>
+    <w:p/>
+    <w:p/>
+    <w:p>
+      <w:r>
+        <w:sym w:font="Wingdings" w:char="F0E8"/>
+      </w:r>
+      <w:r>
+        <w:t xml:space="preserve"> </w:t>
+      </w:r>
+      <w:proofErr w:type="gramStart"/>
+      <w:r>
+        <w:rPr>
+          <w:b/>
+          <w:bCs/>
+          <w:u w:val="single"/>
+        </w:rPr>
+        <w:t>SUBSTITUTE(</w:t>
+      </w:r>
+      <w:proofErr w:type="gramEnd"/>
+      <w:r>
+        <w:rPr>
+          <w:b/>
+          <w:bCs/>
+          <w:u w:val="single"/>
+        </w:rPr>
+        <w:t>):</w:t>
+      </w:r>
+    </w:p>
+    <w:p>
+      <w:proofErr w:type="gramStart"/>
+      <w:r>
+        <w:t>SUBSTITUTE(</w:t>
+      </w:r>
+      <w:proofErr w:type="gramEnd"/>
+      <w:r>
+        <w:t xml:space="preserve">) is an Excel function used to </w:t>
+      </w:r>
+      <w:r>
+        <w:rPr>
+          <w:b/>
+          <w:bCs/>
+        </w:rPr>
+        <w:t>replace specific text within a string</w:t>
+      </w:r>
+      <w:r>
+        <w:t xml:space="preserve"> with different text.</w:t>
+      </w:r>
+    </w:p>
+    <w:tbl>
+      <w:tblPr>
+        <w:tblStyle w:val="TableGrid"/>
+        <w:tblW w:w="0" w:type="auto"/>
+        <w:tblLook w:val="04A0" w:firstRow="1" w:lastRow="0" w:firstColumn="1" w:lastColumn="0" w:noHBand="0" w:noVBand="1"/>
+      </w:tblPr>
+      <w:tblGrid>
+        <w:gridCol w:w="9016"/>
+      </w:tblGrid>
+      <w:tr>
+        <w:tc>
+          <w:tcPr>
+            <w:tcW w:w="9016" w:type="dxa"/>
+            <w:shd w:val="clear" w:color="auto" w:fill="E7E6E6" w:themeFill="background2"/>
+          </w:tcPr>
+          <w:p>
+            <w:proofErr w:type="gramStart"/>
+            <w:r>
+              <w:t>SUBSTITUTE(</w:t>
+            </w:r>
+            <w:proofErr w:type="gramEnd"/>
+            <w:r>
+              <w:t xml:space="preserve">text, </w:t>
+            </w:r>
+            <w:proofErr w:type="spellStart"/>
+            <w:r>
+              <w:t>old_text</w:t>
+            </w:r>
+            <w:proofErr w:type="spellEnd"/>
+            <w:r>
+              <w:t xml:space="preserve">, </w:t>
+            </w:r>
+            <w:proofErr w:type="spellStart"/>
+            <w:r>
+              <w:t>new_text</w:t>
+            </w:r>
+            <w:proofErr w:type="spellEnd"/>
+            <w:r>
+              <w:t>, [</w:t>
+            </w:r>
+            <w:proofErr w:type="spellStart"/>
+            <w:r>
+              <w:t>instance_num</w:t>
+            </w:r>
+            <w:proofErr w:type="spellEnd"/>
+            <w:r>
+              <w:t>])</w:t>
+            </w:r>
+          </w:p>
+        </w:tc>
+      </w:tr>
+    </w:tbl>
+    <w:p/>
+    <w:p>
+      <w:pPr>
+        <w:rPr>
+          <w:b/>
+          <w:bCs/>
+        </w:rPr>
+      </w:pPr>
+      <w:r>
+        <w:rPr>
+          <w:b/>
+          <w:bCs/>
+        </w:rPr>
+        <w:t>Parameters</w:t>
+      </w:r>
+    </w:p>
+    <w:p>
+      <w:pPr>
+        <w:numPr>
+          <w:ilvl w:val="0"/>
+          <w:numId w:val="22"/>
+        </w:numPr>
+      </w:pPr>
+      <w:r>
+        <w:rPr>
+          <w:b/>
+          <w:bCs/>
+        </w:rPr>
+        <w:t>text</w:t>
+      </w:r>
+      <w:r>
+        <w:t xml:space="preserve"> – The original text. </w:t>
+      </w:r>
+    </w:p>
+    <w:p>
+      <w:pPr>
+        <w:numPr>
+          <w:ilvl w:val="0"/>
+          <w:numId w:val="22"/>
+        </w:numPr>
+      </w:pPr>
+      <w:proofErr w:type="spellStart"/>
+      <w:r>
+        <w:rPr>
+          <w:b/>
+          <w:bCs/>
+        </w:rPr>
+        <w:lastRenderedPageBreak/>
+        <w:t>old_text</w:t>
+      </w:r>
+      <w:proofErr w:type="spellEnd"/>
+      <w:r>
+        <w:t xml:space="preserve"> – The text you want to replace. </w:t>
+      </w:r>
+    </w:p>
+    <w:p>
+      <w:pPr>
+        <w:numPr>
+          <w:ilvl w:val="0"/>
+          <w:numId w:val="22"/>
+        </w:numPr>
+      </w:pPr>
+      <w:proofErr w:type="spellStart"/>
+      <w:r>
+        <w:rPr>
+          <w:b/>
+          <w:bCs/>
+        </w:rPr>
+        <w:t>new_text</w:t>
+      </w:r>
+      <w:proofErr w:type="spellEnd"/>
+      <w:r>
+        <w:t xml:space="preserve"> – The replacement text. </w:t>
+      </w:r>
+    </w:p>
+    <w:p>
+      <w:pPr>
+        <w:numPr>
+          <w:ilvl w:val="0"/>
+          <w:numId w:val="22"/>
+        </w:numPr>
+      </w:pPr>
+      <w:proofErr w:type="spellStart"/>
+      <w:r>
+        <w:rPr>
+          <w:b/>
+          <w:bCs/>
+        </w:rPr>
+        <w:t>instance_num</w:t>
+      </w:r>
+      <w:proofErr w:type="spellEnd"/>
+      <w:r>
+        <w:t xml:space="preserve"> </w:t>
+      </w:r>
+      <w:r>
+        <w:rPr>
+          <w:i/>
+          <w:iCs/>
+        </w:rPr>
+        <w:t>(Optional)</w:t>
+      </w:r>
+      <w:r>
+        <w:t xml:space="preserve"> – Specifies which occurrence to replace. If omitted, all occurrences are replaced.</w:t>
+      </w:r>
+    </w:p>
+    <w:p/>
+    <w:p/>
+    <w:p>
+      <w:r>
+        <w:sym w:font="Wingdings" w:char="F0E8"/>
+      </w:r>
+      <w:r>
+        <w:t xml:space="preserve"> We </w:t>
+      </w:r>
+      <w:r>
+        <w:t>can</w:t>
+      </w:r>
+      <w:r>
+        <w:t xml:space="preserve"> do like this</w:t>
+      </w:r>
+      <w:r>
+        <w:t xml:space="preserve"> for </w:t>
+      </w:r>
+      <w:proofErr w:type="spellStart"/>
+      <w:r>
+        <w:t>job_schedule_type</w:t>
+      </w:r>
+      <w:proofErr w:type="spellEnd"/>
+      <w:r>
+        <w:t>,</w:t>
+      </w:r>
+    </w:p>
+    <w:p>
+      <w:pPr>
+        <w:jc w:val="center"/>
+      </w:pPr>
+      <w:r>
+        <w:rPr>
+          <w:noProof/>
+        </w:rPr>
+        <w:drawing>
+          <wp:inline distT="0" distB="0" distL="0" distR="0" wp14:anchorId="7371544C" wp14:editId="1A63F04B">
+            <wp:extent cx="3565071" cy="3151924"/>
+            <wp:effectExtent l="0" t="0" r="0" b="0"/>
+            <wp:docPr id="1424303916" name="Picture 1"/>
+            <wp:cNvGraphicFramePr>
+              <a:graphicFrameLocks xmlns:a="http://schemas.openxmlformats.org/drawingml/2006/main" noChangeAspect="1"/>
+            </wp:cNvGraphicFramePr>
+            <a:graphic xmlns:a="http://schemas.openxmlformats.org/drawingml/2006/main">
+              <a:graphicData uri="http://schemas.openxmlformats.org/drawingml/2006/picture">
+                <pic:pic xmlns:pic="http://schemas.openxmlformats.org/drawingml/2006/picture">
+                  <pic:nvPicPr>
+                    <pic:cNvPr id="1424303916" name=""/>
+                    <pic:cNvPicPr/>
+                  </pic:nvPicPr>
+                  <pic:blipFill>
+                    <a:blip r:embed="rId36"/>
+                    <a:stretch>
+                      <a:fillRect/>
+                    </a:stretch>
+                  </pic:blipFill>
+                  <pic:spPr>
+                    <a:xfrm>
+                      <a:off x="0" y="0"/>
+                      <a:ext cx="3567853" cy="3154383"/>
+                    </a:xfrm>
+                    <a:prstGeom prst="rect">
+                      <a:avLst/>
+                    </a:prstGeom>
+                  </pic:spPr>
+                </pic:pic>
+              </a:graphicData>
+            </a:graphic>
+          </wp:inline>
+        </w:drawing>
+      </w:r>
+    </w:p>
+    <w:p/>
+    <w:p>
+      <w:r>
+        <w:t xml:space="preserve">But, </w:t>
+      </w:r>
+      <w:proofErr w:type="gramStart"/>
+      <w:r>
+        <w:t>Because</w:t>
+      </w:r>
+      <w:proofErr w:type="gramEnd"/>
+      <w:r>
+        <w:t xml:space="preserve"> we had filtered the </w:t>
+      </w:r>
+      <w:proofErr w:type="spellStart"/>
+      <w:r>
+        <w:t>job_Schulde_type</w:t>
+      </w:r>
+      <w:proofErr w:type="spellEnd"/>
+      <w:r>
+        <w:t xml:space="preserve"> a lot, hence we need to find “type” in to actual </w:t>
+      </w:r>
+      <w:proofErr w:type="spellStart"/>
+      <w:r>
+        <w:t>job_schdule_type</w:t>
+      </w:r>
+      <w:proofErr w:type="spellEnd"/>
+      <w:r>
+        <w:t xml:space="preserve"> list</w:t>
+      </w:r>
+    </w:p>
+    <w:p>
+      <w:pPr>
+        <w:tabs>
+          <w:tab w:val="left" w:pos="5863"/>
+        </w:tabs>
+        <w:jc w:val="center"/>
+      </w:pPr>
+      <w:r>
+        <w:rPr>
+          <w:noProof/>
+        </w:rPr>
+        <w:drawing>
+          <wp:inline distT="0" distB="0" distL="0" distR="0" wp14:anchorId="2669CCD0" wp14:editId="1F6A2BE0">
+            <wp:extent cx="2770414" cy="2874794"/>
+            <wp:effectExtent l="0" t="0" r="0" b="1905"/>
+            <wp:docPr id="1695231496" name="Picture 1"/>
+            <wp:cNvGraphicFramePr>
+              <a:graphicFrameLocks xmlns:a="http://schemas.openxmlformats.org/drawingml/2006/main" noChangeAspect="1"/>
+            </wp:cNvGraphicFramePr>
+            <a:graphic xmlns:a="http://schemas.openxmlformats.org/drawingml/2006/main">
+              <a:graphicData uri="http://schemas.openxmlformats.org/drawingml/2006/picture">
+                <pic:pic xmlns:pic="http://schemas.openxmlformats.org/drawingml/2006/picture">
+                  <pic:nvPicPr>
+                    <pic:cNvPr id="1695231496" name=""/>
+                    <pic:cNvPicPr/>
+                  </pic:nvPicPr>
+                  <pic:blipFill>
+                    <a:blip r:embed="rId37"/>
+                    <a:stretch>
+                      <a:fillRect/>
+                    </a:stretch>
+                  </pic:blipFill>
+                  <pic:spPr>
+                    <a:xfrm>
+                      <a:off x="0" y="0"/>
+                      <a:ext cx="2774047" cy="2878564"/>
+                    </a:xfrm>
+                    <a:prstGeom prst="rect">
+                      <a:avLst/>
+                    </a:prstGeom>
+                  </pic:spPr>
+                </pic:pic>
+              </a:graphicData>
+            </a:graphic>
+          </wp:inline>
+        </w:drawing>
+      </w:r>
+    </w:p>
+    <w:p>
+      <w:pPr>
+        <w:tabs>
+          <w:tab w:val="left" w:pos="5863"/>
+        </w:tabs>
+      </w:pPr>
+    </w:p>
+    <w:p>
+      <w:pPr>
+        <w:tabs>
+          <w:tab w:val="left" w:pos="5863"/>
+        </w:tabs>
+      </w:pPr>
+    </w:p>
+    <w:p>
+      <w:pPr>
+        <w:tabs>
+          <w:tab w:val="left" w:pos="5863"/>
+        </w:tabs>
+      </w:pPr>
+      <w:proofErr w:type="gramStart"/>
+      <w:r>
+        <w:t>Hence</w:t>
+      </w:r>
+      <w:proofErr w:type="gramEnd"/>
+      <w:r>
+        <w:t xml:space="preserve"> we can SEARCH here – which will return index of that</w:t>
+      </w:r>
+      <w:r>
+        <w:t>.</w:t>
+      </w:r>
+    </w:p>
+    <w:p>
+      <w:pPr>
+        <w:tabs>
+          <w:tab w:val="left" w:pos="5863"/>
+        </w:tabs>
+      </w:pPr>
+    </w:p>
+    <w:p>
+      <w:pPr>
+        <w:tabs>
+          <w:tab w:val="left" w:pos="5863"/>
+        </w:tabs>
+      </w:pPr>
+    </w:p>
+    <w:p>
+      <w:pPr>
+        <w:tabs>
+          <w:tab w:val="left" w:pos="5863"/>
+        </w:tabs>
+      </w:pPr>
+      <w:r>
+        <w:sym w:font="Wingdings" w:char="F0E8"/>
+      </w:r>
+      <w:r>
+        <w:t xml:space="preserve"> We have not included </w:t>
+      </w:r>
+      <w:r>
+        <w:rPr>
+          <w:b/>
+          <w:bCs/>
+          <w:color w:val="4472C4" w:themeColor="accent1"/>
+        </w:rPr>
+        <w:t>jobs[</w:t>
+      </w:r>
+      <w:proofErr w:type="spellStart"/>
+      <w:r>
+        <w:rPr>
+          <w:b/>
+          <w:bCs/>
+          <w:color w:val="4472C4" w:themeColor="accent1"/>
+        </w:rPr>
+        <w:t>salary_year_</w:t>
+      </w:r>
+      <w:proofErr w:type="gramStart"/>
+      <w:r>
+        <w:rPr>
+          <w:b/>
+          <w:bCs/>
+          <w:color w:val="4472C4" w:themeColor="accent1"/>
+        </w:rPr>
+        <w:t>avg</w:t>
+      </w:r>
+      <w:proofErr w:type="spellEnd"/>
+      <w:r>
+        <w:rPr>
+          <w:b/>
+          <w:bCs/>
+          <w:color w:val="4472C4" w:themeColor="accent1"/>
+        </w:rPr>
+        <w:t>]</w:t>
+      </w:r>
+      <w:r>
+        <w:rPr>
+          <w:b/>
+          <w:bCs/>
+          <w:color w:val="4472C4" w:themeColor="accent1"/>
+        </w:rPr>
+        <w:t>&lt;</w:t>
+      </w:r>
+      <w:proofErr w:type="gramEnd"/>
+      <w:r>
+        <w:rPr>
+          <w:b/>
+          <w:bCs/>
+          <w:color w:val="4472C4" w:themeColor="accent1"/>
+        </w:rPr>
+        <w:t>&gt;0</w:t>
+      </w:r>
+      <w:r>
+        <w:rPr>
+          <w:color w:val="4472C4" w:themeColor="accent1"/>
+        </w:rPr>
+        <w:t xml:space="preserve"> </w:t>
+      </w:r>
+      <w:r>
+        <w:t xml:space="preserve">condition in </w:t>
+      </w:r>
+      <w:proofErr w:type="spellStart"/>
+      <w:r>
+        <w:t>job_via</w:t>
+      </w:r>
+      <w:proofErr w:type="spellEnd"/>
+      <w:r>
+        <w:t xml:space="preserve"> / Platform finding workbook, because </w:t>
+      </w:r>
+      <w:proofErr w:type="gramStart"/>
+      <w:r>
+        <w:t>If</w:t>
+      </w:r>
+      <w:proofErr w:type="gramEnd"/>
+      <w:r>
+        <w:t xml:space="preserve"> we will include it, then </w:t>
+      </w:r>
+      <w:proofErr w:type="gramStart"/>
+      <w:r>
+        <w:t>It</w:t>
+      </w:r>
+      <w:proofErr w:type="gramEnd"/>
+      <w:r>
+        <w:t xml:space="preserve"> will not count those who are having </w:t>
+      </w:r>
+      <w:proofErr w:type="spellStart"/>
+      <w:r>
+        <w:t>salary_year_avg</w:t>
+      </w:r>
+      <w:proofErr w:type="spellEnd"/>
+      <w:r>
+        <w:t xml:space="preserve"> = 0 </w:t>
+      </w:r>
+      <w:r>
+        <w:t xml:space="preserve">and but What if some data have </w:t>
+      </w:r>
+      <w:proofErr w:type="spellStart"/>
+      <w:r>
+        <w:t>salary_year_avg</w:t>
+      </w:r>
+      <w:proofErr w:type="spellEnd"/>
+      <w:r>
+        <w:t xml:space="preserve"> = 0 But have </w:t>
+      </w:r>
+      <w:proofErr w:type="spellStart"/>
+      <w:r>
+        <w:t>salary_month_avg</w:t>
+      </w:r>
+      <w:proofErr w:type="spellEnd"/>
+      <w:r>
+        <w:t xml:space="preserve"> = </w:t>
+      </w:r>
+      <w:r>
+        <w:rPr>
+          <w:rFonts w:asciiTheme="majorHAnsi" w:hAnsiTheme="majorHAnsi" w:cstheme="majorHAnsi"/>
+          <w:i/>
+          <w:iCs/>
+        </w:rPr>
+        <w:t>&lt;</w:t>
+      </w:r>
+      <w:r>
+        <w:rPr>
+          <w:rFonts w:asciiTheme="majorHAnsi" w:hAnsiTheme="majorHAnsi" w:cstheme="majorHAnsi"/>
+          <w:i/>
+          <w:iCs/>
+        </w:rPr>
+        <w:t>something</w:t>
+      </w:r>
+      <w:proofErr w:type="gramStart"/>
+      <w:r>
+        <w:rPr>
+          <w:rFonts w:asciiTheme="majorHAnsi" w:hAnsiTheme="majorHAnsi" w:cstheme="majorHAnsi"/>
+          <w:i/>
+          <w:iCs/>
+        </w:rPr>
+        <w:t>&gt;</w:t>
+      </w:r>
+      <w:r>
+        <w:t xml:space="preserve"> ?</w:t>
+      </w:r>
+      <w:proofErr w:type="gramEnd"/>
+      <w:r>
+        <w:t xml:space="preserve"> </w:t>
+      </w:r>
+      <w:proofErr w:type="gramStart"/>
+      <w:r>
+        <w:t>Hence</w:t>
+      </w:r>
+      <w:proofErr w:type="gramEnd"/>
+      <w:r>
+        <w:t xml:space="preserve"> we are removing that condition</w:t>
+      </w:r>
+      <w:r>
+        <w:t>.</w:t>
+      </w:r>
+    </w:p>
+    <w:p>
+      <w:pPr>
+        <w:tabs>
+          <w:tab w:val="left" w:pos="5863"/>
+        </w:tabs>
+        <w:jc w:val="center"/>
+      </w:pPr>
+      <w:r>
+        <w:drawing>
+          <wp:inline distT="0" distB="0" distL="0" distR="0" wp14:anchorId="0220CAB4" wp14:editId="186E2E63">
+            <wp:extent cx="4528457" cy="3008268"/>
+            <wp:effectExtent l="0" t="0" r="5715" b="1905"/>
+            <wp:docPr id="1272392613" name="Picture 1"/>
+            <wp:cNvGraphicFramePr>
+              <a:graphicFrameLocks xmlns:a="http://schemas.openxmlformats.org/drawingml/2006/main" noChangeAspect="1"/>
+            </wp:cNvGraphicFramePr>
+            <a:graphic xmlns:a="http://schemas.openxmlformats.org/drawingml/2006/main">
+              <a:graphicData uri="http://schemas.openxmlformats.org/drawingml/2006/picture">
+                <pic:pic xmlns:pic="http://schemas.openxmlformats.org/drawingml/2006/picture">
+                  <pic:nvPicPr>
+                    <pic:cNvPr id="1272392613" name=""/>
+                    <pic:cNvPicPr/>
+                  </pic:nvPicPr>
+                  <pic:blipFill>
+                    <a:blip r:embed="rId38"/>
+                    <a:stretch>
+                      <a:fillRect/>
+                    </a:stretch>
+                  </pic:blipFill>
+                  <pic:spPr>
+                    <a:xfrm>
+                      <a:off x="0" y="0"/>
+                      <a:ext cx="4531131" cy="3010044"/>
+                    </a:xfrm>
+                    <a:prstGeom prst="rect">
+                      <a:avLst/>
+                    </a:prstGeom>
+                  </pic:spPr>
+                </pic:pic>
+              </a:graphicData>
+            </a:graphic>
+          </wp:inline>
+        </w:drawing>
+      </w:r>
+    </w:p>
+    <w:p>
+      <w:pPr>
+        <w:tabs>
+          <w:tab w:val="left" w:pos="5863"/>
+        </w:tabs>
+      </w:pPr>
+    </w:p>
+    <w:p>
+      <w:pPr>
+        <w:tabs>
+          <w:tab w:val="left" w:pos="5863"/>
+        </w:tabs>
+      </w:pPr>
+    </w:p>
+    <w:p>
+      <w:pPr>
+        <w:tabs>
+          <w:tab w:val="left" w:pos="5863"/>
+        </w:tabs>
+      </w:pPr>
+      <w:r>
+        <w:sym w:font="Wingdings" w:char="F0E8"/>
+      </w:r>
+      <w:r>
+        <w:t xml:space="preserve"> Final Output of Project:</w:t>
+      </w:r>
+    </w:p>
+    <w:p>
+      <w:pPr>
+        <w:tabs>
+          <w:tab w:val="left" w:pos="5863"/>
+        </w:tabs>
+        <w:jc w:val="center"/>
+      </w:pPr>
+      <w:r>
+        <w:drawing>
+          <wp:inline distT="0" distB="0" distL="0" distR="0" wp14:anchorId="3DF1133F" wp14:editId="15424AF2">
+            <wp:extent cx="5703529" cy="2422072"/>
+            <wp:effectExtent l="0" t="0" r="0" b="0"/>
+            <wp:docPr id="1685068181" name="Picture 1"/>
+            <wp:cNvGraphicFramePr>
+              <a:graphicFrameLocks xmlns:a="http://schemas.openxmlformats.org/drawingml/2006/main" noChangeAspect="1"/>
+            </wp:cNvGraphicFramePr>
+            <a:graphic xmlns:a="http://schemas.openxmlformats.org/drawingml/2006/main">
+              <a:graphicData uri="http://schemas.openxmlformats.org/drawingml/2006/picture">
+                <pic:pic xmlns:pic="http://schemas.openxmlformats.org/drawingml/2006/picture">
+                  <pic:nvPicPr>
+                    <pic:cNvPr id="1685068181" name=""/>
+                    <pic:cNvPicPr/>
+                  </pic:nvPicPr>
+                  <pic:blipFill>
+                    <a:blip r:embed="rId39"/>
+                    <a:stretch>
+                      <a:fillRect/>
+                    </a:stretch>
+                  </pic:blipFill>
+                  <pic:spPr>
+                    <a:xfrm>
+                      <a:off x="0" y="0"/>
+                      <a:ext cx="5718321" cy="2428353"/>
                     </a:xfrm>
                     <a:prstGeom prst="rect">
                       <a:avLst/>
@@ -11761,6 +13338,155 @@
     </w:lvl>
   </w:abstractNum>
   <w:abstractNum w:abstractNumId="3" w15:restartNumberingAfterBreak="0">
+    <w:nsid w:val="0CF53EEC"/>
+    <w:multiLevelType w:val="multilevel"/>
+    <w:tmpl w:val="47306142"/>
+    <w:lvl w:ilvl="0">
+      <w:start w:val="1"/>
+      <w:numFmt w:val="bullet"/>
+      <w:lvlText w:val=""/>
+      <w:lvlJc w:val="left"/>
+      <w:pPr>
+        <w:tabs>
+          <w:tab w:val="num" w:pos="720"/>
+        </w:tabs>
+        <w:ind w:left="720" w:hanging="360"/>
+      </w:pPr>
+      <w:rPr>
+        <w:rFonts w:ascii="Symbol" w:hAnsi="Symbol" w:hint="default"/>
+        <w:sz w:val="20"/>
+      </w:rPr>
+    </w:lvl>
+    <w:lvl w:ilvl="1" w:tentative="1">
+      <w:start w:val="1"/>
+      <w:numFmt w:val="bullet"/>
+      <w:lvlText w:val="o"/>
+      <w:lvlJc w:val="left"/>
+      <w:pPr>
+        <w:tabs>
+          <w:tab w:val="num" w:pos="1440"/>
+        </w:tabs>
+        <w:ind w:left="1440" w:hanging="360"/>
+      </w:pPr>
+      <w:rPr>
+        <w:rFonts w:ascii="Courier New" w:hAnsi="Courier New" w:hint="default"/>
+        <w:sz w:val="20"/>
+      </w:rPr>
+    </w:lvl>
+    <w:lvl w:ilvl="2" w:tentative="1">
+      <w:start w:val="1"/>
+      <w:numFmt w:val="bullet"/>
+      <w:lvlText w:val=""/>
+      <w:lvlJc w:val="left"/>
+      <w:pPr>
+        <w:tabs>
+          <w:tab w:val="num" w:pos="2160"/>
+        </w:tabs>
+        <w:ind w:left="2160" w:hanging="360"/>
+      </w:pPr>
+      <w:rPr>
+        <w:rFonts w:ascii="Wingdings" w:hAnsi="Wingdings" w:hint="default"/>
+        <w:sz w:val="20"/>
+      </w:rPr>
+    </w:lvl>
+    <w:lvl w:ilvl="3" w:tentative="1">
+      <w:start w:val="1"/>
+      <w:numFmt w:val="bullet"/>
+      <w:lvlText w:val=""/>
+      <w:lvlJc w:val="left"/>
+      <w:pPr>
+        <w:tabs>
+          <w:tab w:val="num" w:pos="2880"/>
+        </w:tabs>
+        <w:ind w:left="2880" w:hanging="360"/>
+      </w:pPr>
+      <w:rPr>
+        <w:rFonts w:ascii="Wingdings" w:hAnsi="Wingdings" w:hint="default"/>
+        <w:sz w:val="20"/>
+      </w:rPr>
+    </w:lvl>
+    <w:lvl w:ilvl="4" w:tentative="1">
+      <w:start w:val="1"/>
+      <w:numFmt w:val="bullet"/>
+      <w:lvlText w:val=""/>
+      <w:lvlJc w:val="left"/>
+      <w:pPr>
+        <w:tabs>
+          <w:tab w:val="num" w:pos="3600"/>
+        </w:tabs>
+        <w:ind w:left="3600" w:hanging="360"/>
+      </w:pPr>
+      <w:rPr>
+        <w:rFonts w:ascii="Wingdings" w:hAnsi="Wingdings" w:hint="default"/>
+        <w:sz w:val="20"/>
+      </w:rPr>
+    </w:lvl>
+    <w:lvl w:ilvl="5" w:tentative="1">
+      <w:start w:val="1"/>
+      <w:numFmt w:val="bullet"/>
+      <w:lvlText w:val=""/>
+      <w:lvlJc w:val="left"/>
+      <w:pPr>
+        <w:tabs>
+          <w:tab w:val="num" w:pos="4320"/>
+        </w:tabs>
+        <w:ind w:left="4320" w:hanging="360"/>
+      </w:pPr>
+      <w:rPr>
+        <w:rFonts w:ascii="Wingdings" w:hAnsi="Wingdings" w:hint="default"/>
+        <w:sz w:val="20"/>
+      </w:rPr>
+    </w:lvl>
+    <w:lvl w:ilvl="6" w:tentative="1">
+      <w:start w:val="1"/>
+      <w:numFmt w:val="bullet"/>
+      <w:lvlText w:val=""/>
+      <w:lvlJc w:val="left"/>
+      <w:pPr>
+        <w:tabs>
+          <w:tab w:val="num" w:pos="5040"/>
+        </w:tabs>
+        <w:ind w:left="5040" w:hanging="360"/>
+      </w:pPr>
+      <w:rPr>
+        <w:rFonts w:ascii="Wingdings" w:hAnsi="Wingdings" w:hint="default"/>
+        <w:sz w:val="20"/>
+      </w:rPr>
+    </w:lvl>
+    <w:lvl w:ilvl="7" w:tentative="1">
+      <w:start w:val="1"/>
+      <w:numFmt w:val="bullet"/>
+      <w:lvlText w:val=""/>
+      <w:lvlJc w:val="left"/>
+      <w:pPr>
+        <w:tabs>
+          <w:tab w:val="num" w:pos="5760"/>
+        </w:tabs>
+        <w:ind w:left="5760" w:hanging="360"/>
+      </w:pPr>
+      <w:rPr>
+        <w:rFonts w:ascii="Wingdings" w:hAnsi="Wingdings" w:hint="default"/>
+        <w:sz w:val="20"/>
+      </w:rPr>
+    </w:lvl>
+    <w:lvl w:ilvl="8" w:tentative="1">
+      <w:start w:val="1"/>
+      <w:numFmt w:val="bullet"/>
+      <w:lvlText w:val=""/>
+      <w:lvlJc w:val="left"/>
+      <w:pPr>
+        <w:tabs>
+          <w:tab w:val="num" w:pos="6480"/>
+        </w:tabs>
+        <w:ind w:left="6480" w:hanging="360"/>
+      </w:pPr>
+      <w:rPr>
+        <w:rFonts w:ascii="Wingdings" w:hAnsi="Wingdings" w:hint="default"/>
+        <w:sz w:val="20"/>
+      </w:rPr>
+    </w:lvl>
+  </w:abstractNum>
+  <w:abstractNum w:abstractNumId="4" w15:restartNumberingAfterBreak="0">
     <w:nsid w:val="0D441685"/>
     <w:multiLevelType w:val="multilevel"/>
     <w:tmpl w:val="51D6F06A"/>
@@ -11909,7 +13635,7 @@
       </w:rPr>
     </w:lvl>
   </w:abstractNum>
-  <w:abstractNum w:abstractNumId="4" w15:restartNumberingAfterBreak="0">
+  <w:abstractNum w:abstractNumId="5" w15:restartNumberingAfterBreak="0">
     <w:nsid w:val="0EEF14A2"/>
     <w:multiLevelType w:val="hybridMultilevel"/>
     <w:tmpl w:val="87204A02"/>
@@ -12022,7 +13748,7 @@
       </w:rPr>
     </w:lvl>
   </w:abstractNum>
-  <w:abstractNum w:abstractNumId="5" w15:restartNumberingAfterBreak="0">
+  <w:abstractNum w:abstractNumId="6" w15:restartNumberingAfterBreak="0">
     <w:nsid w:val="159405F6"/>
     <w:multiLevelType w:val="hybridMultilevel"/>
     <w:tmpl w:val="EDF44402"/>
@@ -12111,7 +13837,269 @@
       </w:pPr>
     </w:lvl>
   </w:abstractNum>
-  <w:abstractNum w:abstractNumId="6" w15:restartNumberingAfterBreak="0">
+  <w:abstractNum w:abstractNumId="7" w15:restartNumberingAfterBreak="0">
+    <w:nsid w:val="15ED5E6E"/>
+    <w:multiLevelType w:val="hybridMultilevel"/>
+    <w:tmpl w:val="CAF8056A"/>
+    <w:lvl w:ilvl="0" w:tplc="40090001">
+      <w:start w:val="1"/>
+      <w:numFmt w:val="bullet"/>
+      <w:lvlText w:val=""/>
+      <w:lvlJc w:val="left"/>
+      <w:pPr>
+        <w:ind w:left="720" w:hanging="360"/>
+      </w:pPr>
+      <w:rPr>
+        <w:rFonts w:ascii="Symbol" w:hAnsi="Symbol" w:hint="default"/>
+      </w:rPr>
+    </w:lvl>
+    <w:lvl w:ilvl="1" w:tplc="40090003" w:tentative="1">
+      <w:start w:val="1"/>
+      <w:numFmt w:val="bullet"/>
+      <w:lvlText w:val="o"/>
+      <w:lvlJc w:val="left"/>
+      <w:pPr>
+        <w:ind w:left="1440" w:hanging="360"/>
+      </w:pPr>
+      <w:rPr>
+        <w:rFonts w:ascii="Courier New" w:hAnsi="Courier New" w:cs="Courier New" w:hint="default"/>
+      </w:rPr>
+    </w:lvl>
+    <w:lvl w:ilvl="2" w:tplc="40090005" w:tentative="1">
+      <w:start w:val="1"/>
+      <w:numFmt w:val="bullet"/>
+      <w:lvlText w:val=""/>
+      <w:lvlJc w:val="left"/>
+      <w:pPr>
+        <w:ind w:left="2160" w:hanging="360"/>
+      </w:pPr>
+      <w:rPr>
+        <w:rFonts w:ascii="Wingdings" w:hAnsi="Wingdings" w:hint="default"/>
+      </w:rPr>
+    </w:lvl>
+    <w:lvl w:ilvl="3" w:tplc="40090001" w:tentative="1">
+      <w:start w:val="1"/>
+      <w:numFmt w:val="bullet"/>
+      <w:lvlText w:val=""/>
+      <w:lvlJc w:val="left"/>
+      <w:pPr>
+        <w:ind w:left="2880" w:hanging="360"/>
+      </w:pPr>
+      <w:rPr>
+        <w:rFonts w:ascii="Symbol" w:hAnsi="Symbol" w:hint="default"/>
+      </w:rPr>
+    </w:lvl>
+    <w:lvl w:ilvl="4" w:tplc="40090003" w:tentative="1">
+      <w:start w:val="1"/>
+      <w:numFmt w:val="bullet"/>
+      <w:lvlText w:val="o"/>
+      <w:lvlJc w:val="left"/>
+      <w:pPr>
+        <w:ind w:left="3600" w:hanging="360"/>
+      </w:pPr>
+      <w:rPr>
+        <w:rFonts w:ascii="Courier New" w:hAnsi="Courier New" w:cs="Courier New" w:hint="default"/>
+      </w:rPr>
+    </w:lvl>
+    <w:lvl w:ilvl="5" w:tplc="40090005" w:tentative="1">
+      <w:start w:val="1"/>
+      <w:numFmt w:val="bullet"/>
+      <w:lvlText w:val=""/>
+      <w:lvlJc w:val="left"/>
+      <w:pPr>
+        <w:ind w:left="4320" w:hanging="360"/>
+      </w:pPr>
+      <w:rPr>
+        <w:rFonts w:ascii="Wingdings" w:hAnsi="Wingdings" w:hint="default"/>
+      </w:rPr>
+    </w:lvl>
+    <w:lvl w:ilvl="6" w:tplc="40090001" w:tentative="1">
+      <w:start w:val="1"/>
+      <w:numFmt w:val="bullet"/>
+      <w:lvlText w:val=""/>
+      <w:lvlJc w:val="left"/>
+      <w:pPr>
+        <w:ind w:left="5040" w:hanging="360"/>
+      </w:pPr>
+      <w:rPr>
+        <w:rFonts w:ascii="Symbol" w:hAnsi="Symbol" w:hint="default"/>
+      </w:rPr>
+    </w:lvl>
+    <w:lvl w:ilvl="7" w:tplc="40090003" w:tentative="1">
+      <w:start w:val="1"/>
+      <w:numFmt w:val="bullet"/>
+      <w:lvlText w:val="o"/>
+      <w:lvlJc w:val="left"/>
+      <w:pPr>
+        <w:ind w:left="5760" w:hanging="360"/>
+      </w:pPr>
+      <w:rPr>
+        <w:rFonts w:ascii="Courier New" w:hAnsi="Courier New" w:cs="Courier New" w:hint="default"/>
+      </w:rPr>
+    </w:lvl>
+    <w:lvl w:ilvl="8" w:tplc="40090005" w:tentative="1">
+      <w:start w:val="1"/>
+      <w:numFmt w:val="bullet"/>
+      <w:lvlText w:val=""/>
+      <w:lvlJc w:val="left"/>
+      <w:pPr>
+        <w:ind w:left="6480" w:hanging="360"/>
+      </w:pPr>
+      <w:rPr>
+        <w:rFonts w:ascii="Wingdings" w:hAnsi="Wingdings" w:hint="default"/>
+      </w:rPr>
+    </w:lvl>
+  </w:abstractNum>
+  <w:abstractNum w:abstractNumId="8" w15:restartNumberingAfterBreak="0">
+    <w:nsid w:val="1DF442C7"/>
+    <w:multiLevelType w:val="multilevel"/>
+    <w:tmpl w:val="0FC2F208"/>
+    <w:lvl w:ilvl="0">
+      <w:start w:val="1"/>
+      <w:numFmt w:val="bullet"/>
+      <w:lvlText w:val=""/>
+      <w:lvlJc w:val="left"/>
+      <w:pPr>
+        <w:tabs>
+          <w:tab w:val="num" w:pos="720"/>
+        </w:tabs>
+        <w:ind w:left="720" w:hanging="360"/>
+      </w:pPr>
+      <w:rPr>
+        <w:rFonts w:ascii="Symbol" w:hAnsi="Symbol" w:hint="default"/>
+        <w:sz w:val="20"/>
+      </w:rPr>
+    </w:lvl>
+    <w:lvl w:ilvl="1" w:tentative="1">
+      <w:start w:val="1"/>
+      <w:numFmt w:val="bullet"/>
+      <w:lvlText w:val="o"/>
+      <w:lvlJc w:val="left"/>
+      <w:pPr>
+        <w:tabs>
+          <w:tab w:val="num" w:pos="1440"/>
+        </w:tabs>
+        <w:ind w:left="1440" w:hanging="360"/>
+      </w:pPr>
+      <w:rPr>
+        <w:rFonts w:ascii="Courier New" w:hAnsi="Courier New" w:hint="default"/>
+        <w:sz w:val="20"/>
+      </w:rPr>
+    </w:lvl>
+    <w:lvl w:ilvl="2" w:tentative="1">
+      <w:start w:val="1"/>
+      <w:numFmt w:val="bullet"/>
+      <w:lvlText w:val=""/>
+      <w:lvlJc w:val="left"/>
+      <w:pPr>
+        <w:tabs>
+          <w:tab w:val="num" w:pos="2160"/>
+        </w:tabs>
+        <w:ind w:left="2160" w:hanging="360"/>
+      </w:pPr>
+      <w:rPr>
+        <w:rFonts w:ascii="Wingdings" w:hAnsi="Wingdings" w:hint="default"/>
+        <w:sz w:val="20"/>
+      </w:rPr>
+    </w:lvl>
+    <w:lvl w:ilvl="3" w:tentative="1">
+      <w:start w:val="1"/>
+      <w:numFmt w:val="bullet"/>
+      <w:lvlText w:val=""/>
+      <w:lvlJc w:val="left"/>
+      <w:pPr>
+        <w:tabs>
+          <w:tab w:val="num" w:pos="2880"/>
+        </w:tabs>
+        <w:ind w:left="2880" w:hanging="360"/>
+      </w:pPr>
+      <w:rPr>
+        <w:rFonts w:ascii="Wingdings" w:hAnsi="Wingdings" w:hint="default"/>
+        <w:sz w:val="20"/>
+      </w:rPr>
+    </w:lvl>
+    <w:lvl w:ilvl="4" w:tentative="1">
+      <w:start w:val="1"/>
+      <w:numFmt w:val="bullet"/>
+      <w:lvlText w:val=""/>
+      <w:lvlJc w:val="left"/>
+      <w:pPr>
+        <w:tabs>
+          <w:tab w:val="num" w:pos="3600"/>
+        </w:tabs>
+        <w:ind w:left="3600" w:hanging="360"/>
+      </w:pPr>
+      <w:rPr>
+        <w:rFonts w:ascii="Wingdings" w:hAnsi="Wingdings" w:hint="default"/>
+        <w:sz w:val="20"/>
+      </w:rPr>
+    </w:lvl>
+    <w:lvl w:ilvl="5" w:tentative="1">
+      <w:start w:val="1"/>
+      <w:numFmt w:val="bullet"/>
+      <w:lvlText w:val=""/>
+      <w:lvlJc w:val="left"/>
+      <w:pPr>
+        <w:tabs>
+          <w:tab w:val="num" w:pos="4320"/>
+        </w:tabs>
+        <w:ind w:left="4320" w:hanging="360"/>
+      </w:pPr>
+      <w:rPr>
+        <w:rFonts w:ascii="Wingdings" w:hAnsi="Wingdings" w:hint="default"/>
+        <w:sz w:val="20"/>
+      </w:rPr>
+    </w:lvl>
+    <w:lvl w:ilvl="6" w:tentative="1">
+      <w:start w:val="1"/>
+      <w:numFmt w:val="bullet"/>
+      <w:lvlText w:val=""/>
+      <w:lvlJc w:val="left"/>
+      <w:pPr>
+        <w:tabs>
+          <w:tab w:val="num" w:pos="5040"/>
+        </w:tabs>
+        <w:ind w:left="5040" w:hanging="360"/>
+      </w:pPr>
+      <w:rPr>
+        <w:rFonts w:ascii="Wingdings" w:hAnsi="Wingdings" w:hint="default"/>
+        <w:sz w:val="20"/>
+      </w:rPr>
+    </w:lvl>
+    <w:lvl w:ilvl="7" w:tentative="1">
+      <w:start w:val="1"/>
+      <w:numFmt w:val="bullet"/>
+      <w:lvlText w:val=""/>
+      <w:lvlJc w:val="left"/>
+      <w:pPr>
+        <w:tabs>
+          <w:tab w:val="num" w:pos="5760"/>
+        </w:tabs>
+        <w:ind w:left="5760" w:hanging="360"/>
+      </w:pPr>
+      <w:rPr>
+        <w:rFonts w:ascii="Wingdings" w:hAnsi="Wingdings" w:hint="default"/>
+        <w:sz w:val="20"/>
+      </w:rPr>
+    </w:lvl>
+    <w:lvl w:ilvl="8" w:tentative="1">
+      <w:start w:val="1"/>
+      <w:numFmt w:val="bullet"/>
+      <w:lvlText w:val=""/>
+      <w:lvlJc w:val="left"/>
+      <w:pPr>
+        <w:tabs>
+          <w:tab w:val="num" w:pos="6480"/>
+        </w:tabs>
+        <w:ind w:left="6480" w:hanging="360"/>
+      </w:pPr>
+      <w:rPr>
+        <w:rFonts w:ascii="Wingdings" w:hAnsi="Wingdings" w:hint="default"/>
+        <w:sz w:val="20"/>
+      </w:rPr>
+    </w:lvl>
+  </w:abstractNum>
+  <w:abstractNum w:abstractNumId="9" w15:restartNumberingAfterBreak="0">
     <w:nsid w:val="1FFF3DEA"/>
     <w:multiLevelType w:val="hybridMultilevel"/>
     <w:tmpl w:val="5ED0C05E"/>
@@ -12224,7 +14212,7 @@
       </w:rPr>
     </w:lvl>
   </w:abstractNum>
-  <w:abstractNum w:abstractNumId="7" w15:restartNumberingAfterBreak="0">
+  <w:abstractNum w:abstractNumId="10" w15:restartNumberingAfterBreak="0">
     <w:nsid w:val="2C7F4519"/>
     <w:multiLevelType w:val="hybridMultilevel"/>
     <w:tmpl w:val="489E457C"/>
@@ -12337,7 +14325,7 @@
       </w:rPr>
     </w:lvl>
   </w:abstractNum>
-  <w:abstractNum w:abstractNumId="8" w15:restartNumberingAfterBreak="0">
+  <w:abstractNum w:abstractNumId="11" w15:restartNumberingAfterBreak="0">
     <w:nsid w:val="395705E0"/>
     <w:multiLevelType w:val="multilevel"/>
     <w:tmpl w:val="13343864"/>
@@ -12486,7 +14474,7 @@
       </w:rPr>
     </w:lvl>
   </w:abstractNum>
-  <w:abstractNum w:abstractNumId="9" w15:restartNumberingAfterBreak="0">
+  <w:abstractNum w:abstractNumId="12" w15:restartNumberingAfterBreak="0">
     <w:nsid w:val="43514108"/>
     <w:multiLevelType w:val="multilevel"/>
     <w:tmpl w:val="0EBEFDA2"/>
@@ -12599,7 +14587,7 @@
       </w:rPr>
     </w:lvl>
   </w:abstractNum>
-  <w:abstractNum w:abstractNumId="10" w15:restartNumberingAfterBreak="0">
+  <w:abstractNum w:abstractNumId="13" w15:restartNumberingAfterBreak="0">
     <w:nsid w:val="44DA19B7"/>
     <w:multiLevelType w:val="hybridMultilevel"/>
     <w:tmpl w:val="6EA062E2"/>
@@ -12712,7 +14700,7 @@
       </w:rPr>
     </w:lvl>
   </w:abstractNum>
-  <w:abstractNum w:abstractNumId="11" w15:restartNumberingAfterBreak="0">
+  <w:abstractNum w:abstractNumId="14" w15:restartNumberingAfterBreak="0">
     <w:nsid w:val="454827C2"/>
     <w:multiLevelType w:val="hybridMultilevel"/>
     <w:tmpl w:val="51ACCA48"/>
@@ -12825,7 +14813,7 @@
       </w:rPr>
     </w:lvl>
   </w:abstractNum>
-  <w:abstractNum w:abstractNumId="12" w15:restartNumberingAfterBreak="0">
+  <w:abstractNum w:abstractNumId="15" w15:restartNumberingAfterBreak="0">
     <w:nsid w:val="45953846"/>
     <w:multiLevelType w:val="hybridMultilevel"/>
     <w:tmpl w:val="0CF8C256"/>
@@ -12938,10 +14926,10 @@
       </w:rPr>
     </w:lvl>
   </w:abstractNum>
-  <w:abstractNum w:abstractNumId="13" w15:restartNumberingAfterBreak="0">
+  <w:abstractNum w:abstractNumId="16" w15:restartNumberingAfterBreak="0">
     <w:nsid w:val="47AF414F"/>
     <w:multiLevelType w:val="hybridMultilevel"/>
-    <w:tmpl w:val="F77E2032"/>
+    <w:tmpl w:val="130E7D14"/>
     <w:lvl w:ilvl="0" w:tplc="40090001">
       <w:start w:val="1"/>
       <w:numFmt w:val="bullet"/>
@@ -13051,7 +15039,7 @@
       </w:rPr>
     </w:lvl>
   </w:abstractNum>
-  <w:abstractNum w:abstractNumId="14" w15:restartNumberingAfterBreak="0">
+  <w:abstractNum w:abstractNumId="17" w15:restartNumberingAfterBreak="0">
     <w:nsid w:val="487866AD"/>
     <w:multiLevelType w:val="multilevel"/>
     <w:tmpl w:val="B3463C32"/>
@@ -13200,7 +15188,7 @@
       </w:rPr>
     </w:lvl>
   </w:abstractNum>
-  <w:abstractNum w:abstractNumId="15" w15:restartNumberingAfterBreak="0">
+  <w:abstractNum w:abstractNumId="18" w15:restartNumberingAfterBreak="0">
     <w:nsid w:val="60C24978"/>
     <w:multiLevelType w:val="hybridMultilevel"/>
     <w:tmpl w:val="2BB4F0BE"/>
@@ -13313,7 +15301,7 @@
       </w:rPr>
     </w:lvl>
   </w:abstractNum>
-  <w:abstractNum w:abstractNumId="16" w15:restartNumberingAfterBreak="0">
+  <w:abstractNum w:abstractNumId="19" w15:restartNumberingAfterBreak="0">
     <w:nsid w:val="68C75728"/>
     <w:multiLevelType w:val="hybridMultilevel"/>
     <w:tmpl w:val="11F08874"/>
@@ -13426,7 +15414,7 @@
       </w:rPr>
     </w:lvl>
   </w:abstractNum>
-  <w:abstractNum w:abstractNumId="17" w15:restartNumberingAfterBreak="0">
+  <w:abstractNum w:abstractNumId="20" w15:restartNumberingAfterBreak="0">
     <w:nsid w:val="6D7C70CF"/>
     <w:multiLevelType w:val="hybridMultilevel"/>
     <w:tmpl w:val="293AEE34"/>
@@ -13539,7 +15527,7 @@
       </w:rPr>
     </w:lvl>
   </w:abstractNum>
-  <w:abstractNum w:abstractNumId="18" w15:restartNumberingAfterBreak="0">
+  <w:abstractNum w:abstractNumId="21" w15:restartNumberingAfterBreak="0">
     <w:nsid w:val="6DE5449B"/>
     <w:multiLevelType w:val="hybridMultilevel"/>
     <w:tmpl w:val="87903488"/>
@@ -13654,61 +15642,70 @@
     </w:lvl>
   </w:abstractNum>
   <w:num w:numId="1" w16cid:durableId="1708988502">
+    <w:abstractNumId w:val="12"/>
+  </w:num>
+  <w:num w:numId="2" w16cid:durableId="406732299">
+    <w:abstractNumId w:val="20"/>
+  </w:num>
+  <w:num w:numId="3" w16cid:durableId="2119064549">
     <w:abstractNumId w:val="9"/>
   </w:num>
-  <w:num w:numId="2" w16cid:durableId="406732299">
-    <w:abstractNumId w:val="17"/>
-  </w:num>
-  <w:num w:numId="3" w16cid:durableId="2119064549">
+  <w:num w:numId="4" w16cid:durableId="755633525">
     <w:abstractNumId w:val="6"/>
   </w:num>
-  <w:num w:numId="4" w16cid:durableId="755633525">
+  <w:num w:numId="5" w16cid:durableId="1896887061">
+    <w:abstractNumId w:val="14"/>
+  </w:num>
+  <w:num w:numId="6" w16cid:durableId="922252310">
+    <w:abstractNumId w:val="15"/>
+  </w:num>
+  <w:num w:numId="7" w16cid:durableId="1520200842">
+    <w:abstractNumId w:val="10"/>
+  </w:num>
+  <w:num w:numId="8" w16cid:durableId="126626962">
     <w:abstractNumId w:val="5"/>
   </w:num>
-  <w:num w:numId="5" w16cid:durableId="1896887061">
-    <w:abstractNumId w:val="11"/>
-  </w:num>
-  <w:num w:numId="6" w16cid:durableId="922252310">
-    <w:abstractNumId w:val="12"/>
-  </w:num>
-  <w:num w:numId="7" w16cid:durableId="1520200842">
-    <w:abstractNumId w:val="7"/>
-  </w:num>
-  <w:num w:numId="8" w16cid:durableId="126626962">
-    <w:abstractNumId w:val="4"/>
-  </w:num>
   <w:num w:numId="9" w16cid:durableId="1970554200">
-    <w:abstractNumId w:val="15"/>
+    <w:abstractNumId w:val="18"/>
   </w:num>
   <w:num w:numId="10" w16cid:durableId="1727727092">
-    <w:abstractNumId w:val="10"/>
+    <w:abstractNumId w:val="13"/>
   </w:num>
   <w:num w:numId="11" w16cid:durableId="605574767">
-    <w:abstractNumId w:val="16"/>
+    <w:abstractNumId w:val="19"/>
   </w:num>
   <w:num w:numId="12" w16cid:durableId="201789521">
     <w:abstractNumId w:val="2"/>
   </w:num>
   <w:num w:numId="13" w16cid:durableId="1645040096">
-    <w:abstractNumId w:val="8"/>
+    <w:abstractNumId w:val="11"/>
   </w:num>
   <w:num w:numId="14" w16cid:durableId="1782871077">
-    <w:abstractNumId w:val="3"/>
+    <w:abstractNumId w:val="4"/>
   </w:num>
   <w:num w:numId="15" w16cid:durableId="1805804000">
     <w:abstractNumId w:val="0"/>
   </w:num>
   <w:num w:numId="16" w16cid:durableId="1372730377">
-    <w:abstractNumId w:val="14"/>
+    <w:abstractNumId w:val="17"/>
   </w:num>
   <w:num w:numId="17" w16cid:durableId="1235312651">
     <w:abstractNumId w:val="1"/>
   </w:num>
   <w:num w:numId="18" w16cid:durableId="1880510972">
-    <w:abstractNumId w:val="18"/>
+    <w:abstractNumId w:val="21"/>
   </w:num>
   <w:num w:numId="19" w16cid:durableId="441463429">
-    <w:abstractNumId w:val="13"/>
+    <w:abstractNumId w:val="16"/>
+  </w:num>
+  <w:num w:numId="20" w16cid:durableId="1056734076">
+    <w:abstractNumId w:val="7"/>
+  </w:num>
+  <w:num w:numId="21" w16cid:durableId="1137800845">
+    <w:abstractNumId w:val="3"/>
+  </w:num>
+  <w:num w:numId="22" w16cid:durableId="1788893729">
+    <w:abstractNumId w:val="8"/>
   </w:num>
 </w:numbering>
 </file>
@@ -14321,7 +16318,6 @@
   <w:style w:type="character" w:default="1" w:styleId="DefaultParagraphFont">
     <w:name w:val="Default Paragraph Font"/>
     <w:uiPriority w:val="1"/>
-    <w:semiHidden/>
     <w:unhideWhenUsed/>
   </w:style>
   <w:style w:type="table" w:default="1" w:styleId="TableNormal">

</xml_diff>

<commit_message>
5.2 Pivot Table Advanced
</commit_message>
<xml_diff>
--- a/Notes.docx
+++ b/Notes.docx
@@ -80,7 +80,7 @@
           <w:r>
             <w:fldChar w:fldCharType="separate"/>
           </w:r>
-          <w:hyperlink w:anchor="_Toc233875802" w:history="1">
+          <w:hyperlink w:anchor="_Toc233901976" w:history="1">
             <w:r>
               <w:rPr>
                 <w:rStyle w:val="Hyperlink"/>
@@ -124,7 +124,7 @@
                 <w:noProof/>
                 <w:webHidden/>
               </w:rPr>
-              <w:instrText xml:space="preserve"> PAGEREF _Toc233875802 \h </w:instrText>
+              <w:instrText xml:space="preserve"> PAGEREF _Toc233901976 \h </w:instrText>
             </w:r>
             <w:r>
               <w:rPr>
@@ -144,7 +144,7 @@
                 <w:noProof/>
                 <w:webHidden/>
               </w:rPr>
-              <w:t>2</w:t>
+              <w:t>3</w:t>
             </w:r>
             <w:r>
               <w:rPr>
@@ -168,7 +168,7 @@
               <w:lang w:eastAsia="en-IN" w:bidi="gu-IN"/>
             </w:rPr>
           </w:pPr>
-          <w:hyperlink w:anchor="_Toc233875803" w:history="1">
+          <w:hyperlink w:anchor="_Toc233901977" w:history="1">
             <w:r>
               <w:rPr>
                 <w:rStyle w:val="Hyperlink"/>
@@ -196,7 +196,7 @@
                 <w:noProof/>
                 <w:webHidden/>
               </w:rPr>
-              <w:instrText xml:space="preserve"> PAGEREF _Toc233875803 \h </w:instrText>
+              <w:instrText xml:space="preserve"> PAGEREF _Toc233901977 \h </w:instrText>
             </w:r>
             <w:r>
               <w:rPr>
@@ -216,7 +216,7 @@
                 <w:noProof/>
                 <w:webHidden/>
               </w:rPr>
-              <w:t>3</w:t>
+              <w:t>4</w:t>
             </w:r>
             <w:r>
               <w:rPr>
@@ -241,7 +241,7 @@
               <w:lang w:eastAsia="en-IN" w:bidi="gu-IN"/>
             </w:rPr>
           </w:pPr>
-          <w:hyperlink w:anchor="_Toc233875804" w:history="1">
+          <w:hyperlink w:anchor="_Toc233901978" w:history="1">
             <w:r>
               <w:rPr>
                 <w:rStyle w:val="Hyperlink"/>
@@ -286,7 +286,7 @@
                 <w:noProof/>
                 <w:webHidden/>
               </w:rPr>
-              <w:instrText xml:space="preserve"> PAGEREF _Toc233875804 \h </w:instrText>
+              <w:instrText xml:space="preserve"> PAGEREF _Toc233901978 \h </w:instrText>
             </w:r>
             <w:r>
               <w:rPr>
@@ -306,7 +306,7 @@
                 <w:noProof/>
                 <w:webHidden/>
               </w:rPr>
-              <w:t>3</w:t>
+              <w:t>4</w:t>
             </w:r>
             <w:r>
               <w:rPr>
@@ -330,7 +330,7 @@
               <w:lang w:eastAsia="en-IN" w:bidi="gu-IN"/>
             </w:rPr>
           </w:pPr>
-          <w:hyperlink w:anchor="_Toc233875805" w:history="1">
+          <w:hyperlink w:anchor="_Toc233901979" w:history="1">
             <w:r>
               <w:rPr>
                 <w:rStyle w:val="Hyperlink"/>
@@ -358,7 +358,7 @@
                 <w:noProof/>
                 <w:webHidden/>
               </w:rPr>
-              <w:instrText xml:space="preserve"> PAGEREF _Toc233875805 \h </w:instrText>
+              <w:instrText xml:space="preserve"> PAGEREF _Toc233901979 \h </w:instrText>
             </w:r>
             <w:r>
               <w:rPr>
@@ -378,7 +378,7 @@
                 <w:noProof/>
                 <w:webHidden/>
               </w:rPr>
-              <w:t>3</w:t>
+              <w:t>4</w:t>
             </w:r>
             <w:r>
               <w:rPr>
@@ -402,7 +402,7 @@
               <w:lang w:eastAsia="en-IN" w:bidi="gu-IN"/>
             </w:rPr>
           </w:pPr>
-          <w:hyperlink w:anchor="_Toc233875806" w:history="1">
+          <w:hyperlink w:anchor="_Toc233901980" w:history="1">
             <w:r>
               <w:rPr>
                 <w:rStyle w:val="Hyperlink"/>
@@ -430,7 +430,7 @@
                 <w:noProof/>
                 <w:webHidden/>
               </w:rPr>
-              <w:instrText xml:space="preserve"> PAGEREF _Toc233875806 \h </w:instrText>
+              <w:instrText xml:space="preserve"> PAGEREF _Toc233901980 \h </w:instrText>
             </w:r>
             <w:r>
               <w:rPr>
@@ -450,7 +450,7 @@
                 <w:noProof/>
                 <w:webHidden/>
               </w:rPr>
-              <w:t>3</w:t>
+              <w:t>4</w:t>
             </w:r>
             <w:r>
               <w:rPr>
@@ -475,7 +475,7 @@
               <w:lang w:eastAsia="en-IN" w:bidi="gu-IN"/>
             </w:rPr>
           </w:pPr>
-          <w:hyperlink w:anchor="_Toc233875807" w:history="1">
+          <w:hyperlink w:anchor="_Toc233901981" w:history="1">
             <w:r>
               <w:rPr>
                 <w:rStyle w:val="Hyperlink"/>
@@ -520,7 +520,7 @@
                 <w:noProof/>
                 <w:webHidden/>
               </w:rPr>
-              <w:instrText xml:space="preserve"> PAGEREF _Toc233875807 \h </w:instrText>
+              <w:instrText xml:space="preserve"> PAGEREF _Toc233901981 \h </w:instrText>
             </w:r>
             <w:r>
               <w:rPr>
@@ -540,7 +540,7 @@
                 <w:noProof/>
                 <w:webHidden/>
               </w:rPr>
-              <w:t>4</w:t>
+              <w:t>5</w:t>
             </w:r>
             <w:r>
               <w:rPr>
@@ -565,7 +565,7 @@
               <w:lang w:eastAsia="en-IN" w:bidi="gu-IN"/>
             </w:rPr>
           </w:pPr>
-          <w:hyperlink w:anchor="_Toc233875808" w:history="1">
+          <w:hyperlink w:anchor="_Toc233901982" w:history="1">
             <w:r>
               <w:rPr>
                 <w:rStyle w:val="Hyperlink"/>
@@ -610,7 +610,7 @@
                 <w:noProof/>
                 <w:webHidden/>
               </w:rPr>
-              <w:instrText xml:space="preserve"> PAGEREF _Toc233875808 \h </w:instrText>
+              <w:instrText xml:space="preserve"> PAGEREF _Toc233901982 \h </w:instrText>
             </w:r>
             <w:r>
               <w:rPr>
@@ -630,7 +630,7 @@
                 <w:noProof/>
                 <w:webHidden/>
               </w:rPr>
-              <w:t>5</w:t>
+              <w:t>6</w:t>
             </w:r>
             <w:r>
               <w:rPr>
@@ -654,7 +654,7 @@
               <w:lang w:eastAsia="en-IN" w:bidi="gu-IN"/>
             </w:rPr>
           </w:pPr>
-          <w:hyperlink w:anchor="_Toc233875809" w:history="1">
+          <w:hyperlink w:anchor="_Toc233901983" w:history="1">
             <w:r>
               <w:rPr>
                 <w:rStyle w:val="Hyperlink"/>
@@ -682,7 +682,7 @@
                 <w:noProof/>
                 <w:webHidden/>
               </w:rPr>
-              <w:instrText xml:space="preserve"> PAGEREF _Toc233875809 \h </w:instrText>
+              <w:instrText xml:space="preserve"> PAGEREF _Toc233901983 \h </w:instrText>
             </w:r>
             <w:r>
               <w:rPr>
@@ -702,7 +702,7 @@
                 <w:noProof/>
                 <w:webHidden/>
               </w:rPr>
-              <w:t>7</w:t>
+              <w:t>8</w:t>
             </w:r>
             <w:r>
               <w:rPr>
@@ -726,7 +726,7 @@
               <w:lang w:eastAsia="en-IN" w:bidi="gu-IN"/>
             </w:rPr>
           </w:pPr>
-          <w:hyperlink w:anchor="_Toc233875810" w:history="1">
+          <w:hyperlink w:anchor="_Toc233901984" w:history="1">
             <w:r>
               <w:rPr>
                 <w:rStyle w:val="Hyperlink"/>
@@ -754,7 +754,7 @@
                 <w:noProof/>
                 <w:webHidden/>
               </w:rPr>
-              <w:instrText xml:space="preserve"> PAGEREF _Toc233875810 \h </w:instrText>
+              <w:instrText xml:space="preserve"> PAGEREF _Toc233901984 \h </w:instrText>
             </w:r>
             <w:r>
               <w:rPr>
@@ -774,7 +774,7 @@
                 <w:noProof/>
                 <w:webHidden/>
               </w:rPr>
-              <w:t>7</w:t>
+              <w:t>8</w:t>
             </w:r>
             <w:r>
               <w:rPr>
@@ -798,7 +798,7 @@
               <w:lang w:eastAsia="en-IN" w:bidi="gu-IN"/>
             </w:rPr>
           </w:pPr>
-          <w:hyperlink w:anchor="_Toc233875811" w:history="1">
+          <w:hyperlink w:anchor="_Toc233901985" w:history="1">
             <w:r>
               <w:rPr>
                 <w:rStyle w:val="Hyperlink"/>
@@ -826,7 +826,7 @@
                 <w:noProof/>
                 <w:webHidden/>
               </w:rPr>
-              <w:instrText xml:space="preserve"> PAGEREF _Toc233875811 \h </w:instrText>
+              <w:instrText xml:space="preserve"> PAGEREF _Toc233901985 \h </w:instrText>
             </w:r>
             <w:r>
               <w:rPr>
@@ -846,7 +846,7 @@
                 <w:noProof/>
                 <w:webHidden/>
               </w:rPr>
-              <w:t>8</w:t>
+              <w:t>9</w:t>
             </w:r>
             <w:r>
               <w:rPr>
@@ -870,7 +870,7 @@
               <w:lang w:eastAsia="en-IN" w:bidi="gu-IN"/>
             </w:rPr>
           </w:pPr>
-          <w:hyperlink w:anchor="_Toc233875812" w:history="1">
+          <w:hyperlink w:anchor="_Toc233901986" w:history="1">
             <w:r>
               <w:rPr>
                 <w:rStyle w:val="Hyperlink"/>
@@ -898,7 +898,7 @@
                 <w:noProof/>
                 <w:webHidden/>
               </w:rPr>
-              <w:instrText xml:space="preserve"> PAGEREF _Toc233875812 \h </w:instrText>
+              <w:instrText xml:space="preserve"> PAGEREF _Toc233901986 \h </w:instrText>
             </w:r>
             <w:r>
               <w:rPr>
@@ -918,7 +918,7 @@
                 <w:noProof/>
                 <w:webHidden/>
               </w:rPr>
-              <w:t>10</w:t>
+              <w:t>11</w:t>
             </w:r>
             <w:r>
               <w:rPr>
@@ -942,7 +942,7 @@
               <w:lang w:eastAsia="en-IN" w:bidi="gu-IN"/>
             </w:rPr>
           </w:pPr>
-          <w:hyperlink w:anchor="_Toc233875813" w:history="1">
+          <w:hyperlink w:anchor="_Toc233901987" w:history="1">
             <w:r>
               <w:rPr>
                 <w:rStyle w:val="Hyperlink"/>
@@ -969,7 +969,7 @@
                 <w:noProof/>
                 <w:webHidden/>
               </w:rPr>
-              <w:instrText xml:space="preserve"> PAGEREF _Toc233875813 \h </w:instrText>
+              <w:instrText xml:space="preserve"> PAGEREF _Toc233901987 \h </w:instrText>
             </w:r>
             <w:r>
               <w:rPr>
@@ -989,7 +989,7 @@
                 <w:noProof/>
                 <w:webHidden/>
               </w:rPr>
-              <w:t>10</w:t>
+              <w:t>11</w:t>
             </w:r>
             <w:r>
               <w:rPr>
@@ -1013,7 +1013,7 @@
               <w:lang w:eastAsia="en-IN" w:bidi="gu-IN"/>
             </w:rPr>
           </w:pPr>
-          <w:hyperlink w:anchor="_Toc233875814" w:history="1">
+          <w:hyperlink w:anchor="_Toc233901988" w:history="1">
             <w:r>
               <w:rPr>
                 <w:rStyle w:val="Hyperlink"/>
@@ -1040,7 +1040,7 @@
                 <w:noProof/>
                 <w:webHidden/>
               </w:rPr>
-              <w:instrText xml:space="preserve"> PAGEREF _Toc233875814 \h </w:instrText>
+              <w:instrText xml:space="preserve"> PAGEREF _Toc233901988 \h </w:instrText>
             </w:r>
             <w:r>
               <w:rPr>
@@ -1060,7 +1060,7 @@
                 <w:noProof/>
                 <w:webHidden/>
               </w:rPr>
-              <w:t>11</w:t>
+              <w:t>12</w:t>
             </w:r>
             <w:r>
               <w:rPr>
@@ -1084,7 +1084,7 @@
               <w:lang w:eastAsia="en-IN" w:bidi="gu-IN"/>
             </w:rPr>
           </w:pPr>
-          <w:hyperlink w:anchor="_Toc233875815" w:history="1">
+          <w:hyperlink w:anchor="_Toc233901989" w:history="1">
             <w:r>
               <w:rPr>
                 <w:rStyle w:val="Hyperlink"/>
@@ -1111,7 +1111,7 @@
                 <w:noProof/>
                 <w:webHidden/>
               </w:rPr>
-              <w:instrText xml:space="preserve"> PAGEREF _Toc233875815 \h </w:instrText>
+              <w:instrText xml:space="preserve"> PAGEREF _Toc233901989 \h </w:instrText>
             </w:r>
             <w:r>
               <w:rPr>
@@ -1131,7 +1131,7 @@
                 <w:noProof/>
                 <w:webHidden/>
               </w:rPr>
-              <w:t>12</w:t>
+              <w:t>13</w:t>
             </w:r>
             <w:r>
               <w:rPr>
@@ -1155,7 +1155,7 @@
               <w:lang w:eastAsia="en-IN" w:bidi="gu-IN"/>
             </w:rPr>
           </w:pPr>
-          <w:hyperlink w:anchor="_Toc233875816" w:history="1">
+          <w:hyperlink w:anchor="_Toc233901990" w:history="1">
             <w:r>
               <w:rPr>
                 <w:rStyle w:val="Hyperlink"/>
@@ -1182,7 +1182,7 @@
                 <w:noProof/>
                 <w:webHidden/>
               </w:rPr>
-              <w:instrText xml:space="preserve"> PAGEREF _Toc233875816 \h </w:instrText>
+              <w:instrText xml:space="preserve"> PAGEREF _Toc233901990 \h </w:instrText>
             </w:r>
             <w:r>
               <w:rPr>
@@ -1202,7 +1202,7 @@
                 <w:noProof/>
                 <w:webHidden/>
               </w:rPr>
-              <w:t>14</w:t>
+              <w:t>15</w:t>
             </w:r>
             <w:r>
               <w:rPr>
@@ -1226,7 +1226,7 @@
               <w:lang w:eastAsia="en-IN" w:bidi="gu-IN"/>
             </w:rPr>
           </w:pPr>
-          <w:hyperlink w:anchor="_Toc233875817" w:history="1">
+          <w:hyperlink w:anchor="_Toc233901991" w:history="1">
             <w:r>
               <w:rPr>
                 <w:rStyle w:val="Hyperlink"/>
@@ -1253,7 +1253,7 @@
                 <w:noProof/>
                 <w:webHidden/>
               </w:rPr>
-              <w:instrText xml:space="preserve"> PAGEREF _Toc233875817 \h </w:instrText>
+              <w:instrText xml:space="preserve"> PAGEREF _Toc233901991 \h </w:instrText>
             </w:r>
             <w:r>
               <w:rPr>
@@ -1273,7 +1273,7 @@
                 <w:noProof/>
                 <w:webHidden/>
               </w:rPr>
-              <w:t>16</w:t>
+              <w:t>17</w:t>
             </w:r>
             <w:r>
               <w:rPr>
@@ -1297,7 +1297,7 @@
               <w:lang w:eastAsia="en-IN" w:bidi="gu-IN"/>
             </w:rPr>
           </w:pPr>
-          <w:hyperlink w:anchor="_Toc233875818" w:history="1">
+          <w:hyperlink w:anchor="_Toc233901992" w:history="1">
             <w:r>
               <w:rPr>
                 <w:rStyle w:val="Hyperlink"/>
@@ -1324,7 +1324,7 @@
                 <w:noProof/>
                 <w:webHidden/>
               </w:rPr>
-              <w:instrText xml:space="preserve"> PAGEREF _Toc233875818 \h </w:instrText>
+              <w:instrText xml:space="preserve"> PAGEREF _Toc233901992 \h </w:instrText>
             </w:r>
             <w:r>
               <w:rPr>
@@ -1344,7 +1344,7 @@
                 <w:noProof/>
                 <w:webHidden/>
               </w:rPr>
-              <w:t>19</w:t>
+              <w:t>20</w:t>
             </w:r>
             <w:r>
               <w:rPr>
@@ -1368,7 +1368,7 @@
               <w:lang w:eastAsia="en-IN" w:bidi="gu-IN"/>
             </w:rPr>
           </w:pPr>
-          <w:hyperlink w:anchor="_Toc233875819" w:history="1">
+          <w:hyperlink w:anchor="_Toc233901993" w:history="1">
             <w:r>
               <w:rPr>
                 <w:rStyle w:val="Hyperlink"/>
@@ -1395,7 +1395,7 @@
                 <w:noProof/>
                 <w:webHidden/>
               </w:rPr>
-              <w:instrText xml:space="preserve"> PAGEREF _Toc233875819 \h </w:instrText>
+              <w:instrText xml:space="preserve"> PAGEREF _Toc233901993 \h </w:instrText>
             </w:r>
             <w:r>
               <w:rPr>
@@ -1415,7 +1415,7 @@
                 <w:noProof/>
                 <w:webHidden/>
               </w:rPr>
-              <w:t>20</w:t>
+              <w:t>21</w:t>
             </w:r>
             <w:r>
               <w:rPr>
@@ -1439,7 +1439,7 @@
               <w:lang w:eastAsia="en-IN" w:bidi="gu-IN"/>
             </w:rPr>
           </w:pPr>
-          <w:hyperlink w:anchor="_Toc233875820" w:history="1">
+          <w:hyperlink w:anchor="_Toc233901994" w:history="1">
             <w:r>
               <w:rPr>
                 <w:rStyle w:val="Hyperlink"/>
@@ -1466,7 +1466,7 @@
                 <w:noProof/>
                 <w:webHidden/>
               </w:rPr>
-              <w:instrText xml:space="preserve"> PAGEREF _Toc233875820 \h </w:instrText>
+              <w:instrText xml:space="preserve"> PAGEREF _Toc233901994 \h </w:instrText>
             </w:r>
             <w:r>
               <w:rPr>
@@ -1486,7 +1486,7 @@
                 <w:noProof/>
                 <w:webHidden/>
               </w:rPr>
-              <w:t>20</w:t>
+              <w:t>21</w:t>
             </w:r>
             <w:r>
               <w:rPr>
@@ -1510,7 +1510,7 @@
               <w:lang w:eastAsia="en-IN" w:bidi="gu-IN"/>
             </w:rPr>
           </w:pPr>
-          <w:hyperlink w:anchor="_Toc233875821" w:history="1">
+          <w:hyperlink w:anchor="_Toc233901995" w:history="1">
             <w:r>
               <w:rPr>
                 <w:rStyle w:val="Hyperlink"/>
@@ -1537,7 +1537,7 @@
                 <w:noProof/>
                 <w:webHidden/>
               </w:rPr>
-              <w:instrText xml:space="preserve"> PAGEREF _Toc233875821 \h </w:instrText>
+              <w:instrText xml:space="preserve"> PAGEREF _Toc233901995 \h </w:instrText>
             </w:r>
             <w:r>
               <w:rPr>
@@ -1557,7 +1557,7 @@
                 <w:noProof/>
                 <w:webHidden/>
               </w:rPr>
-              <w:t>20</w:t>
+              <w:t>21</w:t>
             </w:r>
             <w:r>
               <w:rPr>
@@ -1581,7 +1581,7 @@
               <w:lang w:eastAsia="en-IN" w:bidi="gu-IN"/>
             </w:rPr>
           </w:pPr>
-          <w:hyperlink w:anchor="_Toc233875822" w:history="1">
+          <w:hyperlink w:anchor="_Toc233901996" w:history="1">
             <w:r>
               <w:rPr>
                 <w:rStyle w:val="Hyperlink"/>
@@ -1608,7 +1608,7 @@
                 <w:noProof/>
                 <w:webHidden/>
               </w:rPr>
-              <w:instrText xml:space="preserve"> PAGEREF _Toc233875822 \h </w:instrText>
+              <w:instrText xml:space="preserve"> PAGEREF _Toc233901996 \h </w:instrText>
             </w:r>
             <w:r>
               <w:rPr>
@@ -1628,7 +1628,7 @@
                 <w:noProof/>
                 <w:webHidden/>
               </w:rPr>
-              <w:t>21</w:t>
+              <w:t>22</w:t>
             </w:r>
             <w:r>
               <w:rPr>
@@ -1652,7 +1652,7 @@
               <w:lang w:eastAsia="en-IN" w:bidi="gu-IN"/>
             </w:rPr>
           </w:pPr>
-          <w:hyperlink w:anchor="_Toc233875823" w:history="1">
+          <w:hyperlink w:anchor="_Toc233901997" w:history="1">
             <w:r>
               <w:rPr>
                 <w:rStyle w:val="Hyperlink"/>
@@ -1679,7 +1679,7 @@
                 <w:noProof/>
                 <w:webHidden/>
               </w:rPr>
-              <w:instrText xml:space="preserve"> PAGEREF _Toc233875823 \h </w:instrText>
+              <w:instrText xml:space="preserve"> PAGEREF _Toc233901997 \h </w:instrText>
             </w:r>
             <w:r>
               <w:rPr>
@@ -1699,7 +1699,7 @@
                 <w:noProof/>
                 <w:webHidden/>
               </w:rPr>
-              <w:t>21</w:t>
+              <w:t>22</w:t>
             </w:r>
             <w:r>
               <w:rPr>
@@ -1723,7 +1723,7 @@
               <w:lang w:eastAsia="en-IN" w:bidi="gu-IN"/>
             </w:rPr>
           </w:pPr>
-          <w:hyperlink w:anchor="_Toc233875824" w:history="1">
+          <w:hyperlink w:anchor="_Toc233901998" w:history="1">
             <w:r>
               <w:rPr>
                 <w:rStyle w:val="Hyperlink"/>
@@ -1750,7 +1750,7 @@
                 <w:noProof/>
                 <w:webHidden/>
               </w:rPr>
-              <w:instrText xml:space="preserve"> PAGEREF _Toc233875824 \h </w:instrText>
+              <w:instrText xml:space="preserve"> PAGEREF _Toc233901998 \h </w:instrText>
             </w:r>
             <w:r>
               <w:rPr>
@@ -1770,7 +1770,7 @@
                 <w:noProof/>
                 <w:webHidden/>
               </w:rPr>
-              <w:t>23</w:t>
+              <w:t>24</w:t>
             </w:r>
             <w:r>
               <w:rPr>
@@ -1794,7 +1794,7 @@
               <w:lang w:eastAsia="en-IN" w:bidi="gu-IN"/>
             </w:rPr>
           </w:pPr>
-          <w:hyperlink w:anchor="_Toc233875825" w:history="1">
+          <w:hyperlink w:anchor="_Toc233901999" w:history="1">
             <w:r>
               <w:rPr>
                 <w:rStyle w:val="Hyperlink"/>
@@ -1821,7 +1821,7 @@
                 <w:noProof/>
                 <w:webHidden/>
               </w:rPr>
-              <w:instrText xml:space="preserve"> PAGEREF _Toc233875825 \h </w:instrText>
+              <w:instrText xml:space="preserve"> PAGEREF _Toc233901999 \h </w:instrText>
             </w:r>
             <w:r>
               <w:rPr>
@@ -1841,7 +1841,7 @@
                 <w:noProof/>
                 <w:webHidden/>
               </w:rPr>
-              <w:t>23</w:t>
+              <w:t>24</w:t>
             </w:r>
             <w:r>
               <w:rPr>
@@ -1865,7 +1865,7 @@
               <w:lang w:eastAsia="en-IN" w:bidi="gu-IN"/>
             </w:rPr>
           </w:pPr>
-          <w:hyperlink w:anchor="_Toc233875826" w:history="1">
+          <w:hyperlink w:anchor="_Toc233902000" w:history="1">
             <w:r>
               <w:rPr>
                 <w:rStyle w:val="Hyperlink"/>
@@ -1892,7 +1892,7 @@
                 <w:noProof/>
                 <w:webHidden/>
               </w:rPr>
-              <w:instrText xml:space="preserve"> PAGEREF _Toc233875826 \h </w:instrText>
+              <w:instrText xml:space="preserve"> PAGEREF _Toc233902000 \h </w:instrText>
             </w:r>
             <w:r>
               <w:rPr>
@@ -1912,7 +1912,7 @@
                 <w:noProof/>
                 <w:webHidden/>
               </w:rPr>
-              <w:t>24</w:t>
+              <w:t>25</w:t>
             </w:r>
             <w:r>
               <w:rPr>
@@ -1936,7 +1936,7 @@
               <w:lang w:eastAsia="en-IN" w:bidi="gu-IN"/>
             </w:rPr>
           </w:pPr>
-          <w:hyperlink w:anchor="_Toc233875827" w:history="1">
+          <w:hyperlink w:anchor="_Toc233902001" w:history="1">
             <w:r>
               <w:rPr>
                 <w:rStyle w:val="Hyperlink"/>
@@ -1963,7 +1963,7 @@
                 <w:noProof/>
                 <w:webHidden/>
               </w:rPr>
-              <w:instrText xml:space="preserve"> PAGEREF _Toc233875827 \h </w:instrText>
+              <w:instrText xml:space="preserve"> PAGEREF _Toc233902001 \h </w:instrText>
             </w:r>
             <w:r>
               <w:rPr>
@@ -1983,7 +1983,7 @@
                 <w:noProof/>
                 <w:webHidden/>
               </w:rPr>
-              <w:t>26</w:t>
+              <w:t>27</w:t>
             </w:r>
             <w:r>
               <w:rPr>
@@ -2007,7 +2007,7 @@
               <w:lang w:eastAsia="en-IN" w:bidi="gu-IN"/>
             </w:rPr>
           </w:pPr>
-          <w:hyperlink w:anchor="_Toc233875828" w:history="1">
+          <w:hyperlink w:anchor="_Toc233902002" w:history="1">
             <w:r>
               <w:rPr>
                 <w:rStyle w:val="Hyperlink"/>
@@ -2034,7 +2034,7 @@
                 <w:noProof/>
                 <w:webHidden/>
               </w:rPr>
-              <w:instrText xml:space="preserve"> PAGEREF _Toc233875828 \h </w:instrText>
+              <w:instrText xml:space="preserve"> PAGEREF _Toc233902002 \h </w:instrText>
             </w:r>
             <w:r>
               <w:rPr>
@@ -2054,7 +2054,7 @@
                 <w:noProof/>
                 <w:webHidden/>
               </w:rPr>
-              <w:t>27</w:t>
+              <w:t>28</w:t>
             </w:r>
             <w:r>
               <w:rPr>
@@ -2078,27 +2078,155 @@
               <w:lang w:eastAsia="en-IN" w:bidi="gu-IN"/>
             </w:rPr>
           </w:pPr>
-          <w:hyperlink w:anchor="_Toc233875829" w:history="1">
+          <w:hyperlink w:anchor="_Toc233902003" w:history="1">
             <w:r>
               <w:rPr>
                 <w:rStyle w:val="Hyperlink"/>
                 <w:noProof/>
               </w:rPr>
-              <w:t>5. Pivot Tabl</w:t>
-            </w:r>
+              <w:t>5. Pivot Tables Intro</w:t>
+            </w:r>
+            <w:r>
+              <w:rPr>
+                <w:noProof/>
+                <w:webHidden/>
+              </w:rPr>
+              <w:tab/>
+            </w:r>
+            <w:r>
+              <w:rPr>
+                <w:noProof/>
+                <w:webHidden/>
+              </w:rPr>
+              <w:fldChar w:fldCharType="begin"/>
+            </w:r>
+            <w:r>
+              <w:rPr>
+                <w:noProof/>
+                <w:webHidden/>
+              </w:rPr>
+              <w:instrText xml:space="preserve"> PAGEREF _Toc233902003 \h </w:instrText>
+            </w:r>
+            <w:r>
+              <w:rPr>
+                <w:noProof/>
+                <w:webHidden/>
+              </w:rPr>
+            </w:r>
+            <w:r>
+              <w:rPr>
+                <w:noProof/>
+                <w:webHidden/>
+              </w:rPr>
+              <w:fldChar w:fldCharType="separate"/>
+            </w:r>
+            <w:r>
+              <w:rPr>
+                <w:noProof/>
+                <w:webHidden/>
+              </w:rPr>
+              <w:t>32</w:t>
+            </w:r>
+            <w:r>
+              <w:rPr>
+                <w:noProof/>
+                <w:webHidden/>
+              </w:rPr>
+              <w:fldChar w:fldCharType="end"/>
+            </w:r>
+          </w:hyperlink>
+        </w:p>
+        <w:p>
+          <w:pPr>
+            <w:pStyle w:val="TOC2"/>
+            <w:tabs>
+              <w:tab w:val="right" w:leader="dot" w:pos="9016"/>
+            </w:tabs>
+            <w:rPr>
+              <w:rFonts w:asciiTheme="minorHAnsi" w:eastAsiaTheme="minorEastAsia" w:hAnsiTheme="minorHAnsi"/>
+              <w:noProof/>
+              <w:szCs w:val="24"/>
+              <w:lang w:eastAsia="en-IN" w:bidi="gu-IN"/>
+            </w:rPr>
+          </w:pPr>
+          <w:hyperlink w:anchor="_Toc233902004" w:history="1">
             <w:r>
               <w:rPr>
                 <w:rStyle w:val="Hyperlink"/>
                 <w:noProof/>
               </w:rPr>
-              <w:t>e</w:t>
-            </w:r>
+              <w:t>4.2 Pivot Table Advance</w:t>
+            </w:r>
+            <w:r>
+              <w:rPr>
+                <w:noProof/>
+                <w:webHidden/>
+              </w:rPr>
+              <w:tab/>
+            </w:r>
+            <w:r>
+              <w:rPr>
+                <w:noProof/>
+                <w:webHidden/>
+              </w:rPr>
+              <w:fldChar w:fldCharType="begin"/>
+            </w:r>
+            <w:r>
+              <w:rPr>
+                <w:noProof/>
+                <w:webHidden/>
+              </w:rPr>
+              <w:instrText xml:space="preserve"> PAGEREF _Toc233902004 \h </w:instrText>
+            </w:r>
+            <w:r>
+              <w:rPr>
+                <w:noProof/>
+                <w:webHidden/>
+              </w:rPr>
+            </w:r>
+            <w:r>
+              <w:rPr>
+                <w:noProof/>
+                <w:webHidden/>
+              </w:rPr>
+              <w:fldChar w:fldCharType="separate"/>
+            </w:r>
+            <w:r>
+              <w:rPr>
+                <w:noProof/>
+                <w:webHidden/>
+              </w:rPr>
+              <w:t>33</w:t>
+            </w:r>
+            <w:r>
+              <w:rPr>
+                <w:noProof/>
+                <w:webHidden/>
+              </w:rPr>
+              <w:fldChar w:fldCharType="end"/>
+            </w:r>
+          </w:hyperlink>
+        </w:p>
+        <w:p>
+          <w:pPr>
+            <w:pStyle w:val="TOC3"/>
+            <w:tabs>
+              <w:tab w:val="right" w:leader="dot" w:pos="9016"/>
+            </w:tabs>
+            <w:rPr>
+              <w:rFonts w:asciiTheme="minorHAnsi" w:eastAsiaTheme="minorEastAsia" w:hAnsiTheme="minorHAnsi"/>
+              <w:noProof/>
+              <w:szCs w:val="24"/>
+              <w:lang w:eastAsia="en-IN" w:bidi="gu-IN"/>
+            </w:rPr>
+          </w:pPr>
+          <w:hyperlink w:anchor="_Toc233902005" w:history="1">
             <w:r>
               <w:rPr>
                 <w:rStyle w:val="Hyperlink"/>
                 <w:noProof/>
               </w:rPr>
-              <w:t>s</w:t>
+              <w:t>Automatic Grouping:</w:t>
             </w:r>
             <w:r>
               <w:rPr>
@@ -2119,7 +2247,7 @@
                 <w:noProof/>
                 <w:webHidden/>
               </w:rPr>
-              <w:instrText xml:space="preserve"> PAGEREF _Toc233875829 \h </w:instrText>
+              <w:instrText xml:space="preserve"> PAGEREF _Toc233902005 \h </w:instrText>
             </w:r>
             <w:r>
               <w:rPr>
@@ -2139,7 +2267,85 @@
                 <w:noProof/>
                 <w:webHidden/>
               </w:rPr>
-              <w:t>31</w:t>
+              <w:t>36</w:t>
+            </w:r>
+            <w:r>
+              <w:rPr>
+                <w:noProof/>
+                <w:webHidden/>
+              </w:rPr>
+              <w:fldChar w:fldCharType="end"/>
+            </w:r>
+          </w:hyperlink>
+        </w:p>
+        <w:p>
+          <w:pPr>
+            <w:pStyle w:val="TOC3"/>
+            <w:tabs>
+              <w:tab w:val="right" w:leader="dot" w:pos="9016"/>
+            </w:tabs>
+            <w:rPr>
+              <w:rFonts w:asciiTheme="minorHAnsi" w:eastAsiaTheme="minorEastAsia" w:hAnsiTheme="minorHAnsi"/>
+              <w:noProof/>
+              <w:szCs w:val="24"/>
+              <w:lang w:eastAsia="en-IN" w:bidi="gu-IN"/>
+            </w:rPr>
+          </w:pPr>
+          <w:hyperlink w:anchor="_Toc233902006" w:history="1">
+            <w:r>
+              <w:rPr>
+                <w:rStyle w:val="Hyperlink"/>
+                <w:noProof/>
+              </w:rPr>
+              <w:t>Manual Groupin</w:t>
+            </w:r>
+            <w:r>
+              <w:rPr>
+                <w:rStyle w:val="Hyperlink"/>
+                <w:noProof/>
+              </w:rPr>
+              <w:t>g</w:t>
+            </w:r>
+            <w:r>
+              <w:rPr>
+                <w:noProof/>
+                <w:webHidden/>
+              </w:rPr>
+              <w:tab/>
+            </w:r>
+            <w:r>
+              <w:rPr>
+                <w:noProof/>
+                <w:webHidden/>
+              </w:rPr>
+              <w:fldChar w:fldCharType="begin"/>
+            </w:r>
+            <w:r>
+              <w:rPr>
+                <w:noProof/>
+                <w:webHidden/>
+              </w:rPr>
+              <w:instrText xml:space="preserve"> PAGEREF _Toc233902006 \h </w:instrText>
+            </w:r>
+            <w:r>
+              <w:rPr>
+                <w:noProof/>
+                <w:webHidden/>
+              </w:rPr>
+            </w:r>
+            <w:r>
+              <w:rPr>
+                <w:noProof/>
+                <w:webHidden/>
+              </w:rPr>
+              <w:fldChar w:fldCharType="separate"/>
+            </w:r>
+            <w:r>
+              <w:rPr>
+                <w:noProof/>
+                <w:webHidden/>
+              </w:rPr>
+              <w:t>37</w:t>
             </w:r>
             <w:r>
               <w:rPr>
@@ -2157,6 +2363,7 @@
               <w:bCs/>
               <w:noProof/>
             </w:rPr>
+            <w:lastRenderedPageBreak/>
             <w:fldChar w:fldCharType="end"/>
           </w:r>
         </w:p>
@@ -2191,7 +2398,7 @@
         </w:numPr>
         <w:ind w:left="420" w:hanging="420"/>
       </w:pPr>
-      <w:bookmarkStart w:id="0" w:name="_Toc233875802"/>
+      <w:bookmarkStart w:id="0" w:name="_Toc233901976"/>
       <w:r>
         <w:t>Short Cuts</w:t>
       </w:r>
@@ -2347,7 +2554,7 @@
           <w:lang w:val="en-US"/>
         </w:rPr>
       </w:pPr>
-      <w:bookmarkStart w:id="1" w:name="_Toc233875803"/>
+      <w:bookmarkStart w:id="1" w:name="_Toc233901977"/>
       <w:r>
         <w:rPr>
           <w:lang w:val="en-US"/>
@@ -2394,7 +2601,7 @@
           <w:lang w:val="en-US"/>
         </w:rPr>
       </w:pPr>
-      <w:bookmarkStart w:id="2" w:name="_Toc233875804"/>
+      <w:bookmarkStart w:id="2" w:name="_Toc233901978"/>
       <w:r>
         <w:rPr>
           <w:lang w:val="en-US"/>
@@ -2505,7 +2712,7 @@
           <w:lang w:val="en-US"/>
         </w:rPr>
       </w:pPr>
-      <w:bookmarkStart w:id="3" w:name="_Toc233875805"/>
+      <w:bookmarkStart w:id="3" w:name="_Toc233901979"/>
       <w:r>
         <w:rPr>
           <w:lang w:val="en-US"/>
@@ -2655,7 +2862,7 @@
           <w:lang w:val="en-US"/>
         </w:rPr>
       </w:pPr>
-      <w:bookmarkStart w:id="4" w:name="_Toc233875806"/>
+      <w:bookmarkStart w:id="4" w:name="_Toc233901980"/>
       <w:r>
         <w:rPr>
           <w:lang w:val="en-US"/>
@@ -2933,7 +3140,7 @@
         </w:rPr>
         <w:br w:type="page"/>
       </w:r>
-      <w:bookmarkStart w:id="5" w:name="_Toc233875807"/>
+      <w:bookmarkStart w:id="5" w:name="_Toc233901981"/>
       <w:r>
         <w:rPr>
           <w:lang w:val="en-US"/>
@@ -3453,7 +3660,7 @@
         </w:rPr>
         <w:br w:type="page"/>
       </w:r>
-      <w:bookmarkStart w:id="6" w:name="_Toc233875808"/>
+      <w:bookmarkStart w:id="6" w:name="_Toc233901982"/>
       <w:r>
         <w:rPr>
           <w:lang w:val="en-US"/>
@@ -4113,7 +4320,7 @@
           <w:lang w:val="en-US"/>
         </w:rPr>
       </w:pPr>
-      <w:bookmarkStart w:id="7" w:name="_Toc233875809"/>
+      <w:bookmarkStart w:id="7" w:name="_Toc233901983"/>
       <w:r>
         <w:rPr>
           <w:lang w:val="en-US"/>
@@ -4136,7 +4343,7 @@
           <w:lang w:val="en-US"/>
         </w:rPr>
       </w:pPr>
-      <w:bookmarkStart w:id="8" w:name="_Toc233875810"/>
+      <w:bookmarkStart w:id="8" w:name="_Toc233901984"/>
       <w:r>
         <w:rPr>
           <w:lang w:val="en-US"/>
@@ -4539,7 +4746,7 @@
           <w:lang w:val="en-US"/>
         </w:rPr>
       </w:pPr>
-      <w:bookmarkStart w:id="9" w:name="_Toc233875811"/>
+      <w:bookmarkStart w:id="9" w:name="_Toc233901985"/>
       <w:r>
         <w:rPr>
           <w:lang w:val="en-US"/>
@@ -5090,7 +5297,7 @@
           <w:lang w:val="en-US"/>
         </w:rPr>
       </w:pPr>
-      <w:bookmarkStart w:id="10" w:name="_Toc233875812"/>
+      <w:bookmarkStart w:id="10" w:name="_Toc233901986"/>
       <w:r>
         <w:rPr>
           <w:lang w:val="en-US"/>
@@ -5448,7 +5655,7 @@
       <w:pPr>
         <w:pStyle w:val="Heading2"/>
       </w:pPr>
-      <w:bookmarkStart w:id="11" w:name="_Toc233875813"/>
+      <w:bookmarkStart w:id="11" w:name="_Toc233901987"/>
       <w:r>
         <w:t>2.4 Math Functions</w:t>
       </w:r>
@@ -5860,7 +6067,7 @@
       <w:pPr>
         <w:pStyle w:val="Heading2"/>
       </w:pPr>
-      <w:bookmarkStart w:id="12" w:name="_Toc233875814"/>
+      <w:bookmarkStart w:id="12" w:name="_Toc233901988"/>
       <w:r>
         <w:t>2.5 Statistical Functions</w:t>
       </w:r>
@@ -6374,7 +6581,7 @@
       <w:pPr>
         <w:pStyle w:val="Heading2"/>
       </w:pPr>
-      <w:bookmarkStart w:id="13" w:name="_Toc233875815"/>
+      <w:bookmarkStart w:id="13" w:name="_Toc233901989"/>
       <w:r>
         <w:t>2.6 Array</w:t>
       </w:r>
@@ -7075,7 +7282,7 @@
       <w:pPr>
         <w:pStyle w:val="Heading2"/>
       </w:pPr>
-      <w:bookmarkStart w:id="14" w:name="_Toc233875816"/>
+      <w:bookmarkStart w:id="14" w:name="_Toc233901990"/>
       <w:r>
         <w:t>2.7 Lookup Functions</w:t>
       </w:r>
@@ -8189,7 +8396,7 @@
       <w:pPr>
         <w:pStyle w:val="Heading2"/>
       </w:pPr>
-      <w:bookmarkStart w:id="15" w:name="_Toc233875817"/>
+      <w:bookmarkStart w:id="15" w:name="_Toc233901991"/>
       <w:r>
         <w:t>2.8 TEXT Functions</w:t>
       </w:r>
@@ -9578,7 +9785,7 @@
       <w:pPr>
         <w:pStyle w:val="Heading2"/>
       </w:pPr>
-      <w:bookmarkStart w:id="16" w:name="_Toc233875818"/>
+      <w:bookmarkStart w:id="16" w:name="_Toc233901992"/>
       <w:r>
         <w:t>2.9 Date &amp; Time Functions</w:t>
       </w:r>
@@ -9776,7 +9983,7 @@
       <w:pPr>
         <w:pStyle w:val="Heading1"/>
       </w:pPr>
-      <w:bookmarkStart w:id="17" w:name="_Toc233875819"/>
+      <w:bookmarkStart w:id="17" w:name="_Toc233901993"/>
       <w:r>
         <w:lastRenderedPageBreak/>
         <w:t xml:space="preserve">3. </w:t>
@@ -9791,7 +9998,7 @@
       <w:pPr>
         <w:pStyle w:val="Heading2"/>
       </w:pPr>
-      <w:bookmarkStart w:id="18" w:name="_Toc233875820"/>
+      <w:bookmarkStart w:id="18" w:name="_Toc233901994"/>
       <w:r>
         <w:t>3.3 Charts – Statistics</w:t>
       </w:r>
@@ -9861,7 +10068,7 @@
       <w:pPr>
         <w:pStyle w:val="Heading2"/>
       </w:pPr>
-      <w:bookmarkStart w:id="19" w:name="_Toc233875821"/>
+      <w:bookmarkStart w:id="19" w:name="_Toc233901995"/>
       <w:r>
         <w:t>3.4 Sparklines</w:t>
       </w:r>
@@ -9926,7 +10133,7 @@
       <w:pPr>
         <w:pStyle w:val="Heading1"/>
       </w:pPr>
-      <w:bookmarkStart w:id="20" w:name="_Toc233875822"/>
+      <w:bookmarkStart w:id="20" w:name="_Toc233901996"/>
       <w:r>
         <w:lastRenderedPageBreak/>
         <w:t xml:space="preserve">4. </w:t>
@@ -9942,7 +10149,7 @@
       <w:pPr>
         <w:pStyle w:val="Heading2"/>
       </w:pPr>
-      <w:bookmarkStart w:id="21" w:name="_Toc233875823"/>
+      <w:bookmarkStart w:id="21" w:name="_Toc233901997"/>
       <w:r>
         <w:t>4.1 Tables</w:t>
       </w:r>
@@ -10725,7 +10932,7 @@
       <w:pPr>
         <w:pStyle w:val="Heading2"/>
       </w:pPr>
-      <w:bookmarkStart w:id="22" w:name="_Toc233875824"/>
+      <w:bookmarkStart w:id="22" w:name="_Toc233901998"/>
       <w:r>
         <w:t>4.3 Collaboration</w:t>
       </w:r>
@@ -10737,7 +10944,7 @@
       <w:pPr>
         <w:pStyle w:val="Heading3"/>
       </w:pPr>
-      <w:bookmarkStart w:id="23" w:name="_Toc233875825"/>
+      <w:bookmarkStart w:id="23" w:name="_Toc233901999"/>
       <w:r>
         <w:t>Data Validation</w:t>
       </w:r>
@@ -11106,7 +11313,7 @@
       <w:pPr>
         <w:pStyle w:val="Heading3"/>
       </w:pPr>
-      <w:bookmarkStart w:id="24" w:name="_Toc233875826"/>
+      <w:bookmarkStart w:id="24" w:name="_Toc233902000"/>
       <w:r>
         <w:t xml:space="preserve">How to Protect </w:t>
       </w:r>
@@ -11401,7 +11608,7 @@
       <w:pPr>
         <w:pStyle w:val="Heading3"/>
       </w:pPr>
-      <w:bookmarkStart w:id="25" w:name="_Toc233875827"/>
+      <w:bookmarkStart w:id="25" w:name="_Toc233902001"/>
       <w:r>
         <w:t>How to protect Workbooks?</w:t>
       </w:r>
@@ -11556,7 +11763,7 @@
       <w:pPr>
         <w:pStyle w:val="Heading1"/>
       </w:pPr>
-      <w:bookmarkStart w:id="26" w:name="_Toc233875828"/>
+      <w:bookmarkStart w:id="26" w:name="_Toc233902002"/>
       <w:r>
         <w:t>Project 1: Dash</w:t>
       </w:r>
@@ -12948,15 +13155,15 @@
         <w:pStyle w:val="Heading1"/>
         <w:ind w:left="720" w:hanging="720"/>
       </w:pPr>
-      <w:bookmarkStart w:id="27" w:name="_Toc233875829"/>
+      <w:bookmarkStart w:id="27" w:name="_Toc233902003"/>
       <w:r>
         <w:lastRenderedPageBreak/>
         <w:t>5. Pivot Tables</w:t>
       </w:r>
+      <w:r>
+        <w:t xml:space="preserve"> Intro</w:t>
+      </w:r>
       <w:bookmarkEnd w:id="27"/>
-      <w:r>
-        <w:t xml:space="preserve"> Intro</w:t>
-      </w:r>
     </w:p>
     <w:p/>
     <w:p>
@@ -13112,8 +13319,774 @@
     <w:p/>
     <w:p>
       <w:pPr>
+        <w:pStyle w:val="Heading2"/>
+      </w:pPr>
+      <w:bookmarkStart w:id="28" w:name="_Toc233902004"/>
+      <w:r>
+        <w:t>4.2 Pivot Table Advance</w:t>
+      </w:r>
+      <w:bookmarkEnd w:id="28"/>
+    </w:p>
+    <w:p/>
+    <w:p>
+      <w:r>
+        <w:t>This is known as Hierarchy</w:t>
+      </w:r>
+    </w:p>
+    <w:p>
+      <w:r>
+        <w:drawing>
+          <wp:inline distT="0" distB="0" distL="0" distR="0" wp14:anchorId="25607FB4" wp14:editId="4545F1AD">
+            <wp:extent cx="1724930" cy="2694214"/>
+            <wp:effectExtent l="0" t="0" r="8890" b="0"/>
+            <wp:docPr id="1217782228" name="Picture 1"/>
+            <wp:cNvGraphicFramePr>
+              <a:graphicFrameLocks xmlns:a="http://schemas.openxmlformats.org/drawingml/2006/main" noChangeAspect="1"/>
+            </wp:cNvGraphicFramePr>
+            <a:graphic xmlns:a="http://schemas.openxmlformats.org/drawingml/2006/main">
+              <a:graphicData uri="http://schemas.openxmlformats.org/drawingml/2006/picture">
+                <pic:pic xmlns:pic="http://schemas.openxmlformats.org/drawingml/2006/picture">
+                  <pic:nvPicPr>
+                    <pic:cNvPr id="1217782228" name=""/>
+                    <pic:cNvPicPr/>
+                  </pic:nvPicPr>
+                  <pic:blipFill>
+                    <a:blip r:embed="rId43"/>
+                    <a:stretch>
+                      <a:fillRect/>
+                    </a:stretch>
+                  </pic:blipFill>
+                  <pic:spPr>
+                    <a:xfrm>
+                      <a:off x="0" y="0"/>
+                      <a:ext cx="1726971" cy="2697402"/>
+                    </a:xfrm>
+                    <a:prstGeom prst="rect">
+                      <a:avLst/>
+                    </a:prstGeom>
+                  </pic:spPr>
+                </pic:pic>
+              </a:graphicData>
+            </a:graphic>
+          </wp:inline>
+        </w:drawing>
+      </w:r>
+    </w:p>
+    <w:p/>
+    <w:p/>
+    <w:p/>
+    <w:p>
+      <w:r>
+        <w:lastRenderedPageBreak/>
+        <w:t>Trick to sort in pivot tables:</w:t>
+      </w:r>
+    </w:p>
+    <w:p>
+      <w:r>
+        <w:t>Be there / keep your active cell on the cell on the basis of which you want to apply filter</w:t>
+      </w:r>
+    </w:p>
+    <w:p>
+      <w:r>
+        <w:drawing>
+          <wp:inline distT="0" distB="0" distL="0" distR="0" wp14:anchorId="3DB8D79C" wp14:editId="6A26949D">
+            <wp:extent cx="5629265" cy="3091543"/>
+            <wp:effectExtent l="0" t="0" r="0" b="0"/>
+            <wp:docPr id="104680328" name="Picture 1"/>
+            <wp:cNvGraphicFramePr>
+              <a:graphicFrameLocks xmlns:a="http://schemas.openxmlformats.org/drawingml/2006/main" noChangeAspect="1"/>
+            </wp:cNvGraphicFramePr>
+            <a:graphic xmlns:a="http://schemas.openxmlformats.org/drawingml/2006/main">
+              <a:graphicData uri="http://schemas.openxmlformats.org/drawingml/2006/picture">
+                <pic:pic xmlns:pic="http://schemas.openxmlformats.org/drawingml/2006/picture">
+                  <pic:nvPicPr>
+                    <pic:cNvPr id="104680328" name=""/>
+                    <pic:cNvPicPr/>
+                  </pic:nvPicPr>
+                  <pic:blipFill>
+                    <a:blip r:embed="rId44"/>
+                    <a:stretch>
+                      <a:fillRect/>
+                    </a:stretch>
+                  </pic:blipFill>
+                  <pic:spPr>
+                    <a:xfrm>
+                      <a:off x="0" y="0"/>
+                      <a:ext cx="5644105" cy="3099693"/>
+                    </a:xfrm>
+                    <a:prstGeom prst="rect">
+                      <a:avLst/>
+                    </a:prstGeom>
+                  </pic:spPr>
+                </pic:pic>
+              </a:graphicData>
+            </a:graphic>
+          </wp:inline>
+        </w:drawing>
+      </w:r>
+    </w:p>
+    <w:p/>
+    <w:p>
+      <w:r>
+        <w:t>This will sort largest inside each country (But countries won’t be sorted…)</w:t>
+      </w:r>
+    </w:p>
+    <w:p/>
+    <w:p>
+      <w:pPr>
         <w:jc w:val="center"/>
       </w:pPr>
+      <w:r>
+        <w:drawing>
+          <wp:inline distT="0" distB="0" distL="0" distR="0" wp14:anchorId="073EE43D" wp14:editId="2C64F815">
+            <wp:extent cx="3173186" cy="2247527"/>
+            <wp:effectExtent l="0" t="0" r="8255" b="635"/>
+            <wp:docPr id="2097448720" name="Picture 1"/>
+            <wp:cNvGraphicFramePr>
+              <a:graphicFrameLocks xmlns:a="http://schemas.openxmlformats.org/drawingml/2006/main" noChangeAspect="1"/>
+            </wp:cNvGraphicFramePr>
+            <a:graphic xmlns:a="http://schemas.openxmlformats.org/drawingml/2006/main">
+              <a:graphicData uri="http://schemas.openxmlformats.org/drawingml/2006/picture">
+                <pic:pic xmlns:pic="http://schemas.openxmlformats.org/drawingml/2006/picture">
+                  <pic:nvPicPr>
+                    <pic:cNvPr id="2097448720" name=""/>
+                    <pic:cNvPicPr/>
+                  </pic:nvPicPr>
+                  <pic:blipFill>
+                    <a:blip r:embed="rId45"/>
+                    <a:stretch>
+                      <a:fillRect/>
+                    </a:stretch>
+                  </pic:blipFill>
+                  <pic:spPr>
+                    <a:xfrm>
+                      <a:off x="0" y="0"/>
+                      <a:ext cx="3175346" cy="2249057"/>
+                    </a:xfrm>
+                    <a:prstGeom prst="rect">
+                      <a:avLst/>
+                    </a:prstGeom>
+                  </pic:spPr>
+                </pic:pic>
+              </a:graphicData>
+            </a:graphic>
+          </wp:inline>
+        </w:drawing>
+      </w:r>
+    </w:p>
+    <w:p/>
+    <w:p/>
+    <w:p/>
+    <w:p>
+      <w:r>
+        <w:t>Now,</w:t>
+      </w:r>
+    </w:p>
+    <w:p>
+      <w:pPr>
+        <w:jc w:val="center"/>
+      </w:pPr>
+      <w:r>
+        <w:lastRenderedPageBreak/>
+        <w:drawing>
+          <wp:inline distT="0" distB="0" distL="0" distR="0" wp14:anchorId="4B6BAE5F" wp14:editId="2D11FAB3">
+            <wp:extent cx="4465220" cy="2476500"/>
+            <wp:effectExtent l="0" t="0" r="0" b="0"/>
+            <wp:docPr id="1220633198" name="Picture 1"/>
+            <wp:cNvGraphicFramePr>
+              <a:graphicFrameLocks xmlns:a="http://schemas.openxmlformats.org/drawingml/2006/main" noChangeAspect="1"/>
+            </wp:cNvGraphicFramePr>
+            <a:graphic xmlns:a="http://schemas.openxmlformats.org/drawingml/2006/main">
+              <a:graphicData uri="http://schemas.openxmlformats.org/drawingml/2006/picture">
+                <pic:pic xmlns:pic="http://schemas.openxmlformats.org/drawingml/2006/picture">
+                  <pic:nvPicPr>
+                    <pic:cNvPr id="1220633198" name=""/>
+                    <pic:cNvPicPr/>
+                  </pic:nvPicPr>
+                  <pic:blipFill>
+                    <a:blip r:embed="rId46"/>
+                    <a:stretch>
+                      <a:fillRect/>
+                    </a:stretch>
+                  </pic:blipFill>
+                  <pic:spPr>
+                    <a:xfrm>
+                      <a:off x="0" y="0"/>
+                      <a:ext cx="4473492" cy="2481088"/>
+                    </a:xfrm>
+                    <a:prstGeom prst="rect">
+                      <a:avLst/>
+                    </a:prstGeom>
+                  </pic:spPr>
+                </pic:pic>
+              </a:graphicData>
+            </a:graphic>
+          </wp:inline>
+        </w:drawing>
+      </w:r>
+    </w:p>
+    <w:p>
+      <w:pPr>
+        <w:jc w:val="center"/>
+      </w:pPr>
+      <w:r>
+        <w:rPr>
+          <w:noProof/>
+        </w:rPr>
+        <mc:AlternateContent>
+          <mc:Choice Requires="wps">
+            <w:drawing>
+              <wp:anchor distT="0" distB="0" distL="114300" distR="114300" simplePos="0" relativeHeight="251663360" behindDoc="0" locked="0" layoutInCell="1" allowOverlap="1" wp14:anchorId="4BA5DFFB" wp14:editId="7139942F">
+                <wp:simplePos x="0" y="0"/>
+                <wp:positionH relativeFrom="column">
+                  <wp:posOffset>2509157</wp:posOffset>
+                </wp:positionH>
+                <wp:positionV relativeFrom="paragraph">
+                  <wp:posOffset>118473</wp:posOffset>
+                </wp:positionV>
+                <wp:extent cx="881743" cy="1061357"/>
+                <wp:effectExtent l="19050" t="0" r="13970" b="43815"/>
+                <wp:wrapNone/>
+                <wp:docPr id="878918304" name="Arrow: Down 5"/>
+                <wp:cNvGraphicFramePr/>
+                <a:graphic xmlns:a="http://schemas.openxmlformats.org/drawingml/2006/main">
+                  <a:graphicData uri="http://schemas.microsoft.com/office/word/2010/wordprocessingShape">
+                    <wps:wsp>
+                      <wps:cNvSpPr/>
+                      <wps:spPr>
+                        <a:xfrm>
+                          <a:off x="0" y="0"/>
+                          <a:ext cx="881743" cy="1061357"/>
+                        </a:xfrm>
+                        <a:prstGeom prst="downArrow">
+                          <a:avLst/>
+                        </a:prstGeom>
+                      </wps:spPr>
+                      <wps:style>
+                        <a:lnRef idx="2">
+                          <a:schemeClr val="accent1">
+                            <a:shade val="15000"/>
+                          </a:schemeClr>
+                        </a:lnRef>
+                        <a:fillRef idx="1">
+                          <a:schemeClr val="accent1"/>
+                        </a:fillRef>
+                        <a:effectRef idx="0">
+                          <a:schemeClr val="accent1"/>
+                        </a:effectRef>
+                        <a:fontRef idx="minor">
+                          <a:schemeClr val="lt1"/>
+                        </a:fontRef>
+                      </wps:style>
+                      <wps:bodyPr rot="0" spcFirstLastPara="0" vertOverflow="overflow" horzOverflow="overflow" vert="horz" wrap="square" lIns="91440" tIns="45720" rIns="91440" bIns="45720" numCol="1" spcCol="0" rtlCol="0" fromWordArt="0" anchor="ctr" anchorCtr="0" forceAA="0" compatLnSpc="1">
+                        <a:prstTxWarp prst="textNoShape">
+                          <a:avLst/>
+                        </a:prstTxWarp>
+                        <a:noAutofit/>
+                      </wps:bodyPr>
+                    </wps:wsp>
+                  </a:graphicData>
+                </a:graphic>
+              </wp:anchor>
+            </w:drawing>
+          </mc:Choice>
+          <mc:Fallback>
+            <w:pict>
+              <v:shapetype w14:anchorId="61495A3D" id="_x0000_t67" coordsize="21600,21600" o:spt="67" adj="16200,5400" path="m0@0l@1@0@1,0@2,0@2@0,21600@0,10800,21600xe">
+                <v:stroke joinstyle="miter"/>
+                <v:formulas>
+                  <v:f eqn="val #0"/>
+                  <v:f eqn="val #1"/>
+                  <v:f eqn="sum height 0 #1"/>
+                  <v:f eqn="sum 10800 0 #1"/>
+                  <v:f eqn="sum width 0 #0"/>
+                  <v:f eqn="prod @4 @3 10800"/>
+                  <v:f eqn="sum width 0 @5"/>
+                </v:formulas>
+                <v:path o:connecttype="custom" o:connectlocs="10800,0;0,@0;10800,21600;21600,@0" o:connectangles="270,180,90,0" textboxrect="@1,0,@2,@6"/>
+                <v:handles>
+                  <v:h position="#1,#0" xrange="0,10800" yrange="0,21600"/>
+                </v:handles>
+              </v:shapetype>
+              <v:shape id="Arrow: Down 5" o:spid="_x0000_s1026" type="#_x0000_t67" style="position:absolute;margin-left:197.55pt;margin-top:9.35pt;width:69.45pt;height:83.55pt;z-index:251663360;visibility:visible;mso-wrap-style:square;mso-wrap-distance-left:9pt;mso-wrap-distance-top:0;mso-wrap-distance-right:9pt;mso-wrap-distance-bottom:0;mso-position-horizontal:absolute;mso-position-horizontal-relative:text;mso-position-vertical:absolute;mso-position-vertical-relative:text;v-text-anchor:middle" o:gfxdata="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" adj="12628" fillcolor="#4472c4 [3204]" strokecolor="#09101d [484]" strokeweight="1pt"/>
+            </w:pict>
+          </mc:Fallback>
+        </mc:AlternateContent>
+      </w:r>
+    </w:p>
+    <w:p>
+      <w:pPr>
+        <w:jc w:val="center"/>
+      </w:pPr>
+    </w:p>
+    <w:p>
+      <w:pPr>
+        <w:jc w:val="center"/>
+      </w:pPr>
+    </w:p>
+    <w:p>
+      <w:pPr>
+        <w:jc w:val="center"/>
+      </w:pPr>
+    </w:p>
+    <w:p>
+      <w:pPr>
+        <w:jc w:val="center"/>
+      </w:pPr>
+    </w:p>
+    <w:p>
+      <w:pPr>
+        <w:jc w:val="center"/>
+      </w:pPr>
+      <w:r>
+        <w:drawing>
+          <wp:inline distT="0" distB="0" distL="0" distR="0" wp14:anchorId="74CD8E64" wp14:editId="5B018240">
+            <wp:extent cx="4310743" cy="2709856"/>
+            <wp:effectExtent l="0" t="0" r="0" b="0"/>
+            <wp:docPr id="943854744" name="Picture 1"/>
+            <wp:cNvGraphicFramePr>
+              <a:graphicFrameLocks xmlns:a="http://schemas.openxmlformats.org/drawingml/2006/main" noChangeAspect="1"/>
+            </wp:cNvGraphicFramePr>
+            <a:graphic xmlns:a="http://schemas.openxmlformats.org/drawingml/2006/main">
+              <a:graphicData uri="http://schemas.openxmlformats.org/drawingml/2006/picture">
+                <pic:pic xmlns:pic="http://schemas.openxmlformats.org/drawingml/2006/picture">
+                  <pic:nvPicPr>
+                    <pic:cNvPr id="943854744" name=""/>
+                    <pic:cNvPicPr/>
+                  </pic:nvPicPr>
+                  <pic:blipFill>
+                    <a:blip r:embed="rId47"/>
+                    <a:stretch>
+                      <a:fillRect/>
+                    </a:stretch>
+                  </pic:blipFill>
+                  <pic:spPr>
+                    <a:xfrm>
+                      <a:off x="0" y="0"/>
+                      <a:ext cx="4316838" cy="2713687"/>
+                    </a:xfrm>
+                    <a:prstGeom prst="rect">
+                      <a:avLst/>
+                    </a:prstGeom>
+                  </pic:spPr>
+                </pic:pic>
+              </a:graphicData>
+            </a:graphic>
+          </wp:inline>
+        </w:drawing>
+      </w:r>
+    </w:p>
+    <w:p/>
+    <w:p/>
+    <w:p>
+      <w:pPr>
+        <w:rPr>
+          <w:b/>
+          <w:bCs/>
+          <w:u w:val="single"/>
+        </w:rPr>
+      </w:pPr>
+      <w:r>
+        <w:rPr>
+          <w:b/>
+          <w:bCs/>
+          <w:u w:val="single"/>
+        </w:rPr>
+        <w:t>Report Layout:</w:t>
+      </w:r>
+    </w:p>
+    <w:p>
+      <w:pPr>
+        <w:jc w:val="center"/>
+      </w:pPr>
+      <w:r>
+        <w:lastRenderedPageBreak/>
+        <w:drawing>
+          <wp:inline distT="0" distB="0" distL="0" distR="0" wp14:anchorId="5A6613FB" wp14:editId="5DA2F5D0">
+            <wp:extent cx="4523014" cy="2932994"/>
+            <wp:effectExtent l="0" t="0" r="0" b="1270"/>
+            <wp:docPr id="152387377" name="Picture 1"/>
+            <wp:cNvGraphicFramePr>
+              <a:graphicFrameLocks xmlns:a="http://schemas.openxmlformats.org/drawingml/2006/main" noChangeAspect="1"/>
+            </wp:cNvGraphicFramePr>
+            <a:graphic xmlns:a="http://schemas.openxmlformats.org/drawingml/2006/main">
+              <a:graphicData uri="http://schemas.openxmlformats.org/drawingml/2006/picture">
+                <pic:pic xmlns:pic="http://schemas.openxmlformats.org/drawingml/2006/picture">
+                  <pic:nvPicPr>
+                    <pic:cNvPr id="152387377" name=""/>
+                    <pic:cNvPicPr/>
+                  </pic:nvPicPr>
+                  <pic:blipFill>
+                    <a:blip r:embed="rId48"/>
+                    <a:stretch>
+                      <a:fillRect/>
+                    </a:stretch>
+                  </pic:blipFill>
+                  <pic:spPr>
+                    <a:xfrm>
+                      <a:off x="0" y="0"/>
+                      <a:ext cx="4528132" cy="2936313"/>
+                    </a:xfrm>
+                    <a:prstGeom prst="rect">
+                      <a:avLst/>
+                    </a:prstGeom>
+                  </pic:spPr>
+                </pic:pic>
+              </a:graphicData>
+            </a:graphic>
+          </wp:inline>
+        </w:drawing>
+      </w:r>
+    </w:p>
+    <w:p/>
+    <w:p/>
+    <w:p/>
+    <w:p>
+      <w:pPr>
+        <w:pStyle w:val="Heading3"/>
+      </w:pPr>
+      <w:bookmarkStart w:id="29" w:name="_Toc233902005"/>
+      <w:r>
+        <w:t>Automatic Grouping:</w:t>
+      </w:r>
+      <w:bookmarkEnd w:id="29"/>
+    </w:p>
+    <w:p>
+      <w:pPr>
+        <w:rPr>
+          <w:b/>
+          <w:u w:val="single"/>
+        </w:rPr>
+      </w:pPr>
+    </w:p>
+    <w:p>
+      <w:pPr>
+        <w:rPr>
+          <w:bCs/>
+        </w:rPr>
+      </w:pPr>
+      <w:r>
+        <w:rPr>
+          <w:bCs/>
+        </w:rPr>
+        <w:drawing>
+          <wp:inline distT="0" distB="0" distL="0" distR="0" wp14:anchorId="5D3EB85C" wp14:editId="3F78A9CF">
+            <wp:extent cx="5731510" cy="2276475"/>
+            <wp:effectExtent l="0" t="0" r="2540" b="9525"/>
+            <wp:docPr id="404158198" name="Picture 1"/>
+            <wp:cNvGraphicFramePr>
+              <a:graphicFrameLocks xmlns:a="http://schemas.openxmlformats.org/drawingml/2006/main" noChangeAspect="1"/>
+            </wp:cNvGraphicFramePr>
+            <a:graphic xmlns:a="http://schemas.openxmlformats.org/drawingml/2006/main">
+              <a:graphicData uri="http://schemas.openxmlformats.org/drawingml/2006/picture">
+                <pic:pic xmlns:pic="http://schemas.openxmlformats.org/drawingml/2006/picture">
+                  <pic:nvPicPr>
+                    <pic:cNvPr id="404158198" name=""/>
+                    <pic:cNvPicPr/>
+                  </pic:nvPicPr>
+                  <pic:blipFill>
+                    <a:blip r:embed="rId49"/>
+                    <a:stretch>
+                      <a:fillRect/>
+                    </a:stretch>
+                  </pic:blipFill>
+                  <pic:spPr>
+                    <a:xfrm>
+                      <a:off x="0" y="0"/>
+                      <a:ext cx="5731510" cy="2276475"/>
+                    </a:xfrm>
+                    <a:prstGeom prst="rect">
+                      <a:avLst/>
+                    </a:prstGeom>
+                  </pic:spPr>
+                </pic:pic>
+              </a:graphicData>
+            </a:graphic>
+          </wp:inline>
+        </w:drawing>
+      </w:r>
+    </w:p>
+    <w:p>
+      <w:pPr>
+        <w:rPr>
+          <w:bCs/>
+        </w:rPr>
+      </w:pPr>
+    </w:p>
+    <w:p>
+      <w:pPr>
+        <w:rPr>
+          <w:bCs/>
+        </w:rPr>
+      </w:pPr>
+      <w:r>
+        <w:rPr>
+          <w:bCs/>
+        </w:rPr>
+        <w:lastRenderedPageBreak/>
+        <w:drawing>
+          <wp:inline distT="0" distB="0" distL="0" distR="0" wp14:anchorId="1CF2F42E" wp14:editId="18DA94E2">
+            <wp:extent cx="1415143" cy="2713168"/>
+            <wp:effectExtent l="0" t="0" r="0" b="0"/>
+            <wp:docPr id="848915230" name="Picture 1"/>
+            <wp:cNvGraphicFramePr>
+              <a:graphicFrameLocks xmlns:a="http://schemas.openxmlformats.org/drawingml/2006/main" noChangeAspect="1"/>
+            </wp:cNvGraphicFramePr>
+            <a:graphic xmlns:a="http://schemas.openxmlformats.org/drawingml/2006/main">
+              <a:graphicData uri="http://schemas.openxmlformats.org/drawingml/2006/picture">
+                <pic:pic xmlns:pic="http://schemas.openxmlformats.org/drawingml/2006/picture">
+                  <pic:nvPicPr>
+                    <pic:cNvPr id="848915230" name=""/>
+                    <pic:cNvPicPr/>
+                  </pic:nvPicPr>
+                  <pic:blipFill>
+                    <a:blip r:embed="rId50"/>
+                    <a:stretch>
+                      <a:fillRect/>
+                    </a:stretch>
+                  </pic:blipFill>
+                  <pic:spPr>
+                    <a:xfrm>
+                      <a:off x="0" y="0"/>
+                      <a:ext cx="1420825" cy="2724063"/>
+                    </a:xfrm>
+                    <a:prstGeom prst="rect">
+                      <a:avLst/>
+                    </a:prstGeom>
+                  </pic:spPr>
+                </pic:pic>
+              </a:graphicData>
+            </a:graphic>
+          </wp:inline>
+        </w:drawing>
+      </w:r>
+    </w:p>
+    <w:p/>
+    <w:p>
+      <w:r>
+        <w:t>Also, Inserted Job Count</w:t>
+      </w:r>
+    </w:p>
+    <w:p>
+      <w:r>
+        <w:drawing>
+          <wp:inline distT="0" distB="0" distL="0" distR="0" wp14:anchorId="608A05BA" wp14:editId="252626A8">
+            <wp:extent cx="3064329" cy="2560604"/>
+            <wp:effectExtent l="0" t="0" r="3175" b="0"/>
+            <wp:docPr id="1833315740" name="Picture 1"/>
+            <wp:cNvGraphicFramePr>
+              <a:graphicFrameLocks xmlns:a="http://schemas.openxmlformats.org/drawingml/2006/main" noChangeAspect="1"/>
+            </wp:cNvGraphicFramePr>
+            <a:graphic xmlns:a="http://schemas.openxmlformats.org/drawingml/2006/main">
+              <a:graphicData uri="http://schemas.openxmlformats.org/drawingml/2006/picture">
+                <pic:pic xmlns:pic="http://schemas.openxmlformats.org/drawingml/2006/picture">
+                  <pic:nvPicPr>
+                    <pic:cNvPr id="1833315740" name=""/>
+                    <pic:cNvPicPr/>
+                  </pic:nvPicPr>
+                  <pic:blipFill>
+                    <a:blip r:embed="rId51"/>
+                    <a:stretch>
+                      <a:fillRect/>
+                    </a:stretch>
+                  </pic:blipFill>
+                  <pic:spPr>
+                    <a:xfrm>
+                      <a:off x="0" y="0"/>
+                      <a:ext cx="3067949" cy="2563629"/>
+                    </a:xfrm>
+                    <a:prstGeom prst="rect">
+                      <a:avLst/>
+                    </a:prstGeom>
+                  </pic:spPr>
+                </pic:pic>
+              </a:graphicData>
+            </a:graphic>
+          </wp:inline>
+        </w:drawing>
+      </w:r>
+    </w:p>
+    <w:p/>
+    <w:p>
+      <w:r>
+        <w:t xml:space="preserve">Note: If you want to analyse why some months have low or high job count than others, then you can click like this and can navigate to “Show Details” – This is very cool </w:t>
+      </w:r>
+      <w:r>
+        <w:rPr>
+          <mc:AlternateContent>
+            <mc:Choice Requires="w16se"/>
+            <mc:Fallback>
+              <w:rFonts w:ascii="Segoe UI Emoji" w:eastAsia="Segoe UI Emoji" w:hAnsi="Segoe UI Emoji" w:cs="Segoe UI Emoji"/>
+            </mc:Fallback>
+          </mc:AlternateContent>
+        </w:rPr>
+        <mc:AlternateContent>
+          <mc:Choice Requires="w16se">
+            <w16se:symEx w16se:font="Segoe UI Emoji" w16se:char="1F60E"/>
+          </mc:Choice>
+          <mc:Fallback>
+            <w:t>😎</w:t>
+          </mc:Fallback>
+        </mc:AlternateContent>
+      </w:r>
+      <w:r>
+        <w:t xml:space="preserve"> feature.</w:t>
+      </w:r>
+    </w:p>
+    <w:p/>
+    <w:p/>
+    <w:p/>
+    <w:p>
+      <w:pPr>
+        <w:pStyle w:val="Heading3"/>
+      </w:pPr>
+      <w:bookmarkStart w:id="30" w:name="_Toc233902006"/>
+      <w:r>
+        <w:t>Manual Grouping</w:t>
+      </w:r>
+      <w:bookmarkEnd w:id="30"/>
+    </w:p>
+    <w:p/>
+    <w:p/>
+    <w:p>
+      <w:r>
+        <w:lastRenderedPageBreak/>
+        <w:drawing>
+          <wp:inline distT="0" distB="0" distL="0" distR="0" wp14:anchorId="26E01900" wp14:editId="2F792CA9">
+            <wp:extent cx="2524752" cy="2465614"/>
+            <wp:effectExtent l="0" t="0" r="9525" b="0"/>
+            <wp:docPr id="1528468072" name="Picture 1"/>
+            <wp:cNvGraphicFramePr>
+              <a:graphicFrameLocks xmlns:a="http://schemas.openxmlformats.org/drawingml/2006/main" noChangeAspect="1"/>
+            </wp:cNvGraphicFramePr>
+            <a:graphic xmlns:a="http://schemas.openxmlformats.org/drawingml/2006/main">
+              <a:graphicData uri="http://schemas.openxmlformats.org/drawingml/2006/picture">
+                <pic:pic xmlns:pic="http://schemas.openxmlformats.org/drawingml/2006/picture">
+                  <pic:nvPicPr>
+                    <pic:cNvPr id="1528468072" name=""/>
+                    <pic:cNvPicPr/>
+                  </pic:nvPicPr>
+                  <pic:blipFill>
+                    <a:blip r:embed="rId52"/>
+                    <a:stretch>
+                      <a:fillRect/>
+                    </a:stretch>
+                  </pic:blipFill>
+                  <pic:spPr>
+                    <a:xfrm>
+                      <a:off x="0" y="0"/>
+                      <a:ext cx="2527397" cy="2468197"/>
+                    </a:xfrm>
+                    <a:prstGeom prst="rect">
+                      <a:avLst/>
+                    </a:prstGeom>
+                  </pic:spPr>
+                </pic:pic>
+              </a:graphicData>
+            </a:graphic>
+          </wp:inline>
+        </w:drawing>
+      </w:r>
+    </w:p>
+    <w:p/>
+    <w:p/>
+    <w:p>
+      <w:r>
+        <w:t>To calculate % of Grand Total, we can do this:</w:t>
+      </w:r>
+    </w:p>
+    <w:p>
+      <w:pPr>
+        <w:jc w:val="center"/>
+      </w:pPr>
+      <w:r>
+        <w:drawing>
+          <wp:inline distT="0" distB="0" distL="0" distR="0" wp14:anchorId="4FD44884" wp14:editId="4EF6FB56">
+            <wp:extent cx="5164748" cy="3167743"/>
+            <wp:effectExtent l="0" t="0" r="0" b="0"/>
+            <wp:docPr id="1448186038" name="Picture 1"/>
+            <wp:cNvGraphicFramePr>
+              <a:graphicFrameLocks xmlns:a="http://schemas.openxmlformats.org/drawingml/2006/main" noChangeAspect="1"/>
+            </wp:cNvGraphicFramePr>
+            <a:graphic xmlns:a="http://schemas.openxmlformats.org/drawingml/2006/main">
+              <a:graphicData uri="http://schemas.openxmlformats.org/drawingml/2006/picture">
+                <pic:pic xmlns:pic="http://schemas.openxmlformats.org/drawingml/2006/picture">
+                  <pic:nvPicPr>
+                    <pic:cNvPr id="1448186038" name=""/>
+                    <pic:cNvPicPr/>
+                  </pic:nvPicPr>
+                  <pic:blipFill>
+                    <a:blip r:embed="rId53"/>
+                    <a:stretch>
+                      <a:fillRect/>
+                    </a:stretch>
+                  </pic:blipFill>
+                  <pic:spPr>
+                    <a:xfrm>
+                      <a:off x="0" y="0"/>
+                      <a:ext cx="5170811" cy="3171461"/>
+                    </a:xfrm>
+                    <a:prstGeom prst="rect">
+                      <a:avLst/>
+                    </a:prstGeom>
+                  </pic:spPr>
+                </pic:pic>
+              </a:graphicData>
+            </a:graphic>
+          </wp:inline>
+        </w:drawing>
+      </w:r>
+    </w:p>
+    <w:p/>
+    <w:p/>
+    <w:p>
+      <w:r>
+        <w:br/>
+        <w:t>For % of Parent Total:</w:t>
+      </w:r>
+    </w:p>
+    <w:p>
+      <w:pPr>
+        <w:jc w:val="center"/>
+      </w:pPr>
+      <w:r>
+        <w:lastRenderedPageBreak/>
+        <w:drawing>
+          <wp:inline distT="0" distB="0" distL="0" distR="0" wp14:anchorId="144E9E92" wp14:editId="3E7DB60E">
+            <wp:extent cx="3037114" cy="3098593"/>
+            <wp:effectExtent l="0" t="0" r="0" b="6985"/>
+            <wp:docPr id="2106213785" name="Picture 1"/>
+            <wp:cNvGraphicFramePr>
+              <a:graphicFrameLocks xmlns:a="http://schemas.openxmlformats.org/drawingml/2006/main" noChangeAspect="1"/>
+            </wp:cNvGraphicFramePr>
+            <a:graphic xmlns:a="http://schemas.openxmlformats.org/drawingml/2006/main">
+              <a:graphicData uri="http://schemas.openxmlformats.org/drawingml/2006/picture">
+                <pic:pic xmlns:pic="http://schemas.openxmlformats.org/drawingml/2006/picture">
+                  <pic:nvPicPr>
+                    <pic:cNvPr id="2106213785" name=""/>
+                    <pic:cNvPicPr/>
+                  </pic:nvPicPr>
+                  <pic:blipFill>
+                    <a:blip r:embed="rId54"/>
+                    <a:stretch>
+                      <a:fillRect/>
+                    </a:stretch>
+                  </pic:blipFill>
+                  <pic:spPr>
+                    <a:xfrm>
+                      <a:off x="0" y="0"/>
+                      <a:ext cx="3042264" cy="3103847"/>
+                    </a:xfrm>
+                    <a:prstGeom prst="rect">
+                      <a:avLst/>
+                    </a:prstGeom>
+                  </pic:spPr>
+                </pic:pic>
+              </a:graphicData>
+            </a:graphic>
+          </wp:inline>
+        </w:drawing>
+      </w:r>
     </w:p>
     <w:sectPr>
       <w:pgSz w:w="11906" w:h="16838"/>

</xml_diff>